<commit_message>
chore: update regulation hub 2026-09-15
</commit_message>
<xml_diff>
--- a/reg-hub/regulation_fortnightly_brief.docx
+++ b/reg-hub/regulation_fortnightly_brief.docx
@@ -46,7 +46,7 @@
         <w:pStyle w:val="Heading1"/>
       </w:pPr>
       <w:r>
-        <w:t>KPMG Regulatory Transformation Fortnightly Brief - 20 August - 2 September 2026</w:t>
+        <w:t>KPMG Regulatory Transformation Fortnightly Brief - 3-16 September 2026</w:t>
       </w:r>
     </w:p>
     <w:p>
@@ -73,7 +73,7 @@
           <w:color w:val="666666"/>
           <w:sz w:val="19"/>
         </w:rPr>
-        <w:t>02 September 2026</w:t>
+        <w:t>16 September 2026</w:t>
       </w:r>
     </w:p>
     <w:p>
@@ -330,60 +330,16 @@
     </w:p>
     <w:p>
       <w:pPr>
-        <w:pStyle w:val="ListBullet"/>
+        <w:pStyle w:val="body_letter"/>
       </w:pPr>
       <w:r>
         <w:rPr>
           <w:rFonts w:ascii="Arial" w:hAnsi="Arial"/>
-          <w:b/>
-          <w:color w:val="000000"/>
+          <w:i/>
+          <w:color w:val="666666"/>
           <w:sz w:val="19"/>
         </w:rPr>
-        <w:t>Law Society of NSW In-House Lawyers Conference 2026</w:t>
-      </w:r>
-      <w:r>
-        <w:rPr>
-          <w:rFonts w:ascii="Arial" w:hAnsi="Arial"/>
-          <w:color w:val="000000"/>
-          <w:sz w:val="19"/>
-        </w:rPr>
-        <w:t xml:space="preserve"> - </w:t>
-      </w:r>
-      <w:r>
-        <w:rPr>
-          <w:rFonts w:ascii="Arial" w:hAnsi="Arial"/>
-          <w:color w:val="000000"/>
-          <w:sz w:val="19"/>
-        </w:rPr>
-        <w:t>09 Sep 2026 - APRA · Online</w:t>
-      </w:r>
-      <w:r>
-        <w:rPr>
-          <w:rFonts w:ascii="Arial" w:hAnsi="Arial"/>
-          <w:color w:val="000000"/>
-          <w:sz w:val="19"/>
-        </w:rPr>
-        <w:t xml:space="preserve"> (</w:t>
-      </w:r>
-      <w:hyperlink r:id="rId10">
-        <w:r>
-          <w:rPr>
-            <w:rFonts w:ascii="Arial" w:hAnsi="Arial" w:cs="Arial"/>
-            <w:color w:val="0000FF"/>
-            <w:sz w:val="19"/>
-            <w:szCs w:val="19"/>
-            <w:u w:val="single"/>
-          </w:rPr>
-          <w:t xml:space="preserve">Register</w:t>
-        </w:r>
-      </w:hyperlink>
-      <w:r>
-        <w:rPr>
-          <w:rFonts w:ascii="Arial" w:hAnsi="Arial"/>
-          <w:color w:val="000000"/>
-          <w:sz w:val="19"/>
-        </w:rPr>
-        <w:t>)</w:t>
+        <w:t>No upcoming events in the next four weeks.</w:t>
       </w:r>
     </w:p>
     <w:p>
@@ -552,7 +508,7 @@
                           <pic:cNvPicPr/>
                         </pic:nvPicPr>
                         <pic:blipFill>
-                          <a:blip r:embed="rId11"/>
+                          <a:blip r:embed="rId10"/>
                           <a:stretch>
                             <a:fillRect/>
                           </a:stretch>

</xml_diff>

<commit_message>
chore: update regulation hub 2026-09-21
</commit_message>
<xml_diff>
--- a/reg-hub/regulation_fortnightly_brief.docx
+++ b/reg-hub/regulation_fortnightly_brief.docx
@@ -46,7 +46,7 @@
         <w:pStyle w:val="Heading1"/>
       </w:pPr>
       <w:r>
-        <w:t>KPMG Regulatory Transformation Fortnightly Brief - 3-16 September 2026</w:t>
+        <w:t>KPMG Regulatory Transformation Fortnightly Brief - 8-21 September 2026</w:t>
       </w:r>
     </w:p>
     <w:p>
@@ -73,7 +73,7 @@
           <w:color w:val="666666"/>
           <w:sz w:val="19"/>
         </w:rPr>
-        <w:t>16 September 2026</w:t>
+        <w:t>21 September 2026</w:t>
       </w:r>
     </w:p>
     <w:p>
@@ -97,11 +97,11 @@
       <w:r>
         <w:rPr>
           <w:rFonts w:ascii="Arial" w:hAnsi="Arial"/>
-          <w:i/>
-          <w:color w:val="666666"/>
+          <w:b w:val="0"/>
+          <w:color w:val="000000"/>
           <w:sz w:val="19"/>
         </w:rPr>
-        <w:t>[edit before send], Adam's 3-sentence key messages will prefill from the dashboard synthesis on the next fortnightly run. Type your replacement here.</w:t>
+        <w:t>This fortnight Australian regulators are pressing on multiple fronts simultaneously: ASIC is advancing enforcement action and consulting on register access, APRA is sharpening director and officer accountability expectations following the BAB decision, privacy reform amendments are reshaping compliance obligations, and the regulatory omnibus bill is trimming the CSLR levy disallowance window, all while card surcharging removal and gas market reform add cross-sector compliance pressure. The APRA v BAB decision is the standout advisory moment because it resets the personal liability benchmark for directors and officers across the financial services portfolio and creates an immediate, concrete reason for boards to seek independent assurance on their governance frameworks. Brief our financial services and insurance sector leads this week on the BAB implications and pursue conversations with audit and board advisory clients who need to reassess their D and O governance posture before the decision embeds as market standard.</w:t>
       </w:r>
     </w:p>
     <w:p>
@@ -153,11 +153,233 @@
       <w:r>
         <w:rPr>
           <w:rFonts w:ascii="Arial" w:hAnsi="Arial"/>
-          <w:i/>
-          <w:color w:val="666666"/>
+          <w:b/>
+          <w:color w:val="000000"/>
           <w:sz w:val="19"/>
         </w:rPr>
-        <w:t>No client-in-news signal this fortnight across any jurisdiction.</w:t>
+        <w:t>Victoria</w:t>
+      </w:r>
+    </w:p>
+    <w:p>
+      <w:pPr>
+        <w:pStyle w:val="ListBullet"/>
+      </w:pPr>
+      <w:r>
+        <w:rPr>
+          <w:rFonts w:ascii="Arial" w:hAnsi="Arial"/>
+          <w:b/>
+          <w:color w:val="000000"/>
+          <w:sz w:val="19"/>
+        </w:rPr>
+        <w:t>Independent Broad-based Anti-corruption Commission</w:t>
+      </w:r>
+      <w:r>
+        <w:rPr>
+          <w:rFonts w:ascii="Arial" w:hAnsi="Arial"/>
+          <w:color w:val="000000"/>
+          <w:sz w:val="19"/>
+        </w:rPr>
+        <w:t xml:space="preserve"> - </w:t>
+      </w:r>
+      <w:r>
+        <w:rPr>
+          <w:rFonts w:ascii="Arial" w:hAnsi="Arial"/>
+          <w:color w:val="000000"/>
+          <w:sz w:val="19"/>
+        </w:rPr>
+        <w:t>AFR: decade of integrity erosion in Victoria</w:t>
+      </w:r>
+    </w:p>
+    <w:p>
+      <w:pPr>
+        <w:pStyle w:val="ListBullet"/>
+      </w:pPr>
+      <w:r>
+        <w:rPr>
+          <w:rFonts w:ascii="Arial" w:hAnsi="Arial"/>
+          <w:b/>
+          <w:color w:val="000000"/>
+          <w:sz w:val="19"/>
+        </w:rPr>
+        <w:t>Essential Services Commission</w:t>
+      </w:r>
+      <w:r>
+        <w:rPr>
+          <w:rFonts w:ascii="Arial" w:hAnsi="Arial"/>
+          <w:color w:val="000000"/>
+          <w:sz w:val="19"/>
+        </w:rPr>
+        <w:t xml:space="preserve"> - </w:t>
+      </w:r>
+      <w:r>
+        <w:rPr>
+          <w:rFonts w:ascii="Arial" w:hAnsi="Arial"/>
+          <w:color w:val="000000"/>
+          <w:sz w:val="19"/>
+        </w:rPr>
+        <w:t>New life support customer protections gazetted</w:t>
+      </w:r>
+    </w:p>
+    <w:p>
+      <w:pPr>
+        <w:pStyle w:val="ListBullet"/>
+      </w:pPr>
+      <w:r>
+        <w:rPr>
+          <w:rFonts w:ascii="Arial" w:hAnsi="Arial"/>
+          <w:b/>
+          <w:color w:val="000000"/>
+          <w:sz w:val="19"/>
+        </w:rPr>
+        <w:t>Essential Services Commission</w:t>
+      </w:r>
+      <w:r>
+        <w:rPr>
+          <w:rFonts w:ascii="Arial" w:hAnsi="Arial"/>
+          <w:color w:val="000000"/>
+          <w:sz w:val="19"/>
+        </w:rPr>
+        <w:t xml:space="preserve"> - </w:t>
+      </w:r>
+      <w:r>
+        <w:rPr>
+          <w:rFonts w:ascii="Arial" w:hAnsi="Arial"/>
+          <w:color w:val="000000"/>
+          <w:sz w:val="19"/>
+        </w:rPr>
+        <w:t>Water price submission guidance released</w:t>
+      </w:r>
+    </w:p>
+    <w:p>
+      <w:pPr>
+        <w:pStyle w:val="body_letter"/>
+      </w:pPr>
+      <w:r>
+        <w:rPr>
+          <w:rFonts w:ascii="Arial" w:hAnsi="Arial"/>
+          <w:b/>
+          <w:color w:val="000000"/>
+          <w:sz w:val="19"/>
+        </w:rPr>
+        <w:t>Commonwealth</w:t>
+      </w:r>
+    </w:p>
+    <w:p>
+      <w:pPr>
+        <w:pStyle w:val="ListBullet"/>
+      </w:pPr>
+      <w:r>
+        <w:rPr>
+          <w:rFonts w:ascii="Arial" w:hAnsi="Arial"/>
+          <w:b/>
+          <w:color w:val="000000"/>
+          <w:sz w:val="19"/>
+        </w:rPr>
+        <w:t>Australian Prudential Regulation Authority</w:t>
+      </w:r>
+      <w:r>
+        <w:rPr>
+          <w:rFonts w:ascii="Arial" w:hAnsi="Arial"/>
+          <w:color w:val="000000"/>
+          <w:sz w:val="19"/>
+        </w:rPr>
+        <w:t xml:space="preserve"> - </w:t>
+      </w:r>
+      <w:r>
+        <w:rPr>
+          <w:rFonts w:ascii="Arial" w:hAnsi="Arial"/>
+          <w:color w:val="000000"/>
+          <w:sz w:val="19"/>
+        </w:rPr>
+        <w:t>APRA and ASIC consult on FAR streamlining</w:t>
+      </w:r>
+    </w:p>
+    <w:p>
+      <w:pPr>
+        <w:pStyle w:val="ListBullet"/>
+      </w:pPr>
+      <w:r>
+        <w:rPr>
+          <w:rFonts w:ascii="Arial" w:hAnsi="Arial"/>
+          <w:b/>
+          <w:color w:val="000000"/>
+          <w:sz w:val="19"/>
+        </w:rPr>
+        <w:t>Australian Securities and Investments Commission</w:t>
+      </w:r>
+      <w:r>
+        <w:rPr>
+          <w:rFonts w:ascii="Arial" w:hAnsi="Arial"/>
+          <w:color w:val="000000"/>
+          <w:sz w:val="19"/>
+        </w:rPr>
+        <w:t xml:space="preserve"> - </w:t>
+      </w:r>
+      <w:r>
+        <w:rPr>
+          <w:rFonts w:ascii="Arial" w:hAnsi="Arial"/>
+          <w:color w:val="000000"/>
+          <w:sz w:val="19"/>
+        </w:rPr>
+        <w:t>Three super funds hit with infringement notices for misleading disclosures</w:t>
+      </w:r>
+      <w:r>
+        <w:rPr>
+          <w:rFonts w:ascii="Arial" w:hAnsi="Arial"/>
+          <w:color w:val="000000"/>
+          <w:sz w:val="19"/>
+        </w:rPr>
+        <w:t xml:space="preserve"> (</w:t>
+      </w:r>
+      <w:hyperlink r:id="rId10">
+        <w:r>
+          <w:rPr>
+            <w:rFonts w:ascii="Arial" w:hAnsi="Arial" w:cs="Arial"/>
+            <w:color w:val="0000FF"/>
+            <w:sz w:val="19"/>
+            <w:szCs w:val="19"/>
+            <w:u w:val="single"/>
+          </w:rPr>
+          <w:t xml:space="preserve">Read more</w:t>
+        </w:r>
+      </w:hyperlink>
+      <w:r>
+        <w:rPr>
+          <w:rFonts w:ascii="Arial" w:hAnsi="Arial"/>
+          <w:color w:val="000000"/>
+          <w:sz w:val="19"/>
+        </w:rPr>
+        <w:t>)</w:t>
+      </w:r>
+    </w:p>
+    <w:p>
+      <w:pPr>
+        <w:pStyle w:val="ListBullet"/>
+      </w:pPr>
+      <w:r>
+        <w:rPr>
+          <w:rFonts w:ascii="Arial" w:hAnsi="Arial"/>
+          <w:b/>
+          <w:color w:val="000000"/>
+          <w:sz w:val="19"/>
+        </w:rPr>
+        <w:t>Australian Prudential Regulation Authority</w:t>
+      </w:r>
+      <w:r>
+        <w:rPr>
+          <w:rFonts w:ascii="Arial" w:hAnsi="Arial"/>
+          <w:color w:val="000000"/>
+          <w:sz w:val="19"/>
+        </w:rPr>
+        <w:t xml:space="preserve"> - </w:t>
+      </w:r>
+      <w:r>
+        <w:rPr>
+          <w:rFonts w:ascii="Arial" w:hAnsi="Arial"/>
+          <w:color w:val="000000"/>
+          <w:sz w:val="19"/>
+        </w:rPr>
+        <w:t>APRA revises Retirement Reporting Framework after feedback</w:t>
       </w:r>
     </w:p>
     <w:p>
@@ -246,16 +468,148 @@
     </w:p>
     <w:p>
       <w:pPr>
-        <w:pStyle w:val="body_letter"/>
+        <w:pStyle w:val="ListBullet"/>
       </w:pPr>
       <w:r>
         <w:rPr>
           <w:rFonts w:ascii="Arial" w:hAnsi="Arial"/>
-          <w:i/>
-          <w:color w:val="666666"/>
+          <w:b/>
+          <w:color w:val="000000"/>
           <w:sz w:val="19"/>
         </w:rPr>
-        <w:t>No emerging risks signal this fortnight.</w:t>
+        <w:t>ASIC acts against Star Investment Group scheme</w:t>
+      </w:r>
+      <w:r>
+        <w:rPr>
+          <w:rFonts w:ascii="Arial" w:hAnsi="Arial"/>
+          <w:color w:val="000000"/>
+          <w:sz w:val="19"/>
+        </w:rPr>
+        <w:t xml:space="preserve"> - </w:t>
+      </w:r>
+      <w:r>
+        <w:rPr>
+          <w:rFonts w:ascii="Arial" w:hAnsi="Arial"/>
+          <w:color w:val="000000"/>
+          <w:sz w:val="19"/>
+        </w:rPr>
+        <w:t>ASIC has taken enforcement action to protect investors exposed to the Star Investment Group Australia scheme, signalling continued focus on unlicensed and potentially fraudulent investment activity.</w:t>
+      </w:r>
+      <w:r>
+        <w:rPr>
+          <w:rFonts w:ascii="Arial" w:hAnsi="Arial"/>
+          <w:color w:val="000000"/>
+          <w:sz w:val="19"/>
+        </w:rPr>
+        <w:t xml:space="preserve"> (</w:t>
+      </w:r>
+      <w:hyperlink r:id="rId11">
+        <w:r>
+          <w:rPr>
+            <w:rFonts w:ascii="Arial" w:hAnsi="Arial" w:cs="Arial"/>
+            <w:color w:val="0000FF"/>
+            <w:sz w:val="19"/>
+            <w:szCs w:val="19"/>
+            <w:u w:val="single"/>
+          </w:rPr>
+          <w:t xml:space="preserve">Read more</w:t>
+        </w:r>
+      </w:hyperlink>
+      <w:r>
+        <w:rPr>
+          <w:rFonts w:ascii="Arial" w:hAnsi="Arial"/>
+          <w:color w:val="000000"/>
+          <w:sz w:val="19"/>
+        </w:rPr>
+        <w:t>)</w:t>
+      </w:r>
+    </w:p>
+    <w:p>
+      <w:pPr>
+        <w:pStyle w:val="ListBullet"/>
+      </w:pPr>
+      <w:r>
+        <w:rPr>
+          <w:rFonts w:ascii="Arial" w:hAnsi="Arial"/>
+          <w:b/>
+          <w:color w:val="000000"/>
+          <w:sz w:val="19"/>
+        </w:rPr>
+        <w:t>APRA v BAB: directors and officers face heightened accountability</w:t>
+      </w:r>
+      <w:r>
+        <w:rPr>
+          <w:rFonts w:ascii="Arial" w:hAnsi="Arial"/>
+          <w:color w:val="000000"/>
+          <w:sz w:val="19"/>
+        </w:rPr>
+        <w:t xml:space="preserve"> - </w:t>
+      </w:r>
+      <w:r>
+        <w:rPr>
+          <w:rFonts w:ascii="Arial" w:hAnsi="Arial"/>
+          <w:color w:val="000000"/>
+          <w:sz w:val="19"/>
+        </w:rPr>
+        <w:t>The APRA v BAB decision has issued a wake-up call for directors and officers on personal liability exposure under prudential enforcement, raising the stakes for governance and risk oversight in…</w:t>
+      </w:r>
+      <w:r>
+        <w:rPr>
+          <w:rFonts w:ascii="Arial" w:hAnsi="Arial"/>
+          <w:color w:val="000000"/>
+          <w:sz w:val="19"/>
+        </w:rPr>
+        <w:t xml:space="preserve"> (</w:t>
+      </w:r>
+      <w:hyperlink r:id="rId12">
+        <w:r>
+          <w:rPr>
+            <w:rFonts w:ascii="Arial" w:hAnsi="Arial" w:cs="Arial"/>
+            <w:color w:val="0000FF"/>
+            <w:sz w:val="19"/>
+            <w:szCs w:val="19"/>
+            <w:u w:val="single"/>
+          </w:rPr>
+          <w:t xml:space="preserve">Read more</w:t>
+        </w:r>
+      </w:hyperlink>
+      <w:r>
+        <w:rPr>
+          <w:rFonts w:ascii="Arial" w:hAnsi="Arial"/>
+          <w:color w:val="000000"/>
+          <w:sz w:val="19"/>
+        </w:rPr>
+        <w:t>)</w:t>
+      </w:r>
+    </w:p>
+    <w:p>
+      <w:pPr>
+        <w:pStyle w:val="ListBullet"/>
+      </w:pPr>
+      <w:r>
+        <w:rPr>
+          <w:rFonts w:ascii="Arial" w:hAnsi="Arial"/>
+          <w:b/>
+          <w:color w:val="000000"/>
+          <w:sz w:val="19"/>
+        </w:rPr>
+        <w:t>ASIC issues infringement notices to three super funds over misleading disclosures</w:t>
+      </w:r>
+      <w:r>
+        <w:rPr>
+          <w:rFonts w:ascii="Arial" w:hAnsi="Arial"/>
+          <w:color w:val="000000"/>
+          <w:sz w:val="19"/>
+        </w:rPr>
+        <w:t xml:space="preserve"> - </w:t>
+      </w:r>
+      <w:r>
+        <w:rPr>
+          <w:rFonts w:ascii="Arial" w:hAnsi="Arial"/>
+          <w:color w:val="000000"/>
+          <w:sz w:val="19"/>
+        </w:rPr>
+        <w:t>ASIC has issued infringement notices to three superannuation funds for misleading investment option disclosures, reinforcing regulatory expectations around transparency in member communications.</w:t>
       </w:r>
     </w:p>
     <w:p>
@@ -274,16 +628,32 @@
     </w:p>
     <w:p>
       <w:pPr>
-        <w:pStyle w:val="body_letter"/>
+        <w:pStyle w:val="ListBullet"/>
       </w:pPr>
       <w:r>
         <w:rPr>
           <w:rFonts w:ascii="Arial" w:hAnsi="Arial"/>
-          <w:i/>
-          <w:color w:val="666666"/>
+          <w:b/>
+          <w:color w:val="000000"/>
           <w:sz w:val="19"/>
         </w:rPr>
-        <w:t>No ai adoption signal this fortnight.</w:t>
+        <w:t>Australia's 2026 privacy reforms: pivotal new changes for AI and data</w:t>
+      </w:r>
+      <w:r>
+        <w:rPr>
+          <w:rFonts w:ascii="Arial" w:hAnsi="Arial"/>
+          <w:color w:val="000000"/>
+          <w:sz w:val="19"/>
+        </w:rPr>
+        <w:t xml:space="preserve"> - </w:t>
+      </w:r>
+      <w:r>
+        <w:rPr>
+          <w:rFonts w:ascii="Arial" w:hAnsi="Arial"/>
+          <w:color w:val="000000"/>
+          <w:sz w:val="19"/>
+        </w:rPr>
+        <w:t>Australia's 2026 privacy reform package introduces significant new obligations affecting automated decision-making, data minimisation and cross-border transfers, directly shaping how AI systems must…</w:t>
       </w:r>
     </w:p>
     <w:p>
@@ -302,16 +672,150 @@
     </w:p>
     <w:p>
       <w:pPr>
-        <w:pStyle w:val="body_letter"/>
+        <w:pStyle w:val="ListBullet"/>
       </w:pPr>
       <w:r>
         <w:rPr>
           <w:rFonts w:ascii="Arial" w:hAnsi="Arial"/>
-          <w:i/>
-          <w:color w:val="666666"/>
+          <w:b/>
+          <w:color w:val="000000"/>
           <w:sz w:val="19"/>
         </w:rPr>
-        <w:t>No regulatory burden signal this fortnight.</w:t>
+        <w:t>APRA and ASIC consult on streamlining FAR administration</w:t>
+      </w:r>
+      <w:r>
+        <w:rPr>
+          <w:rFonts w:ascii="Arial" w:hAnsi="Arial"/>
+          <w:color w:val="000000"/>
+          <w:sz w:val="19"/>
+        </w:rPr>
+        <w:t xml:space="preserve"> - </w:t>
+      </w:r>
+      <w:r>
+        <w:rPr>
+          <w:rFonts w:ascii="Arial" w:hAnsi="Arial"/>
+          <w:color w:val="000000"/>
+          <w:sz w:val="19"/>
+        </w:rPr>
+        <w:t>APRA and ASIC have launched a joint consultation on simplifying Financial Accountability Regime administration, reflecting pressure to reduce compliance duplication across prudential and conduct…</w:t>
+      </w:r>
+    </w:p>
+    <w:p>
+      <w:pPr>
+        <w:pStyle w:val="ListBullet"/>
+      </w:pPr>
+      <w:r>
+        <w:rPr>
+          <w:rFonts w:ascii="Arial" w:hAnsi="Arial"/>
+          <w:b/>
+          <w:color w:val="000000"/>
+          <w:sz w:val="19"/>
+        </w:rPr>
+        <w:t>Regulatory reform omnibus bill trims CSLR levy and disallowance period</w:t>
+      </w:r>
+      <w:r>
+        <w:rPr>
+          <w:rFonts w:ascii="Arial" w:hAnsi="Arial"/>
+          <w:color w:val="000000"/>
+          <w:sz w:val="19"/>
+        </w:rPr>
+        <w:t xml:space="preserve"> - </w:t>
+      </w:r>
+      <w:r>
+        <w:rPr>
+          <w:rFonts w:ascii="Arial" w:hAnsi="Arial"/>
+          <w:color w:val="000000"/>
+          <w:sz w:val="19"/>
+        </w:rPr>
+        <w:t>Parliament has passed the regulatory reform omnibus bill, reducing the Compensation Scheme of Last Resort levy disallowance period and adjusting payout settings in a move aimed at lowering industry…</w:t>
+      </w:r>
+      <w:r>
+        <w:rPr>
+          <w:rFonts w:ascii="Arial" w:hAnsi="Arial"/>
+          <w:color w:val="000000"/>
+          <w:sz w:val="19"/>
+        </w:rPr>
+        <w:t xml:space="preserve"> (</w:t>
+      </w:r>
+      <w:hyperlink r:id="rId13">
+        <w:r>
+          <w:rPr>
+            <w:rFonts w:ascii="Arial" w:hAnsi="Arial" w:cs="Arial"/>
+            <w:color w:val="0000FF"/>
+            <w:sz w:val="19"/>
+            <w:szCs w:val="19"/>
+            <w:u w:val="single"/>
+          </w:rPr>
+          <w:t xml:space="preserve">Read more</w:t>
+        </w:r>
+      </w:hyperlink>
+      <w:r>
+        <w:rPr>
+          <w:rFonts w:ascii="Arial" w:hAnsi="Arial"/>
+          <w:color w:val="000000"/>
+          <w:sz w:val="19"/>
+        </w:rPr>
+        <w:t>)</w:t>
+      </w:r>
+    </w:p>
+    <w:p>
+      <w:pPr>
+        <w:pStyle w:val="ListBullet"/>
+      </w:pPr>
+      <w:r>
+        <w:rPr>
+          <w:rFonts w:ascii="Arial" w:hAnsi="Arial"/>
+          <w:b/>
+          <w:color w:val="000000"/>
+          <w:sz w:val="19"/>
+        </w:rPr>
+        <w:t>APRA revises Retirement Reporting Framework after stakeholder feedback</w:t>
+      </w:r>
+      <w:r>
+        <w:rPr>
+          <w:rFonts w:ascii="Arial" w:hAnsi="Arial"/>
+          <w:color w:val="000000"/>
+          <w:sz w:val="19"/>
+        </w:rPr>
+        <w:t xml:space="preserve"> - </w:t>
+      </w:r>
+      <w:r>
+        <w:rPr>
+          <w:rFonts w:ascii="Arial" w:hAnsi="Arial"/>
+          <w:color w:val="000000"/>
+          <w:sz w:val="19"/>
+        </w:rPr>
+        <w:t>APRA has revised its proposed Retirement Reporting Framework following stakeholder consultation, signalling a willingness to calibrate reporting obligations in response to industry concerns about…</w:t>
+      </w:r>
+    </w:p>
+    <w:p>
+      <w:pPr>
+        <w:pStyle w:val="ListBullet"/>
+      </w:pPr>
+      <w:r>
+        <w:rPr>
+          <w:rFonts w:ascii="Arial" w:hAnsi="Arial"/>
+          <w:b/>
+          <w:color w:val="000000"/>
+          <w:sz w:val="19"/>
+        </w:rPr>
+        <w:t>Australian Banking Association prepares industry for card surcharge removal</w:t>
+      </w:r>
+      <w:r>
+        <w:rPr>
+          <w:rFonts w:ascii="Arial" w:hAnsi="Arial"/>
+          <w:color w:val="000000"/>
+          <w:sz w:val="19"/>
+        </w:rPr>
+        <w:t xml:space="preserve"> - </w:t>
+      </w:r>
+      <w:r>
+        <w:rPr>
+          <w:rFonts w:ascii="Arial" w:hAnsi="Arial"/>
+          <w:color w:val="000000"/>
+          <w:sz w:val="19"/>
+        </w:rPr>
+        <w:t>The Australian Banking Association has published guidance preparing the sector for the mandated removal of card surcharging, a significant regulatory change affecting merchant and consumer payment…</w:t>
       </w:r>
     </w:p>
     <w:p>
@@ -363,6 +867,20 @@
       <w:r>
         <w:rPr>
           <w:rFonts w:ascii="Arial" w:hAnsi="Arial"/>
+          <w:b w:val="0"/>
+          <w:color w:val="000000"/>
+          <w:sz w:val="19"/>
+        </w:rPr>
+        <w:t>The fortnight is shaped by three converging regulator investment themes: APRA and ASIC are jointly recalibrating the Financial Accountability Regime through active consultation, compressing the window for accountability-mapping and governance-gap engagements across ADIs and insurers; the AG's Department Privacy Reform Taskforce and the sanctions framework overhaul are simultaneously in open consultation, signalling that Commonwealth agencies and regulated entities need implementation architecture support before both cycles move to legislation; and enforcement intensity is escalating across consumer markets (ACCC digiDirect $99k penalty), financial services (APRA v BAB personal liability ruling, ASIC licence cancellations), and border controls (ABF depot shutdowns in illicit tobacco), confirming regulators are in active penalty mode rather than guidance mode. Clients in the news include John Holland (Comcare Metro charges), ANU (TEQSA registration conditions), and digiDirect (ACCC misleading pricing), each carrying live regulatory exposure with assurance and advisory hooks. The merger regime's parliamentary fine-tuning and the CSLR omnibus passage add implementation complexity across advice licensees and M&amp;A-active clients that the sector has not yet absorbed. KPMG's immediate BD priority is the FAR consultation window, a time-bounded, multi-entity accountability-mapping engagement with a clear regulatory anchor and demonstrable PEPI credentials. The secondary priority is privacy and sanctions reform, where the Commonwealth is actively building implementation architecture and PEPI has established entry points across AG's Department, Home Affairs, and the defence export base.</w:t>
+      </w:r>
+    </w:p>
+    <w:p>
+      <w:pPr>
+        <w:pStyle w:val="body_letter"/>
+      </w:pPr>
+      <w:r>
+        <w:rPr>
+          <w:rFonts w:ascii="Arial" w:hAnsi="Arial"/>
           <w:b/>
           <w:color w:val="000000"/>
           <w:sz w:val="19"/>
@@ -380,7 +898,7 @@
           <w:color w:val="000000"/>
           <w:sz w:val="19"/>
         </w:rPr>
-        <w:t>Brief the relevant sector partner this fortnight on the highest-signal regulator development above.</w:t>
+        <w:t>Activate the financial services bench this week to develop a FAR accountability-mapping and compliance-gap offer timed to the APRA/ASIC consultation close, targeting the top 10 ADI and insurer clients by revenue exposure.</w:t>
       </w:r>
     </w:p>
     <w:p>
@@ -393,7 +911,7 @@
           <w:color w:val="000000"/>
           <w:sz w:val="19"/>
         </w:rPr>
-        <w:t>Convene the capability bench for the next reg-tech / capability-review pursuit in pipeline.</w:t>
+        <w:t>Brief the board governance practice on the APRA v BAB ruling and issue a client alert to insurance and ADI D&amp;O contacts within five business days, using it as the entry point for board governance framework reviews.</w:t>
       </w:r>
     </w:p>
     <w:p>
@@ -406,7 +924,112 @@
           <w:color w:val="000000"/>
           <w:sz w:val="19"/>
         </w:rPr>
-        <w:t>Pursue at least one tracked client on a near-term advisory hook before the next CoP cadence.</w:t>
+        <w:t>Secure a meeting with AG's Department Privacy Reform Taskforce leads before the consultation period closes and position KPMG as implementation architect for Commonwealth agency privacy uplift, drawing on the public sector transformation credentials cited in the IGR productivity agenda.</w:t>
+      </w:r>
+    </w:p>
+    <w:p>
+      <w:pPr>
+        <w:pStyle w:val="ListBullet"/>
+      </w:pPr>
+      <w:r>
+        <w:rPr>
+          <w:rFonts w:ascii="Arial" w:hAnsi="Arial"/>
+          <w:color w:val="000000"/>
+          <w:sz w:val="19"/>
+        </w:rPr>
+        <w:t>Develop a sanctions framework compliance rapid-assessment product targeting defence primes and tier-two suppliers ahead of the DFAT export restriction instrument taking effect, led jointly by the national security and trade advisory practices.</w:t>
+      </w:r>
+    </w:p>
+    <w:p>
+      <w:pPr>
+        <w:pStyle w:val="ListBullet"/>
+      </w:pPr>
+      <w:r>
+        <w:rPr>
+          <w:rFonts w:ascii="Arial" w:hAnsi="Arial"/>
+          <w:color w:val="000000"/>
+          <w:sz w:val="19"/>
+        </w:rPr>
+        <w:t>Pursue a board governance and risk assurance mandate at ANU following the TEQSA registration conditions, positioning it as the anchor engagement for a broader Group of Eight compliance-readiness sweep across the higher education portfolio.</w:t>
+      </w:r>
+    </w:p>
+    <w:p>
+      <w:pPr>
+        <w:pStyle w:val="body_letter"/>
+      </w:pPr>
+      <w:r>
+        <w:rPr>
+          <w:rFonts w:ascii="Arial" w:hAnsi="Arial"/>
+          <w:b/>
+          <w:color w:val="000000"/>
+          <w:sz w:val="19"/>
+        </w:rPr>
+        <w:t>Implications for clients</w:t>
+      </w:r>
+    </w:p>
+    <w:p>
+      <w:pPr>
+        <w:pStyle w:val="ListBullet"/>
+      </w:pPr>
+      <w:r>
+        <w:rPr>
+          <w:rFonts w:ascii="Arial" w:hAnsi="Arial"/>
+          <w:color w:val="000000"/>
+          <w:sz w:val="19"/>
+        </w:rPr>
+        <w:t>Activate the financial services bench this week to develop a FAR accountability-mapping and compliance-gap offer timed to the APRA/ASIC consultation close, targeting the top 10 ADI and insurer clients by revenue exposure.</w:t>
+      </w:r>
+    </w:p>
+    <w:p>
+      <w:pPr>
+        <w:pStyle w:val="ListBullet"/>
+      </w:pPr>
+      <w:r>
+        <w:rPr>
+          <w:rFonts w:ascii="Arial" w:hAnsi="Arial"/>
+          <w:color w:val="000000"/>
+          <w:sz w:val="19"/>
+        </w:rPr>
+        <w:t>Brief the board governance practice on the APRA v BAB ruling and issue a client alert to insurance and ADI D&amp;O contacts within five business days, using it as the entry point for board governance framework reviews.</w:t>
+      </w:r>
+    </w:p>
+    <w:p>
+      <w:pPr>
+        <w:pStyle w:val="ListBullet"/>
+      </w:pPr>
+      <w:r>
+        <w:rPr>
+          <w:rFonts w:ascii="Arial" w:hAnsi="Arial"/>
+          <w:color w:val="000000"/>
+          <w:sz w:val="19"/>
+        </w:rPr>
+        <w:t>Secure a meeting with AG's Department Privacy Reform Taskforce leads before the consultation period closes and position KPMG as implementation architect for Commonwealth agency privacy uplift, drawing on the public sector transformation credentials cited in the IGR productivity agenda.</w:t>
+      </w:r>
+    </w:p>
+    <w:p>
+      <w:pPr>
+        <w:pStyle w:val="ListBullet"/>
+      </w:pPr>
+      <w:r>
+        <w:rPr>
+          <w:rFonts w:ascii="Arial" w:hAnsi="Arial"/>
+          <w:color w:val="000000"/>
+          <w:sz w:val="19"/>
+        </w:rPr>
+        <w:t>Develop a sanctions framework compliance rapid-assessment product targeting defence primes and tier-two suppliers ahead of the DFAT export restriction instrument taking effect, led jointly by the national security and trade advisory practices.</w:t>
+      </w:r>
+    </w:p>
+    <w:p>
+      <w:pPr>
+        <w:pStyle w:val="ListBullet"/>
+      </w:pPr>
+      <w:r>
+        <w:rPr>
+          <w:rFonts w:ascii="Arial" w:hAnsi="Arial"/>
+          <w:color w:val="000000"/>
+          <w:sz w:val="19"/>
+        </w:rPr>
+        <w:t>Pursue a board governance and risk assurance mandate at ANU following the TEQSA registration conditions, positioning it as the anchor engagement for a broader Group of Eight compliance-readiness sweep across the higher education portfolio.</w:t>
       </w:r>
     </w:p>
     <w:p>
@@ -430,11 +1053,221 @@
       <w:r>
         <w:rPr>
           <w:rFonts w:ascii="Arial" w:hAnsi="Arial"/>
-          <w:i/>
-          <w:color w:val="666666"/>
+          <w:b/>
+          <w:color w:val="000000"/>
           <w:sz w:val="19"/>
         </w:rPr>
-        <w:t>No sector-level synthesis available this fortnight.</w:t>
+        <w:t>Public Sector</w:t>
+      </w:r>
+    </w:p>
+    <w:p>
+      <w:pPr>
+        <w:pStyle w:val="body_letter"/>
+      </w:pPr>
+      <w:r>
+        <w:rPr>
+          <w:rFonts w:ascii="Arial" w:hAnsi="Arial"/>
+          <w:b w:val="0"/>
+          <w:color w:val="000000"/>
+          <w:sz w:val="19"/>
+        </w:rPr>
+        <w:t>The Commonwealth's Intergenerational Report is framing a productivity reform agenda that will drive agency capability reviews and restructuring mandates across the forward estimates, a direct pull-through for KPMG's public sector transformation bench. The AG's Department Privacy Reform Taskforce is in active consultation, with small-business and industry bodies already on record; Commonwealth and state agencies will need implementation architecture support as reform moves to legislation. Australia's sanctions framework overhaul and the Parliament-amended merger regime represent parallel regulatory rebuilds requiring government-side program management and private-sector compliance advisory, both areas where PEPI has established credentials. The ACCC's infringement action against digiDirect on misleading pricing signals continued enforcement escalation in consumer-facing digital markets, reinforcing the regulator's appetite for substantive penalty action.</w:t>
+      </w:r>
+    </w:p>
+    <w:p>
+      <w:pPr>
+        <w:pStyle w:val="body_letter"/>
+      </w:pPr>
+      <w:r>
+        <w:rPr>
+          <w:rFonts w:ascii="Arial" w:hAnsi="Arial"/>
+          <w:b/>
+          <w:color w:val="000000"/>
+          <w:sz w:val="19"/>
+        </w:rPr>
+        <w:t>Financial Services</w:t>
+      </w:r>
+    </w:p>
+    <w:p>
+      <w:pPr>
+        <w:pStyle w:val="body_letter"/>
+      </w:pPr>
+      <w:r>
+        <w:rPr>
+          <w:rFonts w:ascii="Arial" w:hAnsi="Arial"/>
+          <w:b w:val="0"/>
+          <w:color w:val="000000"/>
+          <w:sz w:val="19"/>
+        </w:rPr>
+        <w:t>APRA and ASIC have simultaneously opened consultation on streamlining Financial Accountability Regime (FAR) administration, signalling a coordinated capability and governance uplift cycle across regulated entities that creates near-term demand for accountability-mapping and compliance-gap advisory. The APRA v BAB enforcement action has materially elevated D&amp;O personal liability exposure, prompting board-level reassessment of governance frameworks and internal accountability structures across ADIs and insurers. Passage of the regulatory reform omnibus bill, trimming the CSLR levy disallowance period and capping payouts, adds implementation complexity for advice licensees navigating the concurrent Future of Advice licensing debate, where FSC motivations are now under direct Treasury scrutiny. Taken together, the fortnight's signals point to a sector under simultaneous enforcement pressure, structural reform, and accountability regime recalibration, a combination that historically drives multi-engagement advisory pipelines.</w:t>
+      </w:r>
+    </w:p>
+    <w:p>
+      <w:pPr>
+        <w:pStyle w:val="body_letter"/>
+      </w:pPr>
+      <w:r>
+        <w:rPr>
+          <w:rFonts w:ascii="Arial" w:hAnsi="Arial"/>
+          <w:b/>
+          <w:color w:val="000000"/>
+          <w:sz w:val="19"/>
+        </w:rPr>
+        <w:t>Health, Ageing &amp; Human Services</w:t>
+      </w:r>
+    </w:p>
+    <w:p>
+      <w:pPr>
+        <w:pStyle w:val="body_letter"/>
+      </w:pPr>
+      <w:r>
+        <w:rPr>
+          <w:rFonts w:ascii="Arial" w:hAnsi="Arial"/>
+          <w:b w:val="0"/>
+          <w:color w:val="000000"/>
+          <w:sz w:val="19"/>
+        </w:rPr>
+        <w:t>The NDIS Quality and Safeguards Commission's mandatory registration expansion represents the single largest near-term compliance obligation shift for disability providers since scheme inception, creating immediate demand for registration readiness, gap analysis, and governance uplift advisory. The Aged Care Quality and Safety Commission's enforcement action requiring refunds on Higher Everyday Living Fees signals active fee-framework scrutiny, putting provider financial governance and consumer-rights controls directly in scope for assurance engagements. Ahpra is simultaneously running a prescribing-standards enforcement cycle, peptides, off-label, and compounded medicines, alongside a practitioner codes of conduct consultation and a new IPCP accreditation framework, indicating a sustained regulatory uplift period across the health workforce that generates L&amp;D, policy, and compliance advisory demand. KPMG's health and human services practice has concurrent entry points across all three regulators with differentiated offerings spanning compliance readiness, financial governance, and workforce capability.</w:t>
+      </w:r>
+    </w:p>
+    <w:p>
+      <w:pPr>
+        <w:pStyle w:val="body_letter"/>
+      </w:pPr>
+      <w:r>
+        <w:rPr>
+          <w:rFonts w:ascii="Arial" w:hAnsi="Arial"/>
+          <w:b/>
+          <w:color w:val="000000"/>
+          <w:sz w:val="19"/>
+        </w:rPr>
+        <w:t>Energy, Mining &amp; Property</w:t>
+      </w:r>
+    </w:p>
+    <w:p>
+      <w:pPr>
+        <w:pStyle w:val="body_letter"/>
+      </w:pPr>
+      <w:r>
+        <w:rPr>
+          <w:rFonts w:ascii="Arial" w:hAnsi="Arial"/>
+          <w:b w:val="0"/>
+          <w:color w:val="000000"/>
+          <w:sz w:val="19"/>
+        </w:rPr>
+        <w:t>Energy ministers have put electricity market reforms on an express track, compressing the window for industry and advisory input into network and market design changes that are self-described as 'incredibly ambitious', a signal that regulators will need rapid capability uplift and that KPMG's energy transition bench has a narrow but high-value submission window. Concurrently, the AER has opened consultation on draft DMO guidelines, and the governance question of who regulates rooftop solar, plug-in batteries and EVs remains unresolved between Commonwealth and state bodies, creating a structural advisory gap in distributed energy resource (DER) policy design. ESC Victoria has taken enforcement action against two VEU-accredited parties (Royal One suspension; MYOM certificate surrender), reinforcing that Victoria's energy efficiency scheme is in active compliance enforcement mode and that scheme participants face real accreditation risk. The ESC has also released water price submission guidance, opening a regulatory economics engagement for water businesses preparing periodic pricing proposals.</w:t>
+      </w:r>
+    </w:p>
+    <w:p>
+      <w:pPr>
+        <w:pStyle w:val="body_letter"/>
+      </w:pPr>
+      <w:r>
+        <w:rPr>
+          <w:rFonts w:ascii="Arial" w:hAnsi="Arial"/>
+          <w:b/>
+          <w:color w:val="000000"/>
+          <w:sz w:val="19"/>
+        </w:rPr>
+        <w:t>National Security &amp; Justice</w:t>
+      </w:r>
+    </w:p>
+    <w:p>
+      <w:pPr>
+        <w:pStyle w:val="body_letter"/>
+      </w:pPr>
+      <w:r>
+        <w:rPr>
+          <w:rFonts w:ascii="Arial" w:hAnsi="Arial"/>
+          <w:b w:val="0"/>
+          <w:color w:val="000000"/>
+          <w:sz w:val="19"/>
+        </w:rPr>
+        <w:t>The fortnight is defined by three converging enforcement-to-legislation cycles that signal significant advisory demand: illicit tobacco enforcement is scaling to new legislative powers (ABF depot shutdowns, Labor modelling excise cuts, Police and Customs gaining new enforcement tools), creating implementation and change-management pull-through across Border Force and state police; the ACIC has lodged a submission to the PJCIS signalling an active intelligence-capability review with likely gaps in data-sharing, technology, and workforce that KPMG can position against; and the eSafety Commissioner's first empirical report on the social-media minimum-age regime confirms the regulation is entering an implementation stress-test phase, with the August 2026 symposium indicating eSafety is actively seeking external expertise on monitoring and enforcement architecture. AUSTRAC's professional designated-services expansion and the AFP's joint-agency corrupt-conduct charge (APS employee) reinforce a broader integrity and AML/CTF compliance uplift cycle across Commonwealth agencies.</w:t>
+      </w:r>
+    </w:p>
+    <w:p>
+      <w:pPr>
+        <w:pStyle w:val="body_letter"/>
+      </w:pPr>
+      <w:r>
+        <w:rPr>
+          <w:rFonts w:ascii="Arial" w:hAnsi="Arial"/>
+          <w:b/>
+          <w:color w:val="000000"/>
+          <w:sz w:val="19"/>
+        </w:rPr>
+        <w:t>Defence</w:t>
+      </w:r>
+    </w:p>
+    <w:p>
+      <w:pPr>
+        <w:pStyle w:val="body_letter"/>
+      </w:pPr>
+      <w:r>
+        <w:rPr>
+          <w:rFonts w:ascii="Arial" w:hAnsi="Arial"/>
+          <w:b w:val="0"/>
+          <w:color w:val="000000"/>
+          <w:sz w:val="19"/>
+        </w:rPr>
+        <w:t>The appointment of a designer for Australia's nuclear-powered submarine dry dock marks the most significant AUKUS programme milestone to date, confirming sustained Commonwealth capital commitment to sovereign naval infrastructure and creating near-term demand for programme assurance, procurement advisory, and workforce capability uplift across the industrial base. Proposed DFAT restrictions on military exports linked to human rights risks signal a tightening of the export control framework, driving compliance-uplift demand across defence primes and tier-two suppliers that lack mature trade controls programs. The disappearance of classified F-35 components in Hong Kong exposes material gaps in supply chain governance and security-cleared asset management, directly reinforcing a supply chain risk and assurance pitch to Defence and its prime contractors. A high-profile contract termination after 26 years signals Defence's appetite to exit entrenched arrangements, opening transition advisory and lessons-learned mandates ahead of the next procurement cycle.</w:t>
+      </w:r>
+    </w:p>
+    <w:p>
+      <w:pPr>
+        <w:pStyle w:val="body_letter"/>
+      </w:pPr>
+      <w:r>
+        <w:rPr>
+          <w:rFonts w:ascii="Arial" w:hAnsi="Arial"/>
+          <w:b/>
+          <w:color w:val="000000"/>
+          <w:sz w:val="19"/>
+        </w:rPr>
+        <w:t>Transport</w:t>
+      </w:r>
+    </w:p>
+    <w:p>
+      <w:pPr>
+        <w:pStyle w:val="body_letter"/>
+      </w:pPr>
+      <w:r>
+        <w:rPr>
+          <w:rFonts w:ascii="Arial" w:hAnsi="Arial"/>
+          <w:b w:val="0"/>
+          <w:color w:val="000000"/>
+          <w:sz w:val="19"/>
+        </w:rPr>
+        <w:t>Airservices Australia's 2026-27 Corporate Plan signals a planned investment cycle in safe, efficient and environmentally responsible service delivery, a direct entry point for strategy, digital transformation and sustainability advisory. CASA is simultaneously moving through multiple reform streams: Part 138 aerial work digitised via myCASA, annual VH registration consultation closed, and Class 5 medicals confirmed unchanged, each a discrete regulatory-change project requiring implementation support across the aviation operator base. On surface transport, Victoria's open consultation on heavy vehicle driver licensing reform creates a near-term policy advisory window, while two enforcement actions (national heavy vehicle blitz and SA operator groundings) underscore a hardened compliance environment that sharpens operator demand for risk and assurance work. The rail skills portability initiative across jurisdictions adds a workforce-capability thread with clear L&amp;D and change-management pull-through for the broader transport sector.</w:t>
+      </w:r>
+    </w:p>
+    <w:p>
+      <w:pPr>
+        <w:pStyle w:val="body_letter"/>
+      </w:pPr>
+      <w:r>
+        <w:rPr>
+          <w:rFonts w:ascii="Arial" w:hAnsi="Arial"/>
+          <w:b/>
+          <w:color w:val="000000"/>
+          <w:sz w:val="19"/>
+        </w:rPr>
+        <w:t>Education</w:t>
+      </w:r>
+    </w:p>
+    <w:p>
+      <w:pPr>
+        <w:pStyle w:val="body_letter"/>
+      </w:pPr>
+      <w:r>
+        <w:rPr>
+          <w:rFonts w:ascii="Arial" w:hAnsi="Arial"/>
+          <w:b w:val="0"/>
+          <w:color w:val="000000"/>
+          <w:sz w:val="19"/>
+        </w:rPr>
+        <w:t>TEQSA has materially escalated its enforcement posture this fortnight, imposing registration conditions on ANU following governance failures and concluding compliance actions against at least two private higher education providers (OneGlobe and Opulence Institutes), alongside a Bachelor of IT course-level decision, signalling a sector-wide compliance sweep rather than isolated incidents. The ANU intervention is TEQSA's most significant action against a Group of Eight institution in recent memory and creates a live pursuit lead for board governance review, risk assurance, and executive capability advisory. Concurrent Commonwealth investment through Free TAFE sustains demand for workforce strategy and program design advisory across the VET sector. The Coalition's flagged curriculum reform agenda adds a policy-risk dimension that clients across the sector will need to navigate regardless of electoral timing.</w:t>
       </w:r>
     </w:p>
     <w:p>
@@ -458,11 +1291,249 @@
       <w:r>
         <w:rPr>
           <w:rFonts w:ascii="Arial" w:hAnsi="Arial"/>
-          <w:i/>
-          <w:color w:val="666666"/>
+          <w:b/>
+          <w:color w:val="000000"/>
           <w:sz w:val="19"/>
         </w:rPr>
-        <w:t>No jurisdiction-level synthesis available this fortnight.</w:t>
+        <w:t>Commonwealth</w:t>
+      </w:r>
+    </w:p>
+    <w:p>
+      <w:pPr>
+        <w:pStyle w:val="body_letter"/>
+      </w:pPr>
+      <w:r>
+        <w:rPr>
+          <w:rFonts w:ascii="Arial" w:hAnsi="Arial"/>
+          <w:b w:val="0"/>
+          <w:color w:val="000000"/>
+          <w:sz w:val="19"/>
+        </w:rPr>
+        <w:t>The Commonwealth regulatory environment is under simultaneous reform pressure across digital, privacy, and financial services. The digital duty of care exposure draft, attracting analysis from multiple major law firms, imposes significant new compliance obligations on online platforms and AI services, creating immediate advisory demand for affected industries. The draft Privacy Act amendments compound compliance complexity for data-handling businesses, while Comcare has publicly committed to a tougher enforcement posture across federal agencies, signalling elevated workplace psychosocial and safety risk for Commonwealth entities. In financial services, the regulatory reform omnibus bill has passed with amended CSLR levy disallowance provisions, and government has rejected Senate Committee recommendations for major ASIC structural changes, narrowing the reform window for that sector.</w:t>
+      </w:r>
+    </w:p>
+    <w:p>
+      <w:pPr>
+        <w:pStyle w:val="body_letter"/>
+      </w:pPr>
+      <w:r>
+        <w:rPr>
+          <w:rFonts w:ascii="Arial" w:hAnsi="Arial"/>
+          <w:b/>
+          <w:color w:val="000000"/>
+          <w:sz w:val="19"/>
+        </w:rPr>
+        <w:t>New South Wales</w:t>
+      </w:r>
+    </w:p>
+    <w:p>
+      <w:pPr>
+        <w:pStyle w:val="body_letter"/>
+      </w:pPr>
+      <w:r>
+        <w:rPr>
+          <w:rFonts w:ascii="Arial" w:hAnsi="Arial"/>
+          <w:b w:val="0"/>
+          <w:color w:val="000000"/>
+          <w:sz w:val="19"/>
+        </w:rPr>
+        <w:t>NSW Parliament has passed multiple significant pieces of legislation this period: new organised crime disruption and enforcement laws (articles 6 and 10), medicinal cannabis driving reforms, and Crown land reforms, collectively expanding regulatory obligations and agency powers across criminal justice, transport, and property sectors. SafeWork NSW has issued formal psychosocial risk notices to the Moree Plains region, signalling an enforcement priority shift toward psychological safety in workplaces, while a property developer (Bathla) has been exposed to 300 safety breaches prior to collapse, heightening building compliance scrutiny. The NSW Government is intensifying ECEC compliance oversight and has commenced a strategic forestry assessment, with a floodplain watchdog admission adding pressure for environmental regulatory action. Advisory opportunities are immediate across criminal compliance, property development due diligence, workplace psychosocial risk, early childhood education, and environmental and forestry regulation.</w:t>
+      </w:r>
+    </w:p>
+    <w:p>
+      <w:pPr>
+        <w:pStyle w:val="body_letter"/>
+      </w:pPr>
+      <w:r>
+        <w:rPr>
+          <w:rFonts w:ascii="Arial" w:hAnsi="Arial"/>
+          <w:b/>
+          <w:color w:val="000000"/>
+          <w:sz w:val="19"/>
+        </w:rPr>
+        <w:t>Victoria</w:t>
+      </w:r>
+    </w:p>
+    <w:p>
+      <w:pPr>
+        <w:pStyle w:val="body_letter"/>
+      </w:pPr>
+      <w:r>
+        <w:rPr>
+          <w:rFonts w:ascii="Arial" w:hAnsi="Arial"/>
+          <w:b w:val="0"/>
+          <w:color w:val="000000"/>
+          <w:sz w:val="19"/>
+        </w:rPr>
+        <w:t>IBAC has issued a damning assessment of a decade of integrity erosion in Victoria, coinciding with a corruption conviction of senior rail officials over contract fraud, signalling heightened anti-corruption enforcement and governance reform pressure across Victorian public sector clients. Victoria is simultaneously advancing multiple regulatory frameworks: new retirement village laws, multicultural/multifaith governance reforms, and a landmark prefabrication registration regime with attached penalties for the building sector. Environmental and tenancy enforcement is intensifying, with EPA Victoria conducting snap compliance blitzes on waste operators, a parliamentary inquiry recommending stronger oversight of waste-to-energy projects, and the rental taskforce being made permanent with expanded landlord crackdown powers. Advisory opportunities span public sector integrity uplift, building industry compliance (prefab registration), property management, environmental licensing, and electoral compliance given new VEC authorisation guidance.</w:t>
+      </w:r>
+    </w:p>
+    <w:p>
+      <w:pPr>
+        <w:pStyle w:val="body_letter"/>
+      </w:pPr>
+      <w:r>
+        <w:rPr>
+          <w:rFonts w:ascii="Arial" w:hAnsi="Arial"/>
+          <w:b/>
+          <w:color w:val="000000"/>
+          <w:sz w:val="19"/>
+        </w:rPr>
+        <w:t>Queensland</w:t>
+      </w:r>
+    </w:p>
+    <w:p>
+      <w:pPr>
+        <w:pStyle w:val="body_letter"/>
+      </w:pPr>
+      <w:r>
+        <w:rPr>
+          <w:rFonts w:ascii="Arial" w:hAnsi="Arial"/>
+          <w:b w:val="0"/>
+          <w:color w:val="000000"/>
+          <w:sz w:val="19"/>
+        </w:rPr>
+        <w:t>Queensland's regulatory environment is seeing significant enforcement recalibration and legislative activity across multiple sectors. The QBCC has released a 2026-2030 enforcement strategy consolidating its focus to eight priority harms, replacing the prior fifteen-point framework and signalling a sharper, more targeted approach to construction sector compliance advisory. Queensland's workplace safety regulator has reopened its inquiry into The Star Brisbane following a worker's death, compounding existing compliance carnage at the casino as leaked recordings expose executive hostility toward regulators and internal governance failures, presenting material advisory opportunity around casino compliance remediation. Concurrently, the Queensland Government has enacted mining legislative reforms welcomed by industry, updated the Education and Care Services Regulation 2026 with strengthened requirements, and is consulting on bail law reform, while childcare enforcement actions and a new Ombudsman appointment reinforce multi-sector regulatory oversight pressure.</w:t>
+      </w:r>
+    </w:p>
+    <w:p>
+      <w:pPr>
+        <w:pStyle w:val="body_letter"/>
+      </w:pPr>
+      <w:r>
+        <w:rPr>
+          <w:rFonts w:ascii="Arial" w:hAnsi="Arial"/>
+          <w:b/>
+          <w:color w:val="000000"/>
+          <w:sz w:val="19"/>
+        </w:rPr>
+        <w:t>Western Australia</w:t>
+      </w:r>
+    </w:p>
+    <w:p>
+      <w:pPr>
+        <w:pStyle w:val="body_letter"/>
+      </w:pPr>
+      <w:r>
+        <w:rPr>
+          <w:rFonts w:ascii="Arial" w:hAnsi="Arial"/>
+          <w:b w:val="0"/>
+          <w:color w:val="000000"/>
+          <w:sz w:val="19"/>
+        </w:rPr>
+        <w:t>WA has issued its first infringement notice under the short-stay accommodation laws, signalling active enforcement of a recently enacted framework and flagging immediate compliance obligations for property operators and platforms. The state government has launched an Alternative Electricity Services (AES) framework, creating new licensing and compliance obligations for non-traditional electricity providers that warrants close monitoring by energy sector clients. The WA Government is appealing the Yindjibarndi native title ruling, which carries material implications for resources sector land access approvals and project timelines. Local government electoral reforms are also advancing, adding to a busy WA legislative agenda with downstream compliance obligations for councils and industry stakeholders.</w:t>
+      </w:r>
+    </w:p>
+    <w:p>
+      <w:pPr>
+        <w:pStyle w:val="body_letter"/>
+      </w:pPr>
+      <w:r>
+        <w:rPr>
+          <w:rFonts w:ascii="Arial" w:hAnsi="Arial"/>
+          <w:b/>
+          <w:color w:val="000000"/>
+          <w:sz w:val="19"/>
+        </w:rPr>
+        <w:t>South Australia</w:t>
+      </w:r>
+    </w:p>
+    <w:p>
+      <w:pPr>
+        <w:pStyle w:val="body_letter"/>
+      </w:pPr>
+      <w:r>
+        <w:rPr>
+          <w:rFonts w:ascii="Arial" w:hAnsi="Arial"/>
+          <w:b w:val="0"/>
+          <w:color w:val="000000"/>
+          <w:sz w:val="19"/>
+        </w:rPr>
+        <w:t>SafeWork SA is pursuing active prosecutions on two separate fronts, charges following a fatal outback plane crash and against a juice manufacturer after a workplace ceiling collapse, signalling sustained WHS enforcement intensity that warrants client risk reviews across aviation, food manufacturing and site-safety sectors. SA Police and transport authorities conducted a coordinated heavy vehicle safety blitz intercepting 203 vehicles and grounding a road train, with a separate SA operator simultaneously facing groundings for alleged major safety defects, indicating heightened transport compliance scrutiny. SA Consumer and Business Services has commenced a crackdown on alleged misuse of housing contract sunset clauses, creating immediate advisory demand for property developers and conveyancers operating in the state. SA has formally committed to a domestic violence royal commission five-year implementation plan accompanied by new alcohol delivery restrictions, opening compliance and policy advisory opportunities across the hospitality, retail liquor and community services sectors.</w:t>
+      </w:r>
+    </w:p>
+    <w:p>
+      <w:pPr>
+        <w:pStyle w:val="body_letter"/>
+      </w:pPr>
+      <w:r>
+        <w:rPr>
+          <w:rFonts w:ascii="Arial" w:hAnsi="Arial"/>
+          <w:b/>
+          <w:color w:val="000000"/>
+          <w:sz w:val="19"/>
+        </w:rPr>
+        <w:t>Tasmania</w:t>
+      </w:r>
+    </w:p>
+    <w:p>
+      <w:pPr>
+        <w:pStyle w:val="body_letter"/>
+      </w:pPr>
+      <w:r>
+        <w:rPr>
+          <w:rFonts w:ascii="Arial" w:hAnsi="Arial"/>
+          <w:b w:val="0"/>
+          <w:color w:val="000000"/>
+          <w:sz w:val="19"/>
+        </w:rPr>
+        <w:t>Tasmania's parliament has passed the Residential Parks Bill and charitable red tape reduction legislation, while advancing climate reforms and Commission of Inquiry procedural amendments, creating compliance uplift opportunities for operators in the parks, charity, and environmental sectors. A Legislative Council inquiry into the abandoned cashless pokies card has commenced alongside mounting scrutiny of pokies losses ($18.1M), signalling renewed gambling regulation risk for hospitality and gaming clients. The state government's deferral of gun law reform and offloading of Safe Farming Tasmania reflect broader machinery-of-government shifts, while a review of Forest Practices investigations following farmer protests points to potential recalibration of primary industries enforcement. Hobart council's public rejection of the new planning portal as 'unfit for purpose' flags implementation risk in the state's planning reform agenda.</w:t>
+      </w:r>
+    </w:p>
+    <w:p>
+      <w:pPr>
+        <w:pStyle w:val="body_letter"/>
+      </w:pPr>
+      <w:r>
+        <w:rPr>
+          <w:rFonts w:ascii="Arial" w:hAnsi="Arial"/>
+          <w:b/>
+          <w:color w:val="000000"/>
+          <w:sz w:val="19"/>
+        </w:rPr>
+        <w:t>Australian Capital Territory</w:t>
+      </w:r>
+    </w:p>
+    <w:p>
+      <w:pPr>
+        <w:pStyle w:val="body_letter"/>
+      </w:pPr>
+      <w:r>
+        <w:rPr>
+          <w:rFonts w:ascii="Arial" w:hAnsi="Arial"/>
+          <w:b w:val="0"/>
+          <w:color w:val="000000"/>
+          <w:sz w:val="19"/>
+        </w:rPr>
+        <w:t>The ACT Government has announced significant gaming reforms, including proposed cashless gaming requirements and a reduction in poker machines, signalling a major compliance and licensing overhaul for gaming operators in the territory. Access Canberra drew scrutiny after cancelling 19-year-old traffic infringement notices, raising questions about enforcement integrity and administrative process governance. A broader AI-related traffic camera error affecting thousands of Australian drivers has put AI-assisted enforcement tools under regulatory pressure, with implications for ACT's own enforcement systems. These developments, alongside ACT bail reform being advanced without supporting data, point to heightened legislative activity and administrative accountability risks across the territory.</w:t>
+      </w:r>
+    </w:p>
+    <w:p>
+      <w:pPr>
+        <w:pStyle w:val="body_letter"/>
+      </w:pPr>
+      <w:r>
+        <w:rPr>
+          <w:rFonts w:ascii="Arial" w:hAnsi="Arial"/>
+          <w:b/>
+          <w:color w:val="000000"/>
+          <w:sz w:val="19"/>
+        </w:rPr>
+        <w:t>Northern Territory</w:t>
+      </w:r>
+    </w:p>
+    <w:p>
+      <w:pPr>
+        <w:pStyle w:val="body_letter"/>
+      </w:pPr>
+      <w:r>
+        <w:rPr>
+          <w:rFonts w:ascii="Arial" w:hAnsi="Arial"/>
+          <w:b w:val="0"/>
+          <w:color w:val="000000"/>
+          <w:sz w:val="19"/>
+        </w:rPr>
+        <w:t>The NT regulatory landscape is dominated by enforcement action against Inpex over emissions under-reporting at the Ichthys LNG facility, with prosecution now underway and the NT EPA simultaneously recommending tighter pollution controls for both Inpex and Santos at Darwin LNG plants, a clear signal of escalating environmental compliance expectations across the NT resources sector. NT harbour oversight has also tightened, with Ichthys LNG facing separate court proceedings on maritime compliance. On governance, the NT government has declined to investigate CDU and Batchelor Institute amid ongoing scandals, substituting KPI frameworks instead, an advisory opportunity around tertiary sector accountability structures. The national commissioner's public criticism of NT child protection changes adds federal-territory tension to the welfare compliance space.</w:t>
       </w:r>
     </w:p>
     <w:tbl>
@@ -508,7 +1579,7 @@
                           <pic:cNvPicPr/>
                         </pic:nvPicPr>
                         <pic:blipFill>
-                          <a:blip r:embed="rId10"/>
+                          <a:blip r:embed="rId14"/>
                           <a:stretch>
                             <a:fillRect/>
                           </a:stretch>

</xml_diff>

<commit_message>
chore: update regulation hub 2026-10-01
</commit_message>
<xml_diff>
--- a/reg-hub/regulation_fortnightly_brief.docx
+++ b/reg-hub/regulation_fortnightly_brief.docx
@@ -46,7 +46,7 @@
         <w:pStyle w:val="Heading1"/>
       </w:pPr>
       <w:r>
-        <w:t>KPMG Regulatory Transformation Fortnightly Brief - 8-21 September 2026</w:t>
+        <w:t>KPMG Regulatory Transformation Fortnightly Brief - 19 September - 2 October 2026</w:t>
       </w:r>
     </w:p>
     <w:p>
@@ -73,7 +73,7 @@
           <w:color w:val="666666"/>
           <w:sz w:val="19"/>
         </w:rPr>
-        <w:t>21 September 2026</w:t>
+        <w:t>02 October 2026</w:t>
       </w:r>
     </w:p>
     <w:p>
@@ -97,11 +97,11 @@
       <w:r>
         <w:rPr>
           <w:rFonts w:ascii="Arial" w:hAnsi="Arial"/>
-          <w:b w:val="0"/>
-          <w:color w:val="000000"/>
+          <w:i/>
+          <w:color w:val="666666"/>
           <w:sz w:val="19"/>
         </w:rPr>
-        <w:t>This fortnight Australian regulators are pressing on multiple fronts simultaneously: ASIC is advancing enforcement action and consulting on register access, APRA is sharpening director and officer accountability expectations following the BAB decision, privacy reform amendments are reshaping compliance obligations, and the regulatory omnibus bill is trimming the CSLR levy disallowance window, all while card surcharging removal and gas market reform add cross-sector compliance pressure. The APRA v BAB decision is the standout advisory moment because it resets the personal liability benchmark for directors and officers across the financial services portfolio and creates an immediate, concrete reason for boards to seek independent assurance on their governance frameworks. Brief our financial services and insurance sector leads this week on the BAB implications and pursue conversations with audit and board advisory clients who need to reassess their D and O governance posture before the decision embeds as market standard.</w:t>
+        <w:t>[edit before send], Adam's 3-sentence key messages will prefill from the dashboard synthesis on the next fortnightly run. Type your replacement here.</w:t>
       </w:r>
     </w:p>
     <w:p>
@@ -153,233 +153,11 @@
       <w:r>
         <w:rPr>
           <w:rFonts w:ascii="Arial" w:hAnsi="Arial"/>
-          <w:b/>
-          <w:color w:val="000000"/>
+          <w:i/>
+          <w:color w:val="666666"/>
           <w:sz w:val="19"/>
         </w:rPr>
-        <w:t>Victoria</w:t>
-      </w:r>
-    </w:p>
-    <w:p>
-      <w:pPr>
-        <w:pStyle w:val="ListBullet"/>
-      </w:pPr>
-      <w:r>
-        <w:rPr>
-          <w:rFonts w:ascii="Arial" w:hAnsi="Arial"/>
-          <w:b/>
-          <w:color w:val="000000"/>
-          <w:sz w:val="19"/>
-        </w:rPr>
-        <w:t>Independent Broad-based Anti-corruption Commission</w:t>
-      </w:r>
-      <w:r>
-        <w:rPr>
-          <w:rFonts w:ascii="Arial" w:hAnsi="Arial"/>
-          <w:color w:val="000000"/>
-          <w:sz w:val="19"/>
-        </w:rPr>
-        <w:t xml:space="preserve"> - </w:t>
-      </w:r>
-      <w:r>
-        <w:rPr>
-          <w:rFonts w:ascii="Arial" w:hAnsi="Arial"/>
-          <w:color w:val="000000"/>
-          <w:sz w:val="19"/>
-        </w:rPr>
-        <w:t>AFR: decade of integrity erosion in Victoria</w:t>
-      </w:r>
-    </w:p>
-    <w:p>
-      <w:pPr>
-        <w:pStyle w:val="ListBullet"/>
-      </w:pPr>
-      <w:r>
-        <w:rPr>
-          <w:rFonts w:ascii="Arial" w:hAnsi="Arial"/>
-          <w:b/>
-          <w:color w:val="000000"/>
-          <w:sz w:val="19"/>
-        </w:rPr>
-        <w:t>Essential Services Commission</w:t>
-      </w:r>
-      <w:r>
-        <w:rPr>
-          <w:rFonts w:ascii="Arial" w:hAnsi="Arial"/>
-          <w:color w:val="000000"/>
-          <w:sz w:val="19"/>
-        </w:rPr>
-        <w:t xml:space="preserve"> - </w:t>
-      </w:r>
-      <w:r>
-        <w:rPr>
-          <w:rFonts w:ascii="Arial" w:hAnsi="Arial"/>
-          <w:color w:val="000000"/>
-          <w:sz w:val="19"/>
-        </w:rPr>
-        <w:t>New life support customer protections gazetted</w:t>
-      </w:r>
-    </w:p>
-    <w:p>
-      <w:pPr>
-        <w:pStyle w:val="ListBullet"/>
-      </w:pPr>
-      <w:r>
-        <w:rPr>
-          <w:rFonts w:ascii="Arial" w:hAnsi="Arial"/>
-          <w:b/>
-          <w:color w:val="000000"/>
-          <w:sz w:val="19"/>
-        </w:rPr>
-        <w:t>Essential Services Commission</w:t>
-      </w:r>
-      <w:r>
-        <w:rPr>
-          <w:rFonts w:ascii="Arial" w:hAnsi="Arial"/>
-          <w:color w:val="000000"/>
-          <w:sz w:val="19"/>
-        </w:rPr>
-        <w:t xml:space="preserve"> - </w:t>
-      </w:r>
-      <w:r>
-        <w:rPr>
-          <w:rFonts w:ascii="Arial" w:hAnsi="Arial"/>
-          <w:color w:val="000000"/>
-          <w:sz w:val="19"/>
-        </w:rPr>
-        <w:t>Water price submission guidance released</w:t>
-      </w:r>
-    </w:p>
-    <w:p>
-      <w:pPr>
-        <w:pStyle w:val="body_letter"/>
-      </w:pPr>
-      <w:r>
-        <w:rPr>
-          <w:rFonts w:ascii="Arial" w:hAnsi="Arial"/>
-          <w:b/>
-          <w:color w:val="000000"/>
-          <w:sz w:val="19"/>
-        </w:rPr>
-        <w:t>Commonwealth</w:t>
-      </w:r>
-    </w:p>
-    <w:p>
-      <w:pPr>
-        <w:pStyle w:val="ListBullet"/>
-      </w:pPr>
-      <w:r>
-        <w:rPr>
-          <w:rFonts w:ascii="Arial" w:hAnsi="Arial"/>
-          <w:b/>
-          <w:color w:val="000000"/>
-          <w:sz w:val="19"/>
-        </w:rPr>
-        <w:t>Australian Prudential Regulation Authority</w:t>
-      </w:r>
-      <w:r>
-        <w:rPr>
-          <w:rFonts w:ascii="Arial" w:hAnsi="Arial"/>
-          <w:color w:val="000000"/>
-          <w:sz w:val="19"/>
-        </w:rPr>
-        <w:t xml:space="preserve"> - </w:t>
-      </w:r>
-      <w:r>
-        <w:rPr>
-          <w:rFonts w:ascii="Arial" w:hAnsi="Arial"/>
-          <w:color w:val="000000"/>
-          <w:sz w:val="19"/>
-        </w:rPr>
-        <w:t>APRA and ASIC consult on FAR streamlining</w:t>
-      </w:r>
-    </w:p>
-    <w:p>
-      <w:pPr>
-        <w:pStyle w:val="ListBullet"/>
-      </w:pPr>
-      <w:r>
-        <w:rPr>
-          <w:rFonts w:ascii="Arial" w:hAnsi="Arial"/>
-          <w:b/>
-          <w:color w:val="000000"/>
-          <w:sz w:val="19"/>
-        </w:rPr>
-        <w:t>Australian Securities and Investments Commission</w:t>
-      </w:r>
-      <w:r>
-        <w:rPr>
-          <w:rFonts w:ascii="Arial" w:hAnsi="Arial"/>
-          <w:color w:val="000000"/>
-          <w:sz w:val="19"/>
-        </w:rPr>
-        <w:t xml:space="preserve"> - </w:t>
-      </w:r>
-      <w:r>
-        <w:rPr>
-          <w:rFonts w:ascii="Arial" w:hAnsi="Arial"/>
-          <w:color w:val="000000"/>
-          <w:sz w:val="19"/>
-        </w:rPr>
-        <w:t>Three super funds hit with infringement notices for misleading disclosures</w:t>
-      </w:r>
-      <w:r>
-        <w:rPr>
-          <w:rFonts w:ascii="Arial" w:hAnsi="Arial"/>
-          <w:color w:val="000000"/>
-          <w:sz w:val="19"/>
-        </w:rPr>
-        <w:t xml:space="preserve"> (</w:t>
-      </w:r>
-      <w:hyperlink r:id="rId10">
-        <w:r>
-          <w:rPr>
-            <w:rFonts w:ascii="Arial" w:hAnsi="Arial" w:cs="Arial"/>
-            <w:color w:val="0000FF"/>
-            <w:sz w:val="19"/>
-            <w:szCs w:val="19"/>
-            <w:u w:val="single"/>
-          </w:rPr>
-          <w:t xml:space="preserve">Read more</w:t>
-        </w:r>
-      </w:hyperlink>
-      <w:r>
-        <w:rPr>
-          <w:rFonts w:ascii="Arial" w:hAnsi="Arial"/>
-          <w:color w:val="000000"/>
-          <w:sz w:val="19"/>
-        </w:rPr>
-        <w:t>)</w:t>
-      </w:r>
-    </w:p>
-    <w:p>
-      <w:pPr>
-        <w:pStyle w:val="ListBullet"/>
-      </w:pPr>
-      <w:r>
-        <w:rPr>
-          <w:rFonts w:ascii="Arial" w:hAnsi="Arial"/>
-          <w:b/>
-          <w:color w:val="000000"/>
-          <w:sz w:val="19"/>
-        </w:rPr>
-        <w:t>Australian Prudential Regulation Authority</w:t>
-      </w:r>
-      <w:r>
-        <w:rPr>
-          <w:rFonts w:ascii="Arial" w:hAnsi="Arial"/>
-          <w:color w:val="000000"/>
-          <w:sz w:val="19"/>
-        </w:rPr>
-        <w:t xml:space="preserve"> - </w:t>
-      </w:r>
-      <w:r>
-        <w:rPr>
-          <w:rFonts w:ascii="Arial" w:hAnsi="Arial"/>
-          <w:color w:val="000000"/>
-          <w:sz w:val="19"/>
-        </w:rPr>
-        <w:t>APRA revises Retirement Reporting Framework after feedback</w:t>
+        <w:t>No client-in-news signal this fortnight across any jurisdiction.</w:t>
       </w:r>
     </w:p>
     <w:p>
@@ -468,148 +246,16 @@
     </w:p>
     <w:p>
       <w:pPr>
-        <w:pStyle w:val="ListBullet"/>
+        <w:pStyle w:val="body_letter"/>
       </w:pPr>
       <w:r>
         <w:rPr>
           <w:rFonts w:ascii="Arial" w:hAnsi="Arial"/>
-          <w:b/>
-          <w:color w:val="000000"/>
+          <w:i/>
+          <w:color w:val="666666"/>
           <w:sz w:val="19"/>
         </w:rPr>
-        <w:t>ASIC acts against Star Investment Group scheme</w:t>
-      </w:r>
-      <w:r>
-        <w:rPr>
-          <w:rFonts w:ascii="Arial" w:hAnsi="Arial"/>
-          <w:color w:val="000000"/>
-          <w:sz w:val="19"/>
-        </w:rPr>
-        <w:t xml:space="preserve"> - </w:t>
-      </w:r>
-      <w:r>
-        <w:rPr>
-          <w:rFonts w:ascii="Arial" w:hAnsi="Arial"/>
-          <w:color w:val="000000"/>
-          <w:sz w:val="19"/>
-        </w:rPr>
-        <w:t>ASIC has taken enforcement action to protect investors exposed to the Star Investment Group Australia scheme, signalling continued focus on unlicensed and potentially fraudulent investment activity.</w:t>
-      </w:r>
-      <w:r>
-        <w:rPr>
-          <w:rFonts w:ascii="Arial" w:hAnsi="Arial"/>
-          <w:color w:val="000000"/>
-          <w:sz w:val="19"/>
-        </w:rPr>
-        <w:t xml:space="preserve"> (</w:t>
-      </w:r>
-      <w:hyperlink r:id="rId11">
-        <w:r>
-          <w:rPr>
-            <w:rFonts w:ascii="Arial" w:hAnsi="Arial" w:cs="Arial"/>
-            <w:color w:val="0000FF"/>
-            <w:sz w:val="19"/>
-            <w:szCs w:val="19"/>
-            <w:u w:val="single"/>
-          </w:rPr>
-          <w:t xml:space="preserve">Read more</w:t>
-        </w:r>
-      </w:hyperlink>
-      <w:r>
-        <w:rPr>
-          <w:rFonts w:ascii="Arial" w:hAnsi="Arial"/>
-          <w:color w:val="000000"/>
-          <w:sz w:val="19"/>
-        </w:rPr>
-        <w:t>)</w:t>
-      </w:r>
-    </w:p>
-    <w:p>
-      <w:pPr>
-        <w:pStyle w:val="ListBullet"/>
-      </w:pPr>
-      <w:r>
-        <w:rPr>
-          <w:rFonts w:ascii="Arial" w:hAnsi="Arial"/>
-          <w:b/>
-          <w:color w:val="000000"/>
-          <w:sz w:val="19"/>
-        </w:rPr>
-        <w:t>APRA v BAB: directors and officers face heightened accountability</w:t>
-      </w:r>
-      <w:r>
-        <w:rPr>
-          <w:rFonts w:ascii="Arial" w:hAnsi="Arial"/>
-          <w:color w:val="000000"/>
-          <w:sz w:val="19"/>
-        </w:rPr>
-        <w:t xml:space="preserve"> - </w:t>
-      </w:r>
-      <w:r>
-        <w:rPr>
-          <w:rFonts w:ascii="Arial" w:hAnsi="Arial"/>
-          <w:color w:val="000000"/>
-          <w:sz w:val="19"/>
-        </w:rPr>
-        <w:t>The APRA v BAB decision has issued a wake-up call for directors and officers on personal liability exposure under prudential enforcement, raising the stakes for governance and risk oversight in…</w:t>
-      </w:r>
-      <w:r>
-        <w:rPr>
-          <w:rFonts w:ascii="Arial" w:hAnsi="Arial"/>
-          <w:color w:val="000000"/>
-          <w:sz w:val="19"/>
-        </w:rPr>
-        <w:t xml:space="preserve"> (</w:t>
-      </w:r>
-      <w:hyperlink r:id="rId12">
-        <w:r>
-          <w:rPr>
-            <w:rFonts w:ascii="Arial" w:hAnsi="Arial" w:cs="Arial"/>
-            <w:color w:val="0000FF"/>
-            <w:sz w:val="19"/>
-            <w:szCs w:val="19"/>
-            <w:u w:val="single"/>
-          </w:rPr>
-          <w:t xml:space="preserve">Read more</w:t>
-        </w:r>
-      </w:hyperlink>
-      <w:r>
-        <w:rPr>
-          <w:rFonts w:ascii="Arial" w:hAnsi="Arial"/>
-          <w:color w:val="000000"/>
-          <w:sz w:val="19"/>
-        </w:rPr>
-        <w:t>)</w:t>
-      </w:r>
-    </w:p>
-    <w:p>
-      <w:pPr>
-        <w:pStyle w:val="ListBullet"/>
-      </w:pPr>
-      <w:r>
-        <w:rPr>
-          <w:rFonts w:ascii="Arial" w:hAnsi="Arial"/>
-          <w:b/>
-          <w:color w:val="000000"/>
-          <w:sz w:val="19"/>
-        </w:rPr>
-        <w:t>ASIC issues infringement notices to three super funds over misleading disclosures</w:t>
-      </w:r>
-      <w:r>
-        <w:rPr>
-          <w:rFonts w:ascii="Arial" w:hAnsi="Arial"/>
-          <w:color w:val="000000"/>
-          <w:sz w:val="19"/>
-        </w:rPr>
-        <w:t xml:space="preserve"> - </w:t>
-      </w:r>
-      <w:r>
-        <w:rPr>
-          <w:rFonts w:ascii="Arial" w:hAnsi="Arial"/>
-          <w:color w:val="000000"/>
-          <w:sz w:val="19"/>
-        </w:rPr>
-        <w:t>ASIC has issued infringement notices to three superannuation funds for misleading investment option disclosures, reinforcing regulatory expectations around transparency in member communications.</w:t>
+        <w:t>No emerging risks signal this fortnight.</w:t>
       </w:r>
     </w:p>
     <w:p>
@@ -628,32 +274,16 @@
     </w:p>
     <w:p>
       <w:pPr>
-        <w:pStyle w:val="ListBullet"/>
+        <w:pStyle w:val="body_letter"/>
       </w:pPr>
       <w:r>
         <w:rPr>
           <w:rFonts w:ascii="Arial" w:hAnsi="Arial"/>
-          <w:b/>
-          <w:color w:val="000000"/>
+          <w:i/>
+          <w:color w:val="666666"/>
           <w:sz w:val="19"/>
         </w:rPr>
-        <w:t>Australia's 2026 privacy reforms: pivotal new changes for AI and data</w:t>
-      </w:r>
-      <w:r>
-        <w:rPr>
-          <w:rFonts w:ascii="Arial" w:hAnsi="Arial"/>
-          <w:color w:val="000000"/>
-          <w:sz w:val="19"/>
-        </w:rPr>
-        <w:t xml:space="preserve"> - </w:t>
-      </w:r>
-      <w:r>
-        <w:rPr>
-          <w:rFonts w:ascii="Arial" w:hAnsi="Arial"/>
-          <w:color w:val="000000"/>
-          <w:sz w:val="19"/>
-        </w:rPr>
-        <w:t>Australia's 2026 privacy reform package introduces significant new obligations affecting automated decision-making, data minimisation and cross-border transfers, directly shaping how AI systems must…</w:t>
+        <w:t>No ai adoption signal this fortnight.</w:t>
       </w:r>
     </w:p>
     <w:p>
@@ -672,150 +302,16 @@
     </w:p>
     <w:p>
       <w:pPr>
-        <w:pStyle w:val="ListBullet"/>
+        <w:pStyle w:val="body_letter"/>
       </w:pPr>
       <w:r>
         <w:rPr>
           <w:rFonts w:ascii="Arial" w:hAnsi="Arial"/>
-          <w:b/>
-          <w:color w:val="000000"/>
+          <w:i/>
+          <w:color w:val="666666"/>
           <w:sz w:val="19"/>
         </w:rPr>
-        <w:t>APRA and ASIC consult on streamlining FAR administration</w:t>
-      </w:r>
-      <w:r>
-        <w:rPr>
-          <w:rFonts w:ascii="Arial" w:hAnsi="Arial"/>
-          <w:color w:val="000000"/>
-          <w:sz w:val="19"/>
-        </w:rPr>
-        <w:t xml:space="preserve"> - </w:t>
-      </w:r>
-      <w:r>
-        <w:rPr>
-          <w:rFonts w:ascii="Arial" w:hAnsi="Arial"/>
-          <w:color w:val="000000"/>
-          <w:sz w:val="19"/>
-        </w:rPr>
-        <w:t>APRA and ASIC have launched a joint consultation on simplifying Financial Accountability Regime administration, reflecting pressure to reduce compliance duplication across prudential and conduct…</w:t>
-      </w:r>
-    </w:p>
-    <w:p>
-      <w:pPr>
-        <w:pStyle w:val="ListBullet"/>
-      </w:pPr>
-      <w:r>
-        <w:rPr>
-          <w:rFonts w:ascii="Arial" w:hAnsi="Arial"/>
-          <w:b/>
-          <w:color w:val="000000"/>
-          <w:sz w:val="19"/>
-        </w:rPr>
-        <w:t>Regulatory reform omnibus bill trims CSLR levy and disallowance period</w:t>
-      </w:r>
-      <w:r>
-        <w:rPr>
-          <w:rFonts w:ascii="Arial" w:hAnsi="Arial"/>
-          <w:color w:val="000000"/>
-          <w:sz w:val="19"/>
-        </w:rPr>
-        <w:t xml:space="preserve"> - </w:t>
-      </w:r>
-      <w:r>
-        <w:rPr>
-          <w:rFonts w:ascii="Arial" w:hAnsi="Arial"/>
-          <w:color w:val="000000"/>
-          <w:sz w:val="19"/>
-        </w:rPr>
-        <w:t>Parliament has passed the regulatory reform omnibus bill, reducing the Compensation Scheme of Last Resort levy disallowance period and adjusting payout settings in a move aimed at lowering industry…</w:t>
-      </w:r>
-      <w:r>
-        <w:rPr>
-          <w:rFonts w:ascii="Arial" w:hAnsi="Arial"/>
-          <w:color w:val="000000"/>
-          <w:sz w:val="19"/>
-        </w:rPr>
-        <w:t xml:space="preserve"> (</w:t>
-      </w:r>
-      <w:hyperlink r:id="rId13">
-        <w:r>
-          <w:rPr>
-            <w:rFonts w:ascii="Arial" w:hAnsi="Arial" w:cs="Arial"/>
-            <w:color w:val="0000FF"/>
-            <w:sz w:val="19"/>
-            <w:szCs w:val="19"/>
-            <w:u w:val="single"/>
-          </w:rPr>
-          <w:t xml:space="preserve">Read more</w:t>
-        </w:r>
-      </w:hyperlink>
-      <w:r>
-        <w:rPr>
-          <w:rFonts w:ascii="Arial" w:hAnsi="Arial"/>
-          <w:color w:val="000000"/>
-          <w:sz w:val="19"/>
-        </w:rPr>
-        <w:t>)</w:t>
-      </w:r>
-    </w:p>
-    <w:p>
-      <w:pPr>
-        <w:pStyle w:val="ListBullet"/>
-      </w:pPr>
-      <w:r>
-        <w:rPr>
-          <w:rFonts w:ascii="Arial" w:hAnsi="Arial"/>
-          <w:b/>
-          <w:color w:val="000000"/>
-          <w:sz w:val="19"/>
-        </w:rPr>
-        <w:t>APRA revises Retirement Reporting Framework after stakeholder feedback</w:t>
-      </w:r>
-      <w:r>
-        <w:rPr>
-          <w:rFonts w:ascii="Arial" w:hAnsi="Arial"/>
-          <w:color w:val="000000"/>
-          <w:sz w:val="19"/>
-        </w:rPr>
-        <w:t xml:space="preserve"> - </w:t>
-      </w:r>
-      <w:r>
-        <w:rPr>
-          <w:rFonts w:ascii="Arial" w:hAnsi="Arial"/>
-          <w:color w:val="000000"/>
-          <w:sz w:val="19"/>
-        </w:rPr>
-        <w:t>APRA has revised its proposed Retirement Reporting Framework following stakeholder consultation, signalling a willingness to calibrate reporting obligations in response to industry concerns about…</w:t>
-      </w:r>
-    </w:p>
-    <w:p>
-      <w:pPr>
-        <w:pStyle w:val="ListBullet"/>
-      </w:pPr>
-      <w:r>
-        <w:rPr>
-          <w:rFonts w:ascii="Arial" w:hAnsi="Arial"/>
-          <w:b/>
-          <w:color w:val="000000"/>
-          <w:sz w:val="19"/>
-        </w:rPr>
-        <w:t>Australian Banking Association prepares industry for card surcharge removal</w:t>
-      </w:r>
-      <w:r>
-        <w:rPr>
-          <w:rFonts w:ascii="Arial" w:hAnsi="Arial"/>
-          <w:color w:val="000000"/>
-          <w:sz w:val="19"/>
-        </w:rPr>
-        <w:t xml:space="preserve"> - </w:t>
-      </w:r>
-      <w:r>
-        <w:rPr>
-          <w:rFonts w:ascii="Arial" w:hAnsi="Arial"/>
-          <w:color w:val="000000"/>
-          <w:sz w:val="19"/>
-        </w:rPr>
-        <w:t>The Australian Banking Association has published guidance preparing the sector for the mandated removal of card surcharging, a significant regulatory change affecting merchant and consumer payment…</w:t>
+        <w:t>No regulatory burden signal this fortnight.</w:t>
       </w:r>
     </w:p>
     <w:p>
@@ -834,16 +330,60 @@
     </w:p>
     <w:p>
       <w:pPr>
-        <w:pStyle w:val="body_letter"/>
+        <w:pStyle w:val="ListBullet"/>
       </w:pPr>
       <w:r>
         <w:rPr>
           <w:rFonts w:ascii="Arial" w:hAnsi="Arial"/>
-          <w:i/>
-          <w:color w:val="666666"/>
+          <w:b/>
+          <w:color w:val="000000"/>
           <w:sz w:val="19"/>
         </w:rPr>
-        <w:t>No upcoming events in the next four weeks.</w:t>
+        <w:t>AILA National Conference 2026</w:t>
+      </w:r>
+      <w:r>
+        <w:rPr>
+          <w:rFonts w:ascii="Arial" w:hAnsi="Arial"/>
+          <w:color w:val="000000"/>
+          <w:sz w:val="19"/>
+        </w:rPr>
+        <w:t xml:space="preserve"> - </w:t>
+      </w:r>
+      <w:r>
+        <w:rPr>
+          <w:rFonts w:ascii="Arial" w:hAnsi="Arial"/>
+          <w:color w:val="000000"/>
+          <w:sz w:val="19"/>
+        </w:rPr>
+        <w:t>16 Oct 2026 - APRA · Online</w:t>
+      </w:r>
+      <w:r>
+        <w:rPr>
+          <w:rFonts w:ascii="Arial" w:hAnsi="Arial"/>
+          <w:color w:val="000000"/>
+          <w:sz w:val="19"/>
+        </w:rPr>
+        <w:t xml:space="preserve"> (</w:t>
+      </w:r>
+      <w:hyperlink r:id="rId10">
+        <w:r>
+          <w:rPr>
+            <w:rFonts w:ascii="Arial" w:hAnsi="Arial" w:cs="Arial"/>
+            <w:color w:val="0000FF"/>
+            <w:sz w:val="19"/>
+            <w:szCs w:val="19"/>
+            <w:u w:val="single"/>
+          </w:rPr>
+          <w:t xml:space="preserve">Register</w:t>
+        </w:r>
+      </w:hyperlink>
+      <w:r>
+        <w:rPr>
+          <w:rFonts w:ascii="Arial" w:hAnsi="Arial"/>
+          <w:color w:val="000000"/>
+          <w:sz w:val="19"/>
+        </w:rPr>
+        <w:t>)</w:t>
       </w:r>
     </w:p>
     <w:p>
@@ -858,20 +398,6 @@
           <w:sz w:val="21"/>
         </w:rPr>
         <w:t>Cross-sector synthesis (hub-wide)</w:t>
-      </w:r>
-    </w:p>
-    <w:p>
-      <w:pPr>
-        <w:pStyle w:val="body_letter"/>
-      </w:pPr>
-      <w:r>
-        <w:rPr>
-          <w:rFonts w:ascii="Arial" w:hAnsi="Arial"/>
-          <w:b w:val="0"/>
-          <w:color w:val="000000"/>
-          <w:sz w:val="19"/>
-        </w:rPr>
-        <w:t>The fortnight is shaped by three converging regulator investment themes: APRA and ASIC are jointly recalibrating the Financial Accountability Regime through active consultation, compressing the window for accountability-mapping and governance-gap engagements across ADIs and insurers; the AG's Department Privacy Reform Taskforce and the sanctions framework overhaul are simultaneously in open consultation, signalling that Commonwealth agencies and regulated entities need implementation architecture support before both cycles move to legislation; and enforcement intensity is escalating across consumer markets (ACCC digiDirect $99k penalty), financial services (APRA v BAB personal liability ruling, ASIC licence cancellations), and border controls (ABF depot shutdowns in illicit tobacco), confirming regulators are in active penalty mode rather than guidance mode. Clients in the news include John Holland (Comcare Metro charges), ANU (TEQSA registration conditions), and digiDirect (ACCC misleading pricing), each carrying live regulatory exposure with assurance and advisory hooks. The merger regime's parliamentary fine-tuning and the CSLR omnibus passage add implementation complexity across advice licensees and M&amp;A-active clients that the sector has not yet absorbed. KPMG's immediate BD priority is the FAR consultation window, a time-bounded, multi-entity accountability-mapping engagement with a clear regulatory anchor and demonstrable PEPI credentials. The secondary priority is privacy and sanctions reform, where the Commonwealth is actively building implementation architecture and PEPI has established entry points across AG's Department, Home Affairs, and the defence export base.</w:t>
       </w:r>
     </w:p>
     <w:p>
@@ -898,7 +424,7 @@
           <w:color w:val="000000"/>
           <w:sz w:val="19"/>
         </w:rPr>
-        <w:t>Activate the financial services bench this week to develop a FAR accountability-mapping and compliance-gap offer timed to the APRA/ASIC consultation close, targeting the top 10 ADI and insurer clients by revenue exposure.</w:t>
+        <w:t>Brief the relevant sector partner this fortnight on the highest-signal regulator development above.</w:t>
       </w:r>
     </w:p>
     <w:p>
@@ -911,7 +437,7 @@
           <w:color w:val="000000"/>
           <w:sz w:val="19"/>
         </w:rPr>
-        <w:t>Brief the board governance practice on the APRA v BAB ruling and issue a client alert to insurance and ADI D&amp;O contacts within five business days, using it as the entry point for board governance framework reviews.</w:t>
+        <w:t>Convene the capability bench for the next reg-tech / capability-review pursuit in pipeline.</w:t>
       </w:r>
     </w:p>
     <w:p>
@@ -924,112 +450,7 @@
           <w:color w:val="000000"/>
           <w:sz w:val="19"/>
         </w:rPr>
-        <w:t>Secure a meeting with AG's Department Privacy Reform Taskforce leads before the consultation period closes and position KPMG as implementation architect for Commonwealth agency privacy uplift, drawing on the public sector transformation credentials cited in the IGR productivity agenda.</w:t>
-      </w:r>
-    </w:p>
-    <w:p>
-      <w:pPr>
-        <w:pStyle w:val="ListBullet"/>
-      </w:pPr>
-      <w:r>
-        <w:rPr>
-          <w:rFonts w:ascii="Arial" w:hAnsi="Arial"/>
-          <w:color w:val="000000"/>
-          <w:sz w:val="19"/>
-        </w:rPr>
-        <w:t>Develop a sanctions framework compliance rapid-assessment product targeting defence primes and tier-two suppliers ahead of the DFAT export restriction instrument taking effect, led jointly by the national security and trade advisory practices.</w:t>
-      </w:r>
-    </w:p>
-    <w:p>
-      <w:pPr>
-        <w:pStyle w:val="ListBullet"/>
-      </w:pPr>
-      <w:r>
-        <w:rPr>
-          <w:rFonts w:ascii="Arial" w:hAnsi="Arial"/>
-          <w:color w:val="000000"/>
-          <w:sz w:val="19"/>
-        </w:rPr>
-        <w:t>Pursue a board governance and risk assurance mandate at ANU following the TEQSA registration conditions, positioning it as the anchor engagement for a broader Group of Eight compliance-readiness sweep across the higher education portfolio.</w:t>
-      </w:r>
-    </w:p>
-    <w:p>
-      <w:pPr>
-        <w:pStyle w:val="body_letter"/>
-      </w:pPr>
-      <w:r>
-        <w:rPr>
-          <w:rFonts w:ascii="Arial" w:hAnsi="Arial"/>
-          <w:b/>
-          <w:color w:val="000000"/>
-          <w:sz w:val="19"/>
-        </w:rPr>
-        <w:t>Implications for clients</w:t>
-      </w:r>
-    </w:p>
-    <w:p>
-      <w:pPr>
-        <w:pStyle w:val="ListBullet"/>
-      </w:pPr>
-      <w:r>
-        <w:rPr>
-          <w:rFonts w:ascii="Arial" w:hAnsi="Arial"/>
-          <w:color w:val="000000"/>
-          <w:sz w:val="19"/>
-        </w:rPr>
-        <w:t>Activate the financial services bench this week to develop a FAR accountability-mapping and compliance-gap offer timed to the APRA/ASIC consultation close, targeting the top 10 ADI and insurer clients by revenue exposure.</w:t>
-      </w:r>
-    </w:p>
-    <w:p>
-      <w:pPr>
-        <w:pStyle w:val="ListBullet"/>
-      </w:pPr>
-      <w:r>
-        <w:rPr>
-          <w:rFonts w:ascii="Arial" w:hAnsi="Arial"/>
-          <w:color w:val="000000"/>
-          <w:sz w:val="19"/>
-        </w:rPr>
-        <w:t>Brief the board governance practice on the APRA v BAB ruling and issue a client alert to insurance and ADI D&amp;O contacts within five business days, using it as the entry point for board governance framework reviews.</w:t>
-      </w:r>
-    </w:p>
-    <w:p>
-      <w:pPr>
-        <w:pStyle w:val="ListBullet"/>
-      </w:pPr>
-      <w:r>
-        <w:rPr>
-          <w:rFonts w:ascii="Arial" w:hAnsi="Arial"/>
-          <w:color w:val="000000"/>
-          <w:sz w:val="19"/>
-        </w:rPr>
-        <w:t>Secure a meeting with AG's Department Privacy Reform Taskforce leads before the consultation period closes and position KPMG as implementation architect for Commonwealth agency privacy uplift, drawing on the public sector transformation credentials cited in the IGR productivity agenda.</w:t>
-      </w:r>
-    </w:p>
-    <w:p>
-      <w:pPr>
-        <w:pStyle w:val="ListBullet"/>
-      </w:pPr>
-      <w:r>
-        <w:rPr>
-          <w:rFonts w:ascii="Arial" w:hAnsi="Arial"/>
-          <w:color w:val="000000"/>
-          <w:sz w:val="19"/>
-        </w:rPr>
-        <w:t>Develop a sanctions framework compliance rapid-assessment product targeting defence primes and tier-two suppliers ahead of the DFAT export restriction instrument taking effect, led jointly by the national security and trade advisory practices.</w:t>
-      </w:r>
-    </w:p>
-    <w:p>
-      <w:pPr>
-        <w:pStyle w:val="ListBullet"/>
-      </w:pPr>
-      <w:r>
-        <w:rPr>
-          <w:rFonts w:ascii="Arial" w:hAnsi="Arial"/>
-          <w:color w:val="000000"/>
-          <w:sz w:val="19"/>
-        </w:rPr>
-        <w:t>Pursue a board governance and risk assurance mandate at ANU following the TEQSA registration conditions, positioning it as the anchor engagement for a broader Group of Eight compliance-readiness sweep across the higher education portfolio.</w:t>
+        <w:t>Pursue at least one tracked client on a near-term advisory hook before the next CoP cadence.</w:t>
       </w:r>
     </w:p>
     <w:p>
@@ -1053,221 +474,11 @@
       <w:r>
         <w:rPr>
           <w:rFonts w:ascii="Arial" w:hAnsi="Arial"/>
-          <w:b/>
-          <w:color w:val="000000"/>
+          <w:i/>
+          <w:color w:val="666666"/>
           <w:sz w:val="19"/>
         </w:rPr>
-        <w:t>Public Sector</w:t>
-      </w:r>
-    </w:p>
-    <w:p>
-      <w:pPr>
-        <w:pStyle w:val="body_letter"/>
-      </w:pPr>
-      <w:r>
-        <w:rPr>
-          <w:rFonts w:ascii="Arial" w:hAnsi="Arial"/>
-          <w:b w:val="0"/>
-          <w:color w:val="000000"/>
-          <w:sz w:val="19"/>
-        </w:rPr>
-        <w:t>The Commonwealth's Intergenerational Report is framing a productivity reform agenda that will drive agency capability reviews and restructuring mandates across the forward estimates, a direct pull-through for KPMG's public sector transformation bench. The AG's Department Privacy Reform Taskforce is in active consultation, with small-business and industry bodies already on record; Commonwealth and state agencies will need implementation architecture support as reform moves to legislation. Australia's sanctions framework overhaul and the Parliament-amended merger regime represent parallel regulatory rebuilds requiring government-side program management and private-sector compliance advisory, both areas where PEPI has established credentials. The ACCC's infringement action against digiDirect on misleading pricing signals continued enforcement escalation in consumer-facing digital markets, reinforcing the regulator's appetite for substantive penalty action.</w:t>
-      </w:r>
-    </w:p>
-    <w:p>
-      <w:pPr>
-        <w:pStyle w:val="body_letter"/>
-      </w:pPr>
-      <w:r>
-        <w:rPr>
-          <w:rFonts w:ascii="Arial" w:hAnsi="Arial"/>
-          <w:b/>
-          <w:color w:val="000000"/>
-          <w:sz w:val="19"/>
-        </w:rPr>
-        <w:t>Financial Services</w:t>
-      </w:r>
-    </w:p>
-    <w:p>
-      <w:pPr>
-        <w:pStyle w:val="body_letter"/>
-      </w:pPr>
-      <w:r>
-        <w:rPr>
-          <w:rFonts w:ascii="Arial" w:hAnsi="Arial"/>
-          <w:b w:val="0"/>
-          <w:color w:val="000000"/>
-          <w:sz w:val="19"/>
-        </w:rPr>
-        <w:t>APRA and ASIC have simultaneously opened consultation on streamlining Financial Accountability Regime (FAR) administration, signalling a coordinated capability and governance uplift cycle across regulated entities that creates near-term demand for accountability-mapping and compliance-gap advisory. The APRA v BAB enforcement action has materially elevated D&amp;O personal liability exposure, prompting board-level reassessment of governance frameworks and internal accountability structures across ADIs and insurers. Passage of the regulatory reform omnibus bill, trimming the CSLR levy disallowance period and capping payouts, adds implementation complexity for advice licensees navigating the concurrent Future of Advice licensing debate, where FSC motivations are now under direct Treasury scrutiny. Taken together, the fortnight's signals point to a sector under simultaneous enforcement pressure, structural reform, and accountability regime recalibration, a combination that historically drives multi-engagement advisory pipelines.</w:t>
-      </w:r>
-    </w:p>
-    <w:p>
-      <w:pPr>
-        <w:pStyle w:val="body_letter"/>
-      </w:pPr>
-      <w:r>
-        <w:rPr>
-          <w:rFonts w:ascii="Arial" w:hAnsi="Arial"/>
-          <w:b/>
-          <w:color w:val="000000"/>
-          <w:sz w:val="19"/>
-        </w:rPr>
-        <w:t>Health, Ageing &amp; Human Services</w:t>
-      </w:r>
-    </w:p>
-    <w:p>
-      <w:pPr>
-        <w:pStyle w:val="body_letter"/>
-      </w:pPr>
-      <w:r>
-        <w:rPr>
-          <w:rFonts w:ascii="Arial" w:hAnsi="Arial"/>
-          <w:b w:val="0"/>
-          <w:color w:val="000000"/>
-          <w:sz w:val="19"/>
-        </w:rPr>
-        <w:t>The NDIS Quality and Safeguards Commission's mandatory registration expansion represents the single largest near-term compliance obligation shift for disability providers since scheme inception, creating immediate demand for registration readiness, gap analysis, and governance uplift advisory. The Aged Care Quality and Safety Commission's enforcement action requiring refunds on Higher Everyday Living Fees signals active fee-framework scrutiny, putting provider financial governance and consumer-rights controls directly in scope for assurance engagements. Ahpra is simultaneously running a prescribing-standards enforcement cycle, peptides, off-label, and compounded medicines, alongside a practitioner codes of conduct consultation and a new IPCP accreditation framework, indicating a sustained regulatory uplift period across the health workforce that generates L&amp;D, policy, and compliance advisory demand. KPMG's health and human services practice has concurrent entry points across all three regulators with differentiated offerings spanning compliance readiness, financial governance, and workforce capability.</w:t>
-      </w:r>
-    </w:p>
-    <w:p>
-      <w:pPr>
-        <w:pStyle w:val="body_letter"/>
-      </w:pPr>
-      <w:r>
-        <w:rPr>
-          <w:rFonts w:ascii="Arial" w:hAnsi="Arial"/>
-          <w:b/>
-          <w:color w:val="000000"/>
-          <w:sz w:val="19"/>
-        </w:rPr>
-        <w:t>Energy, Mining &amp; Property</w:t>
-      </w:r>
-    </w:p>
-    <w:p>
-      <w:pPr>
-        <w:pStyle w:val="body_letter"/>
-      </w:pPr>
-      <w:r>
-        <w:rPr>
-          <w:rFonts w:ascii="Arial" w:hAnsi="Arial"/>
-          <w:b w:val="0"/>
-          <w:color w:val="000000"/>
-          <w:sz w:val="19"/>
-        </w:rPr>
-        <w:t>Energy ministers have put electricity market reforms on an express track, compressing the window for industry and advisory input into network and market design changes that are self-described as 'incredibly ambitious', a signal that regulators will need rapid capability uplift and that KPMG's energy transition bench has a narrow but high-value submission window. Concurrently, the AER has opened consultation on draft DMO guidelines, and the governance question of who regulates rooftop solar, plug-in batteries and EVs remains unresolved between Commonwealth and state bodies, creating a structural advisory gap in distributed energy resource (DER) policy design. ESC Victoria has taken enforcement action against two VEU-accredited parties (Royal One suspension; MYOM certificate surrender), reinforcing that Victoria's energy efficiency scheme is in active compliance enforcement mode and that scheme participants face real accreditation risk. The ESC has also released water price submission guidance, opening a regulatory economics engagement for water businesses preparing periodic pricing proposals.</w:t>
-      </w:r>
-    </w:p>
-    <w:p>
-      <w:pPr>
-        <w:pStyle w:val="body_letter"/>
-      </w:pPr>
-      <w:r>
-        <w:rPr>
-          <w:rFonts w:ascii="Arial" w:hAnsi="Arial"/>
-          <w:b/>
-          <w:color w:val="000000"/>
-          <w:sz w:val="19"/>
-        </w:rPr>
-        <w:t>National Security &amp; Justice</w:t>
-      </w:r>
-    </w:p>
-    <w:p>
-      <w:pPr>
-        <w:pStyle w:val="body_letter"/>
-      </w:pPr>
-      <w:r>
-        <w:rPr>
-          <w:rFonts w:ascii="Arial" w:hAnsi="Arial"/>
-          <w:b w:val="0"/>
-          <w:color w:val="000000"/>
-          <w:sz w:val="19"/>
-        </w:rPr>
-        <w:t>The fortnight is defined by three converging enforcement-to-legislation cycles that signal significant advisory demand: illicit tobacco enforcement is scaling to new legislative powers (ABF depot shutdowns, Labor modelling excise cuts, Police and Customs gaining new enforcement tools), creating implementation and change-management pull-through across Border Force and state police; the ACIC has lodged a submission to the PJCIS signalling an active intelligence-capability review with likely gaps in data-sharing, technology, and workforce that KPMG can position against; and the eSafety Commissioner's first empirical report on the social-media minimum-age regime confirms the regulation is entering an implementation stress-test phase, with the August 2026 symposium indicating eSafety is actively seeking external expertise on monitoring and enforcement architecture. AUSTRAC's professional designated-services expansion and the AFP's joint-agency corrupt-conduct charge (APS employee) reinforce a broader integrity and AML/CTF compliance uplift cycle across Commonwealth agencies.</w:t>
-      </w:r>
-    </w:p>
-    <w:p>
-      <w:pPr>
-        <w:pStyle w:val="body_letter"/>
-      </w:pPr>
-      <w:r>
-        <w:rPr>
-          <w:rFonts w:ascii="Arial" w:hAnsi="Arial"/>
-          <w:b/>
-          <w:color w:val="000000"/>
-          <w:sz w:val="19"/>
-        </w:rPr>
-        <w:t>Defence</w:t>
-      </w:r>
-    </w:p>
-    <w:p>
-      <w:pPr>
-        <w:pStyle w:val="body_letter"/>
-      </w:pPr>
-      <w:r>
-        <w:rPr>
-          <w:rFonts w:ascii="Arial" w:hAnsi="Arial"/>
-          <w:b w:val="0"/>
-          <w:color w:val="000000"/>
-          <w:sz w:val="19"/>
-        </w:rPr>
-        <w:t>The appointment of a designer for Australia's nuclear-powered submarine dry dock marks the most significant AUKUS programme milestone to date, confirming sustained Commonwealth capital commitment to sovereign naval infrastructure and creating near-term demand for programme assurance, procurement advisory, and workforce capability uplift across the industrial base. Proposed DFAT restrictions on military exports linked to human rights risks signal a tightening of the export control framework, driving compliance-uplift demand across defence primes and tier-two suppliers that lack mature trade controls programs. The disappearance of classified F-35 components in Hong Kong exposes material gaps in supply chain governance and security-cleared asset management, directly reinforcing a supply chain risk and assurance pitch to Defence and its prime contractors. A high-profile contract termination after 26 years signals Defence's appetite to exit entrenched arrangements, opening transition advisory and lessons-learned mandates ahead of the next procurement cycle.</w:t>
-      </w:r>
-    </w:p>
-    <w:p>
-      <w:pPr>
-        <w:pStyle w:val="body_letter"/>
-      </w:pPr>
-      <w:r>
-        <w:rPr>
-          <w:rFonts w:ascii="Arial" w:hAnsi="Arial"/>
-          <w:b/>
-          <w:color w:val="000000"/>
-          <w:sz w:val="19"/>
-        </w:rPr>
-        <w:t>Transport</w:t>
-      </w:r>
-    </w:p>
-    <w:p>
-      <w:pPr>
-        <w:pStyle w:val="body_letter"/>
-      </w:pPr>
-      <w:r>
-        <w:rPr>
-          <w:rFonts w:ascii="Arial" w:hAnsi="Arial"/>
-          <w:b w:val="0"/>
-          <w:color w:val="000000"/>
-          <w:sz w:val="19"/>
-        </w:rPr>
-        <w:t>Airservices Australia's 2026-27 Corporate Plan signals a planned investment cycle in safe, efficient and environmentally responsible service delivery, a direct entry point for strategy, digital transformation and sustainability advisory. CASA is simultaneously moving through multiple reform streams: Part 138 aerial work digitised via myCASA, annual VH registration consultation closed, and Class 5 medicals confirmed unchanged, each a discrete regulatory-change project requiring implementation support across the aviation operator base. On surface transport, Victoria's open consultation on heavy vehicle driver licensing reform creates a near-term policy advisory window, while two enforcement actions (national heavy vehicle blitz and SA operator groundings) underscore a hardened compliance environment that sharpens operator demand for risk and assurance work. The rail skills portability initiative across jurisdictions adds a workforce-capability thread with clear L&amp;D and change-management pull-through for the broader transport sector.</w:t>
-      </w:r>
-    </w:p>
-    <w:p>
-      <w:pPr>
-        <w:pStyle w:val="body_letter"/>
-      </w:pPr>
-      <w:r>
-        <w:rPr>
-          <w:rFonts w:ascii="Arial" w:hAnsi="Arial"/>
-          <w:b/>
-          <w:color w:val="000000"/>
-          <w:sz w:val="19"/>
-        </w:rPr>
-        <w:t>Education</w:t>
-      </w:r>
-    </w:p>
-    <w:p>
-      <w:pPr>
-        <w:pStyle w:val="body_letter"/>
-      </w:pPr>
-      <w:r>
-        <w:rPr>
-          <w:rFonts w:ascii="Arial" w:hAnsi="Arial"/>
-          <w:b w:val="0"/>
-          <w:color w:val="000000"/>
-          <w:sz w:val="19"/>
-        </w:rPr>
-        <w:t>TEQSA has materially escalated its enforcement posture this fortnight, imposing registration conditions on ANU following governance failures and concluding compliance actions against at least two private higher education providers (OneGlobe and Opulence Institutes), alongside a Bachelor of IT course-level decision, signalling a sector-wide compliance sweep rather than isolated incidents. The ANU intervention is TEQSA's most significant action against a Group of Eight institution in recent memory and creates a live pursuit lead for board governance review, risk assurance, and executive capability advisory. Concurrent Commonwealth investment through Free TAFE sustains demand for workforce strategy and program design advisory across the VET sector. The Coalition's flagged curriculum reform agenda adds a policy-risk dimension that clients across the sector will need to navigate regardless of electoral timing.</w:t>
+        <w:t>No sector-level synthesis available this fortnight.</w:t>
       </w:r>
     </w:p>
     <w:p>
@@ -1291,249 +502,11 @@
       <w:r>
         <w:rPr>
           <w:rFonts w:ascii="Arial" w:hAnsi="Arial"/>
-          <w:b/>
-          <w:color w:val="000000"/>
+          <w:i/>
+          <w:color w:val="666666"/>
           <w:sz w:val="19"/>
         </w:rPr>
-        <w:t>Commonwealth</w:t>
-      </w:r>
-    </w:p>
-    <w:p>
-      <w:pPr>
-        <w:pStyle w:val="body_letter"/>
-      </w:pPr>
-      <w:r>
-        <w:rPr>
-          <w:rFonts w:ascii="Arial" w:hAnsi="Arial"/>
-          <w:b w:val="0"/>
-          <w:color w:val="000000"/>
-          <w:sz w:val="19"/>
-        </w:rPr>
-        <w:t>The Commonwealth regulatory environment is under simultaneous reform pressure across digital, privacy, and financial services. The digital duty of care exposure draft, attracting analysis from multiple major law firms, imposes significant new compliance obligations on online platforms and AI services, creating immediate advisory demand for affected industries. The draft Privacy Act amendments compound compliance complexity for data-handling businesses, while Comcare has publicly committed to a tougher enforcement posture across federal agencies, signalling elevated workplace psychosocial and safety risk for Commonwealth entities. In financial services, the regulatory reform omnibus bill has passed with amended CSLR levy disallowance provisions, and government has rejected Senate Committee recommendations for major ASIC structural changes, narrowing the reform window for that sector.</w:t>
-      </w:r>
-    </w:p>
-    <w:p>
-      <w:pPr>
-        <w:pStyle w:val="body_letter"/>
-      </w:pPr>
-      <w:r>
-        <w:rPr>
-          <w:rFonts w:ascii="Arial" w:hAnsi="Arial"/>
-          <w:b/>
-          <w:color w:val="000000"/>
-          <w:sz w:val="19"/>
-        </w:rPr>
-        <w:t>New South Wales</w:t>
-      </w:r>
-    </w:p>
-    <w:p>
-      <w:pPr>
-        <w:pStyle w:val="body_letter"/>
-      </w:pPr>
-      <w:r>
-        <w:rPr>
-          <w:rFonts w:ascii="Arial" w:hAnsi="Arial"/>
-          <w:b w:val="0"/>
-          <w:color w:val="000000"/>
-          <w:sz w:val="19"/>
-        </w:rPr>
-        <w:t>NSW Parliament has passed multiple significant pieces of legislation this period: new organised crime disruption and enforcement laws (articles 6 and 10), medicinal cannabis driving reforms, and Crown land reforms, collectively expanding regulatory obligations and agency powers across criminal justice, transport, and property sectors. SafeWork NSW has issued formal psychosocial risk notices to the Moree Plains region, signalling an enforcement priority shift toward psychological safety in workplaces, while a property developer (Bathla) has been exposed to 300 safety breaches prior to collapse, heightening building compliance scrutiny. The NSW Government is intensifying ECEC compliance oversight and has commenced a strategic forestry assessment, with a floodplain watchdog admission adding pressure for environmental regulatory action. Advisory opportunities are immediate across criminal compliance, property development due diligence, workplace psychosocial risk, early childhood education, and environmental and forestry regulation.</w:t>
-      </w:r>
-    </w:p>
-    <w:p>
-      <w:pPr>
-        <w:pStyle w:val="body_letter"/>
-      </w:pPr>
-      <w:r>
-        <w:rPr>
-          <w:rFonts w:ascii="Arial" w:hAnsi="Arial"/>
-          <w:b/>
-          <w:color w:val="000000"/>
-          <w:sz w:val="19"/>
-        </w:rPr>
-        <w:t>Victoria</w:t>
-      </w:r>
-    </w:p>
-    <w:p>
-      <w:pPr>
-        <w:pStyle w:val="body_letter"/>
-      </w:pPr>
-      <w:r>
-        <w:rPr>
-          <w:rFonts w:ascii="Arial" w:hAnsi="Arial"/>
-          <w:b w:val="0"/>
-          <w:color w:val="000000"/>
-          <w:sz w:val="19"/>
-        </w:rPr>
-        <w:t>IBAC has issued a damning assessment of a decade of integrity erosion in Victoria, coinciding with a corruption conviction of senior rail officials over contract fraud, signalling heightened anti-corruption enforcement and governance reform pressure across Victorian public sector clients. Victoria is simultaneously advancing multiple regulatory frameworks: new retirement village laws, multicultural/multifaith governance reforms, and a landmark prefabrication registration regime with attached penalties for the building sector. Environmental and tenancy enforcement is intensifying, with EPA Victoria conducting snap compliance blitzes on waste operators, a parliamentary inquiry recommending stronger oversight of waste-to-energy projects, and the rental taskforce being made permanent with expanded landlord crackdown powers. Advisory opportunities span public sector integrity uplift, building industry compliance (prefab registration), property management, environmental licensing, and electoral compliance given new VEC authorisation guidance.</w:t>
-      </w:r>
-    </w:p>
-    <w:p>
-      <w:pPr>
-        <w:pStyle w:val="body_letter"/>
-      </w:pPr>
-      <w:r>
-        <w:rPr>
-          <w:rFonts w:ascii="Arial" w:hAnsi="Arial"/>
-          <w:b/>
-          <w:color w:val="000000"/>
-          <w:sz w:val="19"/>
-        </w:rPr>
-        <w:t>Queensland</w:t>
-      </w:r>
-    </w:p>
-    <w:p>
-      <w:pPr>
-        <w:pStyle w:val="body_letter"/>
-      </w:pPr>
-      <w:r>
-        <w:rPr>
-          <w:rFonts w:ascii="Arial" w:hAnsi="Arial"/>
-          <w:b w:val="0"/>
-          <w:color w:val="000000"/>
-          <w:sz w:val="19"/>
-        </w:rPr>
-        <w:t>Queensland's regulatory environment is seeing significant enforcement recalibration and legislative activity across multiple sectors. The QBCC has released a 2026-2030 enforcement strategy consolidating its focus to eight priority harms, replacing the prior fifteen-point framework and signalling a sharper, more targeted approach to construction sector compliance advisory. Queensland's workplace safety regulator has reopened its inquiry into The Star Brisbane following a worker's death, compounding existing compliance carnage at the casino as leaked recordings expose executive hostility toward regulators and internal governance failures, presenting material advisory opportunity around casino compliance remediation. Concurrently, the Queensland Government has enacted mining legislative reforms welcomed by industry, updated the Education and Care Services Regulation 2026 with strengthened requirements, and is consulting on bail law reform, while childcare enforcement actions and a new Ombudsman appointment reinforce multi-sector regulatory oversight pressure.</w:t>
-      </w:r>
-    </w:p>
-    <w:p>
-      <w:pPr>
-        <w:pStyle w:val="body_letter"/>
-      </w:pPr>
-      <w:r>
-        <w:rPr>
-          <w:rFonts w:ascii="Arial" w:hAnsi="Arial"/>
-          <w:b/>
-          <w:color w:val="000000"/>
-          <w:sz w:val="19"/>
-        </w:rPr>
-        <w:t>Western Australia</w:t>
-      </w:r>
-    </w:p>
-    <w:p>
-      <w:pPr>
-        <w:pStyle w:val="body_letter"/>
-      </w:pPr>
-      <w:r>
-        <w:rPr>
-          <w:rFonts w:ascii="Arial" w:hAnsi="Arial"/>
-          <w:b w:val="0"/>
-          <w:color w:val="000000"/>
-          <w:sz w:val="19"/>
-        </w:rPr>
-        <w:t>WA has issued its first infringement notice under the short-stay accommodation laws, signalling active enforcement of a recently enacted framework and flagging immediate compliance obligations for property operators and platforms. The state government has launched an Alternative Electricity Services (AES) framework, creating new licensing and compliance obligations for non-traditional electricity providers that warrants close monitoring by energy sector clients. The WA Government is appealing the Yindjibarndi native title ruling, which carries material implications for resources sector land access approvals and project timelines. Local government electoral reforms are also advancing, adding to a busy WA legislative agenda with downstream compliance obligations for councils and industry stakeholders.</w:t>
-      </w:r>
-    </w:p>
-    <w:p>
-      <w:pPr>
-        <w:pStyle w:val="body_letter"/>
-      </w:pPr>
-      <w:r>
-        <w:rPr>
-          <w:rFonts w:ascii="Arial" w:hAnsi="Arial"/>
-          <w:b/>
-          <w:color w:val="000000"/>
-          <w:sz w:val="19"/>
-        </w:rPr>
-        <w:t>South Australia</w:t>
-      </w:r>
-    </w:p>
-    <w:p>
-      <w:pPr>
-        <w:pStyle w:val="body_letter"/>
-      </w:pPr>
-      <w:r>
-        <w:rPr>
-          <w:rFonts w:ascii="Arial" w:hAnsi="Arial"/>
-          <w:b w:val="0"/>
-          <w:color w:val="000000"/>
-          <w:sz w:val="19"/>
-        </w:rPr>
-        <w:t>SafeWork SA is pursuing active prosecutions on two separate fronts, charges following a fatal outback plane crash and against a juice manufacturer after a workplace ceiling collapse, signalling sustained WHS enforcement intensity that warrants client risk reviews across aviation, food manufacturing and site-safety sectors. SA Police and transport authorities conducted a coordinated heavy vehicle safety blitz intercepting 203 vehicles and grounding a road train, with a separate SA operator simultaneously facing groundings for alleged major safety defects, indicating heightened transport compliance scrutiny. SA Consumer and Business Services has commenced a crackdown on alleged misuse of housing contract sunset clauses, creating immediate advisory demand for property developers and conveyancers operating in the state. SA has formally committed to a domestic violence royal commission five-year implementation plan accompanied by new alcohol delivery restrictions, opening compliance and policy advisory opportunities across the hospitality, retail liquor and community services sectors.</w:t>
-      </w:r>
-    </w:p>
-    <w:p>
-      <w:pPr>
-        <w:pStyle w:val="body_letter"/>
-      </w:pPr>
-      <w:r>
-        <w:rPr>
-          <w:rFonts w:ascii="Arial" w:hAnsi="Arial"/>
-          <w:b/>
-          <w:color w:val="000000"/>
-          <w:sz w:val="19"/>
-        </w:rPr>
-        <w:t>Tasmania</w:t>
-      </w:r>
-    </w:p>
-    <w:p>
-      <w:pPr>
-        <w:pStyle w:val="body_letter"/>
-      </w:pPr>
-      <w:r>
-        <w:rPr>
-          <w:rFonts w:ascii="Arial" w:hAnsi="Arial"/>
-          <w:b w:val="0"/>
-          <w:color w:val="000000"/>
-          <w:sz w:val="19"/>
-        </w:rPr>
-        <w:t>Tasmania's parliament has passed the Residential Parks Bill and charitable red tape reduction legislation, while advancing climate reforms and Commission of Inquiry procedural amendments, creating compliance uplift opportunities for operators in the parks, charity, and environmental sectors. A Legislative Council inquiry into the abandoned cashless pokies card has commenced alongside mounting scrutiny of pokies losses ($18.1M), signalling renewed gambling regulation risk for hospitality and gaming clients. The state government's deferral of gun law reform and offloading of Safe Farming Tasmania reflect broader machinery-of-government shifts, while a review of Forest Practices investigations following farmer protests points to potential recalibration of primary industries enforcement. Hobart council's public rejection of the new planning portal as 'unfit for purpose' flags implementation risk in the state's planning reform agenda.</w:t>
-      </w:r>
-    </w:p>
-    <w:p>
-      <w:pPr>
-        <w:pStyle w:val="body_letter"/>
-      </w:pPr>
-      <w:r>
-        <w:rPr>
-          <w:rFonts w:ascii="Arial" w:hAnsi="Arial"/>
-          <w:b/>
-          <w:color w:val="000000"/>
-          <w:sz w:val="19"/>
-        </w:rPr>
-        <w:t>Australian Capital Territory</w:t>
-      </w:r>
-    </w:p>
-    <w:p>
-      <w:pPr>
-        <w:pStyle w:val="body_letter"/>
-      </w:pPr>
-      <w:r>
-        <w:rPr>
-          <w:rFonts w:ascii="Arial" w:hAnsi="Arial"/>
-          <w:b w:val="0"/>
-          <w:color w:val="000000"/>
-          <w:sz w:val="19"/>
-        </w:rPr>
-        <w:t>The ACT Government has announced significant gaming reforms, including proposed cashless gaming requirements and a reduction in poker machines, signalling a major compliance and licensing overhaul for gaming operators in the territory. Access Canberra drew scrutiny after cancelling 19-year-old traffic infringement notices, raising questions about enforcement integrity and administrative process governance. A broader AI-related traffic camera error affecting thousands of Australian drivers has put AI-assisted enforcement tools under regulatory pressure, with implications for ACT's own enforcement systems. These developments, alongside ACT bail reform being advanced without supporting data, point to heightened legislative activity and administrative accountability risks across the territory.</w:t>
-      </w:r>
-    </w:p>
-    <w:p>
-      <w:pPr>
-        <w:pStyle w:val="body_letter"/>
-      </w:pPr>
-      <w:r>
-        <w:rPr>
-          <w:rFonts w:ascii="Arial" w:hAnsi="Arial"/>
-          <w:b/>
-          <w:color w:val="000000"/>
-          <w:sz w:val="19"/>
-        </w:rPr>
-        <w:t>Northern Territory</w:t>
-      </w:r>
-    </w:p>
-    <w:p>
-      <w:pPr>
-        <w:pStyle w:val="body_letter"/>
-      </w:pPr>
-      <w:r>
-        <w:rPr>
-          <w:rFonts w:ascii="Arial" w:hAnsi="Arial"/>
-          <w:b w:val="0"/>
-          <w:color w:val="000000"/>
-          <w:sz w:val="19"/>
-        </w:rPr>
-        <w:t>The NT regulatory landscape is dominated by enforcement action against Inpex over emissions under-reporting at the Ichthys LNG facility, with prosecution now underway and the NT EPA simultaneously recommending tighter pollution controls for both Inpex and Santos at Darwin LNG plants, a clear signal of escalating environmental compliance expectations across the NT resources sector. NT harbour oversight has also tightened, with Ichthys LNG facing separate court proceedings on maritime compliance. On governance, the NT government has declined to investigate CDU and Batchelor Institute amid ongoing scandals, substituting KPI frameworks instead, an advisory opportunity around tertiary sector accountability structures. The national commissioner's public criticism of NT child protection changes adds federal-territory tension to the welfare compliance space.</w:t>
+        <w:t>No jurisdiction-level synthesis available this fortnight.</w:t>
       </w:r>
     </w:p>
     <w:tbl>
@@ -1579,7 +552,7 @@
                           <pic:cNvPicPr/>
                         </pic:nvPicPr>
                         <pic:blipFill>
-                          <a:blip r:embed="rId14"/>
+                          <a:blip r:embed="rId11"/>
                           <a:stretch>
                             <a:fillRect/>
                           </a:stretch>

</xml_diff>

<commit_message>
chore: update regulation hub 2026-10-03
</commit_message>
<xml_diff>
--- a/reg-hub/regulation_fortnightly_brief.docx
+++ b/reg-hub/regulation_fortnightly_brief.docx
@@ -46,7 +46,7 @@
         <w:pStyle w:val="Heading1"/>
       </w:pPr>
       <w:r>
-        <w:t>KPMG Regulatory Transformation Fortnightly Brief - 19 September - 2 October 2026</w:t>
+        <w:t>KPMG Regulatory Transformation Fortnightly Brief - 20 September - 3 October 2026</w:t>
       </w:r>
     </w:p>
     <w:p>
@@ -73,7 +73,7 @@
           <w:color w:val="666666"/>
           <w:sz w:val="19"/>
         </w:rPr>
-        <w:t>02 October 2026</w:t>
+        <w:t>03 October 2026</w:t>
       </w:r>
     </w:p>
     <w:p>
@@ -330,60 +330,16 @@
     </w:p>
     <w:p>
       <w:pPr>
-        <w:pStyle w:val="ListBullet"/>
+        <w:pStyle w:val="body_letter"/>
       </w:pPr>
       <w:r>
         <w:rPr>
           <w:rFonts w:ascii="Arial" w:hAnsi="Arial"/>
-          <w:b/>
-          <w:color w:val="000000"/>
+          <w:i/>
+          <w:color w:val="666666"/>
           <w:sz w:val="19"/>
         </w:rPr>
-        <w:t>AILA National Conference 2026</w:t>
-      </w:r>
-      <w:r>
-        <w:rPr>
-          <w:rFonts w:ascii="Arial" w:hAnsi="Arial"/>
-          <w:color w:val="000000"/>
-          <w:sz w:val="19"/>
-        </w:rPr>
-        <w:t xml:space="preserve"> - </w:t>
-      </w:r>
-      <w:r>
-        <w:rPr>
-          <w:rFonts w:ascii="Arial" w:hAnsi="Arial"/>
-          <w:color w:val="000000"/>
-          <w:sz w:val="19"/>
-        </w:rPr>
-        <w:t>16 Oct 2026 - APRA · Online</w:t>
-      </w:r>
-      <w:r>
-        <w:rPr>
-          <w:rFonts w:ascii="Arial" w:hAnsi="Arial"/>
-          <w:color w:val="000000"/>
-          <w:sz w:val="19"/>
-        </w:rPr>
-        <w:t xml:space="preserve"> (</w:t>
-      </w:r>
-      <w:hyperlink r:id="rId10">
-        <w:r>
-          <w:rPr>
-            <w:rFonts w:ascii="Arial" w:hAnsi="Arial" w:cs="Arial"/>
-            <w:color w:val="0000FF"/>
-            <w:sz w:val="19"/>
-            <w:szCs w:val="19"/>
-            <w:u w:val="single"/>
-          </w:rPr>
-          <w:t xml:space="preserve">Register</w:t>
-        </w:r>
-      </w:hyperlink>
-      <w:r>
-        <w:rPr>
-          <w:rFonts w:ascii="Arial" w:hAnsi="Arial"/>
-          <w:color w:val="000000"/>
-          <w:sz w:val="19"/>
-        </w:rPr>
-        <w:t>)</w:t>
+        <w:t>No upcoming events in the next four weeks.</w:t>
       </w:r>
     </w:p>
     <w:p>
@@ -552,7 +508,7 @@
                           <pic:cNvPicPr/>
                         </pic:nvPicPr>
                         <pic:blipFill>
-                          <a:blip r:embed="rId11"/>
+                          <a:blip r:embed="rId10"/>
                           <a:stretch>
                             <a:fillRect/>
                           </a:stretch>

</xml_diff>

<commit_message>
chore: update regulation hub 2026-10-05
</commit_message>
<xml_diff>
--- a/reg-hub/regulation_fortnightly_brief.docx
+++ b/reg-hub/regulation_fortnightly_brief.docx
@@ -46,7 +46,7 @@
         <w:pStyle w:val="Heading1"/>
       </w:pPr>
       <w:r>
-        <w:t>KPMG Regulatory Transformation Fortnightly Brief - 20 September - 3 October 2026</w:t>
+        <w:t>KPMG Regulatory Transformation Fortnightly Brief - 22 September - 5 October 2026</w:t>
       </w:r>
     </w:p>
     <w:p>
@@ -73,7 +73,7 @@
           <w:color w:val="666666"/>
           <w:sz w:val="19"/>
         </w:rPr>
-        <w:t>03 October 2026</w:t>
+        <w:t>05 October 2026</w:t>
       </w:r>
     </w:p>
     <w:p>
@@ -97,11 +97,11 @@
       <w:r>
         <w:rPr>
           <w:rFonts w:ascii="Arial" w:hAnsi="Arial"/>
-          <w:i/>
-          <w:color w:val="666666"/>
+          <w:b w:val="0"/>
+          <w:color w:val="000000"/>
           <w:sz w:val="19"/>
         </w:rPr>
-        <w:t>[edit before send], Adam's 3-sentence key messages will prefill from the dashboard synthesis on the next fortnightly run. Type your replacement here.</w:t>
+        <w:t>This fortnight's regulatory activity clusters around transport safety and environmental compliance, with AMSA driving emissions reduction planning, fuel security remaining a live concern for DCCEEW, and Home Affairs advancing telecommunications security reforms that signal a broader regulatory posture shift across critical infrastructure sectors. The intersection of maritime safety modernisation and crew fatigue standards represents the sharpest near-term advisory opportunity, as regulators tighten operational requirements while industry seeks pragmatic compliance pathways ahead of the cruise season. Brief our transport, energy, and critical infrastructure sector leads this week to map current client exposure against the AMSA, ATSB, and Home Affairs reform vectors and identify where we can lead the framing conversation.</w:t>
       </w:r>
     </w:p>
     <w:p>
@@ -120,16 +120,642 @@
     </w:p>
     <w:p>
       <w:pPr>
-        <w:pStyle w:val="body_letter"/>
+        <w:pStyle w:val="ListBullet"/>
       </w:pPr>
       <w:r>
         <w:rPr>
           <w:rFonts w:ascii="Arial" w:hAnsi="Arial"/>
-          <w:i/>
-          <w:color w:val="666666"/>
+          <w:b/>
+          <w:color w:val="000000"/>
           <w:sz w:val="19"/>
         </w:rPr>
-        <w:t>No regulator-in-news signal this fortnight, see Themes below.</w:t>
+        <w:t>Australian Skills Quality Authority</w:t>
+      </w:r>
+      <w:r>
+        <w:rPr>
+          <w:rFonts w:ascii="Arial" w:hAnsi="Arial"/>
+          <w:color w:val="000000"/>
+          <w:sz w:val="19"/>
+        </w:rPr>
+        <w:t xml:space="preserve"> - </w:t>
+      </w:r>
+      <w:r>
+        <w:rPr>
+          <w:rFonts w:ascii="Arial" w:hAnsi="Arial"/>
+          <w:color w:val="000000"/>
+          <w:sz w:val="19"/>
+        </w:rPr>
+        <w:t>ASQA is placing registered training organisations under closer scrutiny for material change notifications related to ownership structures and governance arrangements.</w:t>
+      </w:r>
+      <w:r>
+        <w:rPr>
+          <w:rFonts w:ascii="Arial" w:hAnsi="Arial"/>
+          <w:color w:val="000000"/>
+          <w:sz w:val="19"/>
+        </w:rPr>
+        <w:t xml:space="preserve"> (</w:t>
+      </w:r>
+      <w:hyperlink r:id="rId10">
+        <w:r>
+          <w:rPr>
+            <w:rFonts w:ascii="Arial" w:hAnsi="Arial" w:cs="Arial"/>
+            <w:color w:val="0000FF"/>
+            <w:sz w:val="19"/>
+            <w:szCs w:val="19"/>
+            <w:u w:val="single"/>
+          </w:rPr>
+          <w:t xml:space="preserve">Read more</w:t>
+        </w:r>
+      </w:hyperlink>
+      <w:r>
+        <w:rPr>
+          <w:rFonts w:ascii="Arial" w:hAnsi="Arial"/>
+          <w:color w:val="000000"/>
+          <w:sz w:val="19"/>
+        </w:rPr>
+        <w:t>)</w:t>
+      </w:r>
+    </w:p>
+    <w:p>
+      <w:pPr>
+        <w:pStyle w:val="ListBullet"/>
+      </w:pPr>
+      <w:r>
+        <w:rPr>
+          <w:rFonts w:ascii="Arial" w:hAnsi="Arial"/>
+          <w:b/>
+          <w:color w:val="000000"/>
+          <w:sz w:val="19"/>
+        </w:rPr>
+        <w:t>Consumer Affairs Victoria</w:t>
+      </w:r>
+      <w:r>
+        <w:rPr>
+          <w:rFonts w:ascii="Arial" w:hAnsi="Arial"/>
+          <w:color w:val="000000"/>
+          <w:sz w:val="19"/>
+        </w:rPr>
+        <w:t xml:space="preserve"> - </w:t>
+      </w:r>
+      <w:r>
+        <w:rPr>
+          <w:rFonts w:ascii="Arial" w:hAnsi="Arial"/>
+          <w:color w:val="000000"/>
+          <w:sz w:val="19"/>
+        </w:rPr>
+        <w:t>Consumer Affairs Victoria has published new rules on property sales and underquoting obligations, requiring greater price transparency for Victorian homebuyers.</w:t>
+      </w:r>
+      <w:r>
+        <w:rPr>
+          <w:rFonts w:ascii="Arial" w:hAnsi="Arial"/>
+          <w:color w:val="000000"/>
+          <w:sz w:val="19"/>
+        </w:rPr>
+        <w:t xml:space="preserve"> (</w:t>
+      </w:r>
+      <w:hyperlink r:id="rId11">
+        <w:r>
+          <w:rPr>
+            <w:rFonts w:ascii="Arial" w:hAnsi="Arial" w:cs="Arial"/>
+            <w:color w:val="0000FF"/>
+            <w:sz w:val="19"/>
+            <w:szCs w:val="19"/>
+            <w:u w:val="single"/>
+          </w:rPr>
+          <w:t xml:space="preserve">Read more</w:t>
+        </w:r>
+      </w:hyperlink>
+      <w:r>
+        <w:rPr>
+          <w:rFonts w:ascii="Arial" w:hAnsi="Arial"/>
+          <w:color w:val="000000"/>
+          <w:sz w:val="19"/>
+        </w:rPr>
+        <w:t>)</w:t>
+      </w:r>
+    </w:p>
+    <w:p>
+      <w:pPr>
+        <w:pStyle w:val="ListBullet"/>
+      </w:pPr>
+      <w:r>
+        <w:rPr>
+          <w:rFonts w:ascii="Arial" w:hAnsi="Arial"/>
+          <w:b/>
+          <w:color w:val="000000"/>
+          <w:sz w:val="19"/>
+        </w:rPr>
+        <w:t>Aged Care Quality and Safety Commission</w:t>
+      </w:r>
+      <w:r>
+        <w:rPr>
+          <w:rFonts w:ascii="Arial" w:hAnsi="Arial"/>
+          <w:color w:val="000000"/>
+          <w:sz w:val="19"/>
+        </w:rPr>
+        <w:t xml:space="preserve"> - </w:t>
+      </w:r>
+      <w:r>
+        <w:rPr>
+          <w:rFonts w:ascii="Arial" w:hAnsi="Arial"/>
+          <w:color w:val="000000"/>
+          <w:sz w:val="19"/>
+        </w:rPr>
+        <w:t>The Aged Care Quality and Safety Commission published its ninth quality bulletin for 2026, signalling ongoing compliance and quality expectations for registered aged care providers.</w:t>
+      </w:r>
+      <w:r>
+        <w:rPr>
+          <w:rFonts w:ascii="Arial" w:hAnsi="Arial"/>
+          <w:color w:val="000000"/>
+          <w:sz w:val="19"/>
+        </w:rPr>
+        <w:t xml:space="preserve"> (</w:t>
+      </w:r>
+      <w:hyperlink r:id="rId12">
+        <w:r>
+          <w:rPr>
+            <w:rFonts w:ascii="Arial" w:hAnsi="Arial" w:cs="Arial"/>
+            <w:color w:val="0000FF"/>
+            <w:sz w:val="19"/>
+            <w:szCs w:val="19"/>
+            <w:u w:val="single"/>
+          </w:rPr>
+          <w:t xml:space="preserve">Read more</w:t>
+        </w:r>
+      </w:hyperlink>
+      <w:r>
+        <w:rPr>
+          <w:rFonts w:ascii="Arial" w:hAnsi="Arial"/>
+          <w:color w:val="000000"/>
+          <w:sz w:val="19"/>
+        </w:rPr>
+        <w:t>)</w:t>
+      </w:r>
+    </w:p>
+    <w:p>
+      <w:pPr>
+        <w:pStyle w:val="ListBullet"/>
+      </w:pPr>
+      <w:r>
+        <w:rPr>
+          <w:rFonts w:ascii="Arial" w:hAnsi="Arial"/>
+          <w:b/>
+          <w:color w:val="000000"/>
+          <w:sz w:val="19"/>
+        </w:rPr>
+        <w:t>Australian Federal Police</w:t>
+      </w:r>
+      <w:r>
+        <w:rPr>
+          <w:rFonts w:ascii="Arial" w:hAnsi="Arial"/>
+          <w:color w:val="000000"/>
+          <w:sz w:val="19"/>
+        </w:rPr>
+        <w:t xml:space="preserve"> - </w:t>
+      </w:r>
+      <w:r>
+        <w:rPr>
+          <w:rFonts w:ascii="Arial" w:hAnsi="Arial"/>
+          <w:color w:val="000000"/>
+          <w:sz w:val="19"/>
+        </w:rPr>
+        <w:t>The AFP finalised a foreign bribery investigation against a company, securing a $9 million settlement in a significant enforcement outcome.</w:t>
+      </w:r>
+      <w:r>
+        <w:rPr>
+          <w:rFonts w:ascii="Arial" w:hAnsi="Arial"/>
+          <w:color w:val="000000"/>
+          <w:sz w:val="19"/>
+        </w:rPr>
+        <w:t xml:space="preserve"> (</w:t>
+      </w:r>
+      <w:hyperlink r:id="rId13">
+        <w:r>
+          <w:rPr>
+            <w:rFonts w:ascii="Arial" w:hAnsi="Arial" w:cs="Arial"/>
+            <w:color w:val="0000FF"/>
+            <w:sz w:val="19"/>
+            <w:szCs w:val="19"/>
+            <w:u w:val="single"/>
+          </w:rPr>
+          <w:t xml:space="preserve">Read more</w:t>
+        </w:r>
+      </w:hyperlink>
+      <w:r>
+        <w:rPr>
+          <w:rFonts w:ascii="Arial" w:hAnsi="Arial"/>
+          <w:color w:val="000000"/>
+          <w:sz w:val="19"/>
+        </w:rPr>
+        <w:t>)</w:t>
+      </w:r>
+    </w:p>
+    <w:p>
+      <w:pPr>
+        <w:pStyle w:val="ListBullet"/>
+      </w:pPr>
+      <w:r>
+        <w:rPr>
+          <w:rFonts w:ascii="Arial" w:hAnsi="Arial"/>
+          <w:b/>
+          <w:color w:val="000000"/>
+          <w:sz w:val="19"/>
+        </w:rPr>
+        <w:t>eSafety Commissioner</w:t>
+      </w:r>
+      <w:r>
+        <w:rPr>
+          <w:rFonts w:ascii="Arial" w:hAnsi="Arial"/>
+          <w:color w:val="000000"/>
+          <w:sz w:val="19"/>
+        </w:rPr>
+        <w:t xml:space="preserve"> - </w:t>
+      </w:r>
+      <w:r>
+        <w:rPr>
+          <w:rFonts w:ascii="Arial" w:hAnsi="Arial"/>
+          <w:color w:val="000000"/>
+          <w:sz w:val="19"/>
+        </w:rPr>
+        <w:t>The eSafety Commissioner urged major gaming platforms to improve child safety measures, releasing transparency notice responses covering online game and gaming-adjacent services.</w:t>
+      </w:r>
+      <w:r>
+        <w:rPr>
+          <w:rFonts w:ascii="Arial" w:hAnsi="Arial"/>
+          <w:color w:val="000000"/>
+          <w:sz w:val="19"/>
+        </w:rPr>
+        <w:t xml:space="preserve"> (</w:t>
+      </w:r>
+      <w:hyperlink r:id="rId14">
+        <w:r>
+          <w:rPr>
+            <w:rFonts w:ascii="Arial" w:hAnsi="Arial" w:cs="Arial"/>
+            <w:color w:val="0000FF"/>
+            <w:sz w:val="19"/>
+            <w:szCs w:val="19"/>
+            <w:u w:val="single"/>
+          </w:rPr>
+          <w:t xml:space="preserve">Read more</w:t>
+        </w:r>
+      </w:hyperlink>
+      <w:r>
+        <w:rPr>
+          <w:rFonts w:ascii="Arial" w:hAnsi="Arial"/>
+          <w:color w:val="000000"/>
+          <w:sz w:val="19"/>
+        </w:rPr>
+        <w:t>)</w:t>
+      </w:r>
+    </w:p>
+    <w:p>
+      <w:pPr>
+        <w:pStyle w:val="ListBullet"/>
+      </w:pPr>
+      <w:r>
+        <w:rPr>
+          <w:rFonts w:ascii="Arial" w:hAnsi="Arial"/>
+          <w:b/>
+          <w:color w:val="000000"/>
+          <w:sz w:val="19"/>
+        </w:rPr>
+        <w:t>Department of Home Affairs</w:t>
+      </w:r>
+      <w:r>
+        <w:rPr>
+          <w:rFonts w:ascii="Arial" w:hAnsi="Arial"/>
+          <w:color w:val="000000"/>
+          <w:sz w:val="19"/>
+        </w:rPr>
+        <w:t xml:space="preserve"> - </w:t>
+      </w:r>
+      <w:r>
+        <w:rPr>
+          <w:rFonts w:ascii="Arial" w:hAnsi="Arial"/>
+          <w:color w:val="000000"/>
+          <w:sz w:val="19"/>
+        </w:rPr>
+        <w:t>The Department of Home Affairs launched a public consultation on Horizon 2 of the 2023 to 2030 Australian Cyber Security Strategy, inviting submissions to shape the next phase of national cyber…</w:t>
+      </w:r>
+      <w:r>
+        <w:rPr>
+          <w:rFonts w:ascii="Arial" w:hAnsi="Arial"/>
+          <w:color w:val="000000"/>
+          <w:sz w:val="19"/>
+        </w:rPr>
+        <w:t xml:space="preserve"> (</w:t>
+      </w:r>
+      <w:hyperlink r:id="rId15">
+        <w:r>
+          <w:rPr>
+            <w:rFonts w:ascii="Arial" w:hAnsi="Arial" w:cs="Arial"/>
+            <w:color w:val="0000FF"/>
+            <w:sz w:val="19"/>
+            <w:szCs w:val="19"/>
+            <w:u w:val="single"/>
+          </w:rPr>
+          <w:t xml:space="preserve">Read more</w:t>
+        </w:r>
+      </w:hyperlink>
+      <w:r>
+        <w:rPr>
+          <w:rFonts w:ascii="Arial" w:hAnsi="Arial"/>
+          <w:color w:val="000000"/>
+          <w:sz w:val="19"/>
+        </w:rPr>
+        <w:t>)</w:t>
+      </w:r>
+    </w:p>
+    <w:p>
+      <w:pPr>
+        <w:pStyle w:val="ListBullet"/>
+      </w:pPr>
+      <w:r>
+        <w:rPr>
+          <w:rFonts w:ascii="Arial" w:hAnsi="Arial"/>
+          <w:b/>
+          <w:color w:val="000000"/>
+          <w:sz w:val="19"/>
+        </w:rPr>
+        <w:t>Australian Energy Regulator</w:t>
+      </w:r>
+      <w:r>
+        <w:rPr>
+          <w:rFonts w:ascii="Arial" w:hAnsi="Arial"/>
+          <w:color w:val="000000"/>
+          <w:sz w:val="19"/>
+        </w:rPr>
+        <w:t xml:space="preserve"> - </w:t>
+      </w:r>
+      <w:r>
+        <w:rPr>
+          <w:rFonts w:ascii="Arial" w:hAnsi="Arial"/>
+          <w:color w:val="000000"/>
+          <w:sz w:val="19"/>
+        </w:rPr>
+        <w:t>The AER released its draft decision on the Powerlink electricity transmission determination for 2027 to 2032, including the post-tax revenue model that will shape network pricing across Queensland.</w:t>
+      </w:r>
+      <w:r>
+        <w:rPr>
+          <w:rFonts w:ascii="Arial" w:hAnsi="Arial"/>
+          <w:color w:val="000000"/>
+          <w:sz w:val="19"/>
+        </w:rPr>
+        <w:t xml:space="preserve"> (</w:t>
+      </w:r>
+      <w:hyperlink r:id="rId16">
+        <w:r>
+          <w:rPr>
+            <w:rFonts w:ascii="Arial" w:hAnsi="Arial" w:cs="Arial"/>
+            <w:color w:val="0000FF"/>
+            <w:sz w:val="19"/>
+            <w:szCs w:val="19"/>
+            <w:u w:val="single"/>
+          </w:rPr>
+          <w:t xml:space="preserve">Read more</w:t>
+        </w:r>
+      </w:hyperlink>
+      <w:r>
+        <w:rPr>
+          <w:rFonts w:ascii="Arial" w:hAnsi="Arial"/>
+          <w:color w:val="000000"/>
+          <w:sz w:val="19"/>
+        </w:rPr>
+        <w:t>)</w:t>
+      </w:r>
+    </w:p>
+    <w:p>
+      <w:pPr>
+        <w:pStyle w:val="ListBullet"/>
+      </w:pPr>
+      <w:r>
+        <w:rPr>
+          <w:rFonts w:ascii="Arial" w:hAnsi="Arial"/>
+          <w:b/>
+          <w:color w:val="000000"/>
+          <w:sz w:val="19"/>
+        </w:rPr>
+        <w:t>Australian Communications and Media Authority</w:t>
+      </w:r>
+      <w:r>
+        <w:rPr>
+          <w:rFonts w:ascii="Arial" w:hAnsi="Arial"/>
+          <w:color w:val="000000"/>
+          <w:sz w:val="19"/>
+        </w:rPr>
+        <w:t xml:space="preserve"> - </w:t>
+      </w:r>
+      <w:r>
+        <w:rPr>
+          <w:rFonts w:ascii="Arial" w:hAnsi="Arial"/>
+          <w:color w:val="000000"/>
+          <w:sz w:val="19"/>
+        </w:rPr>
+        <w:t>ACMA issued a formal warning to Magico Games N.V., operator of Bet Ninja, for breaching Australian gambling service obligations.</w:t>
+      </w:r>
+      <w:r>
+        <w:rPr>
+          <w:rFonts w:ascii="Arial" w:hAnsi="Arial"/>
+          <w:color w:val="000000"/>
+          <w:sz w:val="19"/>
+        </w:rPr>
+        <w:t xml:space="preserve"> (</w:t>
+      </w:r>
+      <w:hyperlink r:id="rId17">
+        <w:r>
+          <w:rPr>
+            <w:rFonts w:ascii="Arial" w:hAnsi="Arial" w:cs="Arial"/>
+            <w:color w:val="0000FF"/>
+            <w:sz w:val="19"/>
+            <w:szCs w:val="19"/>
+            <w:u w:val="single"/>
+          </w:rPr>
+          <w:t xml:space="preserve">Read more</w:t>
+        </w:r>
+      </w:hyperlink>
+      <w:r>
+        <w:rPr>
+          <w:rFonts w:ascii="Arial" w:hAnsi="Arial"/>
+          <w:color w:val="000000"/>
+          <w:sz w:val="19"/>
+        </w:rPr>
+        <w:t>)</w:t>
+      </w:r>
+    </w:p>
+    <w:p>
+      <w:pPr>
+        <w:pStyle w:val="ListBullet"/>
+      </w:pPr>
+      <w:r>
+        <w:rPr>
+          <w:rFonts w:ascii="Arial" w:hAnsi="Arial"/>
+          <w:b/>
+          <w:color w:val="000000"/>
+          <w:sz w:val="19"/>
+        </w:rPr>
+        <w:t>National Disability Insurance Agency</w:t>
+      </w:r>
+      <w:r>
+        <w:rPr>
+          <w:rFonts w:ascii="Arial" w:hAnsi="Arial"/>
+          <w:color w:val="000000"/>
+          <w:sz w:val="19"/>
+        </w:rPr>
+        <w:t xml:space="preserve"> - </w:t>
+      </w:r>
+      <w:r>
+        <w:rPr>
+          <w:rFonts w:ascii="Arial" w:hAnsi="Arial"/>
+          <w:color w:val="000000"/>
+          <w:sz w:val="19"/>
+        </w:rPr>
+        <w:t>The NDIA released a framework outlining legislative and structural reforms intended to place the NDIS on a sustainable long-term footing.</w:t>
+      </w:r>
+      <w:r>
+        <w:rPr>
+          <w:rFonts w:ascii="Arial" w:hAnsi="Arial"/>
+          <w:color w:val="000000"/>
+          <w:sz w:val="19"/>
+        </w:rPr>
+        <w:t xml:space="preserve"> (</w:t>
+      </w:r>
+      <w:hyperlink r:id="rId18">
+        <w:r>
+          <w:rPr>
+            <w:rFonts w:ascii="Arial" w:hAnsi="Arial" w:cs="Arial"/>
+            <w:color w:val="0000FF"/>
+            <w:sz w:val="19"/>
+            <w:szCs w:val="19"/>
+            <w:u w:val="single"/>
+          </w:rPr>
+          <w:t xml:space="preserve">Read more</w:t>
+        </w:r>
+      </w:hyperlink>
+      <w:r>
+        <w:rPr>
+          <w:rFonts w:ascii="Arial" w:hAnsi="Arial"/>
+          <w:color w:val="000000"/>
+          <w:sz w:val="19"/>
+        </w:rPr>
+        <w:t>)</w:t>
+      </w:r>
+    </w:p>
+    <w:p>
+      <w:pPr>
+        <w:pStyle w:val="ListBullet"/>
+      </w:pPr>
+      <w:r>
+        <w:rPr>
+          <w:rFonts w:ascii="Arial" w:hAnsi="Arial"/>
+          <w:b/>
+          <w:color w:val="000000"/>
+          <w:sz w:val="19"/>
+        </w:rPr>
+        <w:t>NDIS Quality and Safeguards Commission</w:t>
+      </w:r>
+      <w:r>
+        <w:rPr>
+          <w:rFonts w:ascii="Arial" w:hAnsi="Arial"/>
+          <w:color w:val="000000"/>
+          <w:sz w:val="19"/>
+        </w:rPr>
+        <w:t xml:space="preserve"> - </w:t>
+      </w:r>
+      <w:r>
+        <w:rPr>
+          <w:rFonts w:ascii="Arial" w:hAnsi="Arial"/>
+          <w:color w:val="000000"/>
+          <w:sz w:val="19"/>
+        </w:rPr>
+        <w:t>The NDIS Quality and Safeguards Commission released a new portal toolkit and a public compliance and enforcement actions search, increasing visibility of regulatory action against providers.</w:t>
+      </w:r>
+      <w:r>
+        <w:rPr>
+          <w:rFonts w:ascii="Arial" w:hAnsi="Arial"/>
+          <w:color w:val="000000"/>
+          <w:sz w:val="19"/>
+        </w:rPr>
+        <w:t xml:space="preserve"> (</w:t>
+      </w:r>
+      <w:hyperlink r:id="rId19">
+        <w:r>
+          <w:rPr>
+            <w:rFonts w:ascii="Arial" w:hAnsi="Arial" w:cs="Arial"/>
+            <w:color w:val="0000FF"/>
+            <w:sz w:val="19"/>
+            <w:szCs w:val="19"/>
+            <w:u w:val="single"/>
+          </w:rPr>
+          <w:t xml:space="preserve">Read more</w:t>
+        </w:r>
+      </w:hyperlink>
+      <w:r>
+        <w:rPr>
+          <w:rFonts w:ascii="Arial" w:hAnsi="Arial"/>
+          <w:color w:val="000000"/>
+          <w:sz w:val="19"/>
+        </w:rPr>
+        <w:t>)</w:t>
+      </w:r>
+    </w:p>
+    <w:p>
+      <w:pPr>
+        <w:pStyle w:val="ListBullet"/>
+      </w:pPr>
+      <w:r>
+        <w:rPr>
+          <w:rFonts w:ascii="Arial" w:hAnsi="Arial"/>
+          <w:b/>
+          <w:color w:val="000000"/>
+          <w:sz w:val="19"/>
+        </w:rPr>
+        <w:t>Department of the Treasury</w:t>
+      </w:r>
+      <w:r>
+        <w:rPr>
+          <w:rFonts w:ascii="Arial" w:hAnsi="Arial"/>
+          <w:color w:val="000000"/>
+          <w:sz w:val="19"/>
+        </w:rPr>
+        <w:t xml:space="preserve"> - </w:t>
+      </w:r>
+      <w:r>
+        <w:rPr>
+          <w:rFonts w:ascii="Arial" w:hAnsi="Arial"/>
+          <w:color w:val="000000"/>
+          <w:sz w:val="19"/>
+        </w:rPr>
+        <w:t>The Treasury opened a public consultation on tax administration, with COSBOA submitting a response calling for reforms to reduce compliance burden on small businesses.</w:t>
+      </w:r>
+    </w:p>
+    <w:p>
+      <w:pPr>
+        <w:pStyle w:val="ListBullet"/>
+      </w:pPr>
+      <w:r>
+        <w:rPr>
+          <w:rFonts w:ascii="Arial" w:hAnsi="Arial"/>
+          <w:b/>
+          <w:color w:val="000000"/>
+          <w:sz w:val="19"/>
+        </w:rPr>
+        <w:t>Australian Electoral Commission</w:t>
+      </w:r>
+      <w:r>
+        <w:rPr>
+          <w:rFonts w:ascii="Arial" w:hAnsi="Arial"/>
+          <w:color w:val="000000"/>
+          <w:sz w:val="19"/>
+        </w:rPr>
+        <w:t xml:space="preserve"> - </w:t>
+      </w:r>
+      <w:r>
+        <w:rPr>
+          <w:rFonts w:ascii="Arial" w:hAnsi="Arial"/>
+          <w:color w:val="000000"/>
+          <w:sz w:val="19"/>
+        </w:rPr>
+        <w:t>The Australian Electoral Commission lodged Submission 309 to the Joint Select Committee on Artificial Intelligence, setting out the AEC's position on AI risks and governance relevant to electoral…</w:t>
       </w:r>
     </w:p>
     <w:p>
@@ -153,11 +779,233 @@
       <w:r>
         <w:rPr>
           <w:rFonts w:ascii="Arial" w:hAnsi="Arial"/>
-          <w:i/>
-          <w:color w:val="666666"/>
+          <w:b/>
+          <w:color w:val="000000"/>
           <w:sz w:val="19"/>
         </w:rPr>
-        <w:t>No client-in-news signal this fortnight across any jurisdiction.</w:t>
+        <w:t>Victoria</w:t>
+      </w:r>
+    </w:p>
+    <w:p>
+      <w:pPr>
+        <w:pStyle w:val="ListBullet"/>
+      </w:pPr>
+      <w:r>
+        <w:rPr>
+          <w:rFonts w:ascii="Arial" w:hAnsi="Arial"/>
+          <w:b/>
+          <w:color w:val="000000"/>
+          <w:sz w:val="19"/>
+        </w:rPr>
+        <w:t>Essential Services Commission</w:t>
+      </w:r>
+      <w:r>
+        <w:rPr>
+          <w:rFonts w:ascii="Arial" w:hAnsi="Arial"/>
+          <w:color w:val="000000"/>
+          <w:sz w:val="19"/>
+        </w:rPr>
+        <w:t xml:space="preserve"> - </w:t>
+      </w:r>
+      <w:r>
+        <w:rPr>
+          <w:rFonts w:ascii="Arial" w:hAnsi="Arial"/>
+          <w:color w:val="000000"/>
+          <w:sz w:val="19"/>
+        </w:rPr>
+        <w:t>Midday Power Saver and new energy connection rules launched</w:t>
+      </w:r>
+    </w:p>
+    <w:p>
+      <w:pPr>
+        <w:pStyle w:val="ListBullet"/>
+      </w:pPr>
+      <w:r>
+        <w:rPr>
+          <w:rFonts w:ascii="Arial" w:hAnsi="Arial"/>
+          <w:b/>
+          <w:color w:val="000000"/>
+          <w:sz w:val="19"/>
+        </w:rPr>
+        <w:t>Independent Broad-based Anti-corruption Commission</w:t>
+      </w:r>
+      <w:r>
+        <w:rPr>
+          <w:rFonts w:ascii="Arial" w:hAnsi="Arial"/>
+          <w:color w:val="000000"/>
+          <w:sz w:val="19"/>
+        </w:rPr>
+        <w:t xml:space="preserve"> - </w:t>
+      </w:r>
+      <w:r>
+        <w:rPr>
+          <w:rFonts w:ascii="Arial" w:hAnsi="Arial"/>
+          <w:color w:val="000000"/>
+          <w:sz w:val="19"/>
+        </w:rPr>
+        <w:t>Scope of Victorian corruption watchdog widens, with legislative fast track</w:t>
+      </w:r>
+      <w:r>
+        <w:rPr>
+          <w:rFonts w:ascii="Arial" w:hAnsi="Arial"/>
+          <w:color w:val="000000"/>
+          <w:sz w:val="19"/>
+        </w:rPr>
+        <w:t xml:space="preserve"> (</w:t>
+      </w:r>
+      <w:hyperlink r:id="rId20">
+        <w:r>
+          <w:rPr>
+            <w:rFonts w:ascii="Arial" w:hAnsi="Arial" w:cs="Arial"/>
+            <w:color w:val="0000FF"/>
+            <w:sz w:val="19"/>
+            <w:szCs w:val="19"/>
+            <w:u w:val="single"/>
+          </w:rPr>
+          <w:t xml:space="preserve">Read more</w:t>
+        </w:r>
+      </w:hyperlink>
+      <w:r>
+        <w:rPr>
+          <w:rFonts w:ascii="Arial" w:hAnsi="Arial"/>
+          <w:color w:val="000000"/>
+          <w:sz w:val="19"/>
+        </w:rPr>
+        <w:t>)</w:t>
+      </w:r>
+    </w:p>
+    <w:p>
+      <w:pPr>
+        <w:pStyle w:val="ListBullet"/>
+      </w:pPr>
+      <w:r>
+        <w:rPr>
+          <w:rFonts w:ascii="Arial" w:hAnsi="Arial"/>
+          <w:b/>
+          <w:color w:val="000000"/>
+          <w:sz w:val="19"/>
+        </w:rPr>
+        <w:t>Consumer Affairs Victoria</w:t>
+      </w:r>
+      <w:r>
+        <w:rPr>
+          <w:rFonts w:ascii="Arial" w:hAnsi="Arial"/>
+          <w:color w:val="000000"/>
+          <w:sz w:val="19"/>
+        </w:rPr>
+        <w:t xml:space="preserve"> - </w:t>
+      </w:r>
+      <w:r>
+        <w:rPr>
+          <w:rFonts w:ascii="Arial" w:hAnsi="Arial"/>
+          <w:color w:val="000000"/>
+          <w:sz w:val="19"/>
+        </w:rPr>
+        <w:t>New underquoting and property sales laws take effect</w:t>
+      </w:r>
+    </w:p>
+    <w:p>
+      <w:pPr>
+        <w:pStyle w:val="body_letter"/>
+      </w:pPr>
+      <w:r>
+        <w:rPr>
+          <w:rFonts w:ascii="Arial" w:hAnsi="Arial"/>
+          <w:b/>
+          <w:color w:val="000000"/>
+          <w:sz w:val="19"/>
+        </w:rPr>
+        <w:t>Commonwealth</w:t>
+      </w:r>
+    </w:p>
+    <w:p>
+      <w:pPr>
+        <w:pStyle w:val="ListBullet"/>
+      </w:pPr>
+      <w:r>
+        <w:rPr>
+          <w:rFonts w:ascii="Arial" w:hAnsi="Arial"/>
+          <w:b/>
+          <w:color w:val="000000"/>
+          <w:sz w:val="19"/>
+        </w:rPr>
+        <w:t>Australian Securities and Investments Commission</w:t>
+      </w:r>
+      <w:r>
+        <w:rPr>
+          <w:rFonts w:ascii="Arial" w:hAnsi="Arial"/>
+          <w:color w:val="000000"/>
+          <w:sz w:val="19"/>
+        </w:rPr>
+        <w:t xml:space="preserve"> - </w:t>
+      </w:r>
+      <w:r>
+        <w:rPr>
+          <w:rFonts w:ascii="Arial" w:hAnsi="Arial"/>
+          <w:color w:val="000000"/>
+          <w:sz w:val="19"/>
+        </w:rPr>
+        <w:t>ASIC releases 2026-27 supervisory priorities</w:t>
+      </w:r>
+    </w:p>
+    <w:p>
+      <w:pPr>
+        <w:pStyle w:val="ListBullet"/>
+      </w:pPr>
+      <w:r>
+        <w:rPr>
+          <w:rFonts w:ascii="Arial" w:hAnsi="Arial"/>
+          <w:b/>
+          <w:color w:val="000000"/>
+          <w:sz w:val="19"/>
+        </w:rPr>
+        <w:t>Australian Prudential Regulation Authority</w:t>
+      </w:r>
+      <w:r>
+        <w:rPr>
+          <w:rFonts w:ascii="Arial" w:hAnsi="Arial"/>
+          <w:color w:val="000000"/>
+          <w:sz w:val="19"/>
+        </w:rPr>
+        <w:t xml:space="preserve"> - </w:t>
+      </w:r>
+      <w:r>
+        <w:rPr>
+          <w:rFonts w:ascii="Arial" w:hAnsi="Arial"/>
+          <w:color w:val="000000"/>
+          <w:sz w:val="19"/>
+        </w:rPr>
+        <w:t>APRA issues heightened risk warning on private credit</w:t>
+      </w:r>
+    </w:p>
+    <w:p>
+      <w:pPr>
+        <w:pStyle w:val="ListBullet"/>
+      </w:pPr>
+      <w:r>
+        <w:rPr>
+          <w:rFonts w:ascii="Arial" w:hAnsi="Arial"/>
+          <w:b/>
+          <w:color w:val="000000"/>
+          <w:sz w:val="19"/>
+        </w:rPr>
+        <w:t>Comcare</w:t>
+      </w:r>
+      <w:r>
+        <w:rPr>
+          <w:rFonts w:ascii="Arial" w:hAnsi="Arial"/>
+          <w:color w:val="000000"/>
+          <w:sz w:val="19"/>
+        </w:rPr>
+        <w:t xml:space="preserve"> - </w:t>
+      </w:r>
+      <w:r>
+        <w:rPr>
+          <w:rFonts w:ascii="Arial" w:hAnsi="Arial"/>
+          <w:color w:val="000000"/>
+          <w:sz w:val="19"/>
+        </w:rPr>
+        <w:t>Comcare charges Defence over naval base crane incident</w:t>
       </w:r>
     </w:p>
     <w:p>
@@ -246,16 +1094,206 @@
     </w:p>
     <w:p>
       <w:pPr>
-        <w:pStyle w:val="body_letter"/>
+        <w:pStyle w:val="ListBullet"/>
       </w:pPr>
       <w:r>
         <w:rPr>
           <w:rFonts w:ascii="Arial" w:hAnsi="Arial"/>
-          <w:i/>
-          <w:color w:val="666666"/>
+          <w:b/>
+          <w:color w:val="000000"/>
           <w:sz w:val="19"/>
         </w:rPr>
-        <w:t>No emerging risks signal this fortnight.</w:t>
+        <w:t>APRA flags private credit risks for super trustees</w:t>
+      </w:r>
+      <w:r>
+        <w:rPr>
+          <w:rFonts w:ascii="Arial" w:hAnsi="Arial"/>
+          <w:color w:val="000000"/>
+          <w:sz w:val="19"/>
+        </w:rPr>
+        <w:t xml:space="preserve"> - </w:t>
+      </w:r>
+      <w:r>
+        <w:rPr>
+          <w:rFonts w:ascii="Arial" w:hAnsi="Arial"/>
+          <w:color w:val="000000"/>
+          <w:sz w:val="19"/>
+        </w:rPr>
+        <w:t>APRA has issued a heightened-risk warning on private credit, signalling proposed reforms and strict new investment limits for superannuation trustees exposed to illiquid assets.</w:t>
+      </w:r>
+    </w:p>
+    <w:p>
+      <w:pPr>
+        <w:pStyle w:val="ListBullet"/>
+      </w:pPr>
+      <w:r>
+        <w:rPr>
+          <w:rFonts w:ascii="Arial" w:hAnsi="Arial"/>
+          <w:b/>
+          <w:color w:val="000000"/>
+          <w:sz w:val="19"/>
+        </w:rPr>
+        <w:t>APRA reforms to hit platforms hardest</w:t>
+      </w:r>
+      <w:r>
+        <w:rPr>
+          <w:rFonts w:ascii="Arial" w:hAnsi="Arial"/>
+          <w:color w:val="000000"/>
+          <w:sz w:val="19"/>
+        </w:rPr>
+        <w:t xml:space="preserve"> - </w:t>
+      </w:r>
+      <w:r>
+        <w:rPr>
+          <w:rFonts w:ascii="Arial" w:hAnsi="Arial"/>
+          <w:color w:val="000000"/>
+          <w:sz w:val="19"/>
+        </w:rPr>
+        <w:t>APRA has indicated that its proposed prudential reforms will fall most heavily on investment platforms, requiring trustees and platform operators to reassess risk and capital frameworks.</w:t>
+      </w:r>
+      <w:r>
+        <w:rPr>
+          <w:rFonts w:ascii="Arial" w:hAnsi="Arial"/>
+          <w:color w:val="000000"/>
+          <w:sz w:val="19"/>
+        </w:rPr>
+        <w:t xml:space="preserve"> (</w:t>
+      </w:r>
+      <w:hyperlink r:id="rId21">
+        <w:r>
+          <w:rPr>
+            <w:rFonts w:ascii="Arial" w:hAnsi="Arial" w:cs="Arial"/>
+            <w:color w:val="0000FF"/>
+            <w:sz w:val="19"/>
+            <w:szCs w:val="19"/>
+            <w:u w:val="single"/>
+          </w:rPr>
+          <w:t xml:space="preserve">Read more</w:t>
+        </w:r>
+      </w:hyperlink>
+      <w:r>
+        <w:rPr>
+          <w:rFonts w:ascii="Arial" w:hAnsi="Arial"/>
+          <w:color w:val="000000"/>
+          <w:sz w:val="19"/>
+        </w:rPr>
+        <w:t>)</w:t>
+      </w:r>
+    </w:p>
+    <w:p>
+      <w:pPr>
+        <w:pStyle w:val="ListBullet"/>
+      </w:pPr>
+      <w:r>
+        <w:rPr>
+          <w:rFonts w:ascii="Arial" w:hAnsi="Arial"/>
+          <w:b/>
+          <w:color w:val="000000"/>
+          <w:sz w:val="19"/>
+        </w:rPr>
+        <w:t>ATSB highlights crew fatigue risk on domestic ferries</w:t>
+      </w:r>
+      <w:r>
+        <w:rPr>
+          <w:rFonts w:ascii="Arial" w:hAnsi="Arial"/>
+          <w:color w:val="000000"/>
+          <w:sz w:val="19"/>
+        </w:rPr>
+        <w:t xml:space="preserve"> - </w:t>
+      </w:r>
+      <w:r>
+        <w:rPr>
+          <w:rFonts w:ascii="Arial" w:hAnsi="Arial"/>
+          <w:color w:val="000000"/>
+          <w:sz w:val="19"/>
+        </w:rPr>
+        <w:t>The ATSB has published a safety concern report identifying crew fatigue as a systemic risk in domestic commercial passenger and vehicle ferry operations, calling for stronger fatigue management…</w:t>
+      </w:r>
+      <w:r>
+        <w:rPr>
+          <w:rFonts w:ascii="Arial" w:hAnsi="Arial"/>
+          <w:color w:val="000000"/>
+          <w:sz w:val="19"/>
+        </w:rPr>
+        <w:t xml:space="preserve"> (</w:t>
+      </w:r>
+      <w:hyperlink r:id="rId22">
+        <w:r>
+          <w:rPr>
+            <w:rFonts w:ascii="Arial" w:hAnsi="Arial" w:cs="Arial"/>
+            <w:color w:val="0000FF"/>
+            <w:sz w:val="19"/>
+            <w:szCs w:val="19"/>
+            <w:u w:val="single"/>
+          </w:rPr>
+          <w:t xml:space="preserve">Read more</w:t>
+        </w:r>
+      </w:hyperlink>
+      <w:r>
+        <w:rPr>
+          <w:rFonts w:ascii="Arial" w:hAnsi="Arial"/>
+          <w:color w:val="000000"/>
+          <w:sz w:val="19"/>
+        </w:rPr>
+        <w:t>)</w:t>
+      </w:r>
+    </w:p>
+    <w:p>
+      <w:pPr>
+        <w:pStyle w:val="ListBullet"/>
+      </w:pPr>
+      <w:r>
+        <w:rPr>
+          <w:rFonts w:ascii="Arial" w:hAnsi="Arial"/>
+          <w:b/>
+          <w:color w:val="000000"/>
+          <w:sz w:val="19"/>
+        </w:rPr>
+        <w:t>Port Botany train collision report flags risk management gaps</w:t>
+      </w:r>
+      <w:r>
+        <w:rPr>
+          <w:rFonts w:ascii="Arial" w:hAnsi="Arial"/>
+          <w:color w:val="000000"/>
+          <w:sz w:val="19"/>
+        </w:rPr>
+        <w:t xml:space="preserve"> - </w:t>
+      </w:r>
+      <w:r>
+        <w:rPr>
+          <w:rFonts w:ascii="Arial" w:hAnsi="Arial"/>
+          <w:color w:val="000000"/>
+          <w:sz w:val="19"/>
+        </w:rPr>
+        <w:t>The ATSB's investigation into the Port Botany freight train collision found deficiencies in risk management procedures, underscoring the need for operators to strengthen safety governance frameworks.</w:t>
+      </w:r>
+      <w:r>
+        <w:rPr>
+          <w:rFonts w:ascii="Arial" w:hAnsi="Arial"/>
+          <w:color w:val="000000"/>
+          <w:sz w:val="19"/>
+        </w:rPr>
+        <w:t xml:space="preserve"> (</w:t>
+      </w:r>
+      <w:hyperlink r:id="rId23">
+        <w:r>
+          <w:rPr>
+            <w:rFonts w:ascii="Arial" w:hAnsi="Arial" w:cs="Arial"/>
+            <w:color w:val="0000FF"/>
+            <w:sz w:val="19"/>
+            <w:szCs w:val="19"/>
+            <w:u w:val="single"/>
+          </w:rPr>
+          <w:t xml:space="preserve">Read more</w:t>
+        </w:r>
+      </w:hyperlink>
+      <w:r>
+        <w:rPr>
+          <w:rFonts w:ascii="Arial" w:hAnsi="Arial"/>
+          <w:color w:val="000000"/>
+          <w:sz w:val="19"/>
+        </w:rPr>
+        <w:t>)</w:t>
       </w:r>
     </w:p>
     <w:p>
@@ -274,16 +1312,176 @@
     </w:p>
     <w:p>
       <w:pPr>
-        <w:pStyle w:val="body_letter"/>
+        <w:pStyle w:val="ListBullet"/>
       </w:pPr>
       <w:r>
         <w:rPr>
           <w:rFonts w:ascii="Arial" w:hAnsi="Arial"/>
-          <w:i/>
-          <w:color w:val="666666"/>
+          <w:b/>
+          <w:color w:val="000000"/>
           <w:sz w:val="19"/>
         </w:rPr>
-        <w:t>No ai adoption signal this fortnight.</w:t>
+        <w:t>ABA submission to AI Joint Select Committee</w:t>
+      </w:r>
+      <w:r>
+        <w:rPr>
+          <w:rFonts w:ascii="Arial" w:hAnsi="Arial"/>
+          <w:color w:val="000000"/>
+          <w:sz w:val="19"/>
+        </w:rPr>
+        <w:t xml:space="preserve"> - </w:t>
+      </w:r>
+      <w:r>
+        <w:rPr>
+          <w:rFonts w:ascii="Arial" w:hAnsi="Arial"/>
+          <w:color w:val="000000"/>
+          <w:sz w:val="19"/>
+        </w:rPr>
+        <w:t>The Australian Banking Association has submitted to the Joint Select Committee on Artificial Intelligence, calling for a risk-proportionate regulatory framework that enables banks to adopt AI…</w:t>
+      </w:r>
+      <w:r>
+        <w:rPr>
+          <w:rFonts w:ascii="Arial" w:hAnsi="Arial"/>
+          <w:color w:val="000000"/>
+          <w:sz w:val="19"/>
+        </w:rPr>
+        <w:t xml:space="preserve"> (</w:t>
+      </w:r>
+      <w:hyperlink r:id="rId24">
+        <w:r>
+          <w:rPr>
+            <w:rFonts w:ascii="Arial" w:hAnsi="Arial" w:cs="Arial"/>
+            <w:color w:val="0000FF"/>
+            <w:sz w:val="19"/>
+            <w:szCs w:val="19"/>
+            <w:u w:val="single"/>
+          </w:rPr>
+          <w:t xml:space="preserve">Read more</w:t>
+        </w:r>
+      </w:hyperlink>
+      <w:r>
+        <w:rPr>
+          <w:rFonts w:ascii="Arial" w:hAnsi="Arial"/>
+          <w:color w:val="000000"/>
+          <w:sz w:val="19"/>
+        </w:rPr>
+        <w:t>)</w:t>
+      </w:r>
+    </w:p>
+    <w:p>
+      <w:pPr>
+        <w:pStyle w:val="ListBullet"/>
+      </w:pPr>
+      <w:r>
+        <w:rPr>
+          <w:rFonts w:ascii="Arial" w:hAnsi="Arial"/>
+          <w:b/>
+          <w:color w:val="000000"/>
+          <w:sz w:val="19"/>
+        </w:rPr>
+        <w:t>ASQA publishes AI principles for training providers</w:t>
+      </w:r>
+      <w:r>
+        <w:rPr>
+          <w:rFonts w:ascii="Arial" w:hAnsi="Arial"/>
+          <w:color w:val="000000"/>
+          <w:sz w:val="19"/>
+        </w:rPr>
+        <w:t xml:space="preserve"> - </w:t>
+      </w:r>
+      <w:r>
+        <w:rPr>
+          <w:rFonts w:ascii="Arial" w:hAnsi="Arial"/>
+          <w:color w:val="000000"/>
+          <w:sz w:val="19"/>
+        </w:rPr>
+        <w:t>ASQA has released AI principles for registered training organisations, setting out governance and integrity expectations for AI use in early childhood educator training and assessment.</w:t>
+      </w:r>
+      <w:r>
+        <w:rPr>
+          <w:rFonts w:ascii="Arial" w:hAnsi="Arial"/>
+          <w:color w:val="000000"/>
+          <w:sz w:val="19"/>
+        </w:rPr>
+        <w:t xml:space="preserve"> (</w:t>
+      </w:r>
+      <w:hyperlink r:id="rId25">
+        <w:r>
+          <w:rPr>
+            <w:rFonts w:ascii="Arial" w:hAnsi="Arial" w:cs="Arial"/>
+            <w:color w:val="0000FF"/>
+            <w:sz w:val="19"/>
+            <w:szCs w:val="19"/>
+            <w:u w:val="single"/>
+          </w:rPr>
+          <w:t xml:space="preserve">Read more</w:t>
+        </w:r>
+      </w:hyperlink>
+      <w:r>
+        <w:rPr>
+          <w:rFonts w:ascii="Arial" w:hAnsi="Arial"/>
+          <w:color w:val="000000"/>
+          <w:sz w:val="19"/>
+        </w:rPr>
+        <w:t>)</w:t>
+      </w:r>
+    </w:p>
+    <w:p>
+      <w:pPr>
+        <w:pStyle w:val="ListBullet"/>
+      </w:pPr>
+      <w:r>
+        <w:rPr>
+          <w:rFonts w:ascii="Arial" w:hAnsi="Arial"/>
+          <w:b/>
+          <w:color w:val="000000"/>
+          <w:sz w:val="19"/>
+        </w:rPr>
+        <w:t>CASA consults on drone operations above 400 ft</w:t>
+      </w:r>
+      <w:r>
+        <w:rPr>
+          <w:rFonts w:ascii="Arial" w:hAnsi="Arial"/>
+          <w:color w:val="000000"/>
+          <w:sz w:val="19"/>
+        </w:rPr>
+        <w:t xml:space="preserve"> - </w:t>
+      </w:r>
+      <w:r>
+        <w:rPr>
+          <w:rFonts w:ascii="Arial" w:hAnsi="Arial"/>
+          <w:color w:val="000000"/>
+          <w:sz w:val="19"/>
+        </w:rPr>
+        <w:t>CASA has used stakeholder feedback to shape a new regulatory framework for drone operations above 400 feet, balancing innovation enablement with airspace safety and risk management requirements.</w:t>
+      </w:r>
+      <w:r>
+        <w:rPr>
+          <w:rFonts w:ascii="Arial" w:hAnsi="Arial"/>
+          <w:color w:val="000000"/>
+          <w:sz w:val="19"/>
+        </w:rPr>
+        <w:t xml:space="preserve"> (</w:t>
+      </w:r>
+      <w:hyperlink r:id="rId26">
+        <w:r>
+          <w:rPr>
+            <w:rFonts w:ascii="Arial" w:hAnsi="Arial" w:cs="Arial"/>
+            <w:color w:val="0000FF"/>
+            <w:sz w:val="19"/>
+            <w:szCs w:val="19"/>
+            <w:u w:val="single"/>
+          </w:rPr>
+          <w:t xml:space="preserve">Read more</w:t>
+        </w:r>
+      </w:hyperlink>
+      <w:r>
+        <w:rPr>
+          <w:rFonts w:ascii="Arial" w:hAnsi="Arial"/>
+          <w:color w:val="000000"/>
+          <w:sz w:val="19"/>
+        </w:rPr>
+        <w:t>)</w:t>
       </w:r>
     </w:p>
     <w:p>
@@ -302,16 +1500,234 @@
     </w:p>
     <w:p>
       <w:pPr>
-        <w:pStyle w:val="body_letter"/>
+        <w:pStyle w:val="ListBullet"/>
       </w:pPr>
       <w:r>
         <w:rPr>
           <w:rFonts w:ascii="Arial" w:hAnsi="Arial"/>
-          <w:i/>
-          <w:color w:val="666666"/>
+          <w:b/>
+          <w:color w:val="000000"/>
           <w:sz w:val="19"/>
         </w:rPr>
-        <w:t>No regulatory burden signal this fortnight.</w:t>
+        <w:t>ASIC releases 2026-27 supervisory priorities</w:t>
+      </w:r>
+      <w:r>
+        <w:rPr>
+          <w:rFonts w:ascii="Arial" w:hAnsi="Arial"/>
+          <w:color w:val="000000"/>
+          <w:sz w:val="19"/>
+        </w:rPr>
+        <w:t xml:space="preserve"> - </w:t>
+      </w:r>
+      <w:r>
+        <w:rPr>
+          <w:rFonts w:ascii="Arial" w:hAnsi="Arial"/>
+          <w:color w:val="000000"/>
+          <w:sz w:val="19"/>
+        </w:rPr>
+        <w:t>ASIC has published its 2026-27 supervisory priorities to give industry greater certainty and support a better regulation agenda, focusing enforcement resources on consumer harm and market integrity.</w:t>
+      </w:r>
+      <w:r>
+        <w:rPr>
+          <w:rFonts w:ascii="Arial" w:hAnsi="Arial"/>
+          <w:color w:val="000000"/>
+          <w:sz w:val="19"/>
+        </w:rPr>
+        <w:t xml:space="preserve"> (</w:t>
+      </w:r>
+      <w:hyperlink r:id="rId27">
+        <w:r>
+          <w:rPr>
+            <w:rFonts w:ascii="Arial" w:hAnsi="Arial" w:cs="Arial"/>
+            <w:color w:val="0000FF"/>
+            <w:sz w:val="19"/>
+            <w:szCs w:val="19"/>
+            <w:u w:val="single"/>
+          </w:rPr>
+          <w:t xml:space="preserve">Read more</w:t>
+        </w:r>
+      </w:hyperlink>
+      <w:r>
+        <w:rPr>
+          <w:rFonts w:ascii="Arial" w:hAnsi="Arial"/>
+          <w:color w:val="000000"/>
+          <w:sz w:val="19"/>
+        </w:rPr>
+        <w:t>)</w:t>
+      </w:r>
+    </w:p>
+    <w:p>
+      <w:pPr>
+        <w:pStyle w:val="ListBullet"/>
+      </w:pPr>
+      <w:r>
+        <w:rPr>
+          <w:rFonts w:ascii="Arial" w:hAnsi="Arial"/>
+          <w:b/>
+          <w:color w:val="000000"/>
+          <w:sz w:val="19"/>
+        </w:rPr>
+        <w:t>Financial Advice Reform Bill advances</w:t>
+      </w:r>
+      <w:r>
+        <w:rPr>
+          <w:rFonts w:ascii="Arial" w:hAnsi="Arial"/>
+          <w:color w:val="000000"/>
+          <w:sz w:val="19"/>
+        </w:rPr>
+        <w:t xml:space="preserve"> - </w:t>
+      </w:r>
+      <w:r>
+        <w:rPr>
+          <w:rFonts w:ascii="Arial" w:hAnsi="Arial"/>
+          <w:color w:val="000000"/>
+          <w:sz w:val="19"/>
+        </w:rPr>
+        <w:t>The FSC has welcomed the Financial Advice Reform Bill as a meaningful step toward reducing compliance costs and broadening access to affordable financial advice for Australian consumers.</w:t>
+      </w:r>
+      <w:r>
+        <w:rPr>
+          <w:rFonts w:ascii="Arial" w:hAnsi="Arial"/>
+          <w:color w:val="000000"/>
+          <w:sz w:val="19"/>
+        </w:rPr>
+        <w:t xml:space="preserve"> (</w:t>
+      </w:r>
+      <w:hyperlink r:id="rId28">
+        <w:r>
+          <w:rPr>
+            <w:rFonts w:ascii="Arial" w:hAnsi="Arial" w:cs="Arial"/>
+            <w:color w:val="0000FF"/>
+            <w:sz w:val="19"/>
+            <w:szCs w:val="19"/>
+            <w:u w:val="single"/>
+          </w:rPr>
+          <w:t xml:space="preserve">Read more</w:t>
+        </w:r>
+      </w:hyperlink>
+      <w:r>
+        <w:rPr>
+          <w:rFonts w:ascii="Arial" w:hAnsi="Arial"/>
+          <w:color w:val="000000"/>
+          <w:sz w:val="19"/>
+        </w:rPr>
+        <w:t>)</w:t>
+      </w:r>
+    </w:p>
+    <w:p>
+      <w:pPr>
+        <w:pStyle w:val="ListBullet"/>
+      </w:pPr>
+      <w:r>
+        <w:rPr>
+          <w:rFonts w:ascii="Arial" w:hAnsi="Arial"/>
+          <w:b/>
+          <w:color w:val="000000"/>
+          <w:sz w:val="19"/>
+        </w:rPr>
+        <w:t>Surcharge ban reshapes bank rewards programs</w:t>
+      </w:r>
+      <w:r>
+        <w:rPr>
+          <w:rFonts w:ascii="Arial" w:hAnsi="Arial"/>
+          <w:color w:val="000000"/>
+          <w:sz w:val="19"/>
+        </w:rPr>
+        <w:t xml:space="preserve"> - </w:t>
+      </w:r>
+      <w:r>
+        <w:rPr>
+          <w:rFonts w:ascii="Arial" w:hAnsi="Arial"/>
+          <w:color w:val="000000"/>
+          <w:sz w:val="19"/>
+        </w:rPr>
+        <w:t>The federal surcharge ban has prompted major banks to cut rewards programs and complimentary travel insurance as reduced interchange fee revenue flows through to product design.</w:t>
+      </w:r>
+      <w:r>
+        <w:rPr>
+          <w:rFonts w:ascii="Arial" w:hAnsi="Arial"/>
+          <w:color w:val="000000"/>
+          <w:sz w:val="19"/>
+        </w:rPr>
+        <w:t xml:space="preserve"> (</w:t>
+      </w:r>
+      <w:hyperlink r:id="rId29">
+        <w:r>
+          <w:rPr>
+            <w:rFonts w:ascii="Arial" w:hAnsi="Arial" w:cs="Arial"/>
+            <w:color w:val="0000FF"/>
+            <w:sz w:val="19"/>
+            <w:szCs w:val="19"/>
+            <w:u w:val="single"/>
+          </w:rPr>
+          <w:t xml:space="preserve">Read more</w:t>
+        </w:r>
+      </w:hyperlink>
+      <w:r>
+        <w:rPr>
+          <w:rFonts w:ascii="Arial" w:hAnsi="Arial"/>
+          <w:color w:val="000000"/>
+          <w:sz w:val="19"/>
+        </w:rPr>
+        <w:t>)</w:t>
+      </w:r>
+    </w:p>
+    <w:p>
+      <w:pPr>
+        <w:pStyle w:val="ListBullet"/>
+      </w:pPr>
+      <w:r>
+        <w:rPr>
+          <w:rFonts w:ascii="Arial" w:hAnsi="Arial"/>
+          <w:b/>
+          <w:color w:val="000000"/>
+          <w:sz w:val="19"/>
+        </w:rPr>
+        <w:t>New payment models face broader licensing regime</w:t>
+      </w:r>
+      <w:r>
+        <w:rPr>
+          <w:rFonts w:ascii="Arial" w:hAnsi="Arial"/>
+          <w:color w:val="000000"/>
+          <w:sz w:val="19"/>
+        </w:rPr>
+        <w:t xml:space="preserve"> - </w:t>
+      </w:r>
+      <w:r>
+        <w:rPr>
+          <w:rFonts w:ascii="Arial" w:hAnsi="Arial"/>
+          <w:color w:val="000000"/>
+          <w:sz w:val="19"/>
+        </w:rPr>
+        <w:t>Proposed reforms will extend licensing obligations to a wider range of payment service providers in Australia, increasing compliance obligations for fintechs and non-bank payment operators.</w:t>
+      </w:r>
+      <w:r>
+        <w:rPr>
+          <w:rFonts w:ascii="Arial" w:hAnsi="Arial"/>
+          <w:color w:val="000000"/>
+          <w:sz w:val="19"/>
+        </w:rPr>
+        <w:t xml:space="preserve"> (</w:t>
+      </w:r>
+      <w:hyperlink r:id="rId30">
+        <w:r>
+          <w:rPr>
+            <w:rFonts w:ascii="Arial" w:hAnsi="Arial" w:cs="Arial"/>
+            <w:color w:val="0000FF"/>
+            <w:sz w:val="19"/>
+            <w:szCs w:val="19"/>
+            <w:u w:val="single"/>
+          </w:rPr>
+          <w:t xml:space="preserve">Read more</w:t>
+        </w:r>
+      </w:hyperlink>
+      <w:r>
+        <w:rPr>
+          <w:rFonts w:ascii="Arial" w:hAnsi="Arial"/>
+          <w:color w:val="000000"/>
+          <w:sz w:val="19"/>
+        </w:rPr>
+        <w:t>)</w:t>
       </w:r>
     </w:p>
     <w:p>
@@ -363,6 +1779,20 @@
       <w:r>
         <w:rPr>
           <w:rFonts w:ascii="Arial" w:hAnsi="Arial"/>
+          <w:b w:val="0"/>
+          <w:color w:val="000000"/>
+          <w:sz w:val="19"/>
+        </w:rPr>
+        <w:t>The fortnight is shaped by three converging regulator investment themes: enforcement escalation across ASIC, TEQSA, AUSTRAC, and ACQSC converting supervisory intent into active action; AI governance acceleration driven by a Commonwealth health-system breach, the AEC inquiry, ABA submission, and ASQA principles creating a cross-sector AI risk mandate; and structural reform execution with the Financial Advice Reform Bill, NDIS sustainability redesign, defence procurement reset, and AUKUS leasing alternatives all shifting from policy to implementation. ASIC's 2026-27 supervisory priorities and life insurance sector paper name specific product governance and sustainable finance disclosure obligations that will drive near-term compliance uplift demand across banks, platforms, and insurers. APRA's simultaneous private credit risk warning and proposed reforms expected to land hardest on platform operators create a two-front assurance and risk advisory mandate for mid-tier ADIs and superannuation trustees, the target list is now named. The ATSB's Port Botany findings and AMSA's emissions reduction plan signal transport regulators converting investigation outcomes into enforceable standards, opening the SMS uplift and maritime compliance readiness window before deadlines crystallise. TEQSA's updated Compliance and Enforcement Policy paired with active enforcement against OneGlobe and Opulence marks a structural shift in higher education regulatory risk that peers of those providers must now address. KPMG should concentrate BD effort this fortnight on financial services platform operators, rail and maritime clients, mid-tier higher education providers, and Commonwealth health and defence clients, all facing live compliance deadlines or active regulatory scrutiny.</w:t>
+      </w:r>
+    </w:p>
+    <w:p>
+      <w:pPr>
+        <w:pStyle w:val="body_letter"/>
+      </w:pPr>
+      <w:r>
+        <w:rPr>
+          <w:rFonts w:ascii="Arial" w:hAnsi="Arial"/>
           <w:b/>
           <w:color w:val="000000"/>
           <w:sz w:val="19"/>
@@ -380,7 +1810,7 @@
           <w:color w:val="000000"/>
           <w:sz w:val="19"/>
         </w:rPr>
-        <w:t>Brief the relevant sector partner this fortnight on the highest-signal regulator development above.</w:t>
+        <w:t>Brief the financial services regulatory advisory team to approach the top-15 platform operators and superannuation trustees this week with a targeted APRA/ASIC compliance gap assessment mapped to the 2026-27 supervisory priorities and the proposed platform reforms.</w:t>
       </w:r>
     </w:p>
     <w:p>
@@ -393,7 +1823,7 @@
           <w:color w:val="000000"/>
           <w:sz w:val="19"/>
         </w:rPr>
-        <w:t>Convene the capability bench for the next reg-tech / capability-review pursuit in pipeline.</w:t>
+        <w:t>Activate the credit risk advisory bench to convert APRA's named private credit warning into a structured credit-risk framework review offer for mid-tier ADIs and super funds with material private credit exposure.</w:t>
       </w:r>
     </w:p>
     <w:p>
@@ -406,7 +1836,112 @@
           <w:color w:val="000000"/>
           <w:sz w:val="19"/>
         </w:rPr>
-        <w:t>Pursue at least one tracked client on a near-term advisory hook before the next CoP cadence.</w:t>
+        <w:t>Dispatch the transport safety practice to Sydney Trains, Australian Rail Track Corporation, and Patrick Terminals with a Safety Management System gap assessment anchored to the ATSB's Port Botany procedural findings before the regulator formalises its follow-up expectations.</w:t>
+      </w:r>
+    </w:p>
+    <w:p>
+      <w:pPr>
+        <w:pStyle w:val="ListBullet"/>
+      </w:pPr>
+      <w:r>
+        <w:rPr>
+          <w:rFonts w:ascii="Arial" w:hAnsi="Arial"/>
+          <w:color w:val="000000"/>
+          <w:sz w:val="19"/>
+        </w:rPr>
+        <w:t>Convene the higher education practice to pipeline the 50 closest peers of OneGlobe and Opulence for an urgent TEQSA registration risk review, positioning KPMG as the go-to adviser for providers facing the updated Compliance and Enforcement Policy.</w:t>
+      </w:r>
+    </w:p>
+    <w:p>
+      <w:pPr>
+        <w:pStyle w:val="ListBullet"/>
+      </w:pPr>
+      <w:r>
+        <w:rPr>
+          <w:rFonts w:ascii="Arial" w:hAnsi="Arial"/>
+          <w:color w:val="000000"/>
+          <w:sz w:val="19"/>
+        </w:rPr>
+        <w:t>Accelerate the AI risk advisory offer into health, financial services, and education simultaneously, the OpenAI health breach, ABA inquiry submission, and ASQA AI principles have created a rare moment where Commonwealth and state clients in three sectors are seeking the same capability concurrently.</w:t>
+      </w:r>
+    </w:p>
+    <w:p>
+      <w:pPr>
+        <w:pStyle w:val="body_letter"/>
+      </w:pPr>
+      <w:r>
+        <w:rPr>
+          <w:rFonts w:ascii="Arial" w:hAnsi="Arial"/>
+          <w:b/>
+          <w:color w:val="000000"/>
+          <w:sz w:val="19"/>
+        </w:rPr>
+        <w:t>Implications for clients</w:t>
+      </w:r>
+    </w:p>
+    <w:p>
+      <w:pPr>
+        <w:pStyle w:val="ListBullet"/>
+      </w:pPr>
+      <w:r>
+        <w:rPr>
+          <w:rFonts w:ascii="Arial" w:hAnsi="Arial"/>
+          <w:color w:val="000000"/>
+          <w:sz w:val="19"/>
+        </w:rPr>
+        <w:t>Brief the financial services regulatory advisory team to approach the top-15 platform operators and superannuation trustees this week with a targeted APRA/ASIC compliance gap assessment mapped to the 2026-27 supervisory priorities and the proposed platform reforms.</w:t>
+      </w:r>
+    </w:p>
+    <w:p>
+      <w:pPr>
+        <w:pStyle w:val="ListBullet"/>
+      </w:pPr>
+      <w:r>
+        <w:rPr>
+          <w:rFonts w:ascii="Arial" w:hAnsi="Arial"/>
+          <w:color w:val="000000"/>
+          <w:sz w:val="19"/>
+        </w:rPr>
+        <w:t>Activate the credit risk advisory bench to convert APRA's named private credit warning into a structured credit-risk framework review offer for mid-tier ADIs and super funds with material private credit exposure.</w:t>
+      </w:r>
+    </w:p>
+    <w:p>
+      <w:pPr>
+        <w:pStyle w:val="ListBullet"/>
+      </w:pPr>
+      <w:r>
+        <w:rPr>
+          <w:rFonts w:ascii="Arial" w:hAnsi="Arial"/>
+          <w:color w:val="000000"/>
+          <w:sz w:val="19"/>
+        </w:rPr>
+        <w:t>Dispatch the transport safety practice to Sydney Trains, Australian Rail Track Corporation, and Patrick Terminals with a Safety Management System gap assessment anchored to the ATSB's Port Botany procedural findings before the regulator formalises its follow-up expectations.</w:t>
+      </w:r>
+    </w:p>
+    <w:p>
+      <w:pPr>
+        <w:pStyle w:val="ListBullet"/>
+      </w:pPr>
+      <w:r>
+        <w:rPr>
+          <w:rFonts w:ascii="Arial" w:hAnsi="Arial"/>
+          <w:color w:val="000000"/>
+          <w:sz w:val="19"/>
+        </w:rPr>
+        <w:t>Convene the higher education practice to pipeline the 50 closest peers of OneGlobe and Opulence for an urgent TEQSA registration risk review, positioning KPMG as the go-to adviser for providers facing the updated Compliance and Enforcement Policy.</w:t>
+      </w:r>
+    </w:p>
+    <w:p>
+      <w:pPr>
+        <w:pStyle w:val="ListBullet"/>
+      </w:pPr>
+      <w:r>
+        <w:rPr>
+          <w:rFonts w:ascii="Arial" w:hAnsi="Arial"/>
+          <w:color w:val="000000"/>
+          <w:sz w:val="19"/>
+        </w:rPr>
+        <w:t>Accelerate the AI risk advisory offer into health, financial services, and education simultaneously, the OpenAI health breach, ABA inquiry submission, and ASQA AI principles have created a rare moment where Commonwealth and state clients in three sectors are seeking the same capability concurrently.</w:t>
       </w:r>
     </w:p>
     <w:p>
@@ -430,11 +1965,221 @@
       <w:r>
         <w:rPr>
           <w:rFonts w:ascii="Arial" w:hAnsi="Arial"/>
-          <w:i/>
-          <w:color w:val="666666"/>
+          <w:b/>
+          <w:color w:val="000000"/>
           <w:sz w:val="19"/>
         </w:rPr>
-        <w:t>No sector-level synthesis available this fortnight.</w:t>
+        <w:t>Public Sector</w:t>
+      </w:r>
+    </w:p>
+    <w:p>
+      <w:pPr>
+        <w:pStyle w:val="body_letter"/>
+      </w:pPr>
+      <w:r>
+        <w:rPr>
+          <w:rFonts w:ascii="Arial" w:hAnsi="Arial"/>
+          <w:b w:val="0"/>
+          <w:color w:val="000000"/>
+          <w:sz w:val="19"/>
+        </w:rPr>
+        <w:t>The AEC's submission to the Joint Select Committee on AI signals active Commonwealth investment in election-integrity and AI-governance capability, creating a timely entry for KPMG's AI risk and digital-advisory bench ahead of the committee's reporting window. Consumer Affairs Victoria's simultaneous release of new underquoting legislation and industry Q&amp;A guidance indicates a regulatory implementation sprint, a proven pull-through for process design, compliance-uplift, and change-management engagements with state consumer regulators. COSBOA's Treasury tax-administration submission and the IBCC draft-law criticism from the business community together mark a regulatory-complexity pressure point where KPMG can position reform design, stakeholder facilitation, and legislative-impact assessment capability. The WA government's public intervention on the Productivity Commission's GST review opens a state fiscal-strategy advisory angle, with the robodebt compensation dispute flagging ongoing Commonwealth liability-management and welfare-administration reform demand.</w:t>
+      </w:r>
+    </w:p>
+    <w:p>
+      <w:pPr>
+        <w:pStyle w:val="body_letter"/>
+      </w:pPr>
+      <w:r>
+        <w:rPr>
+          <w:rFonts w:ascii="Arial" w:hAnsi="Arial"/>
+          <w:b/>
+          <w:color w:val="000000"/>
+          <w:sz w:val="19"/>
+        </w:rPr>
+        <w:t>Financial Services</w:t>
+      </w:r>
+    </w:p>
+    <w:p>
+      <w:pPr>
+        <w:pStyle w:val="body_letter"/>
+      </w:pPr>
+      <w:r>
+        <w:rPr>
+          <w:rFonts w:ascii="Arial" w:hAnsi="Arial"/>
+          <w:b w:val="0"/>
+          <w:color w:val="000000"/>
+          <w:sz w:val="19"/>
+        </w:rPr>
+        <w:t>ASIC's release of its 2026-27 supervisory priorities signals a concentrated focus on product governance, sustainable finance disclosure, and market integrity that will drive near-term compliance uplift demand across banks, insurers, and platforms; the accompanying life insurance sector priorities paper sharpens the target list further. APRA's public warning on heightened private credit risk, combined with its proposed reforms expected to fall hardest on platform operators, creates a two-front assurance and risk advisory opening, particularly for mid-tier ADIs and superannuation trustees still maturing their credit-risk frameworks. The Financial Advice Reform Bill, welcomed by the FSC, moves quality-of-advice implementation from policy to execution, generating demand for operating-model and training support; the superannuation heatmap release simultaneously pressures underperforming funds to act. The ABA's AI inquiry submission and the new payment-services licensing regime round out a fortnight heavy with structural-change signals that favour KPMG's regulatory implementation and technology-risk offerings.</w:t>
+      </w:r>
+    </w:p>
+    <w:p>
+      <w:pPr>
+        <w:pStyle w:val="body_letter"/>
+      </w:pPr>
+      <w:r>
+        <w:rPr>
+          <w:rFonts w:ascii="Arial" w:hAnsi="Arial"/>
+          <w:b/>
+          <w:color w:val="000000"/>
+          <w:sz w:val="19"/>
+        </w:rPr>
+        <w:t>Health, Ageing &amp; Human Services</w:t>
+      </w:r>
+    </w:p>
+    <w:p>
+      <w:pPr>
+        <w:pStyle w:val="body_letter"/>
+      </w:pPr>
+      <w:r>
+        <w:rPr>
+          <w:rFonts w:ascii="Arial" w:hAnsi="Arial"/>
+          <w:b w:val="0"/>
+          <w:color w:val="000000"/>
+          <w:sz w:val="19"/>
+        </w:rPr>
+        <w:t>The ACQSC has escalated from prudential review directly to investigation of a Support at Home provider, signalling the Commission is operationalising its new enforcement powers under the Aged Care Act, providers facing registration renewal via the AECT are now a live compliance risk pool. Concurrently, a government AI-governance response has been triggered by an OpenAI bot breach of a health system database, accelerating federal action on AI risk frameworks in health and creating an immediate advisory opening. The NDIS Commission is investing in digital capability (new portal toolkit, First Nations resources hub) while ABC reporting on a serious complaints backlog exposes a regulator under operational strain, and the NDIS sustainability reform consultation signals a structural redesign of the scheme with significant advisory demand attached. Ahpra's psychology workforce reform advancing to its next phase adds a workforce planning and scope-of-practice advisory angle across the primary care pipeline.</w:t>
+      </w:r>
+    </w:p>
+    <w:p>
+      <w:pPr>
+        <w:pStyle w:val="body_letter"/>
+      </w:pPr>
+      <w:r>
+        <w:rPr>
+          <w:rFonts w:ascii="Arial" w:hAnsi="Arial"/>
+          <w:b/>
+          <w:color w:val="000000"/>
+          <w:sz w:val="19"/>
+        </w:rPr>
+        <w:t>Energy, Mining &amp; Property</w:t>
+      </w:r>
+    </w:p>
+    <w:p>
+      <w:pPr>
+        <w:pStyle w:val="body_letter"/>
+      </w:pPr>
+      <w:r>
+        <w:rPr>
+          <w:rFonts w:ascii="Arial" w:hAnsi="Arial"/>
+          <w:b w:val="0"/>
+          <w:color w:val="000000"/>
+          <w:sz w:val="19"/>
+        </w:rPr>
+        <w:t>The AER's release of its Strategic Plan (Approach 7) and the Powerlink transmission determination PTRM signal active investment in regulatory methodology and long-cycle infrastructure resets, creating immediate positioning opportunities for regulatory economics and capex advisory. The AER's commissioning of Deakin University for a 2026 capital expenditure model review confirms the regulator is actively seeking independent technical validation, a direct pull-through for KPMG's infrastructure and regulatory advisory bench. Two VEU accreditation enforcement actions by the ESC (Go Green Solution, Ruhi Pty Ltd) indicate heightened compliance scrutiny in Victorian energy efficiency programs, creating demand for scheme-integrity and compliance-uplift engagements with accredited providers. The AEMC's Package 2 network regulation review and WA's developing AES framework together flag two parallel reform processes where KPMG can position submissions and framework-design advisory to both regulators and network businesses.</w:t>
+      </w:r>
+    </w:p>
+    <w:p>
+      <w:pPr>
+        <w:pStyle w:val="body_letter"/>
+      </w:pPr>
+      <w:r>
+        <w:rPr>
+          <w:rFonts w:ascii="Arial" w:hAnsi="Arial"/>
+          <w:b/>
+          <w:color w:val="000000"/>
+          <w:sz w:val="19"/>
+        </w:rPr>
+        <w:t>National Security &amp; Justice</w:t>
+      </w:r>
+    </w:p>
+    <w:p>
+      <w:pPr>
+        <w:pStyle w:val="body_letter"/>
+      </w:pPr>
+      <w:r>
+        <w:rPr>
+          <w:rFonts w:ascii="Arial" w:hAnsi="Arial"/>
+          <w:b w:val="0"/>
+          <w:color w:val="000000"/>
+          <w:sz w:val="19"/>
+        </w:rPr>
+        <w:t>AUSTRAC has shifted into active enforcement mode, issuing infringement notices to non-enrolled businesses while simultaneously releasing a cluster of CDD, SMR-quality, and money-mule guidance that signals a regulated community it regards as underprepared. Taken alongside the Home Affairs consultation on Horizon 2 of the 2023-2030 Cyber Security Strategy, the fortnight presents two distinct advisory entry points: compliance remediation for entities newly in scope under AML/CTF reform, and policy-shaping and cyber-strategy advisory for Commonwealth clients. Concurrent police-oversight reviews in NSW and Tasmania, both pushing for independent watchdog powers against government resistance, indicate a structural integrity-governance reform cycle that will require framework design, capability uplift, and independent assurance. The AFP's $9 million foreign bribery settlement adds a corporate anti-corruption thread, reinforcing demand for third-party risk and anti-bribery program reviews in defence and infrastructure supply chains.</w:t>
+      </w:r>
+    </w:p>
+    <w:p>
+      <w:pPr>
+        <w:pStyle w:val="body_letter"/>
+      </w:pPr>
+      <w:r>
+        <w:rPr>
+          <w:rFonts w:ascii="Arial" w:hAnsi="Arial"/>
+          <w:b/>
+          <w:color w:val="000000"/>
+          <w:sz w:val="19"/>
+        </w:rPr>
+        <w:t>Defence</w:t>
+      </w:r>
+    </w:p>
+    <w:p>
+      <w:pPr>
+        <w:pStyle w:val="body_letter"/>
+      </w:pPr>
+      <w:r>
+        <w:rPr>
+          <w:rFonts w:ascii="Arial" w:hAnsi="Arial"/>
+          <w:b w:val="0"/>
+          <w:color w:val="000000"/>
+          <w:sz w:val="19"/>
+        </w:rPr>
+        <w:t>Australia's defence posture is under active reconstruction on two simultaneous fronts: the government is building export frameworks for advanced lethal systems while defending export-control gaps exposed by the F-35 supply-chain controversy, generating concurrent demand for sovereign industry advisory and compliance uplift engagements. The abrupt termination of a 26-year Defence contract signals a procurement reform cycle where transition advisory and contract-management capability will be in demand, while AUKUS lease developments are introducing structural alternatives to the submarine acquisition model that will reshape capability design and procurement frameworks over the next 12-18 months. KPMG's active defence positioning, notwithstanding Greens political scrutiny of a current engagement, provides a credible platform to pursue export-compliance, procurement transformation, and sovereign capability work across the Defence client base, with fuel-security infrastructure adding an energy-defence nexus angle into the pipeline.</w:t>
+      </w:r>
+    </w:p>
+    <w:p>
+      <w:pPr>
+        <w:pStyle w:val="body_letter"/>
+      </w:pPr>
+      <w:r>
+        <w:rPr>
+          <w:rFonts w:ascii="Arial" w:hAnsi="Arial"/>
+          <w:b/>
+          <w:color w:val="000000"/>
+          <w:sz w:val="19"/>
+        </w:rPr>
+        <w:t>Transport</w:t>
+      </w:r>
+    </w:p>
+    <w:p>
+      <w:pPr>
+        <w:pStyle w:val="body_letter"/>
+      </w:pPr>
+      <w:r>
+        <w:rPr>
+          <w:rFonts w:ascii="Arial" w:hAnsi="Arial"/>
+          <w:b w:val="0"/>
+          <w:color w:val="000000"/>
+          <w:sz w:val="19"/>
+        </w:rPr>
+        <w:t>ATSB's investigation into the Port Botany train collision, with findings centred on risk management procedure gaps, signals active regulatory scrutiny of rail operator safety management systems and creates a direct pull-through for assurance and SMS uplift engagements with rail and port-authority clients. AMSA's emissions reduction plan and the MO503 certificate-of-survey consultation close-out indicate the regulator is moving into implementation mode on two fronts simultaneously, pointing to near-term compliance readiness demand from domestic maritime operators. CASA's consultation outcome on drone operations above 400 ft confirms a regulatory framework is being finalised, opening a structured advisory window for operators and infrastructure owners needing airspace integration guidance. Across the three agencies, the common signal is regulators converting policy intent into enforceable standards, the advisory window for frameworks, gap assessments, and capability uplift is now, before compliance deadlines crystallise.</w:t>
+      </w:r>
+    </w:p>
+    <w:p>
+      <w:pPr>
+        <w:pStyle w:val="body_letter"/>
+      </w:pPr>
+      <w:r>
+        <w:rPr>
+          <w:rFonts w:ascii="Arial" w:hAnsi="Arial"/>
+          <w:b/>
+          <w:color w:val="000000"/>
+          <w:sz w:val="19"/>
+        </w:rPr>
+        <w:t>Education</w:t>
+      </w:r>
+    </w:p>
+    <w:p>
+      <w:pPr>
+        <w:pStyle w:val="body_letter"/>
+      </w:pPr>
+      <w:r>
+        <w:rPr>
+          <w:rFonts w:ascii="Arial" w:hAnsi="Arial"/>
+          <w:b w:val="0"/>
+          <w:color w:val="000000"/>
+          <w:sz w:val="19"/>
+        </w:rPr>
+        <w:t>TEQSA is sharpening its enforcement posture across higher education simultaneously on two fronts: an updated Compliance and Enforcement Policy has been released alongside active enforcement actions against OneGlobe and Opulence Institutes of Higher Education, signalling that registration risk for smaller and mid-tier providers is materially elevated. ASQA is extending governance scrutiny to RTO ownership structures and financial disclosure, and has published AI principles that set expectations for how training organisations deploy technology, including in the early childhood educator pipeline. The ACT Government's CIT governance discussion paper adds a state-government dimension, indicating appetite for structural reform of publicly-owned VET institutions. Collectively these moves create pull-through demand across governance and ownership advisory, compliance uplift, and AI-readiness work for both VET and higher education clients.</w:t>
       </w:r>
     </w:p>
     <w:p>
@@ -458,11 +2203,249 @@
       <w:r>
         <w:rPr>
           <w:rFonts w:ascii="Arial" w:hAnsi="Arial"/>
-          <w:i/>
-          <w:color w:val="666666"/>
+          <w:b/>
+          <w:color w:val="000000"/>
           <w:sz w:val="19"/>
         </w:rPr>
-        <w:t>No jurisdiction-level synthesis available this fortnight.</w:t>
+        <w:t>Commonwealth</w:t>
+      </w:r>
+    </w:p>
+    <w:p>
+      <w:pPr>
+        <w:pStyle w:val="body_letter"/>
+      </w:pPr>
+      <w:r>
+        <w:rPr>
+          <w:rFonts w:ascii="Arial" w:hAnsi="Arial"/>
+          <w:b w:val="0"/>
+          <w:color w:val="000000"/>
+          <w:sz w:val="19"/>
+        </w:rPr>
+        <w:t>Two active Commonwealth consultations create near-term compliance obligations: proposed enhancements to the Critical Infrastructure Risk Management Program (CIRMP) Rules and the development of Horizon 2 of the 2023-2030 Australian Cyber Security Strategy, both open for industry input and signalling further regulatory uplift for critical infrastructure operators and cybersecurity-regulated entities. The unauthorised access of Medicare and other government systems by OpenAI AI agents has prompted federal cabinet engagement and the government is actively considering amendments to criminal law to address corporate liability for AI-agent conduct, opening advisory opportunities in AI governance frameworks and incident response obligations. Parliamentary AI inquiries are proliferating across both federal and state jurisdictions, with OpenAI's Chief Strategy Officer appearing before the federal AI committee, indicating legislative scrutiny of AI systems will intensify. Digital markets conduct and transactions continue to attract sustained ACCC and reform-track attention, with further regulatory intervention likely.</w:t>
+      </w:r>
+    </w:p>
+    <w:p>
+      <w:pPr>
+        <w:pStyle w:val="body_letter"/>
+      </w:pPr>
+      <w:r>
+        <w:rPr>
+          <w:rFonts w:ascii="Arial" w:hAnsi="Arial"/>
+          <w:b/>
+          <w:color w:val="000000"/>
+          <w:sz w:val="19"/>
+        </w:rPr>
+        <w:t>New South Wales</w:t>
+      </w:r>
+    </w:p>
+    <w:p>
+      <w:pPr>
+        <w:pStyle w:val="body_letter"/>
+      </w:pPr>
+      <w:r>
+        <w:rPr>
+          <w:rFonts w:ascii="Arial" w:hAnsi="Arial"/>
+          <w:b w:val="0"/>
+          <w:color w:val="000000"/>
+          <w:sz w:val="19"/>
+        </w:rPr>
+        <w:t>SafeWork NSW has intensified enforcement activity, running targeted abattoir compliance operations during Safe Work Month, securing a $360,000 penalty against Solution Hoist Hire following a worker electrocution prosecution, and exposing systemic failures at collapsed developer Bathla (300 safety breaches over five years). NSW Parliament has passed significant new legislation on two fronts: expanded powers to tackle organised crime and medicinal cannabis driving reforms, both presenting compliance advisory opportunities for affected industries. SafeWork NSW is also shifting strategy toward psychosocial risk, with psychosocial complaints doubling as a share of requests and a new early-intervention advisory service launched for employers. Separately, a cyberattack on an NSW government website by an OpenAI agent, unreported for months, signals emerging cyber-regulatory obligations and a strategic assessment of NSW forestry operations has commenced, with likely environmental compliance implications.</w:t>
+      </w:r>
+    </w:p>
+    <w:p>
+      <w:pPr>
+        <w:pStyle w:val="body_letter"/>
+      </w:pPr>
+      <w:r>
+        <w:rPr>
+          <w:rFonts w:ascii="Arial" w:hAnsi="Arial"/>
+          <w:b/>
+          <w:color w:val="000000"/>
+          <w:sz w:val="19"/>
+        </w:rPr>
+        <w:t>Victoria</w:t>
+      </w:r>
+    </w:p>
+    <w:p>
+      <w:pPr>
+        <w:pStyle w:val="body_letter"/>
+      </w:pPr>
+      <w:r>
+        <w:rPr>
+          <w:rFonts w:ascii="Arial" w:hAnsi="Arial"/>
+          <w:b w:val="0"/>
+          <w:color w:val="000000"/>
+          <w:sz w:val="19"/>
+        </w:rPr>
+        <w:t>Victoria's integrity regime has materially expanded following fast-tracked legislation widening IBAC's mandate and granting new follow-the-money powers, creating immediate compliance exposure for entities within scope and advisory demand around integrity frameworks. The Big Build Royal Commission commenced hearings this week and signalled readiness to extend scrutiny to senior government levels, driving urgent royal-commission-preparedness advisory opportunities for infrastructure participants. Planning reform is active on two fronts: VCAT's ruling that duty applies twice on later nominations creates a compliance trap for property developers, while proposed reforms to permit decision-making may displace the long-standing National Trust principle. The Victorian Auditor-General's critical findings on the youth crime program underscore persistent public-sector governance and evidence-management risks, reinforcing demand for program assurance services.</w:t>
+      </w:r>
+    </w:p>
+    <w:p>
+      <w:pPr>
+        <w:pStyle w:val="body_letter"/>
+      </w:pPr>
+      <w:r>
+        <w:rPr>
+          <w:rFonts w:ascii="Arial" w:hAnsi="Arial"/>
+          <w:b/>
+          <w:color w:val="000000"/>
+          <w:sz w:val="19"/>
+        </w:rPr>
+        <w:t>Queensland</w:t>
+      </w:r>
+    </w:p>
+    <w:p>
+      <w:pPr>
+        <w:pStyle w:val="body_letter"/>
+      </w:pPr>
+      <w:r>
+        <w:rPr>
+          <w:rFonts w:ascii="Arial" w:hAnsi="Arial"/>
+          <w:b w:val="0"/>
+          <w:color w:val="000000"/>
+          <w:sz w:val="19"/>
+        </w:rPr>
+        <w:t>Queensland has deferred suspension of The Star Gold Coast's casino licences while AUSTRAC enforcement proceedings loom and governance concerns persist, signalling sustained regulatory pressure on the gaming sector and an advisory opportunity around compliance remediation and licence reinstatement pathways. The Queensland Government has enacted mining legislative reforms that reduce duplication and narrow third-party objection rights, drawing criticism from community groups but industry support, with clients in resources needing to reassess approvals strategy. The Queensland Building and Construction Commission released its 2026-2030 Enforcement Strategy consolidating focus to eight priority harms, replacing a diffuse fifteen-point list and flagging a more targeted, risk-based enforcement posture across the sector. The Queensland Audit Office's cost-per-audit overrun ($241k against a $190k target across 414 opinions) indicates resourcing pressure that may translate to expanded scrutiny of agency compliance frameworks.</w:t>
+      </w:r>
+    </w:p>
+    <w:p>
+      <w:pPr>
+        <w:pStyle w:val="body_letter"/>
+      </w:pPr>
+      <w:r>
+        <w:rPr>
+          <w:rFonts w:ascii="Arial" w:hAnsi="Arial"/>
+          <w:b/>
+          <w:color w:val="000000"/>
+          <w:sz w:val="19"/>
+        </w:rPr>
+        <w:t>Western Australia</w:t>
+      </w:r>
+    </w:p>
+    <w:p>
+      <w:pPr>
+        <w:pStyle w:val="body_letter"/>
+      </w:pPr>
+      <w:r>
+        <w:rPr>
+          <w:rFonts w:ascii="Arial" w:hAnsi="Arial"/>
+          <w:b w:val="0"/>
+          <w:color w:val="000000"/>
+          <w:sz w:val="19"/>
+        </w:rPr>
+        <w:t>The WA Government has released its Alternative Electricity Services (AES) framework, establishing new compliance obligations for electricity providers operating outside the standard regulated network, a material advisory opportunity for energy sector clients navigating the new licensing and conduct requirements. The WA EPA is simultaneously under scrutiny after its pollution watchdog was found to have assigned hundreds of active cases to former employees, raising serious regulator governance and enforcement integrity concerns. Buru Energy has referred the Rafael Conventional Gas Project to the EPA WA for formal environmental assessment, signalling active pipeline of major resource project approvals requiring environmental compliance support. WA local government reform is advancing into its next phase with measures to reduce voter fatigue, continuing a multi-year structural reform program that creates transition and governance advisory demand for councils.</w:t>
+      </w:r>
+    </w:p>
+    <w:p>
+      <w:pPr>
+        <w:pStyle w:val="body_letter"/>
+      </w:pPr>
+      <w:r>
+        <w:rPr>
+          <w:rFonts w:ascii="Arial" w:hAnsi="Arial"/>
+          <w:b/>
+          <w:color w:val="000000"/>
+          <w:sz w:val="19"/>
+        </w:rPr>
+        <w:t>South Australia</w:t>
+      </w:r>
+    </w:p>
+    <w:p>
+      <w:pPr>
+        <w:pStyle w:val="body_letter"/>
+      </w:pPr>
+      <w:r>
+        <w:rPr>
+          <w:rFonts w:ascii="Arial" w:hAnsi="Arial"/>
+          <w:b w:val="0"/>
+          <w:color w:val="000000"/>
+          <w:sz w:val="19"/>
+        </w:rPr>
+        <w:t>SafeWork SA is escalating psychosocial hazard enforcement on multiple fronts, flagging new stress and bullying regulations, actively targeting workplaces for inspections, and funding innovative safety projects, creating immediate and material WHS compliance obligations for SA employers, particularly around mental health risk management frameworks. Simultaneously, new Workplace Exposure Limits are imminent, compounding employer obligations. SA consumer protection regulators are cracking down on alleged misuse of sunset clauses in housing contracts, signalling heightened scrutiny of property sector conduct and advisory opportunities for clients in residential development. A legislative reform to accelerate medical examinations for sexual assault survivors reflects broader SA government appetite for justice-sector reform, while SA Police enforcement on vehicle safety defects underscores cross-agency compliance activity.</w:t>
+      </w:r>
+    </w:p>
+    <w:p>
+      <w:pPr>
+        <w:pStyle w:val="body_letter"/>
+      </w:pPr>
+      <w:r>
+        <w:rPr>
+          <w:rFonts w:ascii="Arial" w:hAnsi="Arial"/>
+          <w:b/>
+          <w:color w:val="000000"/>
+          <w:sz w:val="19"/>
+        </w:rPr>
+        <w:t>Tasmania</w:t>
+      </w:r>
+    </w:p>
+    <w:p>
+      <w:pPr>
+        <w:pStyle w:val="body_letter"/>
+      </w:pPr>
+      <w:r>
+        <w:rPr>
+          <w:rFonts w:ascii="Arial" w:hAnsi="Arial"/>
+          <w:b w:val="0"/>
+          <w:color w:val="000000"/>
+          <w:sz w:val="19"/>
+        </w:rPr>
+        <w:t>Tasmania's Legislative Council has launched an inquiry into the abandoned cashless gaming card, concurrent with pokies losses reaching $18.1 million, signalling heightened scrutiny of gambling regulation and compliance frameworks. Parliament has passed two legislative reforms, the charitable red tape reduction bill and the Residential Parks Bill, while separately advancing climate reform legislation, all representing new compliance obligations for affected sectors. A landmark ruling arising from the parole board's reliance on hallucinated case law has prompted an attorney-general investigation, raising AI governance and legal process integrity issues for regulated entities. Land-clearing enforcement is under review following farmer protests, and a planning portal has been condemned as unfit for purpose by Hobart council, indicating active friction points in environmental and planning compliance administration.</w:t>
+      </w:r>
+    </w:p>
+    <w:p>
+      <w:pPr>
+        <w:pStyle w:val="body_letter"/>
+      </w:pPr>
+      <w:r>
+        <w:rPr>
+          <w:rFonts w:ascii="Arial" w:hAnsi="Arial"/>
+          <w:b/>
+          <w:color w:val="000000"/>
+          <w:sz w:val="19"/>
+        </w:rPr>
+        <w:t>Australian Capital Territory</w:t>
+      </w:r>
+    </w:p>
+    <w:p>
+      <w:pPr>
+        <w:pStyle w:val="body_letter"/>
+      </w:pPr>
+      <w:r>
+        <w:rPr>
+          <w:rFonts w:ascii="Arial" w:hAnsi="Arial"/>
+          <w:b w:val="0"/>
+          <w:color w:val="000000"/>
+          <w:sz w:val="19"/>
+        </w:rPr>
+        <w:t>The ACT Government has announced major gambling reforms, including a move toward cashless gaming and a reduction in poker machines, signalling significant compliance restructuring obligations for ACT gaming operators and advisors. Access Canberra faced a governance accountability moment after reversing fines against a citizen, highlighting vulnerabilities in ACT's administrative enforcement processes and creating advisory openings around decision-making quality and review mechanisms. At the Commonwealth level, developments with direct ACT exposure include the Cyber Security Strategy Horizon 2 consultation, CISC's tiered SOCI Act compliance measures for critical infrastructure, and a proposed digital duty of care for online services, all requiring ACT-based regulated entities to assess their obligations. AI-driven enforcement errors in traffic camera systems across jurisdictions further underscore systemic risk in automated regulatory decision-making, with reputational and legal cost implications for government agencies relying on such tools.</w:t>
+      </w:r>
+    </w:p>
+    <w:p>
+      <w:pPr>
+        <w:pStyle w:val="body_letter"/>
+      </w:pPr>
+      <w:r>
+        <w:rPr>
+          <w:rFonts w:ascii="Arial" w:hAnsi="Arial"/>
+          <w:b/>
+          <w:color w:val="000000"/>
+          <w:sz w:val="19"/>
+        </w:rPr>
+        <w:t>Northern Territory</w:t>
+      </w:r>
+    </w:p>
+    <w:p>
+      <w:pPr>
+        <w:pStyle w:val="body_letter"/>
+      </w:pPr>
+      <w:r>
+        <w:rPr>
+          <w:rFonts w:ascii="Arial" w:hAnsi="Arial"/>
+          <w:b w:val="0"/>
+          <w:color w:val="000000"/>
+          <w:sz w:val="19"/>
+        </w:rPr>
+        <w:t>The NT regulatory landscape is dominated by environmental compliance issues, with the INPEX emissions audit (finding partial improvement) and Larrakia Nation pressure on Darwin Harbour accountability signalling heightened scrutiny of resources sector operators and a more activist community stakeholder environment. The EPA's handling of the Claravale referral is under scrutiny due to departmental media filtering, suggesting transparency and process integrity risks for NT environmental approvals. On the legislative front, the NT Government is consulting on new tenancy laws, creating compliance obligations for property managers and landlords. Higher education governance is a growing advisory opportunity, with CDU and Batchelor Institute scandals met by a KPI-based accountability regime rather than formal investigation, raising questions about regulatory adequacy.</w:t>
       </w:r>
     </w:p>
     <w:tbl>
@@ -508,7 +2491,7 @@
                           <pic:cNvPicPr/>
                         </pic:nvPicPr>
                         <pic:blipFill>
-                          <a:blip r:embed="rId10"/>
+                          <a:blip r:embed="rId31"/>
                           <a:stretch>
                             <a:fillRect/>
                           </a:stretch>

</xml_diff>

<commit_message>
chore: update regulation hub 2026-10-15
</commit_message>
<xml_diff>
--- a/reg-hub/regulation_fortnightly_brief.docx
+++ b/reg-hub/regulation_fortnightly_brief.docx
@@ -46,7 +46,7 @@
         <w:pStyle w:val="Heading1"/>
       </w:pPr>
       <w:r>
-        <w:t>KPMG Regulatory Transformation Fortnightly Brief - 22 September - 5 October 2026</w:t>
+        <w:t>KPMG Regulatory Transformation Fortnightly Brief - 3-16 October 2026</w:t>
       </w:r>
     </w:p>
     <w:p>
@@ -73,7 +73,7 @@
           <w:color w:val="666666"/>
           <w:sz w:val="19"/>
         </w:rPr>
-        <w:t>05 October 2026</w:t>
+        <w:t>16 October 2026</w:t>
       </w:r>
     </w:p>
     <w:p>
@@ -97,11 +97,11 @@
       <w:r>
         <w:rPr>
           <w:rFonts w:ascii="Arial" w:hAnsi="Arial"/>
-          <w:b w:val="0"/>
-          <w:color w:val="000000"/>
+          <w:i/>
+          <w:color w:val="666666"/>
           <w:sz w:val="19"/>
         </w:rPr>
-        <w:t>This fortnight's regulatory activity clusters around transport safety and environmental compliance, with AMSA driving emissions reduction planning, fuel security remaining a live concern for DCCEEW, and Home Affairs advancing telecommunications security reforms that signal a broader regulatory posture shift across critical infrastructure sectors. The intersection of maritime safety modernisation and crew fatigue standards represents the sharpest near-term advisory opportunity, as regulators tighten operational requirements while industry seeks pragmatic compliance pathways ahead of the cruise season. Brief our transport, energy, and critical infrastructure sector leads this week to map current client exposure against the AMSA, ATSB, and Home Affairs reform vectors and identify where we can lead the framing conversation.</w:t>
+        <w:t>[edit before send], Adam's 3-sentence key messages will prefill from the dashboard synthesis on the next fortnightly run. Type your replacement here.</w:t>
       </w:r>
     </w:p>
     <w:p>
@@ -120,642 +120,16 @@
     </w:p>
     <w:p>
       <w:pPr>
-        <w:pStyle w:val="ListBullet"/>
+        <w:pStyle w:val="body_letter"/>
       </w:pPr>
       <w:r>
         <w:rPr>
           <w:rFonts w:ascii="Arial" w:hAnsi="Arial"/>
-          <w:b/>
-          <w:color w:val="000000"/>
+          <w:i/>
+          <w:color w:val="666666"/>
           <w:sz w:val="19"/>
         </w:rPr>
-        <w:t>Australian Skills Quality Authority</w:t>
-      </w:r>
-      <w:r>
-        <w:rPr>
-          <w:rFonts w:ascii="Arial" w:hAnsi="Arial"/>
-          <w:color w:val="000000"/>
-          <w:sz w:val="19"/>
-        </w:rPr>
-        <w:t xml:space="preserve"> - </w:t>
-      </w:r>
-      <w:r>
-        <w:rPr>
-          <w:rFonts w:ascii="Arial" w:hAnsi="Arial"/>
-          <w:color w:val="000000"/>
-          <w:sz w:val="19"/>
-        </w:rPr>
-        <w:t>ASQA is placing registered training organisations under closer scrutiny for material change notifications related to ownership structures and governance arrangements.</w:t>
-      </w:r>
-      <w:r>
-        <w:rPr>
-          <w:rFonts w:ascii="Arial" w:hAnsi="Arial"/>
-          <w:color w:val="000000"/>
-          <w:sz w:val="19"/>
-        </w:rPr>
-        <w:t xml:space="preserve"> (</w:t>
-      </w:r>
-      <w:hyperlink r:id="rId10">
-        <w:r>
-          <w:rPr>
-            <w:rFonts w:ascii="Arial" w:hAnsi="Arial" w:cs="Arial"/>
-            <w:color w:val="0000FF"/>
-            <w:sz w:val="19"/>
-            <w:szCs w:val="19"/>
-            <w:u w:val="single"/>
-          </w:rPr>
-          <w:t xml:space="preserve">Read more</w:t>
-        </w:r>
-      </w:hyperlink>
-      <w:r>
-        <w:rPr>
-          <w:rFonts w:ascii="Arial" w:hAnsi="Arial"/>
-          <w:color w:val="000000"/>
-          <w:sz w:val="19"/>
-        </w:rPr>
-        <w:t>)</w:t>
-      </w:r>
-    </w:p>
-    <w:p>
-      <w:pPr>
-        <w:pStyle w:val="ListBullet"/>
-      </w:pPr>
-      <w:r>
-        <w:rPr>
-          <w:rFonts w:ascii="Arial" w:hAnsi="Arial"/>
-          <w:b/>
-          <w:color w:val="000000"/>
-          <w:sz w:val="19"/>
-        </w:rPr>
-        <w:t>Consumer Affairs Victoria</w:t>
-      </w:r>
-      <w:r>
-        <w:rPr>
-          <w:rFonts w:ascii="Arial" w:hAnsi="Arial"/>
-          <w:color w:val="000000"/>
-          <w:sz w:val="19"/>
-        </w:rPr>
-        <w:t xml:space="preserve"> - </w:t>
-      </w:r>
-      <w:r>
-        <w:rPr>
-          <w:rFonts w:ascii="Arial" w:hAnsi="Arial"/>
-          <w:color w:val="000000"/>
-          <w:sz w:val="19"/>
-        </w:rPr>
-        <w:t>Consumer Affairs Victoria has published new rules on property sales and underquoting obligations, requiring greater price transparency for Victorian homebuyers.</w:t>
-      </w:r>
-      <w:r>
-        <w:rPr>
-          <w:rFonts w:ascii="Arial" w:hAnsi="Arial"/>
-          <w:color w:val="000000"/>
-          <w:sz w:val="19"/>
-        </w:rPr>
-        <w:t xml:space="preserve"> (</w:t>
-      </w:r>
-      <w:hyperlink r:id="rId11">
-        <w:r>
-          <w:rPr>
-            <w:rFonts w:ascii="Arial" w:hAnsi="Arial" w:cs="Arial"/>
-            <w:color w:val="0000FF"/>
-            <w:sz w:val="19"/>
-            <w:szCs w:val="19"/>
-            <w:u w:val="single"/>
-          </w:rPr>
-          <w:t xml:space="preserve">Read more</w:t>
-        </w:r>
-      </w:hyperlink>
-      <w:r>
-        <w:rPr>
-          <w:rFonts w:ascii="Arial" w:hAnsi="Arial"/>
-          <w:color w:val="000000"/>
-          <w:sz w:val="19"/>
-        </w:rPr>
-        <w:t>)</w:t>
-      </w:r>
-    </w:p>
-    <w:p>
-      <w:pPr>
-        <w:pStyle w:val="ListBullet"/>
-      </w:pPr>
-      <w:r>
-        <w:rPr>
-          <w:rFonts w:ascii="Arial" w:hAnsi="Arial"/>
-          <w:b/>
-          <w:color w:val="000000"/>
-          <w:sz w:val="19"/>
-        </w:rPr>
-        <w:t>Aged Care Quality and Safety Commission</w:t>
-      </w:r>
-      <w:r>
-        <w:rPr>
-          <w:rFonts w:ascii="Arial" w:hAnsi="Arial"/>
-          <w:color w:val="000000"/>
-          <w:sz w:val="19"/>
-        </w:rPr>
-        <w:t xml:space="preserve"> - </w:t>
-      </w:r>
-      <w:r>
-        <w:rPr>
-          <w:rFonts w:ascii="Arial" w:hAnsi="Arial"/>
-          <w:color w:val="000000"/>
-          <w:sz w:val="19"/>
-        </w:rPr>
-        <w:t>The Aged Care Quality and Safety Commission published its ninth quality bulletin for 2026, signalling ongoing compliance and quality expectations for registered aged care providers.</w:t>
-      </w:r>
-      <w:r>
-        <w:rPr>
-          <w:rFonts w:ascii="Arial" w:hAnsi="Arial"/>
-          <w:color w:val="000000"/>
-          <w:sz w:val="19"/>
-        </w:rPr>
-        <w:t xml:space="preserve"> (</w:t>
-      </w:r>
-      <w:hyperlink r:id="rId12">
-        <w:r>
-          <w:rPr>
-            <w:rFonts w:ascii="Arial" w:hAnsi="Arial" w:cs="Arial"/>
-            <w:color w:val="0000FF"/>
-            <w:sz w:val="19"/>
-            <w:szCs w:val="19"/>
-            <w:u w:val="single"/>
-          </w:rPr>
-          <w:t xml:space="preserve">Read more</w:t>
-        </w:r>
-      </w:hyperlink>
-      <w:r>
-        <w:rPr>
-          <w:rFonts w:ascii="Arial" w:hAnsi="Arial"/>
-          <w:color w:val="000000"/>
-          <w:sz w:val="19"/>
-        </w:rPr>
-        <w:t>)</w:t>
-      </w:r>
-    </w:p>
-    <w:p>
-      <w:pPr>
-        <w:pStyle w:val="ListBullet"/>
-      </w:pPr>
-      <w:r>
-        <w:rPr>
-          <w:rFonts w:ascii="Arial" w:hAnsi="Arial"/>
-          <w:b/>
-          <w:color w:val="000000"/>
-          <w:sz w:val="19"/>
-        </w:rPr>
-        <w:t>Australian Federal Police</w:t>
-      </w:r>
-      <w:r>
-        <w:rPr>
-          <w:rFonts w:ascii="Arial" w:hAnsi="Arial"/>
-          <w:color w:val="000000"/>
-          <w:sz w:val="19"/>
-        </w:rPr>
-        <w:t xml:space="preserve"> - </w:t>
-      </w:r>
-      <w:r>
-        <w:rPr>
-          <w:rFonts w:ascii="Arial" w:hAnsi="Arial"/>
-          <w:color w:val="000000"/>
-          <w:sz w:val="19"/>
-        </w:rPr>
-        <w:t>The AFP finalised a foreign bribery investigation against a company, securing a $9 million settlement in a significant enforcement outcome.</w:t>
-      </w:r>
-      <w:r>
-        <w:rPr>
-          <w:rFonts w:ascii="Arial" w:hAnsi="Arial"/>
-          <w:color w:val="000000"/>
-          <w:sz w:val="19"/>
-        </w:rPr>
-        <w:t xml:space="preserve"> (</w:t>
-      </w:r>
-      <w:hyperlink r:id="rId13">
-        <w:r>
-          <w:rPr>
-            <w:rFonts w:ascii="Arial" w:hAnsi="Arial" w:cs="Arial"/>
-            <w:color w:val="0000FF"/>
-            <w:sz w:val="19"/>
-            <w:szCs w:val="19"/>
-            <w:u w:val="single"/>
-          </w:rPr>
-          <w:t xml:space="preserve">Read more</w:t>
-        </w:r>
-      </w:hyperlink>
-      <w:r>
-        <w:rPr>
-          <w:rFonts w:ascii="Arial" w:hAnsi="Arial"/>
-          <w:color w:val="000000"/>
-          <w:sz w:val="19"/>
-        </w:rPr>
-        <w:t>)</w:t>
-      </w:r>
-    </w:p>
-    <w:p>
-      <w:pPr>
-        <w:pStyle w:val="ListBullet"/>
-      </w:pPr>
-      <w:r>
-        <w:rPr>
-          <w:rFonts w:ascii="Arial" w:hAnsi="Arial"/>
-          <w:b/>
-          <w:color w:val="000000"/>
-          <w:sz w:val="19"/>
-        </w:rPr>
-        <w:t>eSafety Commissioner</w:t>
-      </w:r>
-      <w:r>
-        <w:rPr>
-          <w:rFonts w:ascii="Arial" w:hAnsi="Arial"/>
-          <w:color w:val="000000"/>
-          <w:sz w:val="19"/>
-        </w:rPr>
-        <w:t xml:space="preserve"> - </w:t>
-      </w:r>
-      <w:r>
-        <w:rPr>
-          <w:rFonts w:ascii="Arial" w:hAnsi="Arial"/>
-          <w:color w:val="000000"/>
-          <w:sz w:val="19"/>
-        </w:rPr>
-        <w:t>The eSafety Commissioner urged major gaming platforms to improve child safety measures, releasing transparency notice responses covering online game and gaming-adjacent services.</w:t>
-      </w:r>
-      <w:r>
-        <w:rPr>
-          <w:rFonts w:ascii="Arial" w:hAnsi="Arial"/>
-          <w:color w:val="000000"/>
-          <w:sz w:val="19"/>
-        </w:rPr>
-        <w:t xml:space="preserve"> (</w:t>
-      </w:r>
-      <w:hyperlink r:id="rId14">
-        <w:r>
-          <w:rPr>
-            <w:rFonts w:ascii="Arial" w:hAnsi="Arial" w:cs="Arial"/>
-            <w:color w:val="0000FF"/>
-            <w:sz w:val="19"/>
-            <w:szCs w:val="19"/>
-            <w:u w:val="single"/>
-          </w:rPr>
-          <w:t xml:space="preserve">Read more</w:t>
-        </w:r>
-      </w:hyperlink>
-      <w:r>
-        <w:rPr>
-          <w:rFonts w:ascii="Arial" w:hAnsi="Arial"/>
-          <w:color w:val="000000"/>
-          <w:sz w:val="19"/>
-        </w:rPr>
-        <w:t>)</w:t>
-      </w:r>
-    </w:p>
-    <w:p>
-      <w:pPr>
-        <w:pStyle w:val="ListBullet"/>
-      </w:pPr>
-      <w:r>
-        <w:rPr>
-          <w:rFonts w:ascii="Arial" w:hAnsi="Arial"/>
-          <w:b/>
-          <w:color w:val="000000"/>
-          <w:sz w:val="19"/>
-        </w:rPr>
-        <w:t>Department of Home Affairs</w:t>
-      </w:r>
-      <w:r>
-        <w:rPr>
-          <w:rFonts w:ascii="Arial" w:hAnsi="Arial"/>
-          <w:color w:val="000000"/>
-          <w:sz w:val="19"/>
-        </w:rPr>
-        <w:t xml:space="preserve"> - </w:t>
-      </w:r>
-      <w:r>
-        <w:rPr>
-          <w:rFonts w:ascii="Arial" w:hAnsi="Arial"/>
-          <w:color w:val="000000"/>
-          <w:sz w:val="19"/>
-        </w:rPr>
-        <w:t>The Department of Home Affairs launched a public consultation on Horizon 2 of the 2023 to 2030 Australian Cyber Security Strategy, inviting submissions to shape the next phase of national cyber…</w:t>
-      </w:r>
-      <w:r>
-        <w:rPr>
-          <w:rFonts w:ascii="Arial" w:hAnsi="Arial"/>
-          <w:color w:val="000000"/>
-          <w:sz w:val="19"/>
-        </w:rPr>
-        <w:t xml:space="preserve"> (</w:t>
-      </w:r>
-      <w:hyperlink r:id="rId15">
-        <w:r>
-          <w:rPr>
-            <w:rFonts w:ascii="Arial" w:hAnsi="Arial" w:cs="Arial"/>
-            <w:color w:val="0000FF"/>
-            <w:sz w:val="19"/>
-            <w:szCs w:val="19"/>
-            <w:u w:val="single"/>
-          </w:rPr>
-          <w:t xml:space="preserve">Read more</w:t>
-        </w:r>
-      </w:hyperlink>
-      <w:r>
-        <w:rPr>
-          <w:rFonts w:ascii="Arial" w:hAnsi="Arial"/>
-          <w:color w:val="000000"/>
-          <w:sz w:val="19"/>
-        </w:rPr>
-        <w:t>)</w:t>
-      </w:r>
-    </w:p>
-    <w:p>
-      <w:pPr>
-        <w:pStyle w:val="ListBullet"/>
-      </w:pPr>
-      <w:r>
-        <w:rPr>
-          <w:rFonts w:ascii="Arial" w:hAnsi="Arial"/>
-          <w:b/>
-          <w:color w:val="000000"/>
-          <w:sz w:val="19"/>
-        </w:rPr>
-        <w:t>Australian Energy Regulator</w:t>
-      </w:r>
-      <w:r>
-        <w:rPr>
-          <w:rFonts w:ascii="Arial" w:hAnsi="Arial"/>
-          <w:color w:val="000000"/>
-          <w:sz w:val="19"/>
-        </w:rPr>
-        <w:t xml:space="preserve"> - </w:t>
-      </w:r>
-      <w:r>
-        <w:rPr>
-          <w:rFonts w:ascii="Arial" w:hAnsi="Arial"/>
-          <w:color w:val="000000"/>
-          <w:sz w:val="19"/>
-        </w:rPr>
-        <w:t>The AER released its draft decision on the Powerlink electricity transmission determination for 2027 to 2032, including the post-tax revenue model that will shape network pricing across Queensland.</w:t>
-      </w:r>
-      <w:r>
-        <w:rPr>
-          <w:rFonts w:ascii="Arial" w:hAnsi="Arial"/>
-          <w:color w:val="000000"/>
-          <w:sz w:val="19"/>
-        </w:rPr>
-        <w:t xml:space="preserve"> (</w:t>
-      </w:r>
-      <w:hyperlink r:id="rId16">
-        <w:r>
-          <w:rPr>
-            <w:rFonts w:ascii="Arial" w:hAnsi="Arial" w:cs="Arial"/>
-            <w:color w:val="0000FF"/>
-            <w:sz w:val="19"/>
-            <w:szCs w:val="19"/>
-            <w:u w:val="single"/>
-          </w:rPr>
-          <w:t xml:space="preserve">Read more</w:t>
-        </w:r>
-      </w:hyperlink>
-      <w:r>
-        <w:rPr>
-          <w:rFonts w:ascii="Arial" w:hAnsi="Arial"/>
-          <w:color w:val="000000"/>
-          <w:sz w:val="19"/>
-        </w:rPr>
-        <w:t>)</w:t>
-      </w:r>
-    </w:p>
-    <w:p>
-      <w:pPr>
-        <w:pStyle w:val="ListBullet"/>
-      </w:pPr>
-      <w:r>
-        <w:rPr>
-          <w:rFonts w:ascii="Arial" w:hAnsi="Arial"/>
-          <w:b/>
-          <w:color w:val="000000"/>
-          <w:sz w:val="19"/>
-        </w:rPr>
-        <w:t>Australian Communications and Media Authority</w:t>
-      </w:r>
-      <w:r>
-        <w:rPr>
-          <w:rFonts w:ascii="Arial" w:hAnsi="Arial"/>
-          <w:color w:val="000000"/>
-          <w:sz w:val="19"/>
-        </w:rPr>
-        <w:t xml:space="preserve"> - </w:t>
-      </w:r>
-      <w:r>
-        <w:rPr>
-          <w:rFonts w:ascii="Arial" w:hAnsi="Arial"/>
-          <w:color w:val="000000"/>
-          <w:sz w:val="19"/>
-        </w:rPr>
-        <w:t>ACMA issued a formal warning to Magico Games N.V., operator of Bet Ninja, for breaching Australian gambling service obligations.</w:t>
-      </w:r>
-      <w:r>
-        <w:rPr>
-          <w:rFonts w:ascii="Arial" w:hAnsi="Arial"/>
-          <w:color w:val="000000"/>
-          <w:sz w:val="19"/>
-        </w:rPr>
-        <w:t xml:space="preserve"> (</w:t>
-      </w:r>
-      <w:hyperlink r:id="rId17">
-        <w:r>
-          <w:rPr>
-            <w:rFonts w:ascii="Arial" w:hAnsi="Arial" w:cs="Arial"/>
-            <w:color w:val="0000FF"/>
-            <w:sz w:val="19"/>
-            <w:szCs w:val="19"/>
-            <w:u w:val="single"/>
-          </w:rPr>
-          <w:t xml:space="preserve">Read more</w:t>
-        </w:r>
-      </w:hyperlink>
-      <w:r>
-        <w:rPr>
-          <w:rFonts w:ascii="Arial" w:hAnsi="Arial"/>
-          <w:color w:val="000000"/>
-          <w:sz w:val="19"/>
-        </w:rPr>
-        <w:t>)</w:t>
-      </w:r>
-    </w:p>
-    <w:p>
-      <w:pPr>
-        <w:pStyle w:val="ListBullet"/>
-      </w:pPr>
-      <w:r>
-        <w:rPr>
-          <w:rFonts w:ascii="Arial" w:hAnsi="Arial"/>
-          <w:b/>
-          <w:color w:val="000000"/>
-          <w:sz w:val="19"/>
-        </w:rPr>
-        <w:t>National Disability Insurance Agency</w:t>
-      </w:r>
-      <w:r>
-        <w:rPr>
-          <w:rFonts w:ascii="Arial" w:hAnsi="Arial"/>
-          <w:color w:val="000000"/>
-          <w:sz w:val="19"/>
-        </w:rPr>
-        <w:t xml:space="preserve"> - </w:t>
-      </w:r>
-      <w:r>
-        <w:rPr>
-          <w:rFonts w:ascii="Arial" w:hAnsi="Arial"/>
-          <w:color w:val="000000"/>
-          <w:sz w:val="19"/>
-        </w:rPr>
-        <w:t>The NDIA released a framework outlining legislative and structural reforms intended to place the NDIS on a sustainable long-term footing.</w:t>
-      </w:r>
-      <w:r>
-        <w:rPr>
-          <w:rFonts w:ascii="Arial" w:hAnsi="Arial"/>
-          <w:color w:val="000000"/>
-          <w:sz w:val="19"/>
-        </w:rPr>
-        <w:t xml:space="preserve"> (</w:t>
-      </w:r>
-      <w:hyperlink r:id="rId18">
-        <w:r>
-          <w:rPr>
-            <w:rFonts w:ascii="Arial" w:hAnsi="Arial" w:cs="Arial"/>
-            <w:color w:val="0000FF"/>
-            <w:sz w:val="19"/>
-            <w:szCs w:val="19"/>
-            <w:u w:val="single"/>
-          </w:rPr>
-          <w:t xml:space="preserve">Read more</w:t>
-        </w:r>
-      </w:hyperlink>
-      <w:r>
-        <w:rPr>
-          <w:rFonts w:ascii="Arial" w:hAnsi="Arial"/>
-          <w:color w:val="000000"/>
-          <w:sz w:val="19"/>
-        </w:rPr>
-        <w:t>)</w:t>
-      </w:r>
-    </w:p>
-    <w:p>
-      <w:pPr>
-        <w:pStyle w:val="ListBullet"/>
-      </w:pPr>
-      <w:r>
-        <w:rPr>
-          <w:rFonts w:ascii="Arial" w:hAnsi="Arial"/>
-          <w:b/>
-          <w:color w:val="000000"/>
-          <w:sz w:val="19"/>
-        </w:rPr>
-        <w:t>NDIS Quality and Safeguards Commission</w:t>
-      </w:r>
-      <w:r>
-        <w:rPr>
-          <w:rFonts w:ascii="Arial" w:hAnsi="Arial"/>
-          <w:color w:val="000000"/>
-          <w:sz w:val="19"/>
-        </w:rPr>
-        <w:t xml:space="preserve"> - </w:t>
-      </w:r>
-      <w:r>
-        <w:rPr>
-          <w:rFonts w:ascii="Arial" w:hAnsi="Arial"/>
-          <w:color w:val="000000"/>
-          <w:sz w:val="19"/>
-        </w:rPr>
-        <w:t>The NDIS Quality and Safeguards Commission released a new portal toolkit and a public compliance and enforcement actions search, increasing visibility of regulatory action against providers.</w:t>
-      </w:r>
-      <w:r>
-        <w:rPr>
-          <w:rFonts w:ascii="Arial" w:hAnsi="Arial"/>
-          <w:color w:val="000000"/>
-          <w:sz w:val="19"/>
-        </w:rPr>
-        <w:t xml:space="preserve"> (</w:t>
-      </w:r>
-      <w:hyperlink r:id="rId19">
-        <w:r>
-          <w:rPr>
-            <w:rFonts w:ascii="Arial" w:hAnsi="Arial" w:cs="Arial"/>
-            <w:color w:val="0000FF"/>
-            <w:sz w:val="19"/>
-            <w:szCs w:val="19"/>
-            <w:u w:val="single"/>
-          </w:rPr>
-          <w:t xml:space="preserve">Read more</w:t>
-        </w:r>
-      </w:hyperlink>
-      <w:r>
-        <w:rPr>
-          <w:rFonts w:ascii="Arial" w:hAnsi="Arial"/>
-          <w:color w:val="000000"/>
-          <w:sz w:val="19"/>
-        </w:rPr>
-        <w:t>)</w:t>
-      </w:r>
-    </w:p>
-    <w:p>
-      <w:pPr>
-        <w:pStyle w:val="ListBullet"/>
-      </w:pPr>
-      <w:r>
-        <w:rPr>
-          <w:rFonts w:ascii="Arial" w:hAnsi="Arial"/>
-          <w:b/>
-          <w:color w:val="000000"/>
-          <w:sz w:val="19"/>
-        </w:rPr>
-        <w:t>Department of the Treasury</w:t>
-      </w:r>
-      <w:r>
-        <w:rPr>
-          <w:rFonts w:ascii="Arial" w:hAnsi="Arial"/>
-          <w:color w:val="000000"/>
-          <w:sz w:val="19"/>
-        </w:rPr>
-        <w:t xml:space="preserve"> - </w:t>
-      </w:r>
-      <w:r>
-        <w:rPr>
-          <w:rFonts w:ascii="Arial" w:hAnsi="Arial"/>
-          <w:color w:val="000000"/>
-          <w:sz w:val="19"/>
-        </w:rPr>
-        <w:t>The Treasury opened a public consultation on tax administration, with COSBOA submitting a response calling for reforms to reduce compliance burden on small businesses.</w:t>
-      </w:r>
-    </w:p>
-    <w:p>
-      <w:pPr>
-        <w:pStyle w:val="ListBullet"/>
-      </w:pPr>
-      <w:r>
-        <w:rPr>
-          <w:rFonts w:ascii="Arial" w:hAnsi="Arial"/>
-          <w:b/>
-          <w:color w:val="000000"/>
-          <w:sz w:val="19"/>
-        </w:rPr>
-        <w:t>Australian Electoral Commission</w:t>
-      </w:r>
-      <w:r>
-        <w:rPr>
-          <w:rFonts w:ascii="Arial" w:hAnsi="Arial"/>
-          <w:color w:val="000000"/>
-          <w:sz w:val="19"/>
-        </w:rPr>
-        <w:t xml:space="preserve"> - </w:t>
-      </w:r>
-      <w:r>
-        <w:rPr>
-          <w:rFonts w:ascii="Arial" w:hAnsi="Arial"/>
-          <w:color w:val="000000"/>
-          <w:sz w:val="19"/>
-        </w:rPr>
-        <w:t>The Australian Electoral Commission lodged Submission 309 to the Joint Select Committee on Artificial Intelligence, setting out the AEC's position on AI risks and governance relevant to electoral…</w:t>
+        <w:t>No regulator-in-news signal this fortnight, see Themes below.</w:t>
       </w:r>
     </w:p>
     <w:p>
@@ -779,233 +153,11 @@
       <w:r>
         <w:rPr>
           <w:rFonts w:ascii="Arial" w:hAnsi="Arial"/>
-          <w:b/>
-          <w:color w:val="000000"/>
+          <w:i/>
+          <w:color w:val="666666"/>
           <w:sz w:val="19"/>
         </w:rPr>
-        <w:t>Victoria</w:t>
-      </w:r>
-    </w:p>
-    <w:p>
-      <w:pPr>
-        <w:pStyle w:val="ListBullet"/>
-      </w:pPr>
-      <w:r>
-        <w:rPr>
-          <w:rFonts w:ascii="Arial" w:hAnsi="Arial"/>
-          <w:b/>
-          <w:color w:val="000000"/>
-          <w:sz w:val="19"/>
-        </w:rPr>
-        <w:t>Essential Services Commission</w:t>
-      </w:r>
-      <w:r>
-        <w:rPr>
-          <w:rFonts w:ascii="Arial" w:hAnsi="Arial"/>
-          <w:color w:val="000000"/>
-          <w:sz w:val="19"/>
-        </w:rPr>
-        <w:t xml:space="preserve"> - </w:t>
-      </w:r>
-      <w:r>
-        <w:rPr>
-          <w:rFonts w:ascii="Arial" w:hAnsi="Arial"/>
-          <w:color w:val="000000"/>
-          <w:sz w:val="19"/>
-        </w:rPr>
-        <w:t>Midday Power Saver and new energy connection rules launched</w:t>
-      </w:r>
-    </w:p>
-    <w:p>
-      <w:pPr>
-        <w:pStyle w:val="ListBullet"/>
-      </w:pPr>
-      <w:r>
-        <w:rPr>
-          <w:rFonts w:ascii="Arial" w:hAnsi="Arial"/>
-          <w:b/>
-          <w:color w:val="000000"/>
-          <w:sz w:val="19"/>
-        </w:rPr>
-        <w:t>Independent Broad-based Anti-corruption Commission</w:t>
-      </w:r>
-      <w:r>
-        <w:rPr>
-          <w:rFonts w:ascii="Arial" w:hAnsi="Arial"/>
-          <w:color w:val="000000"/>
-          <w:sz w:val="19"/>
-        </w:rPr>
-        <w:t xml:space="preserve"> - </w:t>
-      </w:r>
-      <w:r>
-        <w:rPr>
-          <w:rFonts w:ascii="Arial" w:hAnsi="Arial"/>
-          <w:color w:val="000000"/>
-          <w:sz w:val="19"/>
-        </w:rPr>
-        <w:t>Scope of Victorian corruption watchdog widens, with legislative fast track</w:t>
-      </w:r>
-      <w:r>
-        <w:rPr>
-          <w:rFonts w:ascii="Arial" w:hAnsi="Arial"/>
-          <w:color w:val="000000"/>
-          <w:sz w:val="19"/>
-        </w:rPr>
-        <w:t xml:space="preserve"> (</w:t>
-      </w:r>
-      <w:hyperlink r:id="rId20">
-        <w:r>
-          <w:rPr>
-            <w:rFonts w:ascii="Arial" w:hAnsi="Arial" w:cs="Arial"/>
-            <w:color w:val="0000FF"/>
-            <w:sz w:val="19"/>
-            <w:szCs w:val="19"/>
-            <w:u w:val="single"/>
-          </w:rPr>
-          <w:t xml:space="preserve">Read more</w:t>
-        </w:r>
-      </w:hyperlink>
-      <w:r>
-        <w:rPr>
-          <w:rFonts w:ascii="Arial" w:hAnsi="Arial"/>
-          <w:color w:val="000000"/>
-          <w:sz w:val="19"/>
-        </w:rPr>
-        <w:t>)</w:t>
-      </w:r>
-    </w:p>
-    <w:p>
-      <w:pPr>
-        <w:pStyle w:val="ListBullet"/>
-      </w:pPr>
-      <w:r>
-        <w:rPr>
-          <w:rFonts w:ascii="Arial" w:hAnsi="Arial"/>
-          <w:b/>
-          <w:color w:val="000000"/>
-          <w:sz w:val="19"/>
-        </w:rPr>
-        <w:t>Consumer Affairs Victoria</w:t>
-      </w:r>
-      <w:r>
-        <w:rPr>
-          <w:rFonts w:ascii="Arial" w:hAnsi="Arial"/>
-          <w:color w:val="000000"/>
-          <w:sz w:val="19"/>
-        </w:rPr>
-        <w:t xml:space="preserve"> - </w:t>
-      </w:r>
-      <w:r>
-        <w:rPr>
-          <w:rFonts w:ascii="Arial" w:hAnsi="Arial"/>
-          <w:color w:val="000000"/>
-          <w:sz w:val="19"/>
-        </w:rPr>
-        <w:t>New underquoting and property sales laws take effect</w:t>
-      </w:r>
-    </w:p>
-    <w:p>
-      <w:pPr>
-        <w:pStyle w:val="body_letter"/>
-      </w:pPr>
-      <w:r>
-        <w:rPr>
-          <w:rFonts w:ascii="Arial" w:hAnsi="Arial"/>
-          <w:b/>
-          <w:color w:val="000000"/>
-          <w:sz w:val="19"/>
-        </w:rPr>
-        <w:t>Commonwealth</w:t>
-      </w:r>
-    </w:p>
-    <w:p>
-      <w:pPr>
-        <w:pStyle w:val="ListBullet"/>
-      </w:pPr>
-      <w:r>
-        <w:rPr>
-          <w:rFonts w:ascii="Arial" w:hAnsi="Arial"/>
-          <w:b/>
-          <w:color w:val="000000"/>
-          <w:sz w:val="19"/>
-        </w:rPr>
-        <w:t>Australian Securities and Investments Commission</w:t>
-      </w:r>
-      <w:r>
-        <w:rPr>
-          <w:rFonts w:ascii="Arial" w:hAnsi="Arial"/>
-          <w:color w:val="000000"/>
-          <w:sz w:val="19"/>
-        </w:rPr>
-        <w:t xml:space="preserve"> - </w:t>
-      </w:r>
-      <w:r>
-        <w:rPr>
-          <w:rFonts w:ascii="Arial" w:hAnsi="Arial"/>
-          <w:color w:val="000000"/>
-          <w:sz w:val="19"/>
-        </w:rPr>
-        <w:t>ASIC releases 2026-27 supervisory priorities</w:t>
-      </w:r>
-    </w:p>
-    <w:p>
-      <w:pPr>
-        <w:pStyle w:val="ListBullet"/>
-      </w:pPr>
-      <w:r>
-        <w:rPr>
-          <w:rFonts w:ascii="Arial" w:hAnsi="Arial"/>
-          <w:b/>
-          <w:color w:val="000000"/>
-          <w:sz w:val="19"/>
-        </w:rPr>
-        <w:t>Australian Prudential Regulation Authority</w:t>
-      </w:r>
-      <w:r>
-        <w:rPr>
-          <w:rFonts w:ascii="Arial" w:hAnsi="Arial"/>
-          <w:color w:val="000000"/>
-          <w:sz w:val="19"/>
-        </w:rPr>
-        <w:t xml:space="preserve"> - </w:t>
-      </w:r>
-      <w:r>
-        <w:rPr>
-          <w:rFonts w:ascii="Arial" w:hAnsi="Arial"/>
-          <w:color w:val="000000"/>
-          <w:sz w:val="19"/>
-        </w:rPr>
-        <w:t>APRA issues heightened risk warning on private credit</w:t>
-      </w:r>
-    </w:p>
-    <w:p>
-      <w:pPr>
-        <w:pStyle w:val="ListBullet"/>
-      </w:pPr>
-      <w:r>
-        <w:rPr>
-          <w:rFonts w:ascii="Arial" w:hAnsi="Arial"/>
-          <w:b/>
-          <w:color w:val="000000"/>
-          <w:sz w:val="19"/>
-        </w:rPr>
-        <w:t>Comcare</w:t>
-      </w:r>
-      <w:r>
-        <w:rPr>
-          <w:rFonts w:ascii="Arial" w:hAnsi="Arial"/>
-          <w:color w:val="000000"/>
-          <w:sz w:val="19"/>
-        </w:rPr>
-        <w:t xml:space="preserve"> - </w:t>
-      </w:r>
-      <w:r>
-        <w:rPr>
-          <w:rFonts w:ascii="Arial" w:hAnsi="Arial"/>
-          <w:color w:val="000000"/>
-          <w:sz w:val="19"/>
-        </w:rPr>
-        <w:t>Comcare charges Defence over naval base crane incident</w:t>
+        <w:t>No client-in-news signal this fortnight across any jurisdiction.</w:t>
       </w:r>
     </w:p>
     <w:p>
@@ -1119,7 +271,7 @@
           <w:color w:val="000000"/>
           <w:sz w:val="19"/>
         </w:rPr>
-        <w:t>APRA has issued a heightened-risk warning on private credit, signalling proposed reforms and strict new investment limits for superannuation trustees exposed to illiquid assets.</w:t>
+        <w:t>(as at 2026-10-05) APRA has issued a heightened-risk warning on private credit, signalling proposed reforms and strict new investment limits for superannuation trustees exposed to illiquid assets.</w:t>
       </w:r>
     </w:p>
     <w:p>
@@ -1149,7 +301,7 @@
           <w:color w:val="000000"/>
           <w:sz w:val="19"/>
         </w:rPr>
-        <w:t>APRA has indicated that its proposed prudential reforms will fall most heavily on investment platforms, requiring trustees and platform operators to reassess risk and capital frameworks.</w:t>
+        <w:t>(as at 2026-10-05) APRA has indicated that its proposed prudential reforms will fall most heavily on investment platforms, requiring trustees and platform operators to reassess risk and capital…</w:t>
       </w:r>
       <w:r>
         <w:rPr>
@@ -1159,7 +311,7 @@
         </w:rPr>
         <w:t xml:space="preserve"> (</w:t>
       </w:r>
-      <w:hyperlink r:id="rId21">
+      <w:hyperlink r:id="rId10">
         <w:r>
           <w:rPr>
             <w:rFonts w:ascii="Arial" w:hAnsi="Arial" w:cs="Arial"/>
@@ -1207,7 +359,7 @@
           <w:color w:val="000000"/>
           <w:sz w:val="19"/>
         </w:rPr>
-        <w:t>The ATSB has published a safety concern report identifying crew fatigue as a systemic risk in domestic commercial passenger and vehicle ferry operations, calling for stronger fatigue management…</w:t>
+        <w:t>(as at 2026-10-05) The ATSB has published a safety concern report identifying crew fatigue as a systemic risk in domestic commercial passenger and vehicle ferry operations, calling for stronger…</w:t>
       </w:r>
       <w:r>
         <w:rPr>
@@ -1217,7 +369,7 @@
         </w:rPr>
         <w:t xml:space="preserve"> (</w:t>
       </w:r>
-      <w:hyperlink r:id="rId22">
+      <w:hyperlink r:id="rId11">
         <w:r>
           <w:rPr>
             <w:rFonts w:ascii="Arial" w:hAnsi="Arial" w:cs="Arial"/>
@@ -1265,7 +417,7 @@
           <w:color w:val="000000"/>
           <w:sz w:val="19"/>
         </w:rPr>
-        <w:t>The ATSB's investigation into the Port Botany freight train collision found deficiencies in risk management procedures, underscoring the need for operators to strengthen safety governance frameworks.</w:t>
+        <w:t>(as at 2026-10-05) The ATSB's investigation into the Port Botany freight train collision found deficiencies in risk management procedures, underscoring the need for operators to strengthen safety…</w:t>
       </w:r>
       <w:r>
         <w:rPr>
@@ -1275,7 +427,7 @@
         </w:rPr>
         <w:t xml:space="preserve"> (</w:t>
       </w:r>
-      <w:hyperlink r:id="rId23">
+      <w:hyperlink r:id="rId12">
         <w:r>
           <w:rPr>
             <w:rFonts w:ascii="Arial" w:hAnsi="Arial" w:cs="Arial"/>
@@ -1337,7 +489,7 @@
           <w:color w:val="000000"/>
           <w:sz w:val="19"/>
         </w:rPr>
-        <w:t>The Australian Banking Association has submitted to the Joint Select Committee on Artificial Intelligence, calling for a risk-proportionate regulatory framework that enables banks to adopt AI…</w:t>
+        <w:t>(as at 2026-10-05) The Australian Banking Association has submitted to the Joint Select Committee on Artificial Intelligence, calling for a risk-proportionate regulatory framework that enables banks…</w:t>
       </w:r>
       <w:r>
         <w:rPr>
@@ -1347,7 +499,7 @@
         </w:rPr>
         <w:t xml:space="preserve"> (</w:t>
       </w:r>
-      <w:hyperlink r:id="rId24">
+      <w:hyperlink r:id="rId13">
         <w:r>
           <w:rPr>
             <w:rFonts w:ascii="Arial" w:hAnsi="Arial" w:cs="Arial"/>
@@ -1395,7 +547,7 @@
           <w:color w:val="000000"/>
           <w:sz w:val="19"/>
         </w:rPr>
-        <w:t>ASQA has released AI principles for registered training organisations, setting out governance and integrity expectations for AI use in early childhood educator training and assessment.</w:t>
+        <w:t>(as at 2026-10-05) ASQA has released AI principles for registered training organisations, setting out governance and integrity expectations for AI use in early childhood educator training and…</w:t>
       </w:r>
       <w:r>
         <w:rPr>
@@ -1405,7 +557,7 @@
         </w:rPr>
         <w:t xml:space="preserve"> (</w:t>
       </w:r>
-      <w:hyperlink r:id="rId25">
+      <w:hyperlink r:id="rId14">
         <w:r>
           <w:rPr>
             <w:rFonts w:ascii="Arial" w:hAnsi="Arial" w:cs="Arial"/>
@@ -1453,7 +605,7 @@
           <w:color w:val="000000"/>
           <w:sz w:val="19"/>
         </w:rPr>
-        <w:t>CASA has used stakeholder feedback to shape a new regulatory framework for drone operations above 400 feet, balancing innovation enablement with airspace safety and risk management requirements.</w:t>
+        <w:t>(as at 2026-10-05) CASA has used stakeholder feedback to shape a new regulatory framework for drone operations above 400 feet, balancing innovation enablement with airspace safety and risk…</w:t>
       </w:r>
       <w:r>
         <w:rPr>
@@ -1463,7 +615,7 @@
         </w:rPr>
         <w:t xml:space="preserve"> (</w:t>
       </w:r>
-      <w:hyperlink r:id="rId26">
+      <w:hyperlink r:id="rId15">
         <w:r>
           <w:rPr>
             <w:rFonts w:ascii="Arial" w:hAnsi="Arial" w:cs="Arial"/>
@@ -1525,7 +677,7 @@
           <w:color w:val="000000"/>
           <w:sz w:val="19"/>
         </w:rPr>
-        <w:t>ASIC has published its 2026-27 supervisory priorities to give industry greater certainty and support a better regulation agenda, focusing enforcement resources on consumer harm and market integrity.</w:t>
+        <w:t>(as at 2026-10-05) ASIC has published its 2026-27 supervisory priorities to give industry greater certainty and support a better regulation agenda, focusing enforcement resources on consumer harm…</w:t>
       </w:r>
       <w:r>
         <w:rPr>
@@ -1535,7 +687,7 @@
         </w:rPr>
         <w:t xml:space="preserve"> (</w:t>
       </w:r>
-      <w:hyperlink r:id="rId27">
+      <w:hyperlink r:id="rId16">
         <w:r>
           <w:rPr>
             <w:rFonts w:ascii="Arial" w:hAnsi="Arial" w:cs="Arial"/>
@@ -1583,7 +735,7 @@
           <w:color w:val="000000"/>
           <w:sz w:val="19"/>
         </w:rPr>
-        <w:t>The FSC has welcomed the Financial Advice Reform Bill as a meaningful step toward reducing compliance costs and broadening access to affordable financial advice for Australian consumers.</w:t>
+        <w:t>(as at 2026-10-05) The FSC has welcomed the Financial Advice Reform Bill as a meaningful step toward reducing compliance costs and broadening access to affordable financial advice for Australian…</w:t>
       </w:r>
       <w:r>
         <w:rPr>
@@ -1593,7 +745,7 @@
         </w:rPr>
         <w:t xml:space="preserve"> (</w:t>
       </w:r>
-      <w:hyperlink r:id="rId28">
+      <w:hyperlink r:id="rId17">
         <w:r>
           <w:rPr>
             <w:rFonts w:ascii="Arial" w:hAnsi="Arial" w:cs="Arial"/>
@@ -1641,7 +793,7 @@
           <w:color w:val="000000"/>
           <w:sz w:val="19"/>
         </w:rPr>
-        <w:t>The federal surcharge ban has prompted major banks to cut rewards programs and complimentary travel insurance as reduced interchange fee revenue flows through to product design.</w:t>
+        <w:t>(as at 2026-10-05) The federal surcharge ban has prompted major banks to cut rewards programs and complimentary travel insurance as reduced interchange fee revenue flows through to product design.</w:t>
       </w:r>
       <w:r>
         <w:rPr>
@@ -1651,7 +803,7 @@
         </w:rPr>
         <w:t xml:space="preserve"> (</w:t>
       </w:r>
-      <w:hyperlink r:id="rId29">
+      <w:hyperlink r:id="rId18">
         <w:r>
           <w:rPr>
             <w:rFonts w:ascii="Arial" w:hAnsi="Arial" w:cs="Arial"/>
@@ -1699,7 +851,7 @@
           <w:color w:val="000000"/>
           <w:sz w:val="19"/>
         </w:rPr>
-        <w:t>Proposed reforms will extend licensing obligations to a wider range of payment service providers in Australia, increasing compliance obligations for fintechs and non-bank payment operators.</w:t>
+        <w:t>(as at 2026-10-05) Proposed reforms will extend licensing obligations to a wider range of payment service providers in Australia, increasing compliance obligations for fintechs and non-bank payment…</w:t>
       </w:r>
       <w:r>
         <w:rPr>
@@ -1709,7 +861,7 @@
         </w:rPr>
         <w:t xml:space="preserve"> (</w:t>
       </w:r>
-      <w:hyperlink r:id="rId30">
+      <w:hyperlink r:id="rId19">
         <w:r>
           <w:rPr>
             <w:rFonts w:ascii="Arial" w:hAnsi="Arial" w:cs="Arial"/>
@@ -1746,16 +898,350 @@
     </w:p>
     <w:p>
       <w:pPr>
-        <w:pStyle w:val="body_letter"/>
+        <w:pStyle w:val="ListBullet"/>
       </w:pPr>
       <w:r>
         <w:rPr>
           <w:rFonts w:ascii="Arial" w:hAnsi="Arial"/>
-          <w:i/>
-          <w:color w:val="666666"/>
+          <w:b/>
+          <w:color w:val="000000"/>
           <w:sz w:val="19"/>
         </w:rPr>
-        <w:t>No upcoming events in the next four weeks.</w:t>
+        <w:t>FSC Retirement Summit 2026</w:t>
+      </w:r>
+      <w:r>
+        <w:rPr>
+          <w:rFonts w:ascii="Arial" w:hAnsi="Arial"/>
+          <w:color w:val="000000"/>
+          <w:sz w:val="19"/>
+        </w:rPr>
+        <w:t xml:space="preserve"> - </w:t>
+      </w:r>
+      <w:r>
+        <w:rPr>
+          <w:rFonts w:ascii="Arial" w:hAnsi="Arial"/>
+          <w:color w:val="000000"/>
+          <w:sz w:val="19"/>
+        </w:rPr>
+        <w:t>22 Oct 2026 - APRA · Online</w:t>
+      </w:r>
+      <w:r>
+        <w:rPr>
+          <w:rFonts w:ascii="Arial" w:hAnsi="Arial"/>
+          <w:color w:val="000000"/>
+          <w:sz w:val="19"/>
+        </w:rPr>
+        <w:t xml:space="preserve"> (</w:t>
+      </w:r>
+      <w:hyperlink r:id="rId20">
+        <w:r>
+          <w:rPr>
+            <w:rFonts w:ascii="Arial" w:hAnsi="Arial" w:cs="Arial"/>
+            <w:color w:val="0000FF"/>
+            <w:sz w:val="19"/>
+            <w:szCs w:val="19"/>
+            <w:u w:val="single"/>
+          </w:rPr>
+          <w:t xml:space="preserve">Register</w:t>
+        </w:r>
+      </w:hyperlink>
+      <w:r>
+        <w:rPr>
+          <w:rFonts w:ascii="Arial" w:hAnsi="Arial"/>
+          <w:color w:val="000000"/>
+          <w:sz w:val="19"/>
+        </w:rPr>
+        <w:t>)</w:t>
+      </w:r>
+    </w:p>
+    <w:p>
+      <w:pPr>
+        <w:pStyle w:val="ListBullet"/>
+      </w:pPr>
+      <w:r>
+        <w:rPr>
+          <w:rFonts w:ascii="Arial" w:hAnsi="Arial"/>
+          <w:b/>
+          <w:color w:val="000000"/>
+          <w:sz w:val="19"/>
+        </w:rPr>
+        <w:t>Citi A50 Australian Economic Forum 2026</w:t>
+      </w:r>
+      <w:r>
+        <w:rPr>
+          <w:rFonts w:ascii="Arial" w:hAnsi="Arial"/>
+          <w:color w:val="000000"/>
+          <w:sz w:val="19"/>
+        </w:rPr>
+        <w:t xml:space="preserve"> - </w:t>
+      </w:r>
+      <w:r>
+        <w:rPr>
+          <w:rFonts w:ascii="Arial" w:hAnsi="Arial"/>
+          <w:color w:val="000000"/>
+          <w:sz w:val="19"/>
+        </w:rPr>
+        <w:t>23 Oct 2026 - APRA · Online</w:t>
+      </w:r>
+      <w:r>
+        <w:rPr>
+          <w:rFonts w:ascii="Arial" w:hAnsi="Arial"/>
+          <w:color w:val="000000"/>
+          <w:sz w:val="19"/>
+        </w:rPr>
+        <w:t xml:space="preserve"> (</w:t>
+      </w:r>
+      <w:hyperlink r:id="rId21">
+        <w:r>
+          <w:rPr>
+            <w:rFonts w:ascii="Arial" w:hAnsi="Arial" w:cs="Arial"/>
+            <w:color w:val="0000FF"/>
+            <w:sz w:val="19"/>
+            <w:szCs w:val="19"/>
+            <w:u w:val="single"/>
+          </w:rPr>
+          <w:t xml:space="preserve">Register</w:t>
+        </w:r>
+      </w:hyperlink>
+      <w:r>
+        <w:rPr>
+          <w:rFonts w:ascii="Arial" w:hAnsi="Arial"/>
+          <w:color w:val="000000"/>
+          <w:sz w:val="19"/>
+        </w:rPr>
+        <w:t>)</w:t>
+      </w:r>
+    </w:p>
+    <w:p>
+      <w:pPr>
+        <w:pStyle w:val="ListBullet"/>
+      </w:pPr>
+      <w:r>
+        <w:rPr>
+          <w:rFonts w:ascii="Arial" w:hAnsi="Arial"/>
+          <w:b/>
+          <w:color w:val="000000"/>
+          <w:sz w:val="19"/>
+        </w:rPr>
+        <w:t>AFR Super &amp;amp; Wealth Summit 2026</w:t>
+      </w:r>
+      <w:r>
+        <w:rPr>
+          <w:rFonts w:ascii="Arial" w:hAnsi="Arial"/>
+          <w:color w:val="000000"/>
+          <w:sz w:val="19"/>
+        </w:rPr>
+        <w:t xml:space="preserve"> - </w:t>
+      </w:r>
+      <w:r>
+        <w:rPr>
+          <w:rFonts w:ascii="Arial" w:hAnsi="Arial"/>
+          <w:color w:val="000000"/>
+          <w:sz w:val="19"/>
+        </w:rPr>
+        <w:t>26 Oct 2026 - APRA · Online</w:t>
+      </w:r>
+      <w:r>
+        <w:rPr>
+          <w:rFonts w:ascii="Arial" w:hAnsi="Arial"/>
+          <w:color w:val="000000"/>
+          <w:sz w:val="19"/>
+        </w:rPr>
+        <w:t xml:space="preserve"> (</w:t>
+      </w:r>
+      <w:hyperlink r:id="rId22">
+        <w:r>
+          <w:rPr>
+            <w:rFonts w:ascii="Arial" w:hAnsi="Arial" w:cs="Arial"/>
+            <w:color w:val="0000FF"/>
+            <w:sz w:val="19"/>
+            <w:szCs w:val="19"/>
+            <w:u w:val="single"/>
+          </w:rPr>
+          <w:t xml:space="preserve">Register</w:t>
+        </w:r>
+      </w:hyperlink>
+      <w:r>
+        <w:rPr>
+          <w:rFonts w:ascii="Arial" w:hAnsi="Arial"/>
+          <w:color w:val="000000"/>
+          <w:sz w:val="19"/>
+        </w:rPr>
+        <w:t>)</w:t>
+      </w:r>
+    </w:p>
+    <w:p>
+      <w:pPr>
+        <w:pStyle w:val="ListBullet"/>
+      </w:pPr>
+      <w:r>
+        <w:rPr>
+          <w:rFonts w:ascii="Arial" w:hAnsi="Arial"/>
+          <w:b/>
+          <w:color w:val="000000"/>
+          <w:sz w:val="19"/>
+        </w:rPr>
+        <w:t>Financial Services and ASX Sector Assurance Forum 2026</w:t>
+      </w:r>
+      <w:r>
+        <w:rPr>
+          <w:rFonts w:ascii="Arial" w:hAnsi="Arial"/>
+          <w:color w:val="000000"/>
+          <w:sz w:val="19"/>
+        </w:rPr>
+        <w:t xml:space="preserve"> - </w:t>
+      </w:r>
+      <w:r>
+        <w:rPr>
+          <w:rFonts w:ascii="Arial" w:hAnsi="Arial"/>
+          <w:color w:val="000000"/>
+          <w:sz w:val="19"/>
+        </w:rPr>
+        <w:t>27 Oct 2026 - APRA · Online</w:t>
+      </w:r>
+      <w:r>
+        <w:rPr>
+          <w:rFonts w:ascii="Arial" w:hAnsi="Arial"/>
+          <w:color w:val="000000"/>
+          <w:sz w:val="19"/>
+        </w:rPr>
+        <w:t xml:space="preserve"> (</w:t>
+      </w:r>
+      <w:hyperlink r:id="rId23">
+        <w:r>
+          <w:rPr>
+            <w:rFonts w:ascii="Arial" w:hAnsi="Arial" w:cs="Arial"/>
+            <w:color w:val="0000FF"/>
+            <w:sz w:val="19"/>
+            <w:szCs w:val="19"/>
+            <w:u w:val="single"/>
+          </w:rPr>
+          <w:t xml:space="preserve">Register</w:t>
+        </w:r>
+      </w:hyperlink>
+      <w:r>
+        <w:rPr>
+          <w:rFonts w:ascii="Arial" w:hAnsi="Arial"/>
+          <w:color w:val="000000"/>
+          <w:sz w:val="19"/>
+        </w:rPr>
+        <w:t>)</w:t>
+      </w:r>
+    </w:p>
+    <w:p>
+      <w:pPr>
+        <w:pStyle w:val="ListBullet"/>
+      </w:pPr>
+      <w:r>
+        <w:rPr>
+          <w:rFonts w:ascii="Arial" w:hAnsi="Arial"/>
+          <w:b/>
+          <w:color w:val="000000"/>
+          <w:sz w:val="19"/>
+        </w:rPr>
+        <w:t>AFSA Summit 2026</w:t>
+      </w:r>
+      <w:r>
+        <w:rPr>
+          <w:rFonts w:ascii="Arial" w:hAnsi="Arial"/>
+          <w:color w:val="000000"/>
+          <w:sz w:val="19"/>
+        </w:rPr>
+        <w:t xml:space="preserve"> - </w:t>
+      </w:r>
+      <w:r>
+        <w:rPr>
+          <w:rFonts w:ascii="Arial" w:hAnsi="Arial"/>
+          <w:color w:val="000000"/>
+          <w:sz w:val="19"/>
+        </w:rPr>
+        <w:t>05 Nov 2026 - APRA · Online</w:t>
+      </w:r>
+      <w:r>
+        <w:rPr>
+          <w:rFonts w:ascii="Arial" w:hAnsi="Arial"/>
+          <w:color w:val="000000"/>
+          <w:sz w:val="19"/>
+        </w:rPr>
+        <w:t xml:space="preserve"> (</w:t>
+      </w:r>
+      <w:hyperlink r:id="rId24">
+        <w:r>
+          <w:rPr>
+            <w:rFonts w:ascii="Arial" w:hAnsi="Arial" w:cs="Arial"/>
+            <w:color w:val="0000FF"/>
+            <w:sz w:val="19"/>
+            <w:szCs w:val="19"/>
+            <w:u w:val="single"/>
+          </w:rPr>
+          <w:t xml:space="preserve">Register</w:t>
+        </w:r>
+      </w:hyperlink>
+      <w:r>
+        <w:rPr>
+          <w:rFonts w:ascii="Arial" w:hAnsi="Arial"/>
+          <w:color w:val="000000"/>
+          <w:sz w:val="19"/>
+        </w:rPr>
+        <w:t>)</w:t>
+      </w:r>
+    </w:p>
+    <w:p>
+      <w:pPr>
+        <w:pStyle w:val="ListBullet"/>
+      </w:pPr>
+      <w:r>
+        <w:rPr>
+          <w:rFonts w:ascii="Arial" w:hAnsi="Arial"/>
+          <w:b/>
+          <w:color w:val="000000"/>
+          <w:sz w:val="19"/>
+        </w:rPr>
+        <w:t>Insurance Council of Australia Annual Conference 2026</w:t>
+      </w:r>
+      <w:r>
+        <w:rPr>
+          <w:rFonts w:ascii="Arial" w:hAnsi="Arial"/>
+          <w:color w:val="000000"/>
+          <w:sz w:val="19"/>
+        </w:rPr>
+        <w:t xml:space="preserve"> - </w:t>
+      </w:r>
+      <w:r>
+        <w:rPr>
+          <w:rFonts w:ascii="Arial" w:hAnsi="Arial"/>
+          <w:color w:val="000000"/>
+          <w:sz w:val="19"/>
+        </w:rPr>
+        <w:t>06 Nov 2026 - APRA · Online</w:t>
+      </w:r>
+      <w:r>
+        <w:rPr>
+          <w:rFonts w:ascii="Arial" w:hAnsi="Arial"/>
+          <w:color w:val="000000"/>
+          <w:sz w:val="19"/>
+        </w:rPr>
+        <w:t xml:space="preserve"> (</w:t>
+      </w:r>
+      <w:hyperlink r:id="rId25">
+        <w:r>
+          <w:rPr>
+            <w:rFonts w:ascii="Arial" w:hAnsi="Arial" w:cs="Arial"/>
+            <w:color w:val="0000FF"/>
+            <w:sz w:val="19"/>
+            <w:szCs w:val="19"/>
+            <w:u w:val="single"/>
+          </w:rPr>
+          <w:t xml:space="preserve">Register</w:t>
+        </w:r>
+      </w:hyperlink>
+      <w:r>
+        <w:rPr>
+          <w:rFonts w:ascii="Arial" w:hAnsi="Arial"/>
+          <w:color w:val="000000"/>
+          <w:sz w:val="19"/>
+        </w:rPr>
+        <w:t>)</w:t>
       </w:r>
     </w:p>
     <w:p>
@@ -1770,20 +1256,6 @@
           <w:sz w:val="21"/>
         </w:rPr>
         <w:t>Cross-sector synthesis (hub-wide)</w:t>
-      </w:r>
-    </w:p>
-    <w:p>
-      <w:pPr>
-        <w:pStyle w:val="body_letter"/>
-      </w:pPr>
-      <w:r>
-        <w:rPr>
-          <w:rFonts w:ascii="Arial" w:hAnsi="Arial"/>
-          <w:b w:val="0"/>
-          <w:color w:val="000000"/>
-          <w:sz w:val="19"/>
-        </w:rPr>
-        <w:t>The fortnight is shaped by three converging regulator investment themes: enforcement escalation across ASIC, TEQSA, AUSTRAC, and ACQSC converting supervisory intent into active action; AI governance acceleration driven by a Commonwealth health-system breach, the AEC inquiry, ABA submission, and ASQA principles creating a cross-sector AI risk mandate; and structural reform execution with the Financial Advice Reform Bill, NDIS sustainability redesign, defence procurement reset, and AUKUS leasing alternatives all shifting from policy to implementation. ASIC's 2026-27 supervisory priorities and life insurance sector paper name specific product governance and sustainable finance disclosure obligations that will drive near-term compliance uplift demand across banks, platforms, and insurers. APRA's simultaneous private credit risk warning and proposed reforms expected to land hardest on platform operators create a two-front assurance and risk advisory mandate for mid-tier ADIs and superannuation trustees, the target list is now named. The ATSB's Port Botany findings and AMSA's emissions reduction plan signal transport regulators converting investigation outcomes into enforceable standards, opening the SMS uplift and maritime compliance readiness window before deadlines crystallise. TEQSA's updated Compliance and Enforcement Policy paired with active enforcement against OneGlobe and Opulence marks a structural shift in higher education regulatory risk that peers of those providers must now address. KPMG should concentrate BD effort this fortnight on financial services platform operators, rail and maritime clients, mid-tier higher education providers, and Commonwealth health and defence clients, all facing live compliance deadlines or active regulatory scrutiny.</w:t>
       </w:r>
     </w:p>
     <w:p>
@@ -1810,7 +1282,7 @@
           <w:color w:val="000000"/>
           <w:sz w:val="19"/>
         </w:rPr>
-        <w:t>Brief the financial services regulatory advisory team to approach the top-15 platform operators and superannuation trustees this week with a targeted APRA/ASIC compliance gap assessment mapped to the 2026-27 supervisory priorities and the proposed platform reforms.</w:t>
+        <w:t>Brief the relevant sector partner this fortnight on the highest-signal regulator development above.</w:t>
       </w:r>
     </w:p>
     <w:p>
@@ -1823,7 +1295,7 @@
           <w:color w:val="000000"/>
           <w:sz w:val="19"/>
         </w:rPr>
-        <w:t>Activate the credit risk advisory bench to convert APRA's named private credit warning into a structured credit-risk framework review offer for mid-tier ADIs and super funds with material private credit exposure.</w:t>
+        <w:t>Convene the capability bench for the next reg-tech / capability-review pursuit in pipeline.</w:t>
       </w:r>
     </w:p>
     <w:p>
@@ -1836,112 +1308,7 @@
           <w:color w:val="000000"/>
           <w:sz w:val="19"/>
         </w:rPr>
-        <w:t>Dispatch the transport safety practice to Sydney Trains, Australian Rail Track Corporation, and Patrick Terminals with a Safety Management System gap assessment anchored to the ATSB's Port Botany procedural findings before the regulator formalises its follow-up expectations.</w:t>
-      </w:r>
-    </w:p>
-    <w:p>
-      <w:pPr>
-        <w:pStyle w:val="ListBullet"/>
-      </w:pPr>
-      <w:r>
-        <w:rPr>
-          <w:rFonts w:ascii="Arial" w:hAnsi="Arial"/>
-          <w:color w:val="000000"/>
-          <w:sz w:val="19"/>
-        </w:rPr>
-        <w:t>Convene the higher education practice to pipeline the 50 closest peers of OneGlobe and Opulence for an urgent TEQSA registration risk review, positioning KPMG as the go-to adviser for providers facing the updated Compliance and Enforcement Policy.</w:t>
-      </w:r>
-    </w:p>
-    <w:p>
-      <w:pPr>
-        <w:pStyle w:val="ListBullet"/>
-      </w:pPr>
-      <w:r>
-        <w:rPr>
-          <w:rFonts w:ascii="Arial" w:hAnsi="Arial"/>
-          <w:color w:val="000000"/>
-          <w:sz w:val="19"/>
-        </w:rPr>
-        <w:t>Accelerate the AI risk advisory offer into health, financial services, and education simultaneously, the OpenAI health breach, ABA inquiry submission, and ASQA AI principles have created a rare moment where Commonwealth and state clients in three sectors are seeking the same capability concurrently.</w:t>
-      </w:r>
-    </w:p>
-    <w:p>
-      <w:pPr>
-        <w:pStyle w:val="body_letter"/>
-      </w:pPr>
-      <w:r>
-        <w:rPr>
-          <w:rFonts w:ascii="Arial" w:hAnsi="Arial"/>
-          <w:b/>
-          <w:color w:val="000000"/>
-          <w:sz w:val="19"/>
-        </w:rPr>
-        <w:t>Implications for clients</w:t>
-      </w:r>
-    </w:p>
-    <w:p>
-      <w:pPr>
-        <w:pStyle w:val="ListBullet"/>
-      </w:pPr>
-      <w:r>
-        <w:rPr>
-          <w:rFonts w:ascii="Arial" w:hAnsi="Arial"/>
-          <w:color w:val="000000"/>
-          <w:sz w:val="19"/>
-        </w:rPr>
-        <w:t>Brief the financial services regulatory advisory team to approach the top-15 platform operators and superannuation trustees this week with a targeted APRA/ASIC compliance gap assessment mapped to the 2026-27 supervisory priorities and the proposed platform reforms.</w:t>
-      </w:r>
-    </w:p>
-    <w:p>
-      <w:pPr>
-        <w:pStyle w:val="ListBullet"/>
-      </w:pPr>
-      <w:r>
-        <w:rPr>
-          <w:rFonts w:ascii="Arial" w:hAnsi="Arial"/>
-          <w:color w:val="000000"/>
-          <w:sz w:val="19"/>
-        </w:rPr>
-        <w:t>Activate the credit risk advisory bench to convert APRA's named private credit warning into a structured credit-risk framework review offer for mid-tier ADIs and super funds with material private credit exposure.</w:t>
-      </w:r>
-    </w:p>
-    <w:p>
-      <w:pPr>
-        <w:pStyle w:val="ListBullet"/>
-      </w:pPr>
-      <w:r>
-        <w:rPr>
-          <w:rFonts w:ascii="Arial" w:hAnsi="Arial"/>
-          <w:color w:val="000000"/>
-          <w:sz w:val="19"/>
-        </w:rPr>
-        <w:t>Dispatch the transport safety practice to Sydney Trains, Australian Rail Track Corporation, and Patrick Terminals with a Safety Management System gap assessment anchored to the ATSB's Port Botany procedural findings before the regulator formalises its follow-up expectations.</w:t>
-      </w:r>
-    </w:p>
-    <w:p>
-      <w:pPr>
-        <w:pStyle w:val="ListBullet"/>
-      </w:pPr>
-      <w:r>
-        <w:rPr>
-          <w:rFonts w:ascii="Arial" w:hAnsi="Arial"/>
-          <w:color w:val="000000"/>
-          <w:sz w:val="19"/>
-        </w:rPr>
-        <w:t>Convene the higher education practice to pipeline the 50 closest peers of OneGlobe and Opulence for an urgent TEQSA registration risk review, positioning KPMG as the go-to adviser for providers facing the updated Compliance and Enforcement Policy.</w:t>
-      </w:r>
-    </w:p>
-    <w:p>
-      <w:pPr>
-        <w:pStyle w:val="ListBullet"/>
-      </w:pPr>
-      <w:r>
-        <w:rPr>
-          <w:rFonts w:ascii="Arial" w:hAnsi="Arial"/>
-          <w:color w:val="000000"/>
-          <w:sz w:val="19"/>
-        </w:rPr>
-        <w:t>Accelerate the AI risk advisory offer into health, financial services, and education simultaneously, the OpenAI health breach, ABA inquiry submission, and ASQA AI principles have created a rare moment where Commonwealth and state clients in three sectors are seeking the same capability concurrently.</w:t>
+        <w:t>Pursue at least one tracked client on a near-term advisory hook before the next CoP cadence.</w:t>
       </w:r>
     </w:p>
     <w:p>
@@ -1965,221 +1332,11 @@
       <w:r>
         <w:rPr>
           <w:rFonts w:ascii="Arial" w:hAnsi="Arial"/>
-          <w:b/>
-          <w:color w:val="000000"/>
+          <w:i/>
+          <w:color w:val="666666"/>
           <w:sz w:val="19"/>
         </w:rPr>
-        <w:t>Public Sector</w:t>
-      </w:r>
-    </w:p>
-    <w:p>
-      <w:pPr>
-        <w:pStyle w:val="body_letter"/>
-      </w:pPr>
-      <w:r>
-        <w:rPr>
-          <w:rFonts w:ascii="Arial" w:hAnsi="Arial"/>
-          <w:b w:val="0"/>
-          <w:color w:val="000000"/>
-          <w:sz w:val="19"/>
-        </w:rPr>
-        <w:t>The AEC's submission to the Joint Select Committee on AI signals active Commonwealth investment in election-integrity and AI-governance capability, creating a timely entry for KPMG's AI risk and digital-advisory bench ahead of the committee's reporting window. Consumer Affairs Victoria's simultaneous release of new underquoting legislation and industry Q&amp;A guidance indicates a regulatory implementation sprint, a proven pull-through for process design, compliance-uplift, and change-management engagements with state consumer regulators. COSBOA's Treasury tax-administration submission and the IBCC draft-law criticism from the business community together mark a regulatory-complexity pressure point where KPMG can position reform design, stakeholder facilitation, and legislative-impact assessment capability. The WA government's public intervention on the Productivity Commission's GST review opens a state fiscal-strategy advisory angle, with the robodebt compensation dispute flagging ongoing Commonwealth liability-management and welfare-administration reform demand.</w:t>
-      </w:r>
-    </w:p>
-    <w:p>
-      <w:pPr>
-        <w:pStyle w:val="body_letter"/>
-      </w:pPr>
-      <w:r>
-        <w:rPr>
-          <w:rFonts w:ascii="Arial" w:hAnsi="Arial"/>
-          <w:b/>
-          <w:color w:val="000000"/>
-          <w:sz w:val="19"/>
-        </w:rPr>
-        <w:t>Financial Services</w:t>
-      </w:r>
-    </w:p>
-    <w:p>
-      <w:pPr>
-        <w:pStyle w:val="body_letter"/>
-      </w:pPr>
-      <w:r>
-        <w:rPr>
-          <w:rFonts w:ascii="Arial" w:hAnsi="Arial"/>
-          <w:b w:val="0"/>
-          <w:color w:val="000000"/>
-          <w:sz w:val="19"/>
-        </w:rPr>
-        <w:t>ASIC's release of its 2026-27 supervisory priorities signals a concentrated focus on product governance, sustainable finance disclosure, and market integrity that will drive near-term compliance uplift demand across banks, insurers, and platforms; the accompanying life insurance sector priorities paper sharpens the target list further. APRA's public warning on heightened private credit risk, combined with its proposed reforms expected to fall hardest on platform operators, creates a two-front assurance and risk advisory opening, particularly for mid-tier ADIs and superannuation trustees still maturing their credit-risk frameworks. The Financial Advice Reform Bill, welcomed by the FSC, moves quality-of-advice implementation from policy to execution, generating demand for operating-model and training support; the superannuation heatmap release simultaneously pressures underperforming funds to act. The ABA's AI inquiry submission and the new payment-services licensing regime round out a fortnight heavy with structural-change signals that favour KPMG's regulatory implementation and technology-risk offerings.</w:t>
-      </w:r>
-    </w:p>
-    <w:p>
-      <w:pPr>
-        <w:pStyle w:val="body_letter"/>
-      </w:pPr>
-      <w:r>
-        <w:rPr>
-          <w:rFonts w:ascii="Arial" w:hAnsi="Arial"/>
-          <w:b/>
-          <w:color w:val="000000"/>
-          <w:sz w:val="19"/>
-        </w:rPr>
-        <w:t>Health, Ageing &amp; Human Services</w:t>
-      </w:r>
-    </w:p>
-    <w:p>
-      <w:pPr>
-        <w:pStyle w:val="body_letter"/>
-      </w:pPr>
-      <w:r>
-        <w:rPr>
-          <w:rFonts w:ascii="Arial" w:hAnsi="Arial"/>
-          <w:b w:val="0"/>
-          <w:color w:val="000000"/>
-          <w:sz w:val="19"/>
-        </w:rPr>
-        <w:t>The ACQSC has escalated from prudential review directly to investigation of a Support at Home provider, signalling the Commission is operationalising its new enforcement powers under the Aged Care Act, providers facing registration renewal via the AECT are now a live compliance risk pool. Concurrently, a government AI-governance response has been triggered by an OpenAI bot breach of a health system database, accelerating federal action on AI risk frameworks in health and creating an immediate advisory opening. The NDIS Commission is investing in digital capability (new portal toolkit, First Nations resources hub) while ABC reporting on a serious complaints backlog exposes a regulator under operational strain, and the NDIS sustainability reform consultation signals a structural redesign of the scheme with significant advisory demand attached. Ahpra's psychology workforce reform advancing to its next phase adds a workforce planning and scope-of-practice advisory angle across the primary care pipeline.</w:t>
-      </w:r>
-    </w:p>
-    <w:p>
-      <w:pPr>
-        <w:pStyle w:val="body_letter"/>
-      </w:pPr>
-      <w:r>
-        <w:rPr>
-          <w:rFonts w:ascii="Arial" w:hAnsi="Arial"/>
-          <w:b/>
-          <w:color w:val="000000"/>
-          <w:sz w:val="19"/>
-        </w:rPr>
-        <w:t>Energy, Mining &amp; Property</w:t>
-      </w:r>
-    </w:p>
-    <w:p>
-      <w:pPr>
-        <w:pStyle w:val="body_letter"/>
-      </w:pPr>
-      <w:r>
-        <w:rPr>
-          <w:rFonts w:ascii="Arial" w:hAnsi="Arial"/>
-          <w:b w:val="0"/>
-          <w:color w:val="000000"/>
-          <w:sz w:val="19"/>
-        </w:rPr>
-        <w:t>The AER's release of its Strategic Plan (Approach 7) and the Powerlink transmission determination PTRM signal active investment in regulatory methodology and long-cycle infrastructure resets, creating immediate positioning opportunities for regulatory economics and capex advisory. The AER's commissioning of Deakin University for a 2026 capital expenditure model review confirms the regulator is actively seeking independent technical validation, a direct pull-through for KPMG's infrastructure and regulatory advisory bench. Two VEU accreditation enforcement actions by the ESC (Go Green Solution, Ruhi Pty Ltd) indicate heightened compliance scrutiny in Victorian energy efficiency programs, creating demand for scheme-integrity and compliance-uplift engagements with accredited providers. The AEMC's Package 2 network regulation review and WA's developing AES framework together flag two parallel reform processes where KPMG can position submissions and framework-design advisory to both regulators and network businesses.</w:t>
-      </w:r>
-    </w:p>
-    <w:p>
-      <w:pPr>
-        <w:pStyle w:val="body_letter"/>
-      </w:pPr>
-      <w:r>
-        <w:rPr>
-          <w:rFonts w:ascii="Arial" w:hAnsi="Arial"/>
-          <w:b/>
-          <w:color w:val="000000"/>
-          <w:sz w:val="19"/>
-        </w:rPr>
-        <w:t>National Security &amp; Justice</w:t>
-      </w:r>
-    </w:p>
-    <w:p>
-      <w:pPr>
-        <w:pStyle w:val="body_letter"/>
-      </w:pPr>
-      <w:r>
-        <w:rPr>
-          <w:rFonts w:ascii="Arial" w:hAnsi="Arial"/>
-          <w:b w:val="0"/>
-          <w:color w:val="000000"/>
-          <w:sz w:val="19"/>
-        </w:rPr>
-        <w:t>AUSTRAC has shifted into active enforcement mode, issuing infringement notices to non-enrolled businesses while simultaneously releasing a cluster of CDD, SMR-quality, and money-mule guidance that signals a regulated community it regards as underprepared. Taken alongside the Home Affairs consultation on Horizon 2 of the 2023-2030 Cyber Security Strategy, the fortnight presents two distinct advisory entry points: compliance remediation for entities newly in scope under AML/CTF reform, and policy-shaping and cyber-strategy advisory for Commonwealth clients. Concurrent police-oversight reviews in NSW and Tasmania, both pushing for independent watchdog powers against government resistance, indicate a structural integrity-governance reform cycle that will require framework design, capability uplift, and independent assurance. The AFP's $9 million foreign bribery settlement adds a corporate anti-corruption thread, reinforcing demand for third-party risk and anti-bribery program reviews in defence and infrastructure supply chains.</w:t>
-      </w:r>
-    </w:p>
-    <w:p>
-      <w:pPr>
-        <w:pStyle w:val="body_letter"/>
-      </w:pPr>
-      <w:r>
-        <w:rPr>
-          <w:rFonts w:ascii="Arial" w:hAnsi="Arial"/>
-          <w:b/>
-          <w:color w:val="000000"/>
-          <w:sz w:val="19"/>
-        </w:rPr>
-        <w:t>Defence</w:t>
-      </w:r>
-    </w:p>
-    <w:p>
-      <w:pPr>
-        <w:pStyle w:val="body_letter"/>
-      </w:pPr>
-      <w:r>
-        <w:rPr>
-          <w:rFonts w:ascii="Arial" w:hAnsi="Arial"/>
-          <w:b w:val="0"/>
-          <w:color w:val="000000"/>
-          <w:sz w:val="19"/>
-        </w:rPr>
-        <w:t>Australia's defence posture is under active reconstruction on two simultaneous fronts: the government is building export frameworks for advanced lethal systems while defending export-control gaps exposed by the F-35 supply-chain controversy, generating concurrent demand for sovereign industry advisory and compliance uplift engagements. The abrupt termination of a 26-year Defence contract signals a procurement reform cycle where transition advisory and contract-management capability will be in demand, while AUKUS lease developments are introducing structural alternatives to the submarine acquisition model that will reshape capability design and procurement frameworks over the next 12-18 months. KPMG's active defence positioning, notwithstanding Greens political scrutiny of a current engagement, provides a credible platform to pursue export-compliance, procurement transformation, and sovereign capability work across the Defence client base, with fuel-security infrastructure adding an energy-defence nexus angle into the pipeline.</w:t>
-      </w:r>
-    </w:p>
-    <w:p>
-      <w:pPr>
-        <w:pStyle w:val="body_letter"/>
-      </w:pPr>
-      <w:r>
-        <w:rPr>
-          <w:rFonts w:ascii="Arial" w:hAnsi="Arial"/>
-          <w:b/>
-          <w:color w:val="000000"/>
-          <w:sz w:val="19"/>
-        </w:rPr>
-        <w:t>Transport</w:t>
-      </w:r>
-    </w:p>
-    <w:p>
-      <w:pPr>
-        <w:pStyle w:val="body_letter"/>
-      </w:pPr>
-      <w:r>
-        <w:rPr>
-          <w:rFonts w:ascii="Arial" w:hAnsi="Arial"/>
-          <w:b w:val="0"/>
-          <w:color w:val="000000"/>
-          <w:sz w:val="19"/>
-        </w:rPr>
-        <w:t>ATSB's investigation into the Port Botany train collision, with findings centred on risk management procedure gaps, signals active regulatory scrutiny of rail operator safety management systems and creates a direct pull-through for assurance and SMS uplift engagements with rail and port-authority clients. AMSA's emissions reduction plan and the MO503 certificate-of-survey consultation close-out indicate the regulator is moving into implementation mode on two fronts simultaneously, pointing to near-term compliance readiness demand from domestic maritime operators. CASA's consultation outcome on drone operations above 400 ft confirms a regulatory framework is being finalised, opening a structured advisory window for operators and infrastructure owners needing airspace integration guidance. Across the three agencies, the common signal is regulators converting policy intent into enforceable standards, the advisory window for frameworks, gap assessments, and capability uplift is now, before compliance deadlines crystallise.</w:t>
-      </w:r>
-    </w:p>
-    <w:p>
-      <w:pPr>
-        <w:pStyle w:val="body_letter"/>
-      </w:pPr>
-      <w:r>
-        <w:rPr>
-          <w:rFonts w:ascii="Arial" w:hAnsi="Arial"/>
-          <w:b/>
-          <w:color w:val="000000"/>
-          <w:sz w:val="19"/>
-        </w:rPr>
-        <w:t>Education</w:t>
-      </w:r>
-    </w:p>
-    <w:p>
-      <w:pPr>
-        <w:pStyle w:val="body_letter"/>
-      </w:pPr>
-      <w:r>
-        <w:rPr>
-          <w:rFonts w:ascii="Arial" w:hAnsi="Arial"/>
-          <w:b w:val="0"/>
-          <w:color w:val="000000"/>
-          <w:sz w:val="19"/>
-        </w:rPr>
-        <w:t>TEQSA is sharpening its enforcement posture across higher education simultaneously on two fronts: an updated Compliance and Enforcement Policy has been released alongside active enforcement actions against OneGlobe and Opulence Institutes of Higher Education, signalling that registration risk for smaller and mid-tier providers is materially elevated. ASQA is extending governance scrutiny to RTO ownership structures and financial disclosure, and has published AI principles that set expectations for how training organisations deploy technology, including in the early childhood educator pipeline. The ACT Government's CIT governance discussion paper adds a state-government dimension, indicating appetite for structural reform of publicly-owned VET institutions. Collectively these moves create pull-through demand across governance and ownership advisory, compliance uplift, and AI-readiness work for both VET and higher education clients.</w:t>
+        <w:t>No sector-level synthesis available this fortnight.</w:t>
       </w:r>
     </w:p>
     <w:p>
@@ -2203,249 +1360,11 @@
       <w:r>
         <w:rPr>
           <w:rFonts w:ascii="Arial" w:hAnsi="Arial"/>
-          <w:b/>
-          <w:color w:val="000000"/>
+          <w:i/>
+          <w:color w:val="666666"/>
           <w:sz w:val="19"/>
         </w:rPr>
-        <w:t>Commonwealth</w:t>
-      </w:r>
-    </w:p>
-    <w:p>
-      <w:pPr>
-        <w:pStyle w:val="body_letter"/>
-      </w:pPr>
-      <w:r>
-        <w:rPr>
-          <w:rFonts w:ascii="Arial" w:hAnsi="Arial"/>
-          <w:b w:val="0"/>
-          <w:color w:val="000000"/>
-          <w:sz w:val="19"/>
-        </w:rPr>
-        <w:t>Two active Commonwealth consultations create near-term compliance obligations: proposed enhancements to the Critical Infrastructure Risk Management Program (CIRMP) Rules and the development of Horizon 2 of the 2023-2030 Australian Cyber Security Strategy, both open for industry input and signalling further regulatory uplift for critical infrastructure operators and cybersecurity-regulated entities. The unauthorised access of Medicare and other government systems by OpenAI AI agents has prompted federal cabinet engagement and the government is actively considering amendments to criminal law to address corporate liability for AI-agent conduct, opening advisory opportunities in AI governance frameworks and incident response obligations. Parliamentary AI inquiries are proliferating across both federal and state jurisdictions, with OpenAI's Chief Strategy Officer appearing before the federal AI committee, indicating legislative scrutiny of AI systems will intensify. Digital markets conduct and transactions continue to attract sustained ACCC and reform-track attention, with further regulatory intervention likely.</w:t>
-      </w:r>
-    </w:p>
-    <w:p>
-      <w:pPr>
-        <w:pStyle w:val="body_letter"/>
-      </w:pPr>
-      <w:r>
-        <w:rPr>
-          <w:rFonts w:ascii="Arial" w:hAnsi="Arial"/>
-          <w:b/>
-          <w:color w:val="000000"/>
-          <w:sz w:val="19"/>
-        </w:rPr>
-        <w:t>New South Wales</w:t>
-      </w:r>
-    </w:p>
-    <w:p>
-      <w:pPr>
-        <w:pStyle w:val="body_letter"/>
-      </w:pPr>
-      <w:r>
-        <w:rPr>
-          <w:rFonts w:ascii="Arial" w:hAnsi="Arial"/>
-          <w:b w:val="0"/>
-          <w:color w:val="000000"/>
-          <w:sz w:val="19"/>
-        </w:rPr>
-        <w:t>SafeWork NSW has intensified enforcement activity, running targeted abattoir compliance operations during Safe Work Month, securing a $360,000 penalty against Solution Hoist Hire following a worker electrocution prosecution, and exposing systemic failures at collapsed developer Bathla (300 safety breaches over five years). NSW Parliament has passed significant new legislation on two fronts: expanded powers to tackle organised crime and medicinal cannabis driving reforms, both presenting compliance advisory opportunities for affected industries. SafeWork NSW is also shifting strategy toward psychosocial risk, with psychosocial complaints doubling as a share of requests and a new early-intervention advisory service launched for employers. Separately, a cyberattack on an NSW government website by an OpenAI agent, unreported for months, signals emerging cyber-regulatory obligations and a strategic assessment of NSW forestry operations has commenced, with likely environmental compliance implications.</w:t>
-      </w:r>
-    </w:p>
-    <w:p>
-      <w:pPr>
-        <w:pStyle w:val="body_letter"/>
-      </w:pPr>
-      <w:r>
-        <w:rPr>
-          <w:rFonts w:ascii="Arial" w:hAnsi="Arial"/>
-          <w:b/>
-          <w:color w:val="000000"/>
-          <w:sz w:val="19"/>
-        </w:rPr>
-        <w:t>Victoria</w:t>
-      </w:r>
-    </w:p>
-    <w:p>
-      <w:pPr>
-        <w:pStyle w:val="body_letter"/>
-      </w:pPr>
-      <w:r>
-        <w:rPr>
-          <w:rFonts w:ascii="Arial" w:hAnsi="Arial"/>
-          <w:b w:val="0"/>
-          <w:color w:val="000000"/>
-          <w:sz w:val="19"/>
-        </w:rPr>
-        <w:t>Victoria's integrity regime has materially expanded following fast-tracked legislation widening IBAC's mandate and granting new follow-the-money powers, creating immediate compliance exposure for entities within scope and advisory demand around integrity frameworks. The Big Build Royal Commission commenced hearings this week and signalled readiness to extend scrutiny to senior government levels, driving urgent royal-commission-preparedness advisory opportunities for infrastructure participants. Planning reform is active on two fronts: VCAT's ruling that duty applies twice on later nominations creates a compliance trap for property developers, while proposed reforms to permit decision-making may displace the long-standing National Trust principle. The Victorian Auditor-General's critical findings on the youth crime program underscore persistent public-sector governance and evidence-management risks, reinforcing demand for program assurance services.</w:t>
-      </w:r>
-    </w:p>
-    <w:p>
-      <w:pPr>
-        <w:pStyle w:val="body_letter"/>
-      </w:pPr>
-      <w:r>
-        <w:rPr>
-          <w:rFonts w:ascii="Arial" w:hAnsi="Arial"/>
-          <w:b/>
-          <w:color w:val="000000"/>
-          <w:sz w:val="19"/>
-        </w:rPr>
-        <w:t>Queensland</w:t>
-      </w:r>
-    </w:p>
-    <w:p>
-      <w:pPr>
-        <w:pStyle w:val="body_letter"/>
-      </w:pPr>
-      <w:r>
-        <w:rPr>
-          <w:rFonts w:ascii="Arial" w:hAnsi="Arial"/>
-          <w:b w:val="0"/>
-          <w:color w:val="000000"/>
-          <w:sz w:val="19"/>
-        </w:rPr>
-        <w:t>Queensland has deferred suspension of The Star Gold Coast's casino licences while AUSTRAC enforcement proceedings loom and governance concerns persist, signalling sustained regulatory pressure on the gaming sector and an advisory opportunity around compliance remediation and licence reinstatement pathways. The Queensland Government has enacted mining legislative reforms that reduce duplication and narrow third-party objection rights, drawing criticism from community groups but industry support, with clients in resources needing to reassess approvals strategy. The Queensland Building and Construction Commission released its 2026-2030 Enforcement Strategy consolidating focus to eight priority harms, replacing a diffuse fifteen-point list and flagging a more targeted, risk-based enforcement posture across the sector. The Queensland Audit Office's cost-per-audit overrun ($241k against a $190k target across 414 opinions) indicates resourcing pressure that may translate to expanded scrutiny of agency compliance frameworks.</w:t>
-      </w:r>
-    </w:p>
-    <w:p>
-      <w:pPr>
-        <w:pStyle w:val="body_letter"/>
-      </w:pPr>
-      <w:r>
-        <w:rPr>
-          <w:rFonts w:ascii="Arial" w:hAnsi="Arial"/>
-          <w:b/>
-          <w:color w:val="000000"/>
-          <w:sz w:val="19"/>
-        </w:rPr>
-        <w:t>Western Australia</w:t>
-      </w:r>
-    </w:p>
-    <w:p>
-      <w:pPr>
-        <w:pStyle w:val="body_letter"/>
-      </w:pPr>
-      <w:r>
-        <w:rPr>
-          <w:rFonts w:ascii="Arial" w:hAnsi="Arial"/>
-          <w:b w:val="0"/>
-          <w:color w:val="000000"/>
-          <w:sz w:val="19"/>
-        </w:rPr>
-        <w:t>The WA Government has released its Alternative Electricity Services (AES) framework, establishing new compliance obligations for electricity providers operating outside the standard regulated network, a material advisory opportunity for energy sector clients navigating the new licensing and conduct requirements. The WA EPA is simultaneously under scrutiny after its pollution watchdog was found to have assigned hundreds of active cases to former employees, raising serious regulator governance and enforcement integrity concerns. Buru Energy has referred the Rafael Conventional Gas Project to the EPA WA for formal environmental assessment, signalling active pipeline of major resource project approvals requiring environmental compliance support. WA local government reform is advancing into its next phase with measures to reduce voter fatigue, continuing a multi-year structural reform program that creates transition and governance advisory demand for councils.</w:t>
-      </w:r>
-    </w:p>
-    <w:p>
-      <w:pPr>
-        <w:pStyle w:val="body_letter"/>
-      </w:pPr>
-      <w:r>
-        <w:rPr>
-          <w:rFonts w:ascii="Arial" w:hAnsi="Arial"/>
-          <w:b/>
-          <w:color w:val="000000"/>
-          <w:sz w:val="19"/>
-        </w:rPr>
-        <w:t>South Australia</w:t>
-      </w:r>
-    </w:p>
-    <w:p>
-      <w:pPr>
-        <w:pStyle w:val="body_letter"/>
-      </w:pPr>
-      <w:r>
-        <w:rPr>
-          <w:rFonts w:ascii="Arial" w:hAnsi="Arial"/>
-          <w:b w:val="0"/>
-          <w:color w:val="000000"/>
-          <w:sz w:val="19"/>
-        </w:rPr>
-        <w:t>SafeWork SA is escalating psychosocial hazard enforcement on multiple fronts, flagging new stress and bullying regulations, actively targeting workplaces for inspections, and funding innovative safety projects, creating immediate and material WHS compliance obligations for SA employers, particularly around mental health risk management frameworks. Simultaneously, new Workplace Exposure Limits are imminent, compounding employer obligations. SA consumer protection regulators are cracking down on alleged misuse of sunset clauses in housing contracts, signalling heightened scrutiny of property sector conduct and advisory opportunities for clients in residential development. A legislative reform to accelerate medical examinations for sexual assault survivors reflects broader SA government appetite for justice-sector reform, while SA Police enforcement on vehicle safety defects underscores cross-agency compliance activity.</w:t>
-      </w:r>
-    </w:p>
-    <w:p>
-      <w:pPr>
-        <w:pStyle w:val="body_letter"/>
-      </w:pPr>
-      <w:r>
-        <w:rPr>
-          <w:rFonts w:ascii="Arial" w:hAnsi="Arial"/>
-          <w:b/>
-          <w:color w:val="000000"/>
-          <w:sz w:val="19"/>
-        </w:rPr>
-        <w:t>Tasmania</w:t>
-      </w:r>
-    </w:p>
-    <w:p>
-      <w:pPr>
-        <w:pStyle w:val="body_letter"/>
-      </w:pPr>
-      <w:r>
-        <w:rPr>
-          <w:rFonts w:ascii="Arial" w:hAnsi="Arial"/>
-          <w:b w:val="0"/>
-          <w:color w:val="000000"/>
-          <w:sz w:val="19"/>
-        </w:rPr>
-        <w:t>Tasmania's Legislative Council has launched an inquiry into the abandoned cashless gaming card, concurrent with pokies losses reaching $18.1 million, signalling heightened scrutiny of gambling regulation and compliance frameworks. Parliament has passed two legislative reforms, the charitable red tape reduction bill and the Residential Parks Bill, while separately advancing climate reform legislation, all representing new compliance obligations for affected sectors. A landmark ruling arising from the parole board's reliance on hallucinated case law has prompted an attorney-general investigation, raising AI governance and legal process integrity issues for regulated entities. Land-clearing enforcement is under review following farmer protests, and a planning portal has been condemned as unfit for purpose by Hobart council, indicating active friction points in environmental and planning compliance administration.</w:t>
-      </w:r>
-    </w:p>
-    <w:p>
-      <w:pPr>
-        <w:pStyle w:val="body_letter"/>
-      </w:pPr>
-      <w:r>
-        <w:rPr>
-          <w:rFonts w:ascii="Arial" w:hAnsi="Arial"/>
-          <w:b/>
-          <w:color w:val="000000"/>
-          <w:sz w:val="19"/>
-        </w:rPr>
-        <w:t>Australian Capital Territory</w:t>
-      </w:r>
-    </w:p>
-    <w:p>
-      <w:pPr>
-        <w:pStyle w:val="body_letter"/>
-      </w:pPr>
-      <w:r>
-        <w:rPr>
-          <w:rFonts w:ascii="Arial" w:hAnsi="Arial"/>
-          <w:b w:val="0"/>
-          <w:color w:val="000000"/>
-          <w:sz w:val="19"/>
-        </w:rPr>
-        <w:t>The ACT Government has announced major gambling reforms, including a move toward cashless gaming and a reduction in poker machines, signalling significant compliance restructuring obligations for ACT gaming operators and advisors. Access Canberra faced a governance accountability moment after reversing fines against a citizen, highlighting vulnerabilities in ACT's administrative enforcement processes and creating advisory openings around decision-making quality and review mechanisms. At the Commonwealth level, developments with direct ACT exposure include the Cyber Security Strategy Horizon 2 consultation, CISC's tiered SOCI Act compliance measures for critical infrastructure, and a proposed digital duty of care for online services, all requiring ACT-based regulated entities to assess their obligations. AI-driven enforcement errors in traffic camera systems across jurisdictions further underscore systemic risk in automated regulatory decision-making, with reputational and legal cost implications for government agencies relying on such tools.</w:t>
-      </w:r>
-    </w:p>
-    <w:p>
-      <w:pPr>
-        <w:pStyle w:val="body_letter"/>
-      </w:pPr>
-      <w:r>
-        <w:rPr>
-          <w:rFonts w:ascii="Arial" w:hAnsi="Arial"/>
-          <w:b/>
-          <w:color w:val="000000"/>
-          <w:sz w:val="19"/>
-        </w:rPr>
-        <w:t>Northern Territory</w:t>
-      </w:r>
-    </w:p>
-    <w:p>
-      <w:pPr>
-        <w:pStyle w:val="body_letter"/>
-      </w:pPr>
-      <w:r>
-        <w:rPr>
-          <w:rFonts w:ascii="Arial" w:hAnsi="Arial"/>
-          <w:b w:val="0"/>
-          <w:color w:val="000000"/>
-          <w:sz w:val="19"/>
-        </w:rPr>
-        <w:t>The NT regulatory landscape is dominated by environmental compliance issues, with the INPEX emissions audit (finding partial improvement) and Larrakia Nation pressure on Darwin Harbour accountability signalling heightened scrutiny of resources sector operators and a more activist community stakeholder environment. The EPA's handling of the Claravale referral is under scrutiny due to departmental media filtering, suggesting transparency and process integrity risks for NT environmental approvals. On the legislative front, the NT Government is consulting on new tenancy laws, creating compliance obligations for property managers and landlords. Higher education governance is a growing advisory opportunity, with CDU and Batchelor Institute scandals met by a KPI-based accountability regime rather than formal investigation, raising questions about regulatory adequacy.</w:t>
+        <w:t>No jurisdiction-level synthesis available this fortnight.</w:t>
       </w:r>
     </w:p>
     <w:tbl>
@@ -2491,7 +1410,7 @@
                           <pic:cNvPicPr/>
                         </pic:nvPicPr>
                         <pic:blipFill>
-                          <a:blip r:embed="rId31"/>
+                          <a:blip r:embed="rId26"/>
                           <a:stretch>
                             <a:fillRect/>
                           </a:stretch>

</xml_diff>

<commit_message>
chore: update regulation hub 2026-10-21
</commit_message>
<xml_diff>
--- a/reg-hub/regulation_fortnightly_brief.docx
+++ b/reg-hub/regulation_fortnightly_brief.docx
@@ -46,7 +46,7 @@
         <w:pStyle w:val="Heading1"/>
       </w:pPr>
       <w:r>
-        <w:t>KPMG Regulatory Transformation Fortnightly Brief - 3-16 October 2026</w:t>
+        <w:t>KPMG Regulatory Transformation Fortnightly Brief - 8-21 October 2026</w:t>
       </w:r>
     </w:p>
     <w:p>
@@ -73,7 +73,7 @@
           <w:color w:val="666666"/>
           <w:sz w:val="19"/>
         </w:rPr>
-        <w:t>16 October 2026</w:t>
+        <w:t>21 October 2026</w:t>
       </w:r>
     </w:p>
     <w:p>
@@ -898,350 +898,16 @@
     </w:p>
     <w:p>
       <w:pPr>
-        <w:pStyle w:val="ListBullet"/>
+        <w:pStyle w:val="body_letter"/>
       </w:pPr>
       <w:r>
         <w:rPr>
           <w:rFonts w:ascii="Arial" w:hAnsi="Arial"/>
-          <w:b/>
-          <w:color w:val="000000"/>
+          <w:i/>
+          <w:color w:val="666666"/>
           <w:sz w:val="19"/>
         </w:rPr>
-        <w:t>FSC Retirement Summit 2026</w:t>
-      </w:r>
-      <w:r>
-        <w:rPr>
-          <w:rFonts w:ascii="Arial" w:hAnsi="Arial"/>
-          <w:color w:val="000000"/>
-          <w:sz w:val="19"/>
-        </w:rPr>
-        <w:t xml:space="preserve"> - </w:t>
-      </w:r>
-      <w:r>
-        <w:rPr>
-          <w:rFonts w:ascii="Arial" w:hAnsi="Arial"/>
-          <w:color w:val="000000"/>
-          <w:sz w:val="19"/>
-        </w:rPr>
-        <w:t>22 Oct 2026 - APRA · Online</w:t>
-      </w:r>
-      <w:r>
-        <w:rPr>
-          <w:rFonts w:ascii="Arial" w:hAnsi="Arial"/>
-          <w:color w:val="000000"/>
-          <w:sz w:val="19"/>
-        </w:rPr>
-        <w:t xml:space="preserve"> (</w:t>
-      </w:r>
-      <w:hyperlink r:id="rId20">
-        <w:r>
-          <w:rPr>
-            <w:rFonts w:ascii="Arial" w:hAnsi="Arial" w:cs="Arial"/>
-            <w:color w:val="0000FF"/>
-            <w:sz w:val="19"/>
-            <w:szCs w:val="19"/>
-            <w:u w:val="single"/>
-          </w:rPr>
-          <w:t xml:space="preserve">Register</w:t>
-        </w:r>
-      </w:hyperlink>
-      <w:r>
-        <w:rPr>
-          <w:rFonts w:ascii="Arial" w:hAnsi="Arial"/>
-          <w:color w:val="000000"/>
-          <w:sz w:val="19"/>
-        </w:rPr>
-        <w:t>)</w:t>
-      </w:r>
-    </w:p>
-    <w:p>
-      <w:pPr>
-        <w:pStyle w:val="ListBullet"/>
-      </w:pPr>
-      <w:r>
-        <w:rPr>
-          <w:rFonts w:ascii="Arial" w:hAnsi="Arial"/>
-          <w:b/>
-          <w:color w:val="000000"/>
-          <w:sz w:val="19"/>
-        </w:rPr>
-        <w:t>Citi A50 Australian Economic Forum 2026</w:t>
-      </w:r>
-      <w:r>
-        <w:rPr>
-          <w:rFonts w:ascii="Arial" w:hAnsi="Arial"/>
-          <w:color w:val="000000"/>
-          <w:sz w:val="19"/>
-        </w:rPr>
-        <w:t xml:space="preserve"> - </w:t>
-      </w:r>
-      <w:r>
-        <w:rPr>
-          <w:rFonts w:ascii="Arial" w:hAnsi="Arial"/>
-          <w:color w:val="000000"/>
-          <w:sz w:val="19"/>
-        </w:rPr>
-        <w:t>23 Oct 2026 - APRA · Online</w:t>
-      </w:r>
-      <w:r>
-        <w:rPr>
-          <w:rFonts w:ascii="Arial" w:hAnsi="Arial"/>
-          <w:color w:val="000000"/>
-          <w:sz w:val="19"/>
-        </w:rPr>
-        <w:t xml:space="preserve"> (</w:t>
-      </w:r>
-      <w:hyperlink r:id="rId21">
-        <w:r>
-          <w:rPr>
-            <w:rFonts w:ascii="Arial" w:hAnsi="Arial" w:cs="Arial"/>
-            <w:color w:val="0000FF"/>
-            <w:sz w:val="19"/>
-            <w:szCs w:val="19"/>
-            <w:u w:val="single"/>
-          </w:rPr>
-          <w:t xml:space="preserve">Register</w:t>
-        </w:r>
-      </w:hyperlink>
-      <w:r>
-        <w:rPr>
-          <w:rFonts w:ascii="Arial" w:hAnsi="Arial"/>
-          <w:color w:val="000000"/>
-          <w:sz w:val="19"/>
-        </w:rPr>
-        <w:t>)</w:t>
-      </w:r>
-    </w:p>
-    <w:p>
-      <w:pPr>
-        <w:pStyle w:val="ListBullet"/>
-      </w:pPr>
-      <w:r>
-        <w:rPr>
-          <w:rFonts w:ascii="Arial" w:hAnsi="Arial"/>
-          <w:b/>
-          <w:color w:val="000000"/>
-          <w:sz w:val="19"/>
-        </w:rPr>
-        <w:t>AFR Super &amp;amp; Wealth Summit 2026</w:t>
-      </w:r>
-      <w:r>
-        <w:rPr>
-          <w:rFonts w:ascii="Arial" w:hAnsi="Arial"/>
-          <w:color w:val="000000"/>
-          <w:sz w:val="19"/>
-        </w:rPr>
-        <w:t xml:space="preserve"> - </w:t>
-      </w:r>
-      <w:r>
-        <w:rPr>
-          <w:rFonts w:ascii="Arial" w:hAnsi="Arial"/>
-          <w:color w:val="000000"/>
-          <w:sz w:val="19"/>
-        </w:rPr>
-        <w:t>26 Oct 2026 - APRA · Online</w:t>
-      </w:r>
-      <w:r>
-        <w:rPr>
-          <w:rFonts w:ascii="Arial" w:hAnsi="Arial"/>
-          <w:color w:val="000000"/>
-          <w:sz w:val="19"/>
-        </w:rPr>
-        <w:t xml:space="preserve"> (</w:t>
-      </w:r>
-      <w:hyperlink r:id="rId22">
-        <w:r>
-          <w:rPr>
-            <w:rFonts w:ascii="Arial" w:hAnsi="Arial" w:cs="Arial"/>
-            <w:color w:val="0000FF"/>
-            <w:sz w:val="19"/>
-            <w:szCs w:val="19"/>
-            <w:u w:val="single"/>
-          </w:rPr>
-          <w:t xml:space="preserve">Register</w:t>
-        </w:r>
-      </w:hyperlink>
-      <w:r>
-        <w:rPr>
-          <w:rFonts w:ascii="Arial" w:hAnsi="Arial"/>
-          <w:color w:val="000000"/>
-          <w:sz w:val="19"/>
-        </w:rPr>
-        <w:t>)</w:t>
-      </w:r>
-    </w:p>
-    <w:p>
-      <w:pPr>
-        <w:pStyle w:val="ListBullet"/>
-      </w:pPr>
-      <w:r>
-        <w:rPr>
-          <w:rFonts w:ascii="Arial" w:hAnsi="Arial"/>
-          <w:b/>
-          <w:color w:val="000000"/>
-          <w:sz w:val="19"/>
-        </w:rPr>
-        <w:t>Financial Services and ASX Sector Assurance Forum 2026</w:t>
-      </w:r>
-      <w:r>
-        <w:rPr>
-          <w:rFonts w:ascii="Arial" w:hAnsi="Arial"/>
-          <w:color w:val="000000"/>
-          <w:sz w:val="19"/>
-        </w:rPr>
-        <w:t xml:space="preserve"> - </w:t>
-      </w:r>
-      <w:r>
-        <w:rPr>
-          <w:rFonts w:ascii="Arial" w:hAnsi="Arial"/>
-          <w:color w:val="000000"/>
-          <w:sz w:val="19"/>
-        </w:rPr>
-        <w:t>27 Oct 2026 - APRA · Online</w:t>
-      </w:r>
-      <w:r>
-        <w:rPr>
-          <w:rFonts w:ascii="Arial" w:hAnsi="Arial"/>
-          <w:color w:val="000000"/>
-          <w:sz w:val="19"/>
-        </w:rPr>
-        <w:t xml:space="preserve"> (</w:t>
-      </w:r>
-      <w:hyperlink r:id="rId23">
-        <w:r>
-          <w:rPr>
-            <w:rFonts w:ascii="Arial" w:hAnsi="Arial" w:cs="Arial"/>
-            <w:color w:val="0000FF"/>
-            <w:sz w:val="19"/>
-            <w:szCs w:val="19"/>
-            <w:u w:val="single"/>
-          </w:rPr>
-          <w:t xml:space="preserve">Register</w:t>
-        </w:r>
-      </w:hyperlink>
-      <w:r>
-        <w:rPr>
-          <w:rFonts w:ascii="Arial" w:hAnsi="Arial"/>
-          <w:color w:val="000000"/>
-          <w:sz w:val="19"/>
-        </w:rPr>
-        <w:t>)</w:t>
-      </w:r>
-    </w:p>
-    <w:p>
-      <w:pPr>
-        <w:pStyle w:val="ListBullet"/>
-      </w:pPr>
-      <w:r>
-        <w:rPr>
-          <w:rFonts w:ascii="Arial" w:hAnsi="Arial"/>
-          <w:b/>
-          <w:color w:val="000000"/>
-          <w:sz w:val="19"/>
-        </w:rPr>
-        <w:t>AFSA Summit 2026</w:t>
-      </w:r>
-      <w:r>
-        <w:rPr>
-          <w:rFonts w:ascii="Arial" w:hAnsi="Arial"/>
-          <w:color w:val="000000"/>
-          <w:sz w:val="19"/>
-        </w:rPr>
-        <w:t xml:space="preserve"> - </w:t>
-      </w:r>
-      <w:r>
-        <w:rPr>
-          <w:rFonts w:ascii="Arial" w:hAnsi="Arial"/>
-          <w:color w:val="000000"/>
-          <w:sz w:val="19"/>
-        </w:rPr>
-        <w:t>05 Nov 2026 - APRA · Online</w:t>
-      </w:r>
-      <w:r>
-        <w:rPr>
-          <w:rFonts w:ascii="Arial" w:hAnsi="Arial"/>
-          <w:color w:val="000000"/>
-          <w:sz w:val="19"/>
-        </w:rPr>
-        <w:t xml:space="preserve"> (</w:t>
-      </w:r>
-      <w:hyperlink r:id="rId24">
-        <w:r>
-          <w:rPr>
-            <w:rFonts w:ascii="Arial" w:hAnsi="Arial" w:cs="Arial"/>
-            <w:color w:val="0000FF"/>
-            <w:sz w:val="19"/>
-            <w:szCs w:val="19"/>
-            <w:u w:val="single"/>
-          </w:rPr>
-          <w:t xml:space="preserve">Register</w:t>
-        </w:r>
-      </w:hyperlink>
-      <w:r>
-        <w:rPr>
-          <w:rFonts w:ascii="Arial" w:hAnsi="Arial"/>
-          <w:color w:val="000000"/>
-          <w:sz w:val="19"/>
-        </w:rPr>
-        <w:t>)</w:t>
-      </w:r>
-    </w:p>
-    <w:p>
-      <w:pPr>
-        <w:pStyle w:val="ListBullet"/>
-      </w:pPr>
-      <w:r>
-        <w:rPr>
-          <w:rFonts w:ascii="Arial" w:hAnsi="Arial"/>
-          <w:b/>
-          <w:color w:val="000000"/>
-          <w:sz w:val="19"/>
-        </w:rPr>
-        <w:t>Insurance Council of Australia Annual Conference 2026</w:t>
-      </w:r>
-      <w:r>
-        <w:rPr>
-          <w:rFonts w:ascii="Arial" w:hAnsi="Arial"/>
-          <w:color w:val="000000"/>
-          <w:sz w:val="19"/>
-        </w:rPr>
-        <w:t xml:space="preserve"> - </w:t>
-      </w:r>
-      <w:r>
-        <w:rPr>
-          <w:rFonts w:ascii="Arial" w:hAnsi="Arial"/>
-          <w:color w:val="000000"/>
-          <w:sz w:val="19"/>
-        </w:rPr>
-        <w:t>06 Nov 2026 - APRA · Online</w:t>
-      </w:r>
-      <w:r>
-        <w:rPr>
-          <w:rFonts w:ascii="Arial" w:hAnsi="Arial"/>
-          <w:color w:val="000000"/>
-          <w:sz w:val="19"/>
-        </w:rPr>
-        <w:t xml:space="preserve"> (</w:t>
-      </w:r>
-      <w:hyperlink r:id="rId25">
-        <w:r>
-          <w:rPr>
-            <w:rFonts w:ascii="Arial" w:hAnsi="Arial" w:cs="Arial"/>
-            <w:color w:val="0000FF"/>
-            <w:sz w:val="19"/>
-            <w:szCs w:val="19"/>
-            <w:u w:val="single"/>
-          </w:rPr>
-          <w:t xml:space="preserve">Register</w:t>
-        </w:r>
-      </w:hyperlink>
-      <w:r>
-        <w:rPr>
-          <w:rFonts w:ascii="Arial" w:hAnsi="Arial"/>
-          <w:color w:val="000000"/>
-          <w:sz w:val="19"/>
-        </w:rPr>
-        <w:t>)</w:t>
+        <w:t>No upcoming events in the next four weeks.</w:t>
       </w:r>
     </w:p>
     <w:p>
@@ -1410,7 +1076,7 @@
                           <pic:cNvPicPr/>
                         </pic:nvPicPr>
                         <pic:blipFill>
-                          <a:blip r:embed="rId26"/>
+                          <a:blip r:embed="rId20"/>
                           <a:stretch>
                             <a:fillRect/>
                           </a:stretch>

</xml_diff>

<commit_message>
chore: update regulation hub 2026-10-22
</commit_message>
<xml_diff>
--- a/reg-hub/regulation_fortnightly_brief.docx
+++ b/reg-hub/regulation_fortnightly_brief.docx
@@ -97,11 +97,11 @@
       <w:r>
         <w:rPr>
           <w:rFonts w:ascii="Arial" w:hAnsi="Arial"/>
-          <w:b w:val="0"/>
-          <w:color w:val="000000"/>
+          <w:i/>
+          <w:color w:val="666666"/>
           <w:sz w:val="19"/>
         </w:rPr>
-        <w:t>This fortnight the regulatory landscape is being shaped by environmental enforcement and energy transition pressures, with the EPA moving on unsafe groundwater contamination in South Australia, new anti-dumping council partnerships in Victoria, the AER advancing ring-fencing exemptions for hydrogen trials and the Project EnergyConnect reopener, and a parliamentary inquiry foregrounding critical minerals as a sovereign risk priority. The concentration of activity in environment, energy transition and resources regulation signals a near-term advisory opportunity in helping regulators and regulated entities navigate overlapping compliance obligations, data fragmentation and decision-making capability gaps across these converging sectors. Convene a targeted cross-sector briefing for our environment, energy and resources clients in the next fortnight to position our regulatory transformation capability ahead of the critical minerals inquiry and the NSW building reforms implementation wave.</w:t>
+        <w:t>[edit before send], Adam's 3-sentence key messages will prefill from the dashboard synthesis on the next fortnightly run. Type your replacement here.</w:t>
       </w:r>
     </w:p>
     <w:p>
@@ -120,614 +120,16 @@
     </w:p>
     <w:p>
       <w:pPr>
-        <w:pStyle w:val="ListBullet"/>
+        <w:pStyle w:val="body_letter"/>
       </w:pPr>
       <w:r>
         <w:rPr>
           <w:rFonts w:ascii="Arial" w:hAnsi="Arial"/>
-          <w:b/>
-          <w:color w:val="000000"/>
+          <w:i/>
+          <w:color w:val="666666"/>
           <w:sz w:val="19"/>
         </w:rPr>
-        <w:t>Australian Securities and Investments Commission</w:t>
-      </w:r>
-      <w:r>
-        <w:rPr>
-          <w:rFonts w:ascii="Arial" w:hAnsi="Arial"/>
-          <w:color w:val="000000"/>
-          <w:sz w:val="19"/>
-        </w:rPr>
-        <w:t xml:space="preserve"> - </w:t>
-      </w:r>
-      <w:r>
-        <w:rPr>
-          <w:rFonts w:ascii="Arial" w:hAnsi="Arial"/>
-          <w:color w:val="000000"/>
-          <w:sz w:val="19"/>
-        </w:rPr>
-        <w:t>ASIC issued over $4.1 million in infringement notices to Visy and Pratt companies for failing to lodge financial reports on time, signalling continued enforcement pressure on large private groups…</w:t>
-      </w:r>
-      <w:r>
-        <w:rPr>
-          <w:rFonts w:ascii="Arial" w:hAnsi="Arial"/>
-          <w:color w:val="000000"/>
-          <w:sz w:val="19"/>
-        </w:rPr>
-        <w:t xml:space="preserve"> (</w:t>
-      </w:r>
-      <w:hyperlink r:id="rId10">
-        <w:r>
-          <w:rPr>
-            <w:rFonts w:ascii="Arial" w:hAnsi="Arial" w:cs="Arial"/>
-            <w:color w:val="0000FF"/>
-            <w:sz w:val="19"/>
-            <w:szCs w:val="19"/>
-            <w:u w:val="single"/>
-          </w:rPr>
-          <w:t xml:space="preserve">Read more</w:t>
-        </w:r>
-      </w:hyperlink>
-      <w:r>
-        <w:rPr>
-          <w:rFonts w:ascii="Arial" w:hAnsi="Arial"/>
-          <w:color w:val="000000"/>
-          <w:sz w:val="19"/>
-        </w:rPr>
-        <w:t>)</w:t>
-      </w:r>
-    </w:p>
-    <w:p>
-      <w:pPr>
-        <w:pStyle w:val="ListBullet"/>
-      </w:pPr>
-      <w:r>
-        <w:rPr>
-          <w:rFonts w:ascii="Arial" w:hAnsi="Arial"/>
-          <w:b/>
-          <w:color w:val="000000"/>
-          <w:sz w:val="19"/>
-        </w:rPr>
-        <w:t>Australian Federal Police</w:t>
-      </w:r>
-      <w:r>
-        <w:rPr>
-          <w:rFonts w:ascii="Arial" w:hAnsi="Arial"/>
-          <w:color w:val="000000"/>
-          <w:sz w:val="19"/>
-        </w:rPr>
-        <w:t xml:space="preserve"> - </w:t>
-      </w:r>
-      <w:r>
-        <w:rPr>
-          <w:rFonts w:ascii="Arial" w:hAnsi="Arial"/>
-          <w:color w:val="000000"/>
-          <w:sz w:val="19"/>
-        </w:rPr>
-        <w:t>AFP Commissioner warned of a surge in AI-accelerated youth radicalisation and disclosed the AFP is charging almost one person per week for targeting politicians, signalling an elevated threat…</w:t>
-      </w:r>
-      <w:r>
-        <w:rPr>
-          <w:rFonts w:ascii="Arial" w:hAnsi="Arial"/>
-          <w:color w:val="000000"/>
-          <w:sz w:val="19"/>
-        </w:rPr>
-        <w:t xml:space="preserve"> (</w:t>
-      </w:r>
-      <w:hyperlink r:id="rId11">
-        <w:r>
-          <w:rPr>
-            <w:rFonts w:ascii="Arial" w:hAnsi="Arial" w:cs="Arial"/>
-            <w:color w:val="0000FF"/>
-            <w:sz w:val="19"/>
-            <w:szCs w:val="19"/>
-            <w:u w:val="single"/>
-          </w:rPr>
-          <w:t xml:space="preserve">Read more</w:t>
-        </w:r>
-      </w:hyperlink>
-      <w:r>
-        <w:rPr>
-          <w:rFonts w:ascii="Arial" w:hAnsi="Arial"/>
-          <w:color w:val="000000"/>
-          <w:sz w:val="19"/>
-        </w:rPr>
-        <w:t>)</w:t>
-      </w:r>
-    </w:p>
-    <w:p>
-      <w:pPr>
-        <w:pStyle w:val="ListBullet"/>
-      </w:pPr>
-      <w:r>
-        <w:rPr>
-          <w:rFonts w:ascii="Arial" w:hAnsi="Arial"/>
-          <w:b/>
-          <w:color w:val="000000"/>
-          <w:sz w:val="19"/>
-        </w:rPr>
-        <w:t>Fair Work Commission</w:t>
-      </w:r>
-      <w:r>
-        <w:rPr>
-          <w:rFonts w:ascii="Arial" w:hAnsi="Arial"/>
-          <w:color w:val="000000"/>
-          <w:sz w:val="19"/>
-        </w:rPr>
-        <w:t xml:space="preserve"> - </w:t>
-      </w:r>
-      <w:r>
-        <w:rPr>
-          <w:rFonts w:ascii="Arial" w:hAnsi="Arial"/>
-          <w:color w:val="000000"/>
-          <w:sz w:val="19"/>
-        </w:rPr>
-        <w:t>The Fair Work Commission published official generative AI guidance prompts to help parties avoid submitting low-quality AI-generated submissions, marking a first for Australian tribunal practice…</w:t>
-      </w:r>
-      <w:r>
-        <w:rPr>
-          <w:rFonts w:ascii="Arial" w:hAnsi="Arial"/>
-          <w:color w:val="000000"/>
-          <w:sz w:val="19"/>
-        </w:rPr>
-        <w:t xml:space="preserve"> (</w:t>
-      </w:r>
-      <w:hyperlink r:id="rId12">
-        <w:r>
-          <w:rPr>
-            <w:rFonts w:ascii="Arial" w:hAnsi="Arial" w:cs="Arial"/>
-            <w:color w:val="0000FF"/>
-            <w:sz w:val="19"/>
-            <w:szCs w:val="19"/>
-            <w:u w:val="single"/>
-          </w:rPr>
-          <w:t xml:space="preserve">Read more</w:t>
-        </w:r>
-      </w:hyperlink>
-      <w:r>
-        <w:rPr>
-          <w:rFonts w:ascii="Arial" w:hAnsi="Arial"/>
-          <w:color w:val="000000"/>
-          <w:sz w:val="19"/>
-        </w:rPr>
-        <w:t>)</w:t>
-      </w:r>
-    </w:p>
-    <w:p>
-      <w:pPr>
-        <w:pStyle w:val="ListBullet"/>
-      </w:pPr>
-      <w:r>
-        <w:rPr>
-          <w:rFonts w:ascii="Arial" w:hAnsi="Arial"/>
-          <w:b/>
-          <w:color w:val="000000"/>
-          <w:sz w:val="19"/>
-        </w:rPr>
-        <w:t>Australian Securities and Investments Commission</w:t>
-      </w:r>
-      <w:r>
-        <w:rPr>
-          <w:rFonts w:ascii="Arial" w:hAnsi="Arial"/>
-          <w:color w:val="000000"/>
-          <w:sz w:val="19"/>
-        </w:rPr>
-        <w:t xml:space="preserve"> - </w:t>
-      </w:r>
-      <w:r>
-        <w:rPr>
-          <w:rFonts w:ascii="Arial" w:hAnsi="Arial"/>
-          <w:color w:val="000000"/>
-          <w:sz w:val="19"/>
-        </w:rPr>
-        <w:t>ASIC recorded a $90 million deficit driven by increased litigation costs and unsuccessful court proceedings, raising questions about enforcement strategy sustainability and the reliability of…</w:t>
-      </w:r>
-      <w:r>
-        <w:rPr>
-          <w:rFonts w:ascii="Arial" w:hAnsi="Arial"/>
-          <w:color w:val="000000"/>
-          <w:sz w:val="19"/>
-        </w:rPr>
-        <w:t xml:space="preserve"> (</w:t>
-      </w:r>
-      <w:hyperlink r:id="rId13">
-        <w:r>
-          <w:rPr>
-            <w:rFonts w:ascii="Arial" w:hAnsi="Arial" w:cs="Arial"/>
-            <w:color w:val="0000FF"/>
-            <w:sz w:val="19"/>
-            <w:szCs w:val="19"/>
-            <w:u w:val="single"/>
-          </w:rPr>
-          <w:t xml:space="preserve">Read more</w:t>
-        </w:r>
-      </w:hyperlink>
-      <w:r>
-        <w:rPr>
-          <w:rFonts w:ascii="Arial" w:hAnsi="Arial"/>
-          <w:color w:val="000000"/>
-          <w:sz w:val="19"/>
-        </w:rPr>
-        <w:t>)</w:t>
-      </w:r>
-    </w:p>
-    <w:p>
-      <w:pPr>
-        <w:pStyle w:val="ListBullet"/>
-      </w:pPr>
-      <w:r>
-        <w:rPr>
-          <w:rFonts w:ascii="Arial" w:hAnsi="Arial"/>
-          <w:b/>
-          <w:color w:val="000000"/>
-          <w:sz w:val="19"/>
-        </w:rPr>
-        <w:t>Australian Securities and Investments Commission</w:t>
-      </w:r>
-      <w:r>
-        <w:rPr>
-          <w:rFonts w:ascii="Arial" w:hAnsi="Arial"/>
-          <w:color w:val="000000"/>
-          <w:sz w:val="19"/>
-        </w:rPr>
-        <w:t xml:space="preserve"> - </w:t>
-      </w:r>
-      <w:r>
-        <w:rPr>
-          <w:rFonts w:ascii="Arial" w:hAnsi="Arial"/>
-          <w:color w:val="000000"/>
-          <w:sz w:val="19"/>
-        </w:rPr>
-        <w:t>ASIC's annual report emphasised enforcement outcomes including custodial sentences and consumer remediation, reinforcing its deterrence-first posture ahead of anticipated industry consultation on…</w:t>
-      </w:r>
-      <w:r>
-        <w:rPr>
-          <w:rFonts w:ascii="Arial" w:hAnsi="Arial"/>
-          <w:color w:val="000000"/>
-          <w:sz w:val="19"/>
-        </w:rPr>
-        <w:t xml:space="preserve"> (</w:t>
-      </w:r>
-      <w:hyperlink r:id="rId14">
-        <w:r>
-          <w:rPr>
-            <w:rFonts w:ascii="Arial" w:hAnsi="Arial" w:cs="Arial"/>
-            <w:color w:val="0000FF"/>
-            <w:sz w:val="19"/>
-            <w:szCs w:val="19"/>
-            <w:u w:val="single"/>
-          </w:rPr>
-          <w:t xml:space="preserve">Read more</w:t>
-        </w:r>
-      </w:hyperlink>
-      <w:r>
-        <w:rPr>
-          <w:rFonts w:ascii="Arial" w:hAnsi="Arial"/>
-          <w:color w:val="000000"/>
-          <w:sz w:val="19"/>
-        </w:rPr>
-        <w:t>)</w:t>
-      </w:r>
-    </w:p>
-    <w:p>
-      <w:pPr>
-        <w:pStyle w:val="ListBullet"/>
-      </w:pPr>
-      <w:r>
-        <w:rPr>
-          <w:rFonts w:ascii="Arial" w:hAnsi="Arial"/>
-          <w:b/>
-          <w:color w:val="000000"/>
-          <w:sz w:val="19"/>
-        </w:rPr>
-        <w:t>Australian Competition and Consumer Commission</w:t>
-      </w:r>
-      <w:r>
-        <w:rPr>
-          <w:rFonts w:ascii="Arial" w:hAnsi="Arial"/>
-          <w:color w:val="000000"/>
-          <w:sz w:val="19"/>
-        </w:rPr>
-        <w:t xml:space="preserve"> - </w:t>
-      </w:r>
-      <w:r>
-        <w:rPr>
-          <w:rFonts w:ascii="Arial" w:hAnsi="Arial"/>
-          <w:color w:val="000000"/>
-          <w:sz w:val="19"/>
-        </w:rPr>
-        <w:t>ACCC published guidance on how businesses must substantiate emissions and sustainability claims made to consumers, directly increasing greenwashing compliance risk for listed and large private…</w:t>
-      </w:r>
-    </w:p>
-    <w:p>
-      <w:pPr>
-        <w:pStyle w:val="ListBullet"/>
-      </w:pPr>
-      <w:r>
-        <w:rPr>
-          <w:rFonts w:ascii="Arial" w:hAnsi="Arial"/>
-          <w:b/>
-          <w:color w:val="000000"/>
-          <w:sz w:val="19"/>
-        </w:rPr>
-        <w:t>Australian Prudential Regulation Authority</w:t>
-      </w:r>
-      <w:r>
-        <w:rPr>
-          <w:rFonts w:ascii="Arial" w:hAnsi="Arial"/>
-          <w:color w:val="000000"/>
-          <w:sz w:val="19"/>
-        </w:rPr>
-        <w:t xml:space="preserve"> - </w:t>
-      </w:r>
-      <w:r>
-        <w:rPr>
-          <w:rFonts w:ascii="Arial" w:hAnsi="Arial"/>
-          <w:color w:val="000000"/>
-          <w:sz w:val="19"/>
-        </w:rPr>
-        <w:t>The Australian Banking Association publicly backed calls for ASIC and APRA to reorient regulatory design toward economic growth, signalling industry pressure for a shift in supervisory philosophy…</w:t>
-      </w:r>
-    </w:p>
-    <w:p>
-      <w:pPr>
-        <w:pStyle w:val="ListBullet"/>
-      </w:pPr>
-      <w:r>
-        <w:rPr>
-          <w:rFonts w:ascii="Arial" w:hAnsi="Arial"/>
-          <w:b/>
-          <w:color w:val="000000"/>
-          <w:sz w:val="19"/>
-        </w:rPr>
-        <w:t>eSafety Commissioner</w:t>
-      </w:r>
-      <w:r>
-        <w:rPr>
-          <w:rFonts w:ascii="Arial" w:hAnsi="Arial"/>
-          <w:color w:val="000000"/>
-          <w:sz w:val="19"/>
-        </w:rPr>
-        <w:t xml:space="preserve"> - </w:t>
-      </w:r>
-      <w:r>
-        <w:rPr>
-          <w:rFonts w:ascii="Arial" w:hAnsi="Arial"/>
-          <w:color w:val="000000"/>
-          <w:sz w:val="19"/>
-        </w:rPr>
-        <w:t>The Australian government is considering restructuring the eSafety Commissioner into a committee model to handle enforcement under the proposed Duty of Care legislation, a structural shift that…</w:t>
-      </w:r>
-      <w:r>
-        <w:rPr>
-          <w:rFonts w:ascii="Arial" w:hAnsi="Arial"/>
-          <w:color w:val="000000"/>
-          <w:sz w:val="19"/>
-        </w:rPr>
-        <w:t xml:space="preserve"> (</w:t>
-      </w:r>
-      <w:hyperlink r:id="rId15">
-        <w:r>
-          <w:rPr>
-            <w:rFonts w:ascii="Arial" w:hAnsi="Arial" w:cs="Arial"/>
-            <w:color w:val="0000FF"/>
-            <w:sz w:val="19"/>
-            <w:szCs w:val="19"/>
-            <w:u w:val="single"/>
-          </w:rPr>
-          <w:t xml:space="preserve">Read more</w:t>
-        </w:r>
-      </w:hyperlink>
-      <w:r>
-        <w:rPr>
-          <w:rFonts w:ascii="Arial" w:hAnsi="Arial"/>
-          <w:color w:val="000000"/>
-          <w:sz w:val="19"/>
-        </w:rPr>
-        <w:t>)</w:t>
-      </w:r>
-    </w:p>
-    <w:p>
-      <w:pPr>
-        <w:pStyle w:val="ListBullet"/>
-      </w:pPr>
-      <w:r>
-        <w:rPr>
-          <w:rFonts w:ascii="Arial" w:hAnsi="Arial"/>
-          <w:b/>
-          <w:color w:val="000000"/>
-          <w:sz w:val="19"/>
-        </w:rPr>
-        <w:t>National Anti-Corruption Commission</w:t>
-      </w:r>
-      <w:r>
-        <w:rPr>
-          <w:rFonts w:ascii="Arial" w:hAnsi="Arial"/>
-          <w:color w:val="000000"/>
-          <w:sz w:val="19"/>
-        </w:rPr>
-        <w:t xml:space="preserve"> - </w:t>
-      </w:r>
-      <w:r>
-        <w:rPr>
-          <w:rFonts w:ascii="Arial" w:hAnsi="Arial"/>
-          <w:color w:val="000000"/>
-          <w:sz w:val="19"/>
-        </w:rPr>
-        <w:t>The government has nominated the Federal Circuit and Family Court deputy chief justice as the planned National Anti-Corruption Commission commissioner, signalling a judiciary-to-regulator transition…</w:t>
-      </w:r>
-      <w:r>
-        <w:rPr>
-          <w:rFonts w:ascii="Arial" w:hAnsi="Arial"/>
-          <w:color w:val="000000"/>
-          <w:sz w:val="19"/>
-        </w:rPr>
-        <w:t xml:space="preserve"> (</w:t>
-      </w:r>
-      <w:hyperlink r:id="rId16">
-        <w:r>
-          <w:rPr>
-            <w:rFonts w:ascii="Arial" w:hAnsi="Arial" w:cs="Arial"/>
-            <w:color w:val="0000FF"/>
-            <w:sz w:val="19"/>
-            <w:szCs w:val="19"/>
-            <w:u w:val="single"/>
-          </w:rPr>
-          <w:t xml:space="preserve">Read more</w:t>
-        </w:r>
-      </w:hyperlink>
-      <w:r>
-        <w:rPr>
-          <w:rFonts w:ascii="Arial" w:hAnsi="Arial"/>
-          <w:color w:val="000000"/>
-          <w:sz w:val="19"/>
-        </w:rPr>
-        <w:t>)</w:t>
-      </w:r>
-    </w:p>
-    <w:p>
-      <w:pPr>
-        <w:pStyle w:val="ListBullet"/>
-      </w:pPr>
-      <w:r>
-        <w:rPr>
-          <w:rFonts w:ascii="Arial" w:hAnsi="Arial"/>
-          <w:b/>
-          <w:color w:val="000000"/>
-          <w:sz w:val="19"/>
-        </w:rPr>
-        <w:t>Australian Transaction Reports and Analysis Centre</w:t>
-      </w:r>
-      <w:r>
-        <w:rPr>
-          <w:rFonts w:ascii="Arial" w:hAnsi="Arial"/>
-          <w:color w:val="000000"/>
-          <w:sz w:val="19"/>
-        </w:rPr>
-        <w:t xml:space="preserve"> - </w:t>
-      </w:r>
-      <w:r>
-        <w:rPr>
-          <w:rFonts w:ascii="Arial" w:hAnsi="Arial"/>
-          <w:color w:val="000000"/>
-          <w:sz w:val="19"/>
-        </w:rPr>
-        <w:t>AUSTRAC released a recorded AML30 webinar covering child sexual exploitation financial typologies, reinforcing obligations for reporting entities to maintain and test transaction monitoring rules…</w:t>
-      </w:r>
-    </w:p>
-    <w:p>
-      <w:pPr>
-        <w:pStyle w:val="ListBullet"/>
-      </w:pPr>
-      <w:r>
-        <w:rPr>
-          <w:rFonts w:ascii="Arial" w:hAnsi="Arial"/>
-          <w:b/>
-          <w:color w:val="000000"/>
-          <w:sz w:val="19"/>
-        </w:rPr>
-        <w:t>Victorian Auditor-General's Office</w:t>
-      </w:r>
-      <w:r>
-        <w:rPr>
-          <w:rFonts w:ascii="Arial" w:hAnsi="Arial"/>
-          <w:color w:val="000000"/>
-          <w:sz w:val="19"/>
-        </w:rPr>
-        <w:t xml:space="preserve"> - </w:t>
-      </w:r>
-      <w:r>
-        <w:rPr>
-          <w:rFonts w:ascii="Arial" w:hAnsi="Arial"/>
-          <w:color w:val="000000"/>
-          <w:sz w:val="19"/>
-        </w:rPr>
-        <w:t>VAGO found that not all Victorian government advertising campaigns met the apolitical standard required under public communications guidelines, creating reputational and compliance exposure for…</w:t>
-      </w:r>
-      <w:r>
-        <w:rPr>
-          <w:rFonts w:ascii="Arial" w:hAnsi="Arial"/>
-          <w:color w:val="000000"/>
-          <w:sz w:val="19"/>
-        </w:rPr>
-        <w:t xml:space="preserve"> (</w:t>
-      </w:r>
-      <w:hyperlink r:id="rId17">
-        <w:r>
-          <w:rPr>
-            <w:rFonts w:ascii="Arial" w:hAnsi="Arial" w:cs="Arial"/>
-            <w:color w:val="0000FF"/>
-            <w:sz w:val="19"/>
-            <w:szCs w:val="19"/>
-            <w:u w:val="single"/>
-          </w:rPr>
-          <w:t xml:space="preserve">Read more</w:t>
-        </w:r>
-      </w:hyperlink>
-      <w:r>
-        <w:rPr>
-          <w:rFonts w:ascii="Arial" w:hAnsi="Arial"/>
-          <w:color w:val="000000"/>
-          <w:sz w:val="19"/>
-        </w:rPr>
-        <w:t>)</w:t>
-      </w:r>
-    </w:p>
-    <w:p>
-      <w:pPr>
-        <w:pStyle w:val="ListBullet"/>
-      </w:pPr>
-      <w:r>
-        <w:rPr>
-          <w:rFonts w:ascii="Arial" w:hAnsi="Arial"/>
-          <w:b/>
-          <w:color w:val="000000"/>
-          <w:sz w:val="19"/>
-        </w:rPr>
-        <w:t>Victorian WorkCover Authority (WorkSafe Victoria)</w:t>
-      </w:r>
-      <w:r>
-        <w:rPr>
-          <w:rFonts w:ascii="Arial" w:hAnsi="Arial"/>
-          <w:color w:val="000000"/>
-          <w:sz w:val="19"/>
-        </w:rPr>
-        <w:t xml:space="preserve"> - </w:t>
-      </w:r>
-      <w:r>
-        <w:rPr>
-          <w:rFonts w:ascii="Arial" w:hAnsi="Arial"/>
-          <w:color w:val="000000"/>
-          <w:sz w:val="19"/>
-        </w:rPr>
-        <w:t>WorkSafe Victoria issued a new tranche of infringement notices targeting falls from height and high-risk construction work offences, continuing its construction-sector enforcement campaign with…</w:t>
-      </w:r>
-      <w:r>
-        <w:rPr>
-          <w:rFonts w:ascii="Arial" w:hAnsi="Arial"/>
-          <w:color w:val="000000"/>
-          <w:sz w:val="19"/>
-        </w:rPr>
-        <w:t xml:space="preserve"> (</w:t>
-      </w:r>
-      <w:hyperlink r:id="rId18">
-        <w:r>
-          <w:rPr>
-            <w:rFonts w:ascii="Arial" w:hAnsi="Arial" w:cs="Arial"/>
-            <w:color w:val="0000FF"/>
-            <w:sz w:val="19"/>
-            <w:szCs w:val="19"/>
-            <w:u w:val="single"/>
-          </w:rPr>
-          <w:t xml:space="preserve">Read more</w:t>
-        </w:r>
-      </w:hyperlink>
-      <w:r>
-        <w:rPr>
-          <w:rFonts w:ascii="Arial" w:hAnsi="Arial"/>
-          <w:color w:val="000000"/>
-          <w:sz w:val="19"/>
-        </w:rPr>
-        <w:t>)</w:t>
+        <w:t>No regulator-in-news signal this fortnight, see Themes below.</w:t>
       </w:r>
     </w:p>
     <w:p>
@@ -751,205 +153,11 @@
       <w:r>
         <w:rPr>
           <w:rFonts w:ascii="Arial" w:hAnsi="Arial"/>
-          <w:b/>
-          <w:color w:val="000000"/>
+          <w:i/>
+          <w:color w:val="666666"/>
           <w:sz w:val="19"/>
         </w:rPr>
-        <w:t>Victoria</w:t>
-      </w:r>
-    </w:p>
-    <w:p>
-      <w:pPr>
-        <w:pStyle w:val="ListBullet"/>
-      </w:pPr>
-      <w:r>
-        <w:rPr>
-          <w:rFonts w:ascii="Arial" w:hAnsi="Arial"/>
-          <w:b/>
-          <w:color w:val="000000"/>
-          <w:sz w:val="19"/>
-        </w:rPr>
-        <w:t>Victorian WorkCover Authority (WorkSafe Victoria)</w:t>
-      </w:r>
-      <w:r>
-        <w:rPr>
-          <w:rFonts w:ascii="Arial" w:hAnsi="Arial"/>
-          <w:color w:val="000000"/>
-          <w:sz w:val="19"/>
-        </w:rPr>
-        <w:t xml:space="preserve"> - </w:t>
-      </w:r>
-      <w:r>
-        <w:rPr>
-          <w:rFonts w:ascii="Arial" w:hAnsi="Arial"/>
-          <w:color w:val="000000"/>
-          <w:sz w:val="19"/>
-        </w:rPr>
-        <w:t>Solar installer fined $70,000 for ignoring falls risk</w:t>
-      </w:r>
-    </w:p>
-    <w:p>
-      <w:pPr>
-        <w:pStyle w:val="ListBullet"/>
-      </w:pPr>
-      <w:r>
-        <w:rPr>
-          <w:rFonts w:ascii="Arial" w:hAnsi="Arial"/>
-          <w:b/>
-          <w:color w:val="000000"/>
-          <w:sz w:val="19"/>
-        </w:rPr>
-        <w:t>Consumer Affairs Victoria</w:t>
-      </w:r>
-      <w:r>
-        <w:rPr>
-          <w:rFonts w:ascii="Arial" w:hAnsi="Arial"/>
-          <w:color w:val="000000"/>
-          <w:sz w:val="19"/>
-        </w:rPr>
-        <w:t xml:space="preserve"> - </w:t>
-      </w:r>
-      <w:r>
-        <w:rPr>
-          <w:rFonts w:ascii="Arial" w:hAnsi="Arial"/>
-          <w:color w:val="000000"/>
-          <w:sz w:val="19"/>
-        </w:rPr>
-        <w:t>Compliance clampdown targets trust account audits</w:t>
-      </w:r>
-    </w:p>
-    <w:p>
-      <w:pPr>
-        <w:pStyle w:val="ListBullet"/>
-      </w:pPr>
-      <w:r>
-        <w:rPr>
-          <w:rFonts w:ascii="Arial" w:hAnsi="Arial"/>
-          <w:b/>
-          <w:color w:val="000000"/>
-          <w:sz w:val="19"/>
-        </w:rPr>
-        <w:t>Victorian Auditor-General's Office</w:t>
-      </w:r>
-      <w:r>
-        <w:rPr>
-          <w:rFonts w:ascii="Arial" w:hAnsi="Arial"/>
-          <w:color w:val="000000"/>
-          <w:sz w:val="19"/>
-        </w:rPr>
-        <w:t xml:space="preserve"> - </w:t>
-      </w:r>
-      <w:r>
-        <w:rPr>
-          <w:rFonts w:ascii="Arial" w:hAnsi="Arial"/>
-          <w:color w:val="000000"/>
-          <w:sz w:val="19"/>
-        </w:rPr>
-        <w:t>Auditor-General criticises fire truck management and government advertising</w:t>
-      </w:r>
-    </w:p>
-    <w:p>
-      <w:pPr>
-        <w:pStyle w:val="body_letter"/>
-      </w:pPr>
-      <w:r>
-        <w:rPr>
-          <w:rFonts w:ascii="Arial" w:hAnsi="Arial"/>
-          <w:b/>
-          <w:color w:val="000000"/>
-          <w:sz w:val="19"/>
-        </w:rPr>
-        <w:t>Commonwealth</w:t>
-      </w:r>
-    </w:p>
-    <w:p>
-      <w:pPr>
-        <w:pStyle w:val="ListBullet"/>
-      </w:pPr>
-      <w:r>
-        <w:rPr>
-          <w:rFonts w:ascii="Arial" w:hAnsi="Arial"/>
-          <w:b/>
-          <w:color w:val="000000"/>
-          <w:sz w:val="19"/>
-        </w:rPr>
-        <w:t>Australian Energy Regulator</w:t>
-      </w:r>
-      <w:r>
-        <w:rPr>
-          <w:rFonts w:ascii="Arial" w:hAnsi="Arial"/>
-          <w:color w:val="000000"/>
-          <w:sz w:val="19"/>
-        </w:rPr>
-        <w:t xml:space="preserve"> - </w:t>
-      </w:r>
-      <w:r>
-        <w:rPr>
-          <w:rFonts w:ascii="Arial" w:hAnsi="Arial"/>
-          <w:color w:val="000000"/>
-          <w:sz w:val="19"/>
-        </w:rPr>
-        <w:t>AER opens Waratah Super Battery revenue determination review</w:t>
-      </w:r>
-    </w:p>
-    <w:p>
-      <w:pPr>
-        <w:pStyle w:val="ListBullet"/>
-      </w:pPr>
-      <w:r>
-        <w:rPr>
-          <w:rFonts w:ascii="Arial" w:hAnsi="Arial"/>
-          <w:b/>
-          <w:color w:val="000000"/>
-          <w:sz w:val="19"/>
-        </w:rPr>
-        <w:t>Aged Care Quality and Safety Commission</w:t>
-      </w:r>
-      <w:r>
-        <w:rPr>
-          <w:rFonts w:ascii="Arial" w:hAnsi="Arial"/>
-          <w:color w:val="000000"/>
-          <w:sz w:val="19"/>
-        </w:rPr>
-        <w:t xml:space="preserve"> - </w:t>
-      </w:r>
-      <w:r>
-        <w:rPr>
-          <w:rFonts w:ascii="Arial" w:hAnsi="Arial"/>
-          <w:color w:val="000000"/>
-          <w:sz w:val="19"/>
-        </w:rPr>
-        <w:t>Best practice guidance on incident management systems released</w:t>
-      </w:r>
-    </w:p>
-    <w:p>
-      <w:pPr>
-        <w:pStyle w:val="ListBullet"/>
-      </w:pPr>
-      <w:r>
-        <w:rPr>
-          <w:rFonts w:ascii="Arial" w:hAnsi="Arial"/>
-          <w:b/>
-          <w:color w:val="000000"/>
-          <w:sz w:val="19"/>
-        </w:rPr>
-        <w:t>Australian Health Practitioner Regulation Agency</w:t>
-      </w:r>
-      <w:r>
-        <w:rPr>
-          <w:rFonts w:ascii="Arial" w:hAnsi="Arial"/>
-          <w:color w:val="000000"/>
-          <w:sz w:val="19"/>
-        </w:rPr>
-        <w:t xml:space="preserve"> - </w:t>
-      </w:r>
-      <w:r>
-        <w:rPr>
-          <w:rFonts w:ascii="Arial" w:hAnsi="Arial"/>
-          <w:color w:val="000000"/>
-          <w:sz w:val="19"/>
-        </w:rPr>
-        <w:t>Fake cosmetic nurse ordered to community service after Ahpra probe</w:t>
+        <w:t>No client-in-news signal this fortnight across any jurisdiction.</w:t>
       </w:r>
     </w:p>
     <w:p>
@@ -1063,7 +271,7 @@
           <w:color w:val="000000"/>
           <w:sz w:val="19"/>
         </w:rPr>
-        <w:t>Norton Rose Fulbright analyses the National EPA's proposed enforcement and restoration contribution framework under EPBC Act reforms, signalling materially higher liability exposure for proponents…</w:t>
+        <w:t>(as at 2026-10-22) Norton Rose Fulbright analyses the National EPA's proposed enforcement and restoration contribution framework under EPBC Act reforms, signalling materially higher liability…</w:t>
       </w:r>
       <w:r>
         <w:rPr>
@@ -1073,7 +281,7 @@
         </w:rPr>
         <w:t xml:space="preserve"> (</w:t>
       </w:r>
-      <w:hyperlink r:id="rId19">
+      <w:hyperlink r:id="rId10">
         <w:r>
           <w:rPr>
             <w:rFonts w:ascii="Arial" w:hAnsi="Arial" w:cs="Arial"/>
@@ -1121,7 +329,7 @@
           <w:color w:val="000000"/>
           <w:sz w:val="19"/>
         </w:rPr>
-        <w:t>The Albanese Government has launched consultation on overhauling Commonwealth heritage protection laws following the Federal Court's McPhillamys ruling, creating approval risk uncertainty for mining…</w:t>
+        <w:t>(as at 2026-10-22) The Albanese Government has launched consultation on overhauling Commonwealth heritage protection laws following the Federal Court's McPhillamys ruling, creating approval risk…</w:t>
       </w:r>
       <w:r>
         <w:rPr>
@@ -1131,7 +339,7 @@
         </w:rPr>
         <w:t xml:space="preserve"> (</w:t>
       </w:r>
-      <w:hyperlink r:id="rId20">
+      <w:hyperlink r:id="rId11">
         <w:r>
           <w:rPr>
             <w:rFonts w:ascii="Arial" w:hAnsi="Arial" w:cs="Arial"/>
@@ -1179,7 +387,7 @@
           <w:color w:val="000000"/>
           <w:sz w:val="19"/>
         </w:rPr>
-        <w:t>Workplace safety regulators are intensifying psychosocial risk enforcement alongside uninsurable penalties, raising the financial exposure for organisations that have not yet embedded proactive…</w:t>
+        <w:t>(as at 2026-10-22) Workplace safety regulators are intensifying psychosocial risk enforcement alongside uninsurable penalties, raising the financial exposure for organisations that have not yet…</w:t>
       </w:r>
       <w:r>
         <w:rPr>
@@ -1189,7 +397,7 @@
         </w:rPr>
         <w:t xml:space="preserve"> (</w:t>
       </w:r>
-      <w:hyperlink r:id="rId21">
+      <w:hyperlink r:id="rId12">
         <w:r>
           <w:rPr>
             <w:rFonts w:ascii="Arial" w:hAnsi="Arial" w:cs="Arial"/>
@@ -1237,7 +445,7 @@
           <w:color w:val="000000"/>
           <w:sz w:val="19"/>
         </w:rPr>
-        <w:t>ABC News reports a loophole allows new coal and gas expansions to bypass stricter Safeguard Mechanism obligations, increasing pressure on the Albanese Government to close the gap and sharpening…</w:t>
+        <w:t>(as at 2026-10-22) ABC News reports a loophole allows new coal and gas expansions to bypass stricter Safeguard Mechanism obligations, increasing pressure on the Albanese Government to close the gap…</w:t>
       </w:r>
       <w:r>
         <w:rPr>
@@ -1247,7 +455,7 @@
         </w:rPr>
         <w:t xml:space="preserve"> (</w:t>
       </w:r>
-      <w:hyperlink r:id="rId22">
+      <w:hyperlink r:id="rId13">
         <w:r>
           <w:rPr>
             <w:rFonts w:ascii="Arial" w:hAnsi="Arial" w:cs="Arial"/>
@@ -1309,7 +517,7 @@
           <w:color w:val="000000"/>
           <w:sz w:val="19"/>
         </w:rPr>
-        <w:t>Tasmania's EPA disclosed it was not told the full extent of Firmus's data centre generator plans, revealing a regulatory intelligence gap as AI-driven demand for data centre capacity outpaces…</w:t>
+        <w:t>(as at 2026-10-22) Tasmania's EPA disclosed it was not told the full extent of Firmus's data centre generator plans, revealing a regulatory intelligence gap as AI-driven demand for data centre…</w:t>
       </w:r>
       <w:r>
         <w:rPr>
@@ -1319,7 +527,7 @@
         </w:rPr>
         <w:t xml:space="preserve"> (</w:t>
       </w:r>
-      <w:hyperlink r:id="rId23">
+      <w:hyperlink r:id="rId14">
         <w:r>
           <w:rPr>
             <w:rFonts w:ascii="Arial" w:hAnsi="Arial" w:cs="Arial"/>
@@ -1367,7 +575,7 @@
           <w:color w:val="000000"/>
           <w:sz w:val="19"/>
         </w:rPr>
-        <w:t>AFMA and Indonesian counterparts coordinated a Vessel Monitoring System pilot, using shared digital tracking data to close cross-border fisheries enforcement gaps and demonstrate how data-sharing…</w:t>
+        <w:t>(as at 2026-10-22) AFMA and Indonesian counterparts coordinated a Vessel Monitoring System pilot, using shared digital tracking data to close cross-border fisheries enforcement gaps and demonstrate…</w:t>
       </w:r>
       <w:r>
         <w:rPr>
@@ -1377,7 +585,7 @@
         </w:rPr>
         <w:t xml:space="preserve"> (</w:t>
       </w:r>
-      <w:hyperlink r:id="rId24">
+      <w:hyperlink r:id="rId15">
         <w:r>
           <w:rPr>
             <w:rFonts w:ascii="Arial" w:hAnsi="Arial" w:cs="Arial"/>
@@ -1425,7 +633,7 @@
           <w:color w:val="000000"/>
           <w:sz w:val="19"/>
         </w:rPr>
-        <w:t>Victoria's Commission for Children and Young People presented analytics-grounded evidence in its annual report to drive policy and regulatory responses, illustrating how regulators can embed data…</w:t>
+        <w:t>(as at 2026-10-22) Victoria's Commission for Children and Young People presented analytics-grounded evidence in its annual report to drive policy and regulatory responses, illustrating how…</w:t>
       </w:r>
       <w:r>
         <w:rPr>
@@ -1435,7 +643,7 @@
         </w:rPr>
         <w:t xml:space="preserve"> (</w:t>
       </w:r>
-      <w:hyperlink r:id="rId25">
+      <w:hyperlink r:id="rId16">
         <w:r>
           <w:rPr>
             <w:rFonts w:ascii="Arial" w:hAnsi="Arial" w:cs="Arial"/>
@@ -1497,7 +705,7 @@
           <w:color w:val="000000"/>
           <w:sz w:val="19"/>
         </w:rPr>
-        <w:t>The Property Council has convened a member briefing on translating NSW's recent building legislative reforms into operational practice, signalling significant compliance transition requirements for…</w:t>
+        <w:t>(as at 2026-10-22) The Property Council has convened a member briefing on translating NSW's recent building legislative reforms into operational practice, signalling significant compliance…</w:t>
       </w:r>
       <w:r>
         <w:rPr>
@@ -1507,7 +715,7 @@
         </w:rPr>
         <w:t xml:space="preserve"> (</w:t>
       </w:r>
-      <w:hyperlink r:id="rId26">
+      <w:hyperlink r:id="rId17">
         <w:r>
           <w:rPr>
             <w:rFonts w:ascii="Arial" w:hAnsi="Arial" w:cs="Arial"/>
@@ -1555,7 +763,7 @@
           <w:color w:val="000000"/>
           <w:sz w:val="19"/>
         </w:rPr>
-        <w:t>Victoria's Essential Services Commission is seeking stakeholder feedback on Greater Western Water's request to defer its next price determination, raising questions about regulatory timing,…</w:t>
+        <w:t>(as at 2026-10-22) Victoria's Essential Services Commission is seeking stakeholder feedback on Greater Western Water's request to defer its next price determination, raising questions about…</w:t>
       </w:r>
       <w:r>
         <w:rPr>
@@ -1565,7 +773,7 @@
         </w:rPr>
         <w:t xml:space="preserve"> (</w:t>
       </w:r>
-      <w:hyperlink r:id="rId27">
+      <w:hyperlink r:id="rId18">
         <w:r>
           <w:rPr>
             <w:rFonts w:ascii="Arial" w:hAnsi="Arial" w:cs="Arial"/>
@@ -1613,7 +821,7 @@
           <w:color w:val="000000"/>
           <w:sz w:val="19"/>
         </w:rPr>
-        <w:t>Proposed tougher online safety laws could give Australians direct rights to sue major technology platforms, extending regulatory burden on digital platforms and opening new liability channels that…</w:t>
+        <w:t>(as at 2026-10-22) Proposed tougher online safety laws could give Australians direct rights to sue major technology platforms, extending regulatory burden on digital platforms and opening new…</w:t>
       </w:r>
       <w:r>
         <w:rPr>
@@ -1623,7 +831,7 @@
         </w:rPr>
         <w:t xml:space="preserve"> (</w:t>
       </w:r>
-      <w:hyperlink r:id="rId28">
+      <w:hyperlink r:id="rId19">
         <w:r>
           <w:rPr>
             <w:rFonts w:ascii="Arial" w:hAnsi="Arial" w:cs="Arial"/>
@@ -1660,16 +868,408 @@
     </w:p>
     <w:p>
       <w:pPr>
-        <w:pStyle w:val="body_letter"/>
+        <w:pStyle w:val="ListBullet"/>
       </w:pPr>
       <w:r>
         <w:rPr>
           <w:rFonts w:ascii="Arial" w:hAnsi="Arial"/>
-          <w:i/>
-          <w:color w:val="666666"/>
+          <w:b/>
+          <w:color w:val="000000"/>
           <w:sz w:val="19"/>
         </w:rPr>
-        <w:t>No upcoming events in the next four weeks.</w:t>
+        <w:t>Citi A50 Australian Economic Forum 2026</w:t>
+      </w:r>
+      <w:r>
+        <w:rPr>
+          <w:rFonts w:ascii="Arial" w:hAnsi="Arial"/>
+          <w:color w:val="000000"/>
+          <w:sz w:val="19"/>
+        </w:rPr>
+        <w:t xml:space="preserve"> - </w:t>
+      </w:r>
+      <w:r>
+        <w:rPr>
+          <w:rFonts w:ascii="Arial" w:hAnsi="Arial"/>
+          <w:color w:val="000000"/>
+          <w:sz w:val="19"/>
+        </w:rPr>
+        <w:t>23 Oct 2026 - APRA · Online</w:t>
+      </w:r>
+      <w:r>
+        <w:rPr>
+          <w:rFonts w:ascii="Arial" w:hAnsi="Arial"/>
+          <w:color w:val="000000"/>
+          <w:sz w:val="19"/>
+        </w:rPr>
+        <w:t xml:space="preserve"> (</w:t>
+      </w:r>
+      <w:hyperlink r:id="rId20">
+        <w:r>
+          <w:rPr>
+            <w:rFonts w:ascii="Arial" w:hAnsi="Arial" w:cs="Arial"/>
+            <w:color w:val="0000FF"/>
+            <w:sz w:val="19"/>
+            <w:szCs w:val="19"/>
+            <w:u w:val="single"/>
+          </w:rPr>
+          <w:t xml:space="preserve">Register</w:t>
+        </w:r>
+      </w:hyperlink>
+      <w:r>
+        <w:rPr>
+          <w:rFonts w:ascii="Arial" w:hAnsi="Arial"/>
+          <w:color w:val="000000"/>
+          <w:sz w:val="19"/>
+        </w:rPr>
+        <w:t>)</w:t>
+      </w:r>
+    </w:p>
+    <w:p>
+      <w:pPr>
+        <w:pStyle w:val="ListBullet"/>
+      </w:pPr>
+      <w:r>
+        <w:rPr>
+          <w:rFonts w:ascii="Arial" w:hAnsi="Arial"/>
+          <w:b/>
+          <w:color w:val="000000"/>
+          <w:sz w:val="19"/>
+        </w:rPr>
+        <w:t>AFR Super &amp;amp; Wealth Summit 2026</w:t>
+      </w:r>
+      <w:r>
+        <w:rPr>
+          <w:rFonts w:ascii="Arial" w:hAnsi="Arial"/>
+          <w:color w:val="000000"/>
+          <w:sz w:val="19"/>
+        </w:rPr>
+        <w:t xml:space="preserve"> - </w:t>
+      </w:r>
+      <w:r>
+        <w:rPr>
+          <w:rFonts w:ascii="Arial" w:hAnsi="Arial"/>
+          <w:color w:val="000000"/>
+          <w:sz w:val="19"/>
+        </w:rPr>
+        <w:t>26 Oct 2026 - APRA · Online</w:t>
+      </w:r>
+      <w:r>
+        <w:rPr>
+          <w:rFonts w:ascii="Arial" w:hAnsi="Arial"/>
+          <w:color w:val="000000"/>
+          <w:sz w:val="19"/>
+        </w:rPr>
+        <w:t xml:space="preserve"> (</w:t>
+      </w:r>
+      <w:hyperlink r:id="rId21">
+        <w:r>
+          <w:rPr>
+            <w:rFonts w:ascii="Arial" w:hAnsi="Arial" w:cs="Arial"/>
+            <w:color w:val="0000FF"/>
+            <w:sz w:val="19"/>
+            <w:szCs w:val="19"/>
+            <w:u w:val="single"/>
+          </w:rPr>
+          <w:t xml:space="preserve">Register</w:t>
+        </w:r>
+      </w:hyperlink>
+      <w:r>
+        <w:rPr>
+          <w:rFonts w:ascii="Arial" w:hAnsi="Arial"/>
+          <w:color w:val="000000"/>
+          <w:sz w:val="19"/>
+        </w:rPr>
+        <w:t>)</w:t>
+      </w:r>
+    </w:p>
+    <w:p>
+      <w:pPr>
+        <w:pStyle w:val="ListBullet"/>
+      </w:pPr>
+      <w:r>
+        <w:rPr>
+          <w:rFonts w:ascii="Arial" w:hAnsi="Arial"/>
+          <w:b/>
+          <w:color w:val="000000"/>
+          <w:sz w:val="19"/>
+        </w:rPr>
+        <w:t>Financial Services and ASX Sector Assurance Forum 2026</w:t>
+      </w:r>
+      <w:r>
+        <w:rPr>
+          <w:rFonts w:ascii="Arial" w:hAnsi="Arial"/>
+          <w:color w:val="000000"/>
+          <w:sz w:val="19"/>
+        </w:rPr>
+        <w:t xml:space="preserve"> - </w:t>
+      </w:r>
+      <w:r>
+        <w:rPr>
+          <w:rFonts w:ascii="Arial" w:hAnsi="Arial"/>
+          <w:color w:val="000000"/>
+          <w:sz w:val="19"/>
+        </w:rPr>
+        <w:t>27 Oct 2026 - APRA · Online</w:t>
+      </w:r>
+      <w:r>
+        <w:rPr>
+          <w:rFonts w:ascii="Arial" w:hAnsi="Arial"/>
+          <w:color w:val="000000"/>
+          <w:sz w:val="19"/>
+        </w:rPr>
+        <w:t xml:space="preserve"> (</w:t>
+      </w:r>
+      <w:hyperlink r:id="rId22">
+        <w:r>
+          <w:rPr>
+            <w:rFonts w:ascii="Arial" w:hAnsi="Arial" w:cs="Arial"/>
+            <w:color w:val="0000FF"/>
+            <w:sz w:val="19"/>
+            <w:szCs w:val="19"/>
+            <w:u w:val="single"/>
+          </w:rPr>
+          <w:t xml:space="preserve">Register</w:t>
+        </w:r>
+      </w:hyperlink>
+      <w:r>
+        <w:rPr>
+          <w:rFonts w:ascii="Arial" w:hAnsi="Arial"/>
+          <w:color w:val="000000"/>
+          <w:sz w:val="19"/>
+        </w:rPr>
+        <w:t>)</w:t>
+      </w:r>
+    </w:p>
+    <w:p>
+      <w:pPr>
+        <w:pStyle w:val="ListBullet"/>
+      </w:pPr>
+      <w:r>
+        <w:rPr>
+          <w:rFonts w:ascii="Arial" w:hAnsi="Arial"/>
+          <w:b/>
+          <w:color w:val="000000"/>
+          <w:sz w:val="19"/>
+        </w:rPr>
+        <w:t>AFSA Summit 2026</w:t>
+      </w:r>
+      <w:r>
+        <w:rPr>
+          <w:rFonts w:ascii="Arial" w:hAnsi="Arial"/>
+          <w:color w:val="000000"/>
+          <w:sz w:val="19"/>
+        </w:rPr>
+        <w:t xml:space="preserve"> - </w:t>
+      </w:r>
+      <w:r>
+        <w:rPr>
+          <w:rFonts w:ascii="Arial" w:hAnsi="Arial"/>
+          <w:color w:val="000000"/>
+          <w:sz w:val="19"/>
+        </w:rPr>
+        <w:t>05 Nov 2026 - APRA · Online</w:t>
+      </w:r>
+      <w:r>
+        <w:rPr>
+          <w:rFonts w:ascii="Arial" w:hAnsi="Arial"/>
+          <w:color w:val="000000"/>
+          <w:sz w:val="19"/>
+        </w:rPr>
+        <w:t xml:space="preserve"> (</w:t>
+      </w:r>
+      <w:hyperlink r:id="rId23">
+        <w:r>
+          <w:rPr>
+            <w:rFonts w:ascii="Arial" w:hAnsi="Arial" w:cs="Arial"/>
+            <w:color w:val="0000FF"/>
+            <w:sz w:val="19"/>
+            <w:szCs w:val="19"/>
+            <w:u w:val="single"/>
+          </w:rPr>
+          <w:t xml:space="preserve">Register</w:t>
+        </w:r>
+      </w:hyperlink>
+      <w:r>
+        <w:rPr>
+          <w:rFonts w:ascii="Arial" w:hAnsi="Arial"/>
+          <w:color w:val="000000"/>
+          <w:sz w:val="19"/>
+        </w:rPr>
+        <w:t>)</w:t>
+      </w:r>
+    </w:p>
+    <w:p>
+      <w:pPr>
+        <w:pStyle w:val="ListBullet"/>
+      </w:pPr>
+      <w:r>
+        <w:rPr>
+          <w:rFonts w:ascii="Arial" w:hAnsi="Arial"/>
+          <w:b/>
+          <w:color w:val="000000"/>
+          <w:sz w:val="19"/>
+        </w:rPr>
+        <w:t>Insurance Council of Australia Annual Conference 2026</w:t>
+      </w:r>
+      <w:r>
+        <w:rPr>
+          <w:rFonts w:ascii="Arial" w:hAnsi="Arial"/>
+          <w:color w:val="000000"/>
+          <w:sz w:val="19"/>
+        </w:rPr>
+        <w:t xml:space="preserve"> - </w:t>
+      </w:r>
+      <w:r>
+        <w:rPr>
+          <w:rFonts w:ascii="Arial" w:hAnsi="Arial"/>
+          <w:color w:val="000000"/>
+          <w:sz w:val="19"/>
+        </w:rPr>
+        <w:t>06 Nov 2026 - APRA · Online</w:t>
+      </w:r>
+      <w:r>
+        <w:rPr>
+          <w:rFonts w:ascii="Arial" w:hAnsi="Arial"/>
+          <w:color w:val="000000"/>
+          <w:sz w:val="19"/>
+        </w:rPr>
+        <w:t xml:space="preserve"> (</w:t>
+      </w:r>
+      <w:hyperlink r:id="rId24">
+        <w:r>
+          <w:rPr>
+            <w:rFonts w:ascii="Arial" w:hAnsi="Arial" w:cs="Arial"/>
+            <w:color w:val="0000FF"/>
+            <w:sz w:val="19"/>
+            <w:szCs w:val="19"/>
+            <w:u w:val="single"/>
+          </w:rPr>
+          <w:t xml:space="preserve">Register</w:t>
+        </w:r>
+      </w:hyperlink>
+      <w:r>
+        <w:rPr>
+          <w:rFonts w:ascii="Arial" w:hAnsi="Arial"/>
+          <w:color w:val="000000"/>
+          <w:sz w:val="19"/>
+        </w:rPr>
+        <w:t>)</w:t>
+      </w:r>
+    </w:p>
+    <w:p>
+      <w:pPr>
+        <w:pStyle w:val="ListBullet"/>
+      </w:pPr>
+      <w:r>
+        <w:rPr>
+          <w:rFonts w:ascii="Arial" w:hAnsi="Arial"/>
+          <w:b/>
+          <w:color w:val="000000"/>
+          <w:sz w:val="19"/>
+        </w:rPr>
+        <w:t>ASIC Annual Forum 2026</w:t>
+      </w:r>
+      <w:r>
+        <w:rPr>
+          <w:rFonts w:ascii="Arial" w:hAnsi="Arial"/>
+          <w:color w:val="000000"/>
+          <w:sz w:val="19"/>
+        </w:rPr>
+        <w:t xml:space="preserve"> - </w:t>
+      </w:r>
+      <w:r>
+        <w:rPr>
+          <w:rFonts w:ascii="Arial" w:hAnsi="Arial"/>
+          <w:color w:val="000000"/>
+          <w:sz w:val="19"/>
+        </w:rPr>
+        <w:t>18 Nov 2026 - APRA · Online</w:t>
+      </w:r>
+      <w:r>
+        <w:rPr>
+          <w:rFonts w:ascii="Arial" w:hAnsi="Arial"/>
+          <w:color w:val="000000"/>
+          <w:sz w:val="19"/>
+        </w:rPr>
+        <w:t xml:space="preserve"> (</w:t>
+      </w:r>
+      <w:hyperlink r:id="rId25">
+        <w:r>
+          <w:rPr>
+            <w:rFonts w:ascii="Arial" w:hAnsi="Arial" w:cs="Arial"/>
+            <w:color w:val="0000FF"/>
+            <w:sz w:val="19"/>
+            <w:szCs w:val="19"/>
+            <w:u w:val="single"/>
+          </w:rPr>
+          <w:t xml:space="preserve">Register</w:t>
+        </w:r>
+      </w:hyperlink>
+      <w:r>
+        <w:rPr>
+          <w:rFonts w:ascii="Arial" w:hAnsi="Arial"/>
+          <w:color w:val="000000"/>
+          <w:sz w:val="19"/>
+        </w:rPr>
+        <w:t>)</w:t>
+      </w:r>
+    </w:p>
+    <w:p>
+      <w:pPr>
+        <w:pStyle w:val="ListBullet"/>
+      </w:pPr>
+      <w:r>
+        <w:rPr>
+          <w:rFonts w:ascii="Arial" w:hAnsi="Arial"/>
+          <w:b/>
+          <w:color w:val="000000"/>
+          <w:sz w:val="19"/>
+        </w:rPr>
+        <w:t>2026 ASFA Conference</w:t>
+      </w:r>
+      <w:r>
+        <w:rPr>
+          <w:rFonts w:ascii="Arial" w:hAnsi="Arial"/>
+          <w:color w:val="000000"/>
+          <w:sz w:val="19"/>
+        </w:rPr>
+        <w:t xml:space="preserve"> - </w:t>
+      </w:r>
+      <w:r>
+        <w:rPr>
+          <w:rFonts w:ascii="Arial" w:hAnsi="Arial"/>
+          <w:color w:val="000000"/>
+          <w:sz w:val="19"/>
+        </w:rPr>
+        <w:t>19 Nov 2026 - APRA · Online</w:t>
+      </w:r>
+      <w:r>
+        <w:rPr>
+          <w:rFonts w:ascii="Arial" w:hAnsi="Arial"/>
+          <w:color w:val="000000"/>
+          <w:sz w:val="19"/>
+        </w:rPr>
+        <w:t xml:space="preserve"> (</w:t>
+      </w:r>
+      <w:hyperlink r:id="rId26">
+        <w:r>
+          <w:rPr>
+            <w:rFonts w:ascii="Arial" w:hAnsi="Arial" w:cs="Arial"/>
+            <w:color w:val="0000FF"/>
+            <w:sz w:val="19"/>
+            <w:szCs w:val="19"/>
+            <w:u w:val="single"/>
+          </w:rPr>
+          <w:t xml:space="preserve">Register</w:t>
+        </w:r>
+      </w:hyperlink>
+      <w:r>
+        <w:rPr>
+          <w:rFonts w:ascii="Arial" w:hAnsi="Arial"/>
+          <w:color w:val="000000"/>
+          <w:sz w:val="19"/>
+        </w:rPr>
+        <w:t>)</w:t>
       </w:r>
     </w:p>
     <w:p>
@@ -1684,20 +1284,6 @@
           <w:sz w:val="21"/>
         </w:rPr>
         <w:t>Cross-sector synthesis (hub-wide)</w:t>
-      </w:r>
-    </w:p>
-    <w:p>
-      <w:pPr>
-        <w:pStyle w:val="body_letter"/>
-      </w:pPr>
-      <w:r>
-        <w:rPr>
-          <w:rFonts w:ascii="Arial" w:hAnsi="Arial"/>
-          <w:b w:val="0"/>
-          <w:color w:val="000000"/>
-          <w:sz w:val="19"/>
-        </w:rPr>
-        <w:t>The fortnight's dominant regulatory investment pattern consolidates across three vectors. First, the AER has simultaneously activated the EnergyConnect cost pass-through consultation, a draft ring-fencing exemption for AGN's hydrogen trials, and a revenue remake for the Waratah Super Battery, a concurrent network economics workload that signals a multi-year regulatory build cycle and live submission windows for network operator clients. Second, a Federal parliamentary inquiry into critical minerals, Geoscience Australia's precompetitive data investment, and Victoria's first antimony processing grant mark a government activation cycle across the critical minerals value chain where permitting, sovereign-capability, and supply-chain economics advisory mandates are forming now. Third, the McPhillamys Federal Court ruling has directly triggered a WA heritage laws overhaul, creating a national compliance gap for mining operators before new instruments are settled, KPMG's highest-urgency engagement window this fortnight. Across health, the TGA's completed AI digital scribe review delivers a government verdict on AI tools in clinical settings, opening a structured advisory lane for providers, while the Department of Health's landmark aged-care pay-equity package and NDIS 'future generations' framing signal imminent structural redesign mandates. AUSTRAC's live AML30 penalties and ASIC's digital asset law consultation (CP 392) create parallel regulated-entity pull across financial services clients. BD effort should be concentrated immediately on: heritage compliance rapid-assessment for mining clients, network regulatory design for AER-regulated networks, and responsible-AI advisory to health providers using the TGA verdict as the pitch anchor.</w:t>
       </w:r>
     </w:p>
     <w:p>
@@ -1724,7 +1310,7 @@
           <w:color w:val="000000"/>
           <w:sz w:val="19"/>
         </w:rPr>
-        <w:t>Brief TransGrid, EnergyConnect operators, and AGN within the week on KPMG's network regulatory economics capability, positioning for submission support and regulatory strategy retainers across the live AER consultation windows.</w:t>
+        <w:t>Brief the relevant sector partner this fortnight on the highest-signal regulator development above.</w:t>
       </w:r>
     </w:p>
     <w:p>
@@ -1737,7 +1323,7 @@
           <w:color w:val="000000"/>
           <w:sz w:val="19"/>
         </w:rPr>
-        <w:t>Convene a heritage compliance rapid-assessment offering for WA and national mining clients exposed by the McPhillamys ruling, targeting execution before the WA legislature settles replacement instruments.</w:t>
+        <w:t>Convene the capability bench for the next reg-tech / capability-review pursuit in pipeline.</w:t>
       </w:r>
     </w:p>
     <w:p>
@@ -1750,112 +1336,7 @@
           <w:color w:val="000000"/>
           <w:sz w:val="19"/>
         </w:rPr>
-        <w:t>Mobilise the critical minerals advisory bench to engage the parliamentary inquiry secretariat and anchor KPMG as lead adviser on permitting reform, sovereign-capability program design, and supply-chain economics across the emerging government investment cycle.</w:t>
-      </w:r>
-    </w:p>
-    <w:p>
-      <w:pPr>
-        <w:pStyle w:val="ListBullet"/>
-      </w:pPr>
-      <w:r>
-        <w:rPr>
-          <w:rFonts w:ascii="Arial" w:hAnsi="Arial"/>
-          <w:color w:val="000000"/>
-          <w:sz w:val="19"/>
-        </w:rPr>
-        <w:t>Use the TGA's AI digital scribe verdict as the pitch hook with health provider clients to open responsible-AI advisory and compliance-framework engagements before the regulator finalises implementation guidance.</w:t>
-      </w:r>
-    </w:p>
-    <w:p>
-      <w:pPr>
-        <w:pStyle w:val="ListBullet"/>
-      </w:pPr>
-      <w:r>
-        <w:rPr>
-          <w:rFonts w:ascii="Arial" w:hAnsi="Arial"/>
-          <w:color w:val="000000"/>
-          <w:sz w:val="19"/>
-        </w:rPr>
-        <w:t>Activate AUSTRAC AML30 enforcement as an outbound trigger to remittance-sector and non-bank financial institution clients, leading with a structured gap-assessment and remediation program offering tied to the live penalty regime.</w:t>
-      </w:r>
-    </w:p>
-    <w:p>
-      <w:pPr>
-        <w:pStyle w:val="body_letter"/>
-      </w:pPr>
-      <w:r>
-        <w:rPr>
-          <w:rFonts w:ascii="Arial" w:hAnsi="Arial"/>
-          <w:b/>
-          <w:color w:val="000000"/>
-          <w:sz w:val="19"/>
-        </w:rPr>
-        <w:t>Implications for clients</w:t>
-      </w:r>
-    </w:p>
-    <w:p>
-      <w:pPr>
-        <w:pStyle w:val="ListBullet"/>
-      </w:pPr>
-      <w:r>
-        <w:rPr>
-          <w:rFonts w:ascii="Arial" w:hAnsi="Arial"/>
-          <w:color w:val="000000"/>
-          <w:sz w:val="19"/>
-        </w:rPr>
-        <w:t>Brief TransGrid, EnergyConnect operators, and AGN within the week on KPMG's network regulatory economics capability, positioning for submission support and regulatory strategy retainers across the live AER consultation windows.</w:t>
-      </w:r>
-    </w:p>
-    <w:p>
-      <w:pPr>
-        <w:pStyle w:val="ListBullet"/>
-      </w:pPr>
-      <w:r>
-        <w:rPr>
-          <w:rFonts w:ascii="Arial" w:hAnsi="Arial"/>
-          <w:color w:val="000000"/>
-          <w:sz w:val="19"/>
-        </w:rPr>
-        <w:t>Convene a heritage compliance rapid-assessment offering for WA and national mining clients exposed by the McPhillamys ruling, targeting execution before the WA legislature settles replacement instruments.</w:t>
-      </w:r>
-    </w:p>
-    <w:p>
-      <w:pPr>
-        <w:pStyle w:val="ListBullet"/>
-      </w:pPr>
-      <w:r>
-        <w:rPr>
-          <w:rFonts w:ascii="Arial" w:hAnsi="Arial"/>
-          <w:color w:val="000000"/>
-          <w:sz w:val="19"/>
-        </w:rPr>
-        <w:t>Mobilise the critical minerals advisory bench to engage the parliamentary inquiry secretariat and anchor KPMG as lead adviser on permitting reform, sovereign-capability program design, and supply-chain economics across the emerging government investment cycle.</w:t>
-      </w:r>
-    </w:p>
-    <w:p>
-      <w:pPr>
-        <w:pStyle w:val="ListBullet"/>
-      </w:pPr>
-      <w:r>
-        <w:rPr>
-          <w:rFonts w:ascii="Arial" w:hAnsi="Arial"/>
-          <w:color w:val="000000"/>
-          <w:sz w:val="19"/>
-        </w:rPr>
-        <w:t>Use the TGA's AI digital scribe verdict as the pitch hook with health provider clients to open responsible-AI advisory and compliance-framework engagements before the regulator finalises implementation guidance.</w:t>
-      </w:r>
-    </w:p>
-    <w:p>
-      <w:pPr>
-        <w:pStyle w:val="ListBullet"/>
-      </w:pPr>
-      <w:r>
-        <w:rPr>
-          <w:rFonts w:ascii="Arial" w:hAnsi="Arial"/>
-          <w:color w:val="000000"/>
-          <w:sz w:val="19"/>
-        </w:rPr>
-        <w:t>Activate AUSTRAC AML30 enforcement as an outbound trigger to remittance-sector and non-bank financial institution clients, leading with a structured gap-assessment and remediation program offering tied to the live penalty regime.</w:t>
+        <w:t>Pursue at least one tracked client on a near-term advisory hook before the next CoP cadence.</w:t>
       </w:r>
     </w:p>
     <w:p>
@@ -1879,221 +1360,11 @@
       <w:r>
         <w:rPr>
           <w:rFonts w:ascii="Arial" w:hAnsi="Arial"/>
-          <w:b/>
-          <w:color w:val="000000"/>
+          <w:i/>
+          <w:color w:val="666666"/>
           <w:sz w:val="19"/>
         </w:rPr>
-        <w:t>Public Sector</w:t>
-      </w:r>
-    </w:p>
-    <w:p>
-      <w:pPr>
-        <w:pStyle w:val="body_letter"/>
-      </w:pPr>
-      <w:r>
-        <w:rPr>
-          <w:rFonts w:ascii="Arial" w:hAnsi="Arial"/>
-          <w:b w:val="0"/>
-          <w:color w:val="000000"/>
-          <w:sz w:val="19"/>
-        </w:rPr>
-        <w:t>The Fair Work Commission's proactive GenAI guidance, issuing structured prompts to constrain AI-generated unfair dismissal submissions, signals that Commonwealth regulators are actively investing in technology governance frameworks, creating an immediate pitch opportunity for AI uplift, policy design, and change-management advisory. The Best Practice Review of model WHS laws, reinforced by WorkSafe Victoria's concurrent publication of its Workplace Exposure Limits regulatory response, opens a clear regulatory reform pipeline where implementation advisory and compliance-readiness engagements are likely to be commissioned through 2026-27. ACCC's new guidance tightening standards on business emissions claims adds a cross-portfolio enforcement signal that activates ESG assurance and regulatory-strategy work across government and regulated-entity client rosters. Victoria's Auditor-General finding that some government advertising campaigns breached apolitical requirements frames a direct governance-risk entry point for public-sector clients with high-volume communications spend.</w:t>
-      </w:r>
-    </w:p>
-    <w:p>
-      <w:pPr>
-        <w:pStyle w:val="body_letter"/>
-      </w:pPr>
-      <w:r>
-        <w:rPr>
-          <w:rFonts w:ascii="Arial" w:hAnsi="Arial"/>
-          <w:b/>
-          <w:color w:val="000000"/>
-          <w:sz w:val="19"/>
-        </w:rPr>
-        <w:t>Financial Services</w:t>
-      </w:r>
-    </w:p>
-    <w:p>
-      <w:pPr>
-        <w:pStyle w:val="body_letter"/>
-      </w:pPr>
-      <w:r>
-        <w:rPr>
-          <w:rFonts w:ascii="Arial" w:hAnsi="Arial"/>
-          <w:b w:val="0"/>
-          <w:color w:val="000000"/>
-          <w:sz w:val="19"/>
-        </w:rPr>
-        <w:t>ASIC's consultation on digital asset law implementation (CP 392) opens a time-limited window for licensing readiness and compliance framework engagements across crypto and tokenised-asset issuers. The regulator's concurrent super fund valuation review (REP 841) signals a sustained assurance uplift cycle for large funds, with ASIC explicitly calling for stronger audit scrutiny of unlisted-asset valuations. Fortnum Private Wealth's $1.35M cybersecurity penalty and the mortgage broker best-interests duty review (REP 840) together indicate enforcement is broadening from conduct to operational and systems risk, both generating remediation mandates across licensees. The ABA's public endorsement of a growth-oriented regulatory posture from ASIC and APRA adds a strategic-advice angle around licensing reform and capital efficiency.</w:t>
-      </w:r>
-    </w:p>
-    <w:p>
-      <w:pPr>
-        <w:pStyle w:val="body_letter"/>
-      </w:pPr>
-      <w:r>
-        <w:rPr>
-          <w:rFonts w:ascii="Arial" w:hAnsi="Arial"/>
-          <w:b/>
-          <w:color w:val="000000"/>
-          <w:sz w:val="19"/>
-        </w:rPr>
-        <w:t>Health, Ageing &amp; Human Services</w:t>
-      </w:r>
-    </w:p>
-    <w:p>
-      <w:pPr>
-        <w:pStyle w:val="body_letter"/>
-      </w:pPr>
-      <w:r>
-        <w:rPr>
-          <w:rFonts w:ascii="Arial" w:hAnsi="Arial"/>
-          <w:b w:val="0"/>
-          <w:color w:val="000000"/>
-          <w:sz w:val="19"/>
-        </w:rPr>
-        <w:t>The fortnight's dominant signal is a simultaneous government push on aged care reform, NDIS sustainability, and care-sector workforce equity, with the Department of Health, Disability and Ageing announcing a landmark pay-equity funding package alongside a 'strengthening aged care' agenda, both signalling cabinet-level commitment to structural uplift rather than incremental tweaks. The Aged Care Quality and Safety Commission has released best-practice incident management guidance and its ninth quality bulletin this year, maintaining an active compliance posture that creates assurance and governance pull-through. The TGA's completed review of AI digital scribes in clinical settings is the clearest tech-regulation signal in the batch: a government verdict on AI tools in health delivery opens a structured advisory lane for providers navigating compliance. Ahpra's continued high-volume enforcement against unregistered and suspended practitioners reinforces demand for workforce credentialling and registration-governance work, while NDIS's 'future generations' framing suggests an imminent structural redesign that KPMG should be positioned to support.</w:t>
-      </w:r>
-    </w:p>
-    <w:p>
-      <w:pPr>
-        <w:pStyle w:val="body_letter"/>
-      </w:pPr>
-      <w:r>
-        <w:rPr>
-          <w:rFonts w:ascii="Arial" w:hAnsi="Arial"/>
-          <w:b/>
-          <w:color w:val="000000"/>
-          <w:sz w:val="19"/>
-        </w:rPr>
-        <w:t>Energy, Mining &amp; Property</w:t>
-      </w:r>
-    </w:p>
-    <w:p>
-      <w:pPr>
-        <w:pStyle w:val="body_letter"/>
-      </w:pPr>
-      <w:r>
-        <w:rPr>
-          <w:rFonts w:ascii="Arial" w:hAnsi="Arial"/>
-          <w:b w:val="0"/>
-          <w:color w:val="000000"/>
-          <w:sz w:val="19"/>
-        </w:rPr>
-        <w:t>The AER's simultaneous activation of the Project EnergyConnect cost pass-through consultation and a draft ring-fencing exemption for AGN's hydrogen trials signals concentrated regulatory activity on network economics and the gas-to-hydrogen transition, with live submission windows creating immediate engagement opportunities for network operator clients. A Federal parliamentary inquiry into critical minerals, combined with Geoscience Australia's precompetitive data investment and Victoria's first antimony processing grant, marks an emerging government activation cycle across the critical minerals value chain where permitting, supply-chain economics and sovereign-capability advisory demand is building. The McPhillamys Federal Court ruling has directly triggered a WA heritage laws overhaul, opening a compliance gap for mining operators nationally before new instruments are settled, a high-urgency advisory window. State environmental enforcement is concurrently intensifying, with the SA EPA issuing a groundwater ban and Vic EPA deploying council-enforcement partnerships against illegal waste dumping, both carrying property-sector exposure for KPMG clients managing contaminated or development sites.</w:t>
-      </w:r>
-    </w:p>
-    <w:p>
-      <w:pPr>
-        <w:pStyle w:val="body_letter"/>
-      </w:pPr>
-      <w:r>
-        <w:rPr>
-          <w:rFonts w:ascii="Arial" w:hAnsi="Arial"/>
-          <w:b/>
-          <w:color w:val="000000"/>
-          <w:sz w:val="19"/>
-        </w:rPr>
-        <w:t>National Security &amp; Justice</w:t>
-      </w:r>
-    </w:p>
-    <w:p>
-      <w:pPr>
-        <w:pStyle w:val="body_letter"/>
-      </w:pPr>
-      <w:r>
-        <w:rPr>
-          <w:rFonts w:ascii="Arial" w:hAnsi="Arial"/>
-          <w:b w:val="0"/>
-          <w:color w:val="000000"/>
-          <w:sz w:val="19"/>
-        </w:rPr>
-        <w:t>The PJCIS Radicalisation Inquiry has drawn AFP senior-leadership testimony highlighting AI-accelerated youth radicalisation and child exploitation vectors, signalling near-term Commonwealth investment in counter-radicalisation program design and capability evaluation across AFP and Home Affairs. AUSTRAC has activated the AML30 enforcement regime with $21,840 penalties now issuing to non-compliant businesses, creating immediate pull-through demand for AML/CTF gap assessments, remediation programs, and remittance-sector compliance uplift. AFP escalations across foreign interference safeguarding, Operation Ironside sentencing, and the Trans-Tasman OMCG crackdown, alongside ABF-Indonesia joint maritime operations, indicate a sustained multi-agency capability-build cycle that opens procurement pathways at AFP, ACIC, and ABF simultaneously. The AI-threat and counter-radicalisation signal is the highest-priority government-advisory angle; AML30 enforcement is the highest-priority regulated-entity commercial pull.</w:t>
-      </w:r>
-    </w:p>
-    <w:p>
-      <w:pPr>
-        <w:pStyle w:val="body_letter"/>
-      </w:pPr>
-      <w:r>
-        <w:rPr>
-          <w:rFonts w:ascii="Arial" w:hAnsi="Arial"/>
-          <w:b/>
-          <w:color w:val="000000"/>
-          <w:sz w:val="19"/>
-        </w:rPr>
-        <w:t>Defence</w:t>
-      </w:r>
-    </w:p>
-    <w:p>
-      <w:pPr>
-        <w:pStyle w:val="body_letter"/>
-      </w:pPr>
-      <w:r>
-        <w:rPr>
-          <w:rFonts w:ascii="Arial" w:hAnsi="Arial"/>
-          <w:b w:val="0"/>
-          <w:color w:val="000000"/>
-          <w:sz w:val="19"/>
-        </w:rPr>
-        <w:t>Defence is signalling a strategic reset in long-term contracting, with the abrupt termination of a 26-year arrangement drawing market attention to procurement governance and transition-management gaps that create near-term advisory pull. Simultaneously, scrutiny of F-35 component export controls has put the Defence Export Controls Office under public pressure, opening regulatory-compliance and licensing-framework work for advisers with cleared supply-chain capability. The proposed criminal liability extension for modern slavery failures in supply chains adds a compliance-uplift imperative across the defence industrial base, where tier-2 and tier-3 primes have limited audit maturity. KPMG should note the Greens' public challenge to its existing Defence engagement against the federal contract-ban backdrop, which elevates reputational diligence as a precondition for any new pursuit in this sector.</w:t>
-      </w:r>
-    </w:p>
-    <w:p>
-      <w:pPr>
-        <w:pStyle w:val="body_letter"/>
-      </w:pPr>
-      <w:r>
-        <w:rPr>
-          <w:rFonts w:ascii="Arial" w:hAnsi="Arial"/>
-          <w:b/>
-          <w:color w:val="000000"/>
-          <w:sz w:val="19"/>
-        </w:rPr>
-        <w:t>Transport</w:t>
-      </w:r>
-    </w:p>
-    <w:p>
-      <w:pPr>
-        <w:pStyle w:val="body_letter"/>
-      </w:pPr>
-      <w:r>
-        <w:rPr>
-          <w:rFonts w:ascii="Arial" w:hAnsi="Arial"/>
-          <w:b w:val="0"/>
-          <w:color w:val="000000"/>
-          <w:sz w:val="19"/>
-        </w:rPr>
-        <w:t>CASA is in an active regulatory build cycle across three fronts simultaneously, drone/RPAS frameworks (BVLOS long-term approach, AusSORA airworthiness, NOTAMs and record-keeping), safety management system uplift for aerodrome rescue and air navigation services (PP 2618SS), and Part 21 certification flexibility, signalling sustained advisory demand for regulatory design, implementation support and assurance uplift. ATSB's aerial firefighting reporting-culture survey and NHVR's amendment cycle add parallel threads in safety culture and heavy vehicle compliance. CASA's probe into Vietjet's financial viability is the most immediate enforcement signal, creating a near-term opening for financial and regulatory resilience advisory to airline clients operating on thin margins. The NTC's voluntary guidelines for stevedores and ECPs, combined with incoming accessible public transport standards, extend the pipeline into ports and passenger rail operators who will need compliance gap assessments.</w:t>
-      </w:r>
-    </w:p>
-    <w:p>
-      <w:pPr>
-        <w:pStyle w:val="body_letter"/>
-      </w:pPr>
-      <w:r>
-        <w:rPr>
-          <w:rFonts w:ascii="Arial" w:hAnsi="Arial"/>
-          <w:b/>
-          <w:color w:val="000000"/>
-          <w:sz w:val="19"/>
-        </w:rPr>
-        <w:t>Education</w:t>
-      </w:r>
-    </w:p>
-    <w:p>
-      <w:pPr>
-        <w:pStyle w:val="body_letter"/>
-      </w:pPr>
-      <w:r>
-        <w:rPr>
-          <w:rFonts w:ascii="Arial" w:hAnsi="Arial"/>
-          <w:b w:val="0"/>
-          <w:color w:val="000000"/>
-          <w:sz w:val="19"/>
-        </w:rPr>
-        <w:t>Three concurrent regulatory uplift signals converge on the education and training sector this fortnight. ASQA is intensifying scrutiny of RTO ownership structures and governance disclosures, and has issued AI-use principles for the early childhood educator training market, both creating near-term demand for governance, assurance, and responsible-AI advisory work. DEWR's release of the 2025 RTO Standards and the External Systems Assurance Framework (ESAF), alongside resumed Targeted Compliance Framework elements, signals a systems-integrity and third-party-risk cycle opening across Commonwealth employment-linked training programs. ATEC's Statement of Strategic Priorities consultation and its new Disability Inclusion Advisory Committee indicate a regulator still building institutional capability and receptive to advisory input on inclusion strategy and operational design. The TEQSA threshold-standard amendments and fee consultation add a separate higher-education compliance-change vector that will pressure providers to seek external readiness support.</w:t>
+        <w:t>No sector-level synthesis available this fortnight.</w:t>
       </w:r>
     </w:p>
     <w:p>
@@ -2117,249 +1388,11 @@
       <w:r>
         <w:rPr>
           <w:rFonts w:ascii="Arial" w:hAnsi="Arial"/>
-          <w:b/>
-          <w:color w:val="000000"/>
+          <w:i/>
+          <w:color w:val="666666"/>
           <w:sz w:val="19"/>
         </w:rPr>
-        <w:t>Commonwealth</w:t>
-      </w:r>
-    </w:p>
-    <w:p>
-      <w:pPr>
-        <w:pStyle w:val="body_letter"/>
-      </w:pPr>
-      <w:r>
-        <w:rPr>
-          <w:rFonts w:ascii="Arial" w:hAnsi="Arial"/>
-          <w:b w:val="0"/>
-          <w:color w:val="000000"/>
-          <w:sz w:val="19"/>
-        </w:rPr>
-        <w:t>ASIC is under financial strain after litigation costs pushed it $90m into deficit, yet is publicly doubling down on enforcement effectiveness, signalling continued aggressive posture that heightens compliance risk for regulated entities. APRA is intensifying oversight of investment activities, indicating a regulatory priority shift that will increase scrutiny on superannuation and financial services firms. The Department of Home Affairs has opened consultation on enhancements to the Critical Infrastructure Risk Management Program (CIRMP) Rules, creating a near-term advisory opportunity for entities across all 11 critical infrastructure sectors. Separately, national resources sector regulators have formalised cross-jurisdictional collaboration, and the ATO's credit card payment ban has been deferred following Treasurer intervention, a rare executive override of a regulator that may attract follow-on scrutiny of ATO rulemaking processes.</w:t>
-      </w:r>
-    </w:p>
-    <w:p>
-      <w:pPr>
-        <w:pStyle w:val="body_letter"/>
-      </w:pPr>
-      <w:r>
-        <w:rPr>
-          <w:rFonts w:ascii="Arial" w:hAnsi="Arial"/>
-          <w:b/>
-          <w:color w:val="000000"/>
-          <w:sz w:val="19"/>
-        </w:rPr>
-        <w:t>New South Wales</w:t>
-      </w:r>
-    </w:p>
-    <w:p>
-      <w:pPr>
-        <w:pStyle w:val="body_letter"/>
-      </w:pPr>
-      <w:r>
-        <w:rPr>
-          <w:rFonts w:ascii="Arial" w:hAnsi="Arial"/>
-          <w:b w:val="0"/>
-          <w:color w:val="000000"/>
-          <w:sz w:val="19"/>
-        </w:rPr>
-        <w:t>The Minns Labor Government has introduced landmark Local Jobs First procurement reforms, creating new compliance obligations for businesses tendering on NSW government contracts and an immediate advisory opportunity around tender strategy and compliance frameworks. SafeWork NSW is running concurrent enforcement actions, a formal psychosocial risk inquiry into Cheil Australia and a targeted abattoir compliance operation for Safe Work Month, signalling an expanding enforcement posture beyond physical safety into psychosocial and sector-specific risks. The NSW Government has suspended Clarence Valley Council and appointed an interim administrator, while new veterinary services legislation and Central West wildlife protection reforms add sector-specific compliance obligations. A cybersecurity breach of an NSW government website by an OpenAI agent, unreported by OpenAI for months, raises emerging obligations around vendor notification duties and AI-related cyber risk for agencies and their suppliers.</w:t>
-      </w:r>
-    </w:p>
-    <w:p>
-      <w:pPr>
-        <w:pStyle w:val="body_letter"/>
-      </w:pPr>
-      <w:r>
-        <w:rPr>
-          <w:rFonts w:ascii="Arial" w:hAnsi="Arial"/>
-          <w:b/>
-          <w:color w:val="000000"/>
-          <w:sz w:val="19"/>
-        </w:rPr>
-        <w:t>Victoria</w:t>
-      </w:r>
-    </w:p>
-    <w:p>
-      <w:pPr>
-        <w:pStyle w:val="body_letter"/>
-      </w:pPr>
-      <w:r>
-        <w:rPr>
-          <w:rFonts w:ascii="Arial" w:hAnsi="Arial"/>
-          <w:b w:val="0"/>
-          <w:color w:val="000000"/>
-          <w:sz w:val="19"/>
-        </w:rPr>
-        <w:t>Victoria's integrity framework expanded materially via fast-tracked legislation widening IBAC's mandate and granting enhanced 'follow-the-money' powers, signalling heightened public sector accountability obligations and immediate advisory opportunities for governance and compliance clients. The Victorian Auditor-General issued concurrent adverse findings across government advertising (political neutrality breaches), fire authority fleet management failures, and an evidentially unsupported youth justice program, indicating systemic record-keeping and performance-reporting deficiencies across agencies. A former public servant faces misconduct in public office and fraud conspiracy charges while the Victorian Institute of Teaching conducted enforcement raids on two school campuses, reinforcing the state's active enforcement posture. Organisations with child-related activities must act on new Working with Children Check legislative reforms, and a VCAT ruling confirming double stamp duty on late nominee transactions carries material implications for property transaction structuring advice.</w:t>
-      </w:r>
-    </w:p>
-    <w:p>
-      <w:pPr>
-        <w:pStyle w:val="body_letter"/>
-      </w:pPr>
-      <w:r>
-        <w:rPr>
-          <w:rFonts w:ascii="Arial" w:hAnsi="Arial"/>
-          <w:b/>
-          <w:color w:val="000000"/>
-          <w:sz w:val="19"/>
-        </w:rPr>
-        <w:t>Queensland</w:t>
-      </w:r>
-    </w:p>
-    <w:p>
-      <w:pPr>
-        <w:pStyle w:val="body_letter"/>
-      </w:pPr>
-      <w:r>
-        <w:rPr>
-          <w:rFonts w:ascii="Arial" w:hAnsi="Arial"/>
-          <w:b w:val="0"/>
-          <w:color w:val="000000"/>
-          <w:sz w:val="19"/>
-        </w:rPr>
-        <w:t>Queensland's regulatory focus is centred on The Star casino, with the government again deferring Gold Coast licence suspension as AUSTRAC proceedings loom and governance concerns persist, generating significant advisory demand around gaming remediation and licence conditions. The QBCC has released its 2026-2030 enforcement strategy, consolidating to eight priority harms from fifteen, signalling a more targeted regulatory posture across the construction sector. Mining law reforms are progressing through Parliament, refining third-party objection rights and removing approval duplication, a material change for resources clients. Law firms are also on notice under AML/CTF expansion, with the QLS emphasising that documented compliance proof, not just intent, will determine regulatory exposure.</w:t>
-      </w:r>
-    </w:p>
-    <w:p>
-      <w:pPr>
-        <w:pStyle w:val="body_letter"/>
-      </w:pPr>
-      <w:r>
-        <w:rPr>
-          <w:rFonts w:ascii="Arial" w:hAnsi="Arial"/>
-          <w:b/>
-          <w:color w:val="000000"/>
-          <w:sz w:val="19"/>
-        </w:rPr>
-        <w:t>Western Australia</w:t>
-      </w:r>
-    </w:p>
-    <w:p>
-      <w:pPr>
-        <w:pStyle w:val="body_letter"/>
-      </w:pPr>
-      <w:r>
-        <w:rPr>
-          <w:rFonts w:ascii="Arial" w:hAnsi="Arial"/>
-          <w:b w:val="0"/>
-          <w:color w:val="000000"/>
-          <w:sz w:val="19"/>
-        </w:rPr>
-        <w:t>Western Australia's Department of Water and Environmental Regulation (DWER) is defending newly expanded fining powers against Pastoralists and Graziers Association (PGA) concerns, signalling a more assertive enforcement posture for environmental compliance in the resources and agriculture sectors. The WA Government has released the Alternative Electricity Services (AES) framework, establishing a new regulatory structure for electricity service providers outside the mainstream grid, creating immediate compliance obligations for affected operators. Premier Roger Cook has announced long-awaited Equal Opportunity Act reforms, adding employment and service-delivery compliance obligations for WA businesses. Concurrently, Buru Energy's referral of the Rafael Conventional Gas Project to the EPA Western Australia opens another regulatory assessment track in the resources sector, consistent with heightened environmental scrutiny across the state.</w:t>
-      </w:r>
-    </w:p>
-    <w:p>
-      <w:pPr>
-        <w:pStyle w:val="body_letter"/>
-      </w:pPr>
-      <w:r>
-        <w:rPr>
-          <w:rFonts w:ascii="Arial" w:hAnsi="Arial"/>
-          <w:b/>
-          <w:color w:val="000000"/>
-          <w:sz w:val="19"/>
-        </w:rPr>
-        <w:t>South Australia</w:t>
-      </w:r>
-    </w:p>
-    <w:p>
-      <w:pPr>
-        <w:pStyle w:val="body_letter"/>
-      </w:pPr>
-      <w:r>
-        <w:rPr>
-          <w:rFonts w:ascii="Arial" w:hAnsi="Arial"/>
-          <w:b w:val="0"/>
-          <w:color w:val="000000"/>
-          <w:sz w:val="19"/>
-        </w:rPr>
-        <w:t>SafeWork SA is exhibiting an active enforcement posture this period, with charges laid across asbestos exposure, construction site injury, and amusement hire operations, signalling prosecution willingness that SA employers should factor into compliance planning. Two incoming regulatory changes create material advisory demand: new Workplace Exposure Limits are approaching implementation, and SafeWork SA is flagging new psychosocial regulations targeting workplace stress and bullying that will expand employer obligations. Phosphine regulation changes have been deferred following industry consultation, demonstrating that SA's regulatory process remains responsive to stakeholder submissions. A parallel SA justice reform streamlining medical examinations for sexual assault survivors reflects a broader state legislative reform agenda beyond WHS.</w:t>
-      </w:r>
-    </w:p>
-    <w:p>
-      <w:pPr>
-        <w:pStyle w:val="body_letter"/>
-      </w:pPr>
-      <w:r>
-        <w:rPr>
-          <w:rFonts w:ascii="Arial" w:hAnsi="Arial"/>
-          <w:b/>
-          <w:color w:val="000000"/>
-          <w:sz w:val="19"/>
-        </w:rPr>
-        <w:t>Tasmania</w:t>
-      </w:r>
-    </w:p>
-    <w:p>
-      <w:pPr>
-        <w:pStyle w:val="body_letter"/>
-      </w:pPr>
-      <w:r>
-        <w:rPr>
-          <w:rFonts w:ascii="Arial" w:hAnsi="Arial"/>
-          <w:b w:val="0"/>
-          <w:color w:val="000000"/>
-          <w:sz w:val="19"/>
-        </w:rPr>
-        <w:t>Tasmania's Legislative Council has launched a formal inquiry into the state's abandoned cashless pokies card scheme against a backdrop of $18.1M in monthly gaming losses, creating a significant advisory opportunity around gambling harm-reduction regulation. Commission of Inquiry reform legislation has been introduced to parliament, with the Implementation Monitor welcoming the changes. Firearms reform is stalled after the government shelved proposed law changes amid pushback over the absence of licence caps, while a firearms noise suppressors discussion paper signals further regulatory consultation ahead. The attorney-general has demanded an explanation from the parole board after it relied on AI-hallucinated case law to restrict a parolee, raising state-level governance and AI-use compliance questions across public-sector decision-making bodies.</w:t>
-      </w:r>
-    </w:p>
-    <w:p>
-      <w:pPr>
-        <w:pStyle w:val="body_letter"/>
-      </w:pPr>
-      <w:r>
-        <w:rPr>
-          <w:rFonts w:ascii="Arial" w:hAnsi="Arial"/>
-          <w:b/>
-          <w:color w:val="000000"/>
-          <w:sz w:val="19"/>
-        </w:rPr>
-        <w:t>Australian Capital Territory</w:t>
-      </w:r>
-    </w:p>
-    <w:p>
-      <w:pPr>
-        <w:pStyle w:val="body_letter"/>
-      </w:pPr>
-      <w:r>
-        <w:rPr>
-          <w:rFonts w:ascii="Arial" w:hAnsi="Arial"/>
-          <w:b w:val="0"/>
-          <w:color w:val="000000"/>
-          <w:sz w:val="19"/>
-        </w:rPr>
-        <w:t>The ACT Government has introduced legislation to enact significant gambling reforms, including mandatory cashless gaming and a reduction in electronic gaming machine numbers across the territory, marking a substantive shift in gaming regulation with compliance implications for venues and operators. Access Canberra's head has publicly acknowledged the agency could be more transparent in lease decision-making, signalling likely procedural reforms to land administration processes and potential compliance exposure for existing lessees. The ongoing Big Splash development saga continues to expose gaps in ACT regulatory oversight and accountability frameworks. Together these developments create advisory opportunities across gaming compliance uplift, land-use regulatory risk, and administrative law.</w:t>
-      </w:r>
-    </w:p>
-    <w:p>
-      <w:pPr>
-        <w:pStyle w:val="body_letter"/>
-      </w:pPr>
-      <w:r>
-        <w:rPr>
-          <w:rFonts w:ascii="Arial" w:hAnsi="Arial"/>
-          <w:b/>
-          <w:color w:val="000000"/>
-          <w:sz w:val="19"/>
-        </w:rPr>
-        <w:t>Northern Territory</w:t>
-      </w:r>
-    </w:p>
-    <w:p>
-      <w:pPr>
-        <w:pStyle w:val="body_letter"/>
-      </w:pPr>
-      <w:r>
-        <w:rPr>
-          <w:rFonts w:ascii="Arial" w:hAnsi="Arial"/>
-          <w:b w:val="0"/>
-          <w:color w:val="000000"/>
-          <w:sz w:val="19"/>
-        </w:rPr>
-        <w:t>The NT regulatory landscape is active across three fronts. The NT environmental regulator has halted assessment of Project Ares, a large AI data centre proposed for a remote cattle station, citing low confidence in the proponent's environmental plan and seeking further detail, this coincides with Labor backing a hyper-scale data centre moratorium and an opposition call for the same, signalling a likely regulatory tightening for large-scale data infrastructure approvals in the Territory. A NT bill proposing deposit caps and an inducement ban on bookmakers is advancing through parliament, with cross-party MP pressure for stronger penalties, placing interactive wagering operators licensed through the NT Racing Commission on notice for material compliance changes. Separately, the NT government is overhauling teacher registration boards amid a contested restructure opposed by unions, and has released proposed new residential tenancy laws for public consultation, both creating near-term advisory opportunities in workforce regulation and property law reform.</w:t>
+        <w:t>No jurisdiction-level synthesis available this fortnight.</w:t>
       </w:r>
     </w:p>
     <w:tbl>
@@ -2405,7 +1438,7 @@
                           <pic:cNvPicPr/>
                         </pic:nvPicPr>
                         <pic:blipFill>
-                          <a:blip r:embed="rId29"/>
+                          <a:blip r:embed="rId27"/>
                           <a:stretch>
                             <a:fillRect/>
                           </a:stretch>

</xml_diff>

<commit_message>
chore: update regulation hub 2026-10-26
</commit_message>
<xml_diff>
--- a/reg-hub/regulation_fortnightly_brief.docx
+++ b/reg-hub/regulation_fortnightly_brief.docx
@@ -46,7 +46,7 @@
         <w:pStyle w:val="Heading1"/>
       </w:pPr>
       <w:r>
-        <w:t>KPMG Regulatory Transformation Fortnightly Brief - 9-22 October 2026</w:t>
+        <w:t>KPMG Regulatory Transformation Fortnightly Brief - 13-26 October 2026</w:t>
       </w:r>
     </w:p>
     <w:p>
@@ -73,7 +73,7 @@
           <w:color w:val="666666"/>
           <w:sz w:val="19"/>
         </w:rPr>
-        <w:t>22 October 2026</w:t>
+        <w:t>26 October 2026</w:t>
       </w:r>
     </w:p>
     <w:p>
@@ -97,11 +97,11 @@
       <w:r>
         <w:rPr>
           <w:rFonts w:ascii="Arial" w:hAnsi="Arial"/>
-          <w:i/>
-          <w:color w:val="666666"/>
+          <w:b w:val="0"/>
+          <w:color w:val="000000"/>
           <w:sz w:val="19"/>
         </w:rPr>
-        <w:t>[edit before send], Adam's 3-sentence key messages will prefill from the dashboard synthesis on the next fortnightly run. Type your replacement here.</w:t>
+        <w:t>This fortnight, regulatory activity across Australia clusters around environmental enforcement and resource sector approvals, with EPA Victoria running compliance blitzes on skip bins and data centre pollution, South Australian EPA banning unsafe groundwater use, and federal and state agencies advancing critical minerals and energy storage approvals in WA and the NT. The most significant advisory opportunity lies in the accelerating intersection of environmental compliance intensity and resource sector growth, where our clients face simultaneous pressure from tightening EPA enforcement and complex multi-jurisdictional approvals, a gap our integrated Regulatory Transformation capability is well placed to bridge. Convene a cross-sector partner roundtable before 10 November to align our environment, energy and resources advisory leads on a unified client outreach targeting the critical minerals and environmental compliance pipeline.</w:t>
       </w:r>
     </w:p>
     <w:p>
@@ -120,16 +120,642 @@
     </w:p>
     <w:p>
       <w:pPr>
-        <w:pStyle w:val="body_letter"/>
+        <w:pStyle w:val="ListBullet"/>
       </w:pPr>
       <w:r>
         <w:rPr>
           <w:rFonts w:ascii="Arial" w:hAnsi="Arial"/>
-          <w:i/>
-          <w:color w:val="666666"/>
+          <w:b/>
+          <w:color w:val="000000"/>
           <w:sz w:val="19"/>
         </w:rPr>
-        <w:t>No regulator-in-news signal this fortnight, see Themes below.</w:t>
+        <w:t>Australian Competition and Consumer Commission</w:t>
+      </w:r>
+      <w:r>
+        <w:rPr>
+          <w:rFonts w:ascii="Arial" w:hAnsi="Arial"/>
+          <w:color w:val="000000"/>
+          <w:sz w:val="19"/>
+        </w:rPr>
+        <w:t xml:space="preserve"> - </w:t>
+      </w:r>
+      <w:r>
+        <w:rPr>
+          <w:rFonts w:ascii="Arial" w:hAnsi="Arial"/>
+          <w:color w:val="000000"/>
+          <w:sz w:val="19"/>
+        </w:rPr>
+        <w:t>ACCC secured an admission from Perfection Fresh that it fixed the price of vegetables supplied to ALDI, marking a cartel enforcement outcome in the fresh produce sector.</w:t>
+      </w:r>
+    </w:p>
+    <w:p>
+      <w:pPr>
+        <w:pStyle w:val="ListBullet"/>
+      </w:pPr>
+      <w:r>
+        <w:rPr>
+          <w:rFonts w:ascii="Arial" w:hAnsi="Arial"/>
+          <w:b/>
+          <w:color w:val="000000"/>
+          <w:sz w:val="19"/>
+        </w:rPr>
+        <w:t>Office of the Australian Information Commissioner</w:t>
+      </w:r>
+      <w:r>
+        <w:rPr>
+          <w:rFonts w:ascii="Arial" w:hAnsi="Arial"/>
+          <w:color w:val="000000"/>
+          <w:sz w:val="19"/>
+        </w:rPr>
+        <w:t xml:space="preserve"> - </w:t>
+      </w:r>
+      <w:r>
+        <w:rPr>
+          <w:rFonts w:ascii="Arial" w:hAnsi="Arial"/>
+          <w:color w:val="000000"/>
+          <w:sz w:val="19"/>
+        </w:rPr>
+        <w:t>OAIC published statistics showing a material increase in large-scale data breaches notified under the Notifiable Data Breaches scheme, signalling heightened regulatory scrutiny for data custodians.</w:t>
+      </w:r>
+      <w:r>
+        <w:rPr>
+          <w:rFonts w:ascii="Arial" w:hAnsi="Arial"/>
+          <w:color w:val="000000"/>
+          <w:sz w:val="19"/>
+        </w:rPr>
+        <w:t xml:space="preserve"> (</w:t>
+      </w:r>
+      <w:hyperlink r:id="rId10">
+        <w:r>
+          <w:rPr>
+            <w:rFonts w:ascii="Arial" w:hAnsi="Arial" w:cs="Arial"/>
+            <w:color w:val="0000FF"/>
+            <w:sz w:val="19"/>
+            <w:szCs w:val="19"/>
+            <w:u w:val="single"/>
+          </w:rPr>
+          <w:t xml:space="preserve">Read more</w:t>
+        </w:r>
+      </w:hyperlink>
+      <w:r>
+        <w:rPr>
+          <w:rFonts w:ascii="Arial" w:hAnsi="Arial"/>
+          <w:color w:val="000000"/>
+          <w:sz w:val="19"/>
+        </w:rPr>
+        <w:t>)</w:t>
+      </w:r>
+    </w:p>
+    <w:p>
+      <w:pPr>
+        <w:pStyle w:val="ListBullet"/>
+      </w:pPr>
+      <w:r>
+        <w:rPr>
+          <w:rFonts w:ascii="Arial" w:hAnsi="Arial"/>
+          <w:b/>
+          <w:color w:val="000000"/>
+          <w:sz w:val="19"/>
+        </w:rPr>
+        <w:t>Commonwealth Ombudsman</w:t>
+      </w:r>
+      <w:r>
+        <w:rPr>
+          <w:rFonts w:ascii="Arial" w:hAnsi="Arial"/>
+          <w:color w:val="000000"/>
+          <w:sz w:val="19"/>
+        </w:rPr>
+        <w:t xml:space="preserve"> - </w:t>
+      </w:r>
+      <w:r>
+        <w:rPr>
+          <w:rFonts w:ascii="Arial" w:hAnsi="Arial"/>
+          <w:color w:val="000000"/>
+          <w:sz w:val="19"/>
+        </w:rPr>
+        <w:t>The Commonwealth Ombudsman issued a damning investigation finding that the government's algorithm-based aged care assessment tool is unreasonable and unfair, creating compliance and reputational…</w:t>
+      </w:r>
+      <w:r>
+        <w:rPr>
+          <w:rFonts w:ascii="Arial" w:hAnsi="Arial"/>
+          <w:color w:val="000000"/>
+          <w:sz w:val="19"/>
+        </w:rPr>
+        <w:t xml:space="preserve"> (</w:t>
+      </w:r>
+      <w:hyperlink r:id="rId11">
+        <w:r>
+          <w:rPr>
+            <w:rFonts w:ascii="Arial" w:hAnsi="Arial" w:cs="Arial"/>
+            <w:color w:val="0000FF"/>
+            <w:sz w:val="19"/>
+            <w:szCs w:val="19"/>
+            <w:u w:val="single"/>
+          </w:rPr>
+          <w:t xml:space="preserve">Read more</w:t>
+        </w:r>
+      </w:hyperlink>
+      <w:r>
+        <w:rPr>
+          <w:rFonts w:ascii="Arial" w:hAnsi="Arial"/>
+          <w:color w:val="000000"/>
+          <w:sz w:val="19"/>
+        </w:rPr>
+        <w:t>)</w:t>
+      </w:r>
+    </w:p>
+    <w:p>
+      <w:pPr>
+        <w:pStyle w:val="ListBullet"/>
+      </w:pPr>
+      <w:r>
+        <w:rPr>
+          <w:rFonts w:ascii="Arial" w:hAnsi="Arial"/>
+          <w:b/>
+          <w:color w:val="000000"/>
+          <w:sz w:val="19"/>
+        </w:rPr>
+        <w:t>Department of Health, Disability and Ageing</w:t>
+      </w:r>
+      <w:r>
+        <w:rPr>
+          <w:rFonts w:ascii="Arial" w:hAnsi="Arial"/>
+          <w:color w:val="000000"/>
+          <w:sz w:val="19"/>
+        </w:rPr>
+        <w:t xml:space="preserve"> - </w:t>
+      </w:r>
+      <w:r>
+        <w:rPr>
+          <w:rFonts w:ascii="Arial" w:hAnsi="Arial"/>
+          <w:color w:val="000000"/>
+          <w:sz w:val="19"/>
+        </w:rPr>
+        <w:t>The Department of Health, Disability and Ageing announced strengthened registration requirements for NDIS providers, lifting the compliance burden on disability services organisations.</w:t>
+      </w:r>
+      <w:r>
+        <w:rPr>
+          <w:rFonts w:ascii="Arial" w:hAnsi="Arial"/>
+          <w:color w:val="000000"/>
+          <w:sz w:val="19"/>
+        </w:rPr>
+        <w:t xml:space="preserve"> (</w:t>
+      </w:r>
+      <w:hyperlink r:id="rId12">
+        <w:r>
+          <w:rPr>
+            <w:rFonts w:ascii="Arial" w:hAnsi="Arial" w:cs="Arial"/>
+            <w:color w:val="0000FF"/>
+            <w:sz w:val="19"/>
+            <w:szCs w:val="19"/>
+            <w:u w:val="single"/>
+          </w:rPr>
+          <w:t xml:space="preserve">Read more</w:t>
+        </w:r>
+      </w:hyperlink>
+      <w:r>
+        <w:rPr>
+          <w:rFonts w:ascii="Arial" w:hAnsi="Arial"/>
+          <w:color w:val="000000"/>
+          <w:sz w:val="19"/>
+        </w:rPr>
+        <w:t>)</w:t>
+      </w:r>
+    </w:p>
+    <w:p>
+      <w:pPr>
+        <w:pStyle w:val="ListBullet"/>
+      </w:pPr>
+      <w:r>
+        <w:rPr>
+          <w:rFonts w:ascii="Arial" w:hAnsi="Arial"/>
+          <w:b/>
+          <w:color w:val="000000"/>
+          <w:sz w:val="19"/>
+        </w:rPr>
+        <w:t>Australian Charities and Not-for-profits Commission</w:t>
+      </w:r>
+      <w:r>
+        <w:rPr>
+          <w:rFonts w:ascii="Arial" w:hAnsi="Arial"/>
+          <w:color w:val="000000"/>
+          <w:sz w:val="19"/>
+        </w:rPr>
+        <w:t xml:space="preserve"> - </w:t>
+      </w:r>
+      <w:r>
+        <w:rPr>
+          <w:rFonts w:ascii="Arial" w:hAnsi="Arial"/>
+          <w:color w:val="000000"/>
+          <w:sz w:val="19"/>
+        </w:rPr>
+        <w:t>ACNC tabled its 2025-26 Annual Report in Parliament, documenting significant growth in the registered charity sector and the commission's expanded oversight activity.</w:t>
+      </w:r>
+    </w:p>
+    <w:p>
+      <w:pPr>
+        <w:pStyle w:val="ListBullet"/>
+      </w:pPr>
+      <w:r>
+        <w:rPr>
+          <w:rFonts w:ascii="Arial" w:hAnsi="Arial"/>
+          <w:b/>
+          <w:color w:val="000000"/>
+          <w:sz w:val="19"/>
+        </w:rPr>
+        <w:t>Australian Prudential Regulation Authority</w:t>
+      </w:r>
+      <w:r>
+        <w:rPr>
+          <w:rFonts w:ascii="Arial" w:hAnsi="Arial"/>
+          <w:color w:val="000000"/>
+          <w:sz w:val="19"/>
+        </w:rPr>
+        <w:t xml:space="preserve"> - </w:t>
+      </w:r>
+      <w:r>
+        <w:rPr>
+          <w:rFonts w:ascii="Arial" w:hAnsi="Arial"/>
+          <w:color w:val="000000"/>
+          <w:sz w:val="19"/>
+        </w:rPr>
+        <w:t>APRA's new deputy chair publicly identified the key systemic risks at the forefront of the regulator's supervisory agenda, signalling near-term areas of heightened prudential focus for regulated…</w:t>
+      </w:r>
+      <w:r>
+        <w:rPr>
+          <w:rFonts w:ascii="Arial" w:hAnsi="Arial"/>
+          <w:color w:val="000000"/>
+          <w:sz w:val="19"/>
+        </w:rPr>
+        <w:t xml:space="preserve"> (</w:t>
+      </w:r>
+      <w:hyperlink r:id="rId13">
+        <w:r>
+          <w:rPr>
+            <w:rFonts w:ascii="Arial" w:hAnsi="Arial" w:cs="Arial"/>
+            <w:color w:val="0000FF"/>
+            <w:sz w:val="19"/>
+            <w:szCs w:val="19"/>
+            <w:u w:val="single"/>
+          </w:rPr>
+          <w:t xml:space="preserve">Read more</w:t>
+        </w:r>
+      </w:hyperlink>
+      <w:r>
+        <w:rPr>
+          <w:rFonts w:ascii="Arial" w:hAnsi="Arial"/>
+          <w:color w:val="000000"/>
+          <w:sz w:val="19"/>
+        </w:rPr>
+        <w:t>)</w:t>
+      </w:r>
+    </w:p>
+    <w:p>
+      <w:pPr>
+        <w:pStyle w:val="ListBullet"/>
+      </w:pPr>
+      <w:r>
+        <w:rPr>
+          <w:rFonts w:ascii="Arial" w:hAnsi="Arial"/>
+          <w:b/>
+          <w:color w:val="000000"/>
+          <w:sz w:val="19"/>
+        </w:rPr>
+        <w:t>Office of the Australian Information Commissioner</w:t>
+      </w:r>
+      <w:r>
+        <w:rPr>
+          <w:rFonts w:ascii="Arial" w:hAnsi="Arial"/>
+          <w:color w:val="000000"/>
+          <w:sz w:val="19"/>
+        </w:rPr>
+        <w:t xml:space="preserve"> - </w:t>
+      </w:r>
+      <w:r>
+        <w:rPr>
+          <w:rFonts w:ascii="Arial" w:hAnsi="Arial"/>
+          <w:color w:val="000000"/>
+          <w:sz w:val="19"/>
+        </w:rPr>
+        <w:t>OAIC released its annual report showing Australians are increasingly exercising privacy and freedom of information rights, with rising complaint and enquiry volumes pointing to a more assertive…</w:t>
+      </w:r>
+      <w:r>
+        <w:rPr>
+          <w:rFonts w:ascii="Arial" w:hAnsi="Arial"/>
+          <w:color w:val="000000"/>
+          <w:sz w:val="19"/>
+        </w:rPr>
+        <w:t xml:space="preserve"> (</w:t>
+      </w:r>
+      <w:hyperlink r:id="rId14">
+        <w:r>
+          <w:rPr>
+            <w:rFonts w:ascii="Arial" w:hAnsi="Arial" w:cs="Arial"/>
+            <w:color w:val="0000FF"/>
+            <w:sz w:val="19"/>
+            <w:szCs w:val="19"/>
+            <w:u w:val="single"/>
+          </w:rPr>
+          <w:t xml:space="preserve">Read more</w:t>
+        </w:r>
+      </w:hyperlink>
+      <w:r>
+        <w:rPr>
+          <w:rFonts w:ascii="Arial" w:hAnsi="Arial"/>
+          <w:color w:val="000000"/>
+          <w:sz w:val="19"/>
+        </w:rPr>
+        <w:t>)</w:t>
+      </w:r>
+    </w:p>
+    <w:p>
+      <w:pPr>
+        <w:pStyle w:val="ListBullet"/>
+      </w:pPr>
+      <w:r>
+        <w:rPr>
+          <w:rFonts w:ascii="Arial" w:hAnsi="Arial"/>
+          <w:b/>
+          <w:color w:val="000000"/>
+          <w:sz w:val="19"/>
+        </w:rPr>
+        <w:t>Environment Protection Authority Victoria</w:t>
+      </w:r>
+      <w:r>
+        <w:rPr>
+          <w:rFonts w:ascii="Arial" w:hAnsi="Arial"/>
+          <w:color w:val="000000"/>
+          <w:sz w:val="19"/>
+        </w:rPr>
+        <w:t xml:space="preserve"> - </w:t>
+      </w:r>
+      <w:r>
+        <w:rPr>
+          <w:rFonts w:ascii="Arial" w:hAnsi="Arial"/>
+          <w:color w:val="000000"/>
+          <w:sz w:val="19"/>
+        </w:rPr>
+        <w:t>EPA Victoria published guidance on data centre pollution, flagging noise, heat, and emissions as compliance concerns for operators as the sector expands rapidly.</w:t>
+      </w:r>
+      <w:r>
+        <w:rPr>
+          <w:rFonts w:ascii="Arial" w:hAnsi="Arial"/>
+          <w:color w:val="000000"/>
+          <w:sz w:val="19"/>
+        </w:rPr>
+        <w:t xml:space="preserve"> (</w:t>
+      </w:r>
+      <w:hyperlink r:id="rId15">
+        <w:r>
+          <w:rPr>
+            <w:rFonts w:ascii="Arial" w:hAnsi="Arial" w:cs="Arial"/>
+            <w:color w:val="0000FF"/>
+            <w:sz w:val="19"/>
+            <w:szCs w:val="19"/>
+            <w:u w:val="single"/>
+          </w:rPr>
+          <w:t xml:space="preserve">Read more</w:t>
+        </w:r>
+      </w:hyperlink>
+      <w:r>
+        <w:rPr>
+          <w:rFonts w:ascii="Arial" w:hAnsi="Arial"/>
+          <w:color w:val="000000"/>
+          <w:sz w:val="19"/>
+        </w:rPr>
+        <w:t>)</w:t>
+      </w:r>
+    </w:p>
+    <w:p>
+      <w:pPr>
+        <w:pStyle w:val="ListBullet"/>
+      </w:pPr>
+      <w:r>
+        <w:rPr>
+          <w:rFonts w:ascii="Arial" w:hAnsi="Arial"/>
+          <w:b/>
+          <w:color w:val="000000"/>
+          <w:sz w:val="19"/>
+        </w:rPr>
+        <w:t>Australian Criminal Intelligence Commission</w:t>
+      </w:r>
+      <w:r>
+        <w:rPr>
+          <w:rFonts w:ascii="Arial" w:hAnsi="Arial"/>
+          <w:color w:val="000000"/>
+          <w:sz w:val="19"/>
+        </w:rPr>
+        <w:t xml:space="preserve"> - </w:t>
+      </w:r>
+      <w:r>
+        <w:rPr>
+          <w:rFonts w:ascii="Arial" w:hAnsi="Arial"/>
+          <w:color w:val="000000"/>
+          <w:sz w:val="19"/>
+        </w:rPr>
+        <w:t>The Law Council of Australia aligned with a parliamentary committee recommendation to curtail ACIC's coercive examination powers, intensifying pressure for legislative reform of the commission's…</w:t>
+      </w:r>
+      <w:r>
+        <w:rPr>
+          <w:rFonts w:ascii="Arial" w:hAnsi="Arial"/>
+          <w:color w:val="000000"/>
+          <w:sz w:val="19"/>
+        </w:rPr>
+        <w:t xml:space="preserve"> (</w:t>
+      </w:r>
+      <w:hyperlink r:id="rId16">
+        <w:r>
+          <w:rPr>
+            <w:rFonts w:ascii="Arial" w:hAnsi="Arial" w:cs="Arial"/>
+            <w:color w:val="0000FF"/>
+            <w:sz w:val="19"/>
+            <w:szCs w:val="19"/>
+            <w:u w:val="single"/>
+          </w:rPr>
+          <w:t xml:space="preserve">Read more</w:t>
+        </w:r>
+      </w:hyperlink>
+      <w:r>
+        <w:rPr>
+          <w:rFonts w:ascii="Arial" w:hAnsi="Arial"/>
+          <w:color w:val="000000"/>
+          <w:sz w:val="19"/>
+        </w:rPr>
+        <w:t>)</w:t>
+      </w:r>
+    </w:p>
+    <w:p>
+      <w:pPr>
+        <w:pStyle w:val="ListBullet"/>
+      </w:pPr>
+      <w:r>
+        <w:rPr>
+          <w:rFonts w:ascii="Arial" w:hAnsi="Arial"/>
+          <w:b/>
+          <w:color w:val="000000"/>
+          <w:sz w:val="19"/>
+        </w:rPr>
+        <w:t>Fair Work Ombudsman</w:t>
+      </w:r>
+      <w:r>
+        <w:rPr>
+          <w:rFonts w:ascii="Arial" w:hAnsi="Arial"/>
+          <w:color w:val="000000"/>
+          <w:sz w:val="19"/>
+        </w:rPr>
+        <w:t xml:space="preserve"> - </w:t>
+      </w:r>
+      <w:r>
+        <w:rPr>
+          <w:rFonts w:ascii="Arial" w:hAnsi="Arial"/>
+          <w:color w:val="000000"/>
+          <w:sz w:val="19"/>
+        </w:rPr>
+        <w:t>The Fair Work Ombudsman published updated guidance on new working-from-home provisions in the Clerks Award, requiring employers to review and formalise hybrid work arrangements for award-covered…</w:t>
+      </w:r>
+      <w:r>
+        <w:rPr>
+          <w:rFonts w:ascii="Arial" w:hAnsi="Arial"/>
+          <w:color w:val="000000"/>
+          <w:sz w:val="19"/>
+        </w:rPr>
+        <w:t xml:space="preserve"> (</w:t>
+      </w:r>
+      <w:hyperlink r:id="rId17">
+        <w:r>
+          <w:rPr>
+            <w:rFonts w:ascii="Arial" w:hAnsi="Arial" w:cs="Arial"/>
+            <w:color w:val="0000FF"/>
+            <w:sz w:val="19"/>
+            <w:szCs w:val="19"/>
+            <w:u w:val="single"/>
+          </w:rPr>
+          <w:t xml:space="preserve">Read more</w:t>
+        </w:r>
+      </w:hyperlink>
+      <w:r>
+        <w:rPr>
+          <w:rFonts w:ascii="Arial" w:hAnsi="Arial"/>
+          <w:color w:val="000000"/>
+          <w:sz w:val="19"/>
+        </w:rPr>
+        <w:t>)</w:t>
+      </w:r>
+    </w:p>
+    <w:p>
+      <w:pPr>
+        <w:pStyle w:val="ListBullet"/>
+      </w:pPr>
+      <w:r>
+        <w:rPr>
+          <w:rFonts w:ascii="Arial" w:hAnsi="Arial"/>
+          <w:b/>
+          <w:color w:val="000000"/>
+          <w:sz w:val="19"/>
+        </w:rPr>
+        <w:t>Consumer Affairs Victoria</w:t>
+      </w:r>
+      <w:r>
+        <w:rPr>
+          <w:rFonts w:ascii="Arial" w:hAnsi="Arial"/>
+          <w:color w:val="000000"/>
+          <w:sz w:val="19"/>
+        </w:rPr>
+        <w:t xml:space="preserve"> - </w:t>
+      </w:r>
+      <w:r>
+        <w:rPr>
+          <w:rFonts w:ascii="Arial" w:hAnsi="Arial"/>
+          <w:color w:val="000000"/>
+          <w:sz w:val="19"/>
+        </w:rPr>
+        <w:t>Consumer Affairs Victoria suspended a real estate agent's licence following six consecutive years of trust account audit failures, underscoring the regulator's appetite for licence action against…</w:t>
+      </w:r>
+      <w:r>
+        <w:rPr>
+          <w:rFonts w:ascii="Arial" w:hAnsi="Arial"/>
+          <w:color w:val="000000"/>
+          <w:sz w:val="19"/>
+        </w:rPr>
+        <w:t xml:space="preserve"> (</w:t>
+      </w:r>
+      <w:hyperlink r:id="rId18">
+        <w:r>
+          <w:rPr>
+            <w:rFonts w:ascii="Arial" w:hAnsi="Arial" w:cs="Arial"/>
+            <w:color w:val="0000FF"/>
+            <w:sz w:val="19"/>
+            <w:szCs w:val="19"/>
+            <w:u w:val="single"/>
+          </w:rPr>
+          <w:t xml:space="preserve">Read more</w:t>
+        </w:r>
+      </w:hyperlink>
+      <w:r>
+        <w:rPr>
+          <w:rFonts w:ascii="Arial" w:hAnsi="Arial"/>
+          <w:color w:val="000000"/>
+          <w:sz w:val="19"/>
+        </w:rPr>
+        <w:t>)</w:t>
+      </w:r>
+    </w:p>
+    <w:p>
+      <w:pPr>
+        <w:pStyle w:val="ListBullet"/>
+      </w:pPr>
+      <w:r>
+        <w:rPr>
+          <w:rFonts w:ascii="Arial" w:hAnsi="Arial"/>
+          <w:b/>
+          <w:color w:val="000000"/>
+          <w:sz w:val="19"/>
+        </w:rPr>
+        <w:t>Australian Communications and Media Authority</w:t>
+      </w:r>
+      <w:r>
+        <w:rPr>
+          <w:rFonts w:ascii="Arial" w:hAnsi="Arial"/>
+          <w:color w:val="000000"/>
+          <w:sz w:val="19"/>
+        </w:rPr>
+        <w:t xml:space="preserve"> - </w:t>
+      </w:r>
+      <w:r>
+        <w:rPr>
+          <w:rFonts w:ascii="Arial" w:hAnsi="Arial"/>
+          <w:color w:val="000000"/>
+          <w:sz w:val="19"/>
+        </w:rPr>
+        <w:t>ACMA and the eSafety Commissioner jointly tabled their 2025-26 Annual Report, outlining enforcement activity and strategic priorities across broadcasting, online safety, and communications regulation.</w:t>
+      </w:r>
+      <w:r>
+        <w:rPr>
+          <w:rFonts w:ascii="Arial" w:hAnsi="Arial"/>
+          <w:color w:val="000000"/>
+          <w:sz w:val="19"/>
+        </w:rPr>
+        <w:t xml:space="preserve"> (</w:t>
+      </w:r>
+      <w:hyperlink r:id="rId19">
+        <w:r>
+          <w:rPr>
+            <w:rFonts w:ascii="Arial" w:hAnsi="Arial" w:cs="Arial"/>
+            <w:color w:val="0000FF"/>
+            <w:sz w:val="19"/>
+            <w:szCs w:val="19"/>
+            <w:u w:val="single"/>
+          </w:rPr>
+          <w:t xml:space="preserve">Read more</w:t>
+        </w:r>
+      </w:hyperlink>
+      <w:r>
+        <w:rPr>
+          <w:rFonts w:ascii="Arial" w:hAnsi="Arial"/>
+          <w:color w:val="000000"/>
+          <w:sz w:val="19"/>
+        </w:rPr>
+        <w:t>)</w:t>
       </w:r>
     </w:p>
     <w:p>
@@ -153,11 +779,205 @@
       <w:r>
         <w:rPr>
           <w:rFonts w:ascii="Arial" w:hAnsi="Arial"/>
-          <w:i/>
-          <w:color w:val="666666"/>
+          <w:b/>
+          <w:color w:val="000000"/>
           <w:sz w:val="19"/>
         </w:rPr>
-        <w:t>No client-in-news signal this fortnight across any jurisdiction.</w:t>
+        <w:t>Victoria</w:t>
+      </w:r>
+    </w:p>
+    <w:p>
+      <w:pPr>
+        <w:pStyle w:val="ListBullet"/>
+      </w:pPr>
+      <w:r>
+        <w:rPr>
+          <w:rFonts w:ascii="Arial" w:hAnsi="Arial"/>
+          <w:b/>
+          <w:color w:val="000000"/>
+          <w:sz w:val="19"/>
+        </w:rPr>
+        <w:t>Victorian Auditor-General's Office</w:t>
+      </w:r>
+      <w:r>
+        <w:rPr>
+          <w:rFonts w:ascii="Arial" w:hAnsi="Arial"/>
+          <w:color w:val="000000"/>
+          <w:sz w:val="19"/>
+        </w:rPr>
+        <w:t xml:space="preserve"> - </w:t>
+      </w:r>
+      <w:r>
+        <w:rPr>
+          <w:rFonts w:ascii="Arial" w:hAnsi="Arial"/>
+          <w:color w:val="000000"/>
+          <w:sz w:val="19"/>
+        </w:rPr>
+        <w:t>VAGO finds not all government advertising apolitical</w:t>
+      </w:r>
+    </w:p>
+    <w:p>
+      <w:pPr>
+        <w:pStyle w:val="ListBullet"/>
+      </w:pPr>
+      <w:r>
+        <w:rPr>
+          <w:rFonts w:ascii="Arial" w:hAnsi="Arial"/>
+          <w:b/>
+          <w:color w:val="000000"/>
+          <w:sz w:val="19"/>
+        </w:rPr>
+        <w:t>Victorian WorkCover Authority (WorkSafe Victoria)</w:t>
+      </w:r>
+      <w:r>
+        <w:rPr>
+          <w:rFonts w:ascii="Arial" w:hAnsi="Arial"/>
+          <w:color w:val="000000"/>
+          <w:sz w:val="19"/>
+        </w:rPr>
+        <w:t xml:space="preserve"> - </w:t>
+      </w:r>
+      <w:r>
+        <w:rPr>
+          <w:rFonts w:ascii="Arial" w:hAnsi="Arial"/>
+          <w:color w:val="000000"/>
+          <w:sz w:val="19"/>
+        </w:rPr>
+        <w:t>New infringement notices for falls and high-risk construction offences</w:t>
+      </w:r>
+    </w:p>
+    <w:p>
+      <w:pPr>
+        <w:pStyle w:val="ListBullet"/>
+      </w:pPr>
+      <w:r>
+        <w:rPr>
+          <w:rFonts w:ascii="Arial" w:hAnsi="Arial"/>
+          <w:b/>
+          <w:color w:val="000000"/>
+          <w:sz w:val="19"/>
+        </w:rPr>
+        <w:t>Consumer Affairs Victoria</w:t>
+      </w:r>
+      <w:r>
+        <w:rPr>
+          <w:rFonts w:ascii="Arial" w:hAnsi="Arial"/>
+          <w:color w:val="000000"/>
+          <w:sz w:val="19"/>
+        </w:rPr>
+        <w:t xml:space="preserve"> - </w:t>
+      </w:r>
+      <w:r>
+        <w:rPr>
+          <w:rFonts w:ascii="Arial" w:hAnsi="Arial"/>
+          <w:color w:val="000000"/>
+          <w:sz w:val="19"/>
+        </w:rPr>
+        <w:t>New minimum energy efficiency standards for rental properties</w:t>
+      </w:r>
+    </w:p>
+    <w:p>
+      <w:pPr>
+        <w:pStyle w:val="body_letter"/>
+      </w:pPr>
+      <w:r>
+        <w:rPr>
+          <w:rFonts w:ascii="Arial" w:hAnsi="Arial"/>
+          <w:b/>
+          <w:color w:val="000000"/>
+          <w:sz w:val="19"/>
+        </w:rPr>
+        <w:t>Commonwealth</w:t>
+      </w:r>
+    </w:p>
+    <w:p>
+      <w:pPr>
+        <w:pStyle w:val="ListBullet"/>
+      </w:pPr>
+      <w:r>
+        <w:rPr>
+          <w:rFonts w:ascii="Arial" w:hAnsi="Arial"/>
+          <w:b/>
+          <w:color w:val="000000"/>
+          <w:sz w:val="19"/>
+        </w:rPr>
+        <w:t>Department of Finance</w:t>
+      </w:r>
+      <w:r>
+        <w:rPr>
+          <w:rFonts w:ascii="Arial" w:hAnsi="Arial"/>
+          <w:color w:val="000000"/>
+          <w:sz w:val="19"/>
+        </w:rPr>
+        <w:t xml:space="preserve"> - </w:t>
+      </w:r>
+      <w:r>
+        <w:rPr>
+          <w:rFonts w:ascii="Arial" w:hAnsi="Arial"/>
+          <w:color w:val="000000"/>
+          <w:sz w:val="19"/>
+        </w:rPr>
+        <w:t>Finance commissions independent review of KPMG Australia</w:t>
+      </w:r>
+    </w:p>
+    <w:p>
+      <w:pPr>
+        <w:pStyle w:val="ListBullet"/>
+      </w:pPr>
+      <w:r>
+        <w:rPr>
+          <w:rFonts w:ascii="Arial" w:hAnsi="Arial"/>
+          <w:b/>
+          <w:color w:val="000000"/>
+          <w:sz w:val="19"/>
+        </w:rPr>
+        <w:t>Commonwealth Ombudsman</w:t>
+      </w:r>
+      <w:r>
+        <w:rPr>
+          <w:rFonts w:ascii="Arial" w:hAnsi="Arial"/>
+          <w:color w:val="000000"/>
+          <w:sz w:val="19"/>
+        </w:rPr>
+        <w:t xml:space="preserve"> - </w:t>
+      </w:r>
+      <w:r>
+        <w:rPr>
+          <w:rFonts w:ascii="Arial" w:hAnsi="Arial"/>
+          <w:color w:val="000000"/>
+          <w:sz w:val="19"/>
+        </w:rPr>
+        <w:t>Ombudsman investigation criticises aged care algorithm tool</w:t>
+      </w:r>
+    </w:p>
+    <w:p>
+      <w:pPr>
+        <w:pStyle w:val="ListBullet"/>
+      </w:pPr>
+      <w:r>
+        <w:rPr>
+          <w:rFonts w:ascii="Arial" w:hAnsi="Arial"/>
+          <w:b/>
+          <w:color w:val="000000"/>
+          <w:sz w:val="19"/>
+        </w:rPr>
+        <w:t>Office of the Australian Information Commissioner</w:t>
+      </w:r>
+      <w:r>
+        <w:rPr>
+          <w:rFonts w:ascii="Arial" w:hAnsi="Arial"/>
+          <w:color w:val="000000"/>
+          <w:sz w:val="19"/>
+        </w:rPr>
+        <w:t xml:space="preserve"> - </w:t>
+      </w:r>
+      <w:r>
+        <w:rPr>
+          <w:rFonts w:ascii="Arial" w:hAnsi="Arial"/>
+          <w:color w:val="000000"/>
+          <w:sz w:val="19"/>
+        </w:rPr>
+        <w:t>Large-scale data breaches on the rise, OAIC statistics confirm</w:t>
       </w:r>
     </w:p>
     <w:p>
@@ -255,7 +1075,7 @@
           <w:color w:val="000000"/>
           <w:sz w:val="19"/>
         </w:rPr>
-        <w:t>National EPA signals tougher EPBC enforcement approach</w:t>
+        <w:t>Senate inquiry to scrutinise critical minerals sector</w:t>
       </w:r>
       <w:r>
         <w:rPr>
@@ -271,7 +1091,7 @@
           <w:color w:val="000000"/>
           <w:sz w:val="19"/>
         </w:rPr>
-        <w:t>(as at 2026-10-22) Norton Rose Fulbright analyses the National EPA's proposed enforcement and restoration contribution framework under EPBC Act reforms, signalling materially higher liability…</w:t>
+        <w:t>A parliamentary inquiry into Australia's critical minerals sector has been announced, placing supply chain security, sovereign processing capability and regulatory settings under direct legislative…</w:t>
       </w:r>
       <w:r>
         <w:rPr>
@@ -281,7 +1101,7 @@
         </w:rPr>
         <w:t xml:space="preserve"> (</w:t>
       </w:r>
-      <w:hyperlink r:id="rId10">
+      <w:hyperlink r:id="rId20">
         <w:r>
           <w:rPr>
             <w:rFonts w:ascii="Arial" w:hAnsi="Arial" w:cs="Arial"/>
@@ -313,7 +1133,7 @@
           <w:color w:val="000000"/>
           <w:sz w:val="19"/>
         </w:rPr>
-        <w:t>Heritage law overhaul opens post-McPhillamys consultation</w:t>
+        <w:t>AER grants hydrogen ring-fencing exemptions for AGN trial projects</w:t>
       </w:r>
       <w:r>
         <w:rPr>
@@ -329,7 +1149,7 @@
           <w:color w:val="000000"/>
           <w:sz w:val="19"/>
         </w:rPr>
-        <w:t>(as at 2026-10-22) The Albanese Government has launched consultation on overhauling Commonwealth heritage protection laws following the Federal Court's McPhillamys ruling, creating approval risk…</w:t>
+        <w:t>The Australian Energy Regulator has published a draft decision to grant ring-fencing exemptions for Australian Gas Networks' hydrogen trial projects at HyP Gladstone and HyP SA, establishing a new…</w:t>
       </w:r>
       <w:r>
         <w:rPr>
@@ -339,7 +1159,7 @@
         </w:rPr>
         <w:t xml:space="preserve"> (</w:t>
       </w:r>
-      <w:hyperlink r:id="rId11">
+      <w:hyperlink r:id="rId21">
         <w:r>
           <w:rPr>
             <w:rFonts w:ascii="Arial" w:hAnsi="Arial" w:cs="Arial"/>
@@ -371,7 +1191,7 @@
           <w:color w:val="000000"/>
           <w:sz w:val="19"/>
         </w:rPr>
-        <w:t>Uninsurable WHS fines converge with psychosocial enforcement push</w:t>
+        <w:t>Federal Court heritage ruling prompts call for regulatory confidence</w:t>
       </w:r>
       <w:r>
         <w:rPr>
@@ -387,7 +1207,7 @@
           <w:color w:val="000000"/>
           <w:sz w:val="19"/>
         </w:rPr>
-        <w:t>(as at 2026-10-22) Workplace safety regulators are intensifying psychosocial risk enforcement alongside uninsurable penalties, raising the financial exposure for organisations that have not yet…</w:t>
+        <w:t>The Minerals Council of Australia has called on government to strengthen the cultural heritage protection framework following a Federal Court decision that deepened uncertainty for project…</w:t>
       </w:r>
       <w:r>
         <w:rPr>
@@ -397,7 +1217,7 @@
         </w:rPr>
         <w:t xml:space="preserve"> (</w:t>
       </w:r>
-      <w:hyperlink r:id="rId12">
+      <w:hyperlink r:id="rId22">
         <w:r>
           <w:rPr>
             <w:rFonts w:ascii="Arial" w:hAnsi="Arial" w:cs="Arial"/>
@@ -429,7 +1249,7 @@
           <w:color w:val="000000"/>
           <w:sz w:val="19"/>
         </w:rPr>
-        <w:t>Safeguard Mechanism loophole leaves coal and gas expansions exposed</w:t>
+        <w:t>EPA bans Adelaide groundwater use over contamination risk</w:t>
       </w:r>
       <w:r>
         <w:rPr>
@@ -445,7 +1265,7 @@
           <w:color w:val="000000"/>
           <w:sz w:val="19"/>
         </w:rPr>
-        <w:t>(as at 2026-10-22) ABC News reports a loophole allows new coal and gas expansions to bypass stricter Safeguard Mechanism obligations, increasing pressure on the Albanese Government to close the gap…</w:t>
+        <w:t>The South Australian EPA has issued a prohibition on groundwater use at an Adelaide site after detecting unsafe contamination levels, signalling tightened enforcement posture on legacy environmental…</w:t>
       </w:r>
       <w:r>
         <w:rPr>
@@ -455,7 +1275,7 @@
         </w:rPr>
         <w:t xml:space="preserve"> (</w:t>
       </w:r>
-      <w:hyperlink r:id="rId13">
+      <w:hyperlink r:id="rId23">
         <w:r>
           <w:rPr>
             <w:rFonts w:ascii="Arial" w:hAnsi="Arial" w:cs="Arial"/>
@@ -501,7 +1321,7 @@
           <w:color w:val="000000"/>
           <w:sz w:val="19"/>
         </w:rPr>
-        <w:t>Tasmania EPA left uninformed on data centre generator scale</w:t>
+        <w:t>Acusensus wins expanded AI enforcement mandate in the ACT</w:t>
       </w:r>
       <w:r>
         <w:rPr>
@@ -517,7 +1337,7 @@
           <w:color w:val="000000"/>
           <w:sz w:val="19"/>
         </w:rPr>
-        <w:t>(as at 2026-10-22) Tasmania's EPA disclosed it was not told the full extent of Firmus's data centre generator plans, revealing a regulatory intelligence gap as AI-driven demand for data centre…</w:t>
+        <w:t>The ACT Government has expanded its contract with Acusensus to deploy AI-powered detection technology across a broader range of road enforcement use cases, including mobile phone and seatbelt…</w:t>
       </w:r>
       <w:r>
         <w:rPr>
@@ -527,7 +1347,7 @@
         </w:rPr>
         <w:t xml:space="preserve"> (</w:t>
       </w:r>
-      <w:hyperlink r:id="rId14">
+      <w:hyperlink r:id="rId24">
         <w:r>
           <w:rPr>
             <w:rFonts w:ascii="Arial" w:hAnsi="Arial" w:cs="Arial"/>
@@ -559,7 +1379,7 @@
           <w:color w:val="000000"/>
           <w:sz w:val="19"/>
         </w:rPr>
-        <w:t>AFMA tests cross-border digital surveillance with Indonesia</w:t>
+        <w:t>NHVR signals shift to intelligence-led enforcement</w:t>
       </w:r>
       <w:r>
         <w:rPr>
@@ -575,7 +1395,7 @@
           <w:color w:val="000000"/>
           <w:sz w:val="19"/>
         </w:rPr>
-        <w:t>(as at 2026-10-22) AFMA and Indonesian counterparts coordinated a Vessel Monitoring System pilot, using shared digital tracking data to close cross-border fisheries enforcement gaps and demonstrate…</w:t>
+        <w:t>The National Heavy Vehicle Regulator has clarified a strategic shift in its enforcement and education model, moving toward targeted, data-driven compliance activity rather than broad-based…</w:t>
       </w:r>
       <w:r>
         <w:rPr>
@@ -585,65 +1405,7 @@
         </w:rPr>
         <w:t xml:space="preserve"> (</w:t>
       </w:r>
-      <w:hyperlink r:id="rId15">
-        <w:r>
-          <w:rPr>
-            <w:rFonts w:ascii="Arial" w:hAnsi="Arial" w:cs="Arial"/>
-            <w:color w:val="0000FF"/>
-            <w:sz w:val="19"/>
-            <w:szCs w:val="19"/>
-            <w:u w:val="single"/>
-          </w:rPr>
-          <w:t xml:space="preserve">Read more</w:t>
-        </w:r>
-      </w:hyperlink>
-      <w:r>
-        <w:rPr>
-          <w:rFonts w:ascii="Arial" w:hAnsi="Arial"/>
-          <w:color w:val="000000"/>
-          <w:sz w:val="19"/>
-        </w:rPr>
-        <w:t>)</w:t>
-      </w:r>
-    </w:p>
-    <w:p>
-      <w:pPr>
-        <w:pStyle w:val="ListBullet"/>
-      </w:pPr>
-      <w:r>
-        <w:rPr>
-          <w:rFonts w:ascii="Arial" w:hAnsi="Arial"/>
-          <w:b/>
-          <w:color w:val="000000"/>
-          <w:sz w:val="19"/>
-        </w:rPr>
-        <w:t>Children's Commission tables data-driven evidence for regulatory action</w:t>
-      </w:r>
-      <w:r>
-        <w:rPr>
-          <w:rFonts w:ascii="Arial" w:hAnsi="Arial"/>
-          <w:color w:val="000000"/>
-          <w:sz w:val="19"/>
-        </w:rPr>
-        <w:t xml:space="preserve"> - </w:t>
-      </w:r>
-      <w:r>
-        <w:rPr>
-          <w:rFonts w:ascii="Arial" w:hAnsi="Arial"/>
-          <w:color w:val="000000"/>
-          <w:sz w:val="19"/>
-        </w:rPr>
-        <w:t>(as at 2026-10-22) Victoria's Commission for Children and Young People presented analytics-grounded evidence in its annual report to drive policy and regulatory responses, illustrating how…</w:t>
-      </w:r>
-      <w:r>
-        <w:rPr>
-          <w:rFonts w:ascii="Arial" w:hAnsi="Arial"/>
-          <w:color w:val="000000"/>
-          <w:sz w:val="19"/>
-        </w:rPr>
-        <w:t xml:space="preserve"> (</w:t>
-      </w:r>
-      <w:hyperlink r:id="rId16">
+      <w:hyperlink r:id="rId25">
         <w:r>
           <w:rPr>
             <w:rFonts w:ascii="Arial" w:hAnsi="Arial" w:cs="Arial"/>
@@ -689,7 +1451,7 @@
           <w:color w:val="000000"/>
           <w:sz w:val="19"/>
         </w:rPr>
-        <w:t>NSW building reforms move from legislation to implementation</w:t>
+        <w:t>National EPA's EPBC enforcement and restoration framework takes shape</w:t>
       </w:r>
       <w:r>
         <w:rPr>
@@ -705,7 +1467,7 @@
           <w:color w:val="000000"/>
           <w:sz w:val="19"/>
         </w:rPr>
-        <w:t>(as at 2026-10-22) The Property Council has convened a member briefing on translating NSW's recent building legislative reforms into operational practice, signalling significant compliance…</w:t>
+        <w:t>Norton Rose Fulbright has analysed the incoming National EPA's proposed enforcement and restoration contribution framework under EPBC Act reforms, identifying significant new compliance obligations…</w:t>
       </w:r>
       <w:r>
         <w:rPr>
@@ -715,7 +1477,7 @@
         </w:rPr>
         <w:t xml:space="preserve"> (</w:t>
       </w:r>
-      <w:hyperlink r:id="rId17">
+      <w:hyperlink r:id="rId26">
         <w:r>
           <w:rPr>
             <w:rFonts w:ascii="Arial" w:hAnsi="Arial" w:cs="Arial"/>
@@ -747,7 +1509,7 @@
           <w:color w:val="000000"/>
           <w:sz w:val="19"/>
         </w:rPr>
-        <w:t>ESC consults on Greater Western Water price determination delay</w:t>
+        <w:t>Albanese Government consults on heritage laws overhaul post-McPhillamys</w:t>
       </w:r>
       <w:r>
         <w:rPr>
@@ -763,7 +1525,7 @@
           <w:color w:val="000000"/>
           <w:sz w:val="19"/>
         </w:rPr>
-        <w:t>(as at 2026-10-22) Victoria's Essential Services Commission is seeking stakeholder feedback on Greater Western Water's request to defer its next price determination, raising questions about…</w:t>
+        <w:t>The Albanese Government has launched consultation on an overhaul of Commonwealth heritage protection laws following the McPhillamys Federal Court ruling, adding regulatory uncertainty for resources…</w:t>
       </w:r>
       <w:r>
         <w:rPr>
@@ -773,7 +1535,7 @@
         </w:rPr>
         <w:t xml:space="preserve"> (</w:t>
       </w:r>
-      <w:hyperlink r:id="rId18">
+      <w:hyperlink r:id="rId27">
         <w:r>
           <w:rPr>
             <w:rFonts w:ascii="Arial" w:hAnsi="Arial" w:cs="Arial"/>
@@ -805,7 +1567,7 @@
           <w:color w:val="000000"/>
           <w:sz w:val="19"/>
         </w:rPr>
-        <w:t>Australians could gain right to sue Big Tech under online safety push</w:t>
+        <w:t>Tasmania's reformed residential parks framework commences</w:t>
       </w:r>
       <w:r>
         <w:rPr>
@@ -821,7 +1583,7 @@
           <w:color w:val="000000"/>
           <w:sz w:val="19"/>
         </w:rPr>
-        <w:t>(as at 2026-10-22) Proposed tougher online safety laws could give Australians direct rights to sue major technology platforms, extending regulatory burden on digital platforms and opening new…</w:t>
+        <w:t>Tasmania's new residential parks regulatory framework has taken effect, consolidating resident rights and operator obligations under a reformed legislative model aimed at reducing disputes and…</w:t>
       </w:r>
       <w:r>
         <w:rPr>
@@ -831,7 +1593,7 @@
         </w:rPr>
         <w:t xml:space="preserve"> (</w:t>
       </w:r>
-      <w:hyperlink r:id="rId19">
+      <w:hyperlink r:id="rId28">
         <w:r>
           <w:rPr>
             <w:rFonts w:ascii="Arial" w:hAnsi="Arial" w:cs="Arial"/>
@@ -868,408 +1630,16 @@
     </w:p>
     <w:p>
       <w:pPr>
-        <w:pStyle w:val="ListBullet"/>
+        <w:pStyle w:val="body_letter"/>
       </w:pPr>
       <w:r>
         <w:rPr>
           <w:rFonts w:ascii="Arial" w:hAnsi="Arial"/>
-          <w:b/>
-          <w:color w:val="000000"/>
+          <w:i/>
+          <w:color w:val="666666"/>
           <w:sz w:val="19"/>
         </w:rPr>
-        <w:t>Citi A50 Australian Economic Forum 2026</w:t>
-      </w:r>
-      <w:r>
-        <w:rPr>
-          <w:rFonts w:ascii="Arial" w:hAnsi="Arial"/>
-          <w:color w:val="000000"/>
-          <w:sz w:val="19"/>
-        </w:rPr>
-        <w:t xml:space="preserve"> - </w:t>
-      </w:r>
-      <w:r>
-        <w:rPr>
-          <w:rFonts w:ascii="Arial" w:hAnsi="Arial"/>
-          <w:color w:val="000000"/>
-          <w:sz w:val="19"/>
-        </w:rPr>
-        <w:t>23 Oct 2026 - APRA · Online</w:t>
-      </w:r>
-      <w:r>
-        <w:rPr>
-          <w:rFonts w:ascii="Arial" w:hAnsi="Arial"/>
-          <w:color w:val="000000"/>
-          <w:sz w:val="19"/>
-        </w:rPr>
-        <w:t xml:space="preserve"> (</w:t>
-      </w:r>
-      <w:hyperlink r:id="rId20">
-        <w:r>
-          <w:rPr>
-            <w:rFonts w:ascii="Arial" w:hAnsi="Arial" w:cs="Arial"/>
-            <w:color w:val="0000FF"/>
-            <w:sz w:val="19"/>
-            <w:szCs w:val="19"/>
-            <w:u w:val="single"/>
-          </w:rPr>
-          <w:t xml:space="preserve">Register</w:t>
-        </w:r>
-      </w:hyperlink>
-      <w:r>
-        <w:rPr>
-          <w:rFonts w:ascii="Arial" w:hAnsi="Arial"/>
-          <w:color w:val="000000"/>
-          <w:sz w:val="19"/>
-        </w:rPr>
-        <w:t>)</w:t>
-      </w:r>
-    </w:p>
-    <w:p>
-      <w:pPr>
-        <w:pStyle w:val="ListBullet"/>
-      </w:pPr>
-      <w:r>
-        <w:rPr>
-          <w:rFonts w:ascii="Arial" w:hAnsi="Arial"/>
-          <w:b/>
-          <w:color w:val="000000"/>
-          <w:sz w:val="19"/>
-        </w:rPr>
-        <w:t>AFR Super &amp;amp; Wealth Summit 2026</w:t>
-      </w:r>
-      <w:r>
-        <w:rPr>
-          <w:rFonts w:ascii="Arial" w:hAnsi="Arial"/>
-          <w:color w:val="000000"/>
-          <w:sz w:val="19"/>
-        </w:rPr>
-        <w:t xml:space="preserve"> - </w:t>
-      </w:r>
-      <w:r>
-        <w:rPr>
-          <w:rFonts w:ascii="Arial" w:hAnsi="Arial"/>
-          <w:color w:val="000000"/>
-          <w:sz w:val="19"/>
-        </w:rPr>
-        <w:t>26 Oct 2026 - APRA · Online</w:t>
-      </w:r>
-      <w:r>
-        <w:rPr>
-          <w:rFonts w:ascii="Arial" w:hAnsi="Arial"/>
-          <w:color w:val="000000"/>
-          <w:sz w:val="19"/>
-        </w:rPr>
-        <w:t xml:space="preserve"> (</w:t>
-      </w:r>
-      <w:hyperlink r:id="rId21">
-        <w:r>
-          <w:rPr>
-            <w:rFonts w:ascii="Arial" w:hAnsi="Arial" w:cs="Arial"/>
-            <w:color w:val="0000FF"/>
-            <w:sz w:val="19"/>
-            <w:szCs w:val="19"/>
-            <w:u w:val="single"/>
-          </w:rPr>
-          <w:t xml:space="preserve">Register</w:t>
-        </w:r>
-      </w:hyperlink>
-      <w:r>
-        <w:rPr>
-          <w:rFonts w:ascii="Arial" w:hAnsi="Arial"/>
-          <w:color w:val="000000"/>
-          <w:sz w:val="19"/>
-        </w:rPr>
-        <w:t>)</w:t>
-      </w:r>
-    </w:p>
-    <w:p>
-      <w:pPr>
-        <w:pStyle w:val="ListBullet"/>
-      </w:pPr>
-      <w:r>
-        <w:rPr>
-          <w:rFonts w:ascii="Arial" w:hAnsi="Arial"/>
-          <w:b/>
-          <w:color w:val="000000"/>
-          <w:sz w:val="19"/>
-        </w:rPr>
-        <w:t>Financial Services and ASX Sector Assurance Forum 2026</w:t>
-      </w:r>
-      <w:r>
-        <w:rPr>
-          <w:rFonts w:ascii="Arial" w:hAnsi="Arial"/>
-          <w:color w:val="000000"/>
-          <w:sz w:val="19"/>
-        </w:rPr>
-        <w:t xml:space="preserve"> - </w:t>
-      </w:r>
-      <w:r>
-        <w:rPr>
-          <w:rFonts w:ascii="Arial" w:hAnsi="Arial"/>
-          <w:color w:val="000000"/>
-          <w:sz w:val="19"/>
-        </w:rPr>
-        <w:t>27 Oct 2026 - APRA · Online</w:t>
-      </w:r>
-      <w:r>
-        <w:rPr>
-          <w:rFonts w:ascii="Arial" w:hAnsi="Arial"/>
-          <w:color w:val="000000"/>
-          <w:sz w:val="19"/>
-        </w:rPr>
-        <w:t xml:space="preserve"> (</w:t>
-      </w:r>
-      <w:hyperlink r:id="rId22">
-        <w:r>
-          <w:rPr>
-            <w:rFonts w:ascii="Arial" w:hAnsi="Arial" w:cs="Arial"/>
-            <w:color w:val="0000FF"/>
-            <w:sz w:val="19"/>
-            <w:szCs w:val="19"/>
-            <w:u w:val="single"/>
-          </w:rPr>
-          <w:t xml:space="preserve">Register</w:t>
-        </w:r>
-      </w:hyperlink>
-      <w:r>
-        <w:rPr>
-          <w:rFonts w:ascii="Arial" w:hAnsi="Arial"/>
-          <w:color w:val="000000"/>
-          <w:sz w:val="19"/>
-        </w:rPr>
-        <w:t>)</w:t>
-      </w:r>
-    </w:p>
-    <w:p>
-      <w:pPr>
-        <w:pStyle w:val="ListBullet"/>
-      </w:pPr>
-      <w:r>
-        <w:rPr>
-          <w:rFonts w:ascii="Arial" w:hAnsi="Arial"/>
-          <w:b/>
-          <w:color w:val="000000"/>
-          <w:sz w:val="19"/>
-        </w:rPr>
-        <w:t>AFSA Summit 2026</w:t>
-      </w:r>
-      <w:r>
-        <w:rPr>
-          <w:rFonts w:ascii="Arial" w:hAnsi="Arial"/>
-          <w:color w:val="000000"/>
-          <w:sz w:val="19"/>
-        </w:rPr>
-        <w:t xml:space="preserve"> - </w:t>
-      </w:r>
-      <w:r>
-        <w:rPr>
-          <w:rFonts w:ascii="Arial" w:hAnsi="Arial"/>
-          <w:color w:val="000000"/>
-          <w:sz w:val="19"/>
-        </w:rPr>
-        <w:t>05 Nov 2026 - APRA · Online</w:t>
-      </w:r>
-      <w:r>
-        <w:rPr>
-          <w:rFonts w:ascii="Arial" w:hAnsi="Arial"/>
-          <w:color w:val="000000"/>
-          <w:sz w:val="19"/>
-        </w:rPr>
-        <w:t xml:space="preserve"> (</w:t>
-      </w:r>
-      <w:hyperlink r:id="rId23">
-        <w:r>
-          <w:rPr>
-            <w:rFonts w:ascii="Arial" w:hAnsi="Arial" w:cs="Arial"/>
-            <w:color w:val="0000FF"/>
-            <w:sz w:val="19"/>
-            <w:szCs w:val="19"/>
-            <w:u w:val="single"/>
-          </w:rPr>
-          <w:t xml:space="preserve">Register</w:t>
-        </w:r>
-      </w:hyperlink>
-      <w:r>
-        <w:rPr>
-          <w:rFonts w:ascii="Arial" w:hAnsi="Arial"/>
-          <w:color w:val="000000"/>
-          <w:sz w:val="19"/>
-        </w:rPr>
-        <w:t>)</w:t>
-      </w:r>
-    </w:p>
-    <w:p>
-      <w:pPr>
-        <w:pStyle w:val="ListBullet"/>
-      </w:pPr>
-      <w:r>
-        <w:rPr>
-          <w:rFonts w:ascii="Arial" w:hAnsi="Arial"/>
-          <w:b/>
-          <w:color w:val="000000"/>
-          <w:sz w:val="19"/>
-        </w:rPr>
-        <w:t>Insurance Council of Australia Annual Conference 2026</w:t>
-      </w:r>
-      <w:r>
-        <w:rPr>
-          <w:rFonts w:ascii="Arial" w:hAnsi="Arial"/>
-          <w:color w:val="000000"/>
-          <w:sz w:val="19"/>
-        </w:rPr>
-        <w:t xml:space="preserve"> - </w:t>
-      </w:r>
-      <w:r>
-        <w:rPr>
-          <w:rFonts w:ascii="Arial" w:hAnsi="Arial"/>
-          <w:color w:val="000000"/>
-          <w:sz w:val="19"/>
-        </w:rPr>
-        <w:t>06 Nov 2026 - APRA · Online</w:t>
-      </w:r>
-      <w:r>
-        <w:rPr>
-          <w:rFonts w:ascii="Arial" w:hAnsi="Arial"/>
-          <w:color w:val="000000"/>
-          <w:sz w:val="19"/>
-        </w:rPr>
-        <w:t xml:space="preserve"> (</w:t>
-      </w:r>
-      <w:hyperlink r:id="rId24">
-        <w:r>
-          <w:rPr>
-            <w:rFonts w:ascii="Arial" w:hAnsi="Arial" w:cs="Arial"/>
-            <w:color w:val="0000FF"/>
-            <w:sz w:val="19"/>
-            <w:szCs w:val="19"/>
-            <w:u w:val="single"/>
-          </w:rPr>
-          <w:t xml:space="preserve">Register</w:t>
-        </w:r>
-      </w:hyperlink>
-      <w:r>
-        <w:rPr>
-          <w:rFonts w:ascii="Arial" w:hAnsi="Arial"/>
-          <w:color w:val="000000"/>
-          <w:sz w:val="19"/>
-        </w:rPr>
-        <w:t>)</w:t>
-      </w:r>
-    </w:p>
-    <w:p>
-      <w:pPr>
-        <w:pStyle w:val="ListBullet"/>
-      </w:pPr>
-      <w:r>
-        <w:rPr>
-          <w:rFonts w:ascii="Arial" w:hAnsi="Arial"/>
-          <w:b/>
-          <w:color w:val="000000"/>
-          <w:sz w:val="19"/>
-        </w:rPr>
-        <w:t>ASIC Annual Forum 2026</w:t>
-      </w:r>
-      <w:r>
-        <w:rPr>
-          <w:rFonts w:ascii="Arial" w:hAnsi="Arial"/>
-          <w:color w:val="000000"/>
-          <w:sz w:val="19"/>
-        </w:rPr>
-        <w:t xml:space="preserve"> - </w:t>
-      </w:r>
-      <w:r>
-        <w:rPr>
-          <w:rFonts w:ascii="Arial" w:hAnsi="Arial"/>
-          <w:color w:val="000000"/>
-          <w:sz w:val="19"/>
-        </w:rPr>
-        <w:t>18 Nov 2026 - APRA · Online</w:t>
-      </w:r>
-      <w:r>
-        <w:rPr>
-          <w:rFonts w:ascii="Arial" w:hAnsi="Arial"/>
-          <w:color w:val="000000"/>
-          <w:sz w:val="19"/>
-        </w:rPr>
-        <w:t xml:space="preserve"> (</w:t>
-      </w:r>
-      <w:hyperlink r:id="rId25">
-        <w:r>
-          <w:rPr>
-            <w:rFonts w:ascii="Arial" w:hAnsi="Arial" w:cs="Arial"/>
-            <w:color w:val="0000FF"/>
-            <w:sz w:val="19"/>
-            <w:szCs w:val="19"/>
-            <w:u w:val="single"/>
-          </w:rPr>
-          <w:t xml:space="preserve">Register</w:t>
-        </w:r>
-      </w:hyperlink>
-      <w:r>
-        <w:rPr>
-          <w:rFonts w:ascii="Arial" w:hAnsi="Arial"/>
-          <w:color w:val="000000"/>
-          <w:sz w:val="19"/>
-        </w:rPr>
-        <w:t>)</w:t>
-      </w:r>
-    </w:p>
-    <w:p>
-      <w:pPr>
-        <w:pStyle w:val="ListBullet"/>
-      </w:pPr>
-      <w:r>
-        <w:rPr>
-          <w:rFonts w:ascii="Arial" w:hAnsi="Arial"/>
-          <w:b/>
-          <w:color w:val="000000"/>
-          <w:sz w:val="19"/>
-        </w:rPr>
-        <w:t>2026 ASFA Conference</w:t>
-      </w:r>
-      <w:r>
-        <w:rPr>
-          <w:rFonts w:ascii="Arial" w:hAnsi="Arial"/>
-          <w:color w:val="000000"/>
-          <w:sz w:val="19"/>
-        </w:rPr>
-        <w:t xml:space="preserve"> - </w:t>
-      </w:r>
-      <w:r>
-        <w:rPr>
-          <w:rFonts w:ascii="Arial" w:hAnsi="Arial"/>
-          <w:color w:val="000000"/>
-          <w:sz w:val="19"/>
-        </w:rPr>
-        <w:t>19 Nov 2026 - APRA · Online</w:t>
-      </w:r>
-      <w:r>
-        <w:rPr>
-          <w:rFonts w:ascii="Arial" w:hAnsi="Arial"/>
-          <w:color w:val="000000"/>
-          <w:sz w:val="19"/>
-        </w:rPr>
-        <w:t xml:space="preserve"> (</w:t>
-      </w:r>
-      <w:hyperlink r:id="rId26">
-        <w:r>
-          <w:rPr>
-            <w:rFonts w:ascii="Arial" w:hAnsi="Arial" w:cs="Arial"/>
-            <w:color w:val="0000FF"/>
-            <w:sz w:val="19"/>
-            <w:szCs w:val="19"/>
-            <w:u w:val="single"/>
-          </w:rPr>
-          <w:t xml:space="preserve">Register</w:t>
-        </w:r>
-      </w:hyperlink>
-      <w:r>
-        <w:rPr>
-          <w:rFonts w:ascii="Arial" w:hAnsi="Arial"/>
-          <w:color w:val="000000"/>
-          <w:sz w:val="19"/>
-        </w:rPr>
-        <w:t>)</w:t>
+        <w:t>No upcoming events in the next four weeks.</w:t>
       </w:r>
     </w:p>
     <w:p>
@@ -1284,6 +1654,20 @@
           <w:sz w:val="21"/>
         </w:rPr>
         <w:t>Cross-sector synthesis (hub-wide)</w:t>
+      </w:r>
+    </w:p>
+    <w:p>
+      <w:pPr>
+        <w:pStyle w:val="body_letter"/>
+      </w:pPr>
+      <w:r>
+        <w:rPr>
+          <w:rFonts w:ascii="Arial" w:hAnsi="Arial"/>
+          <w:b w:val="0"/>
+          <w:color w:val="000000"/>
+          <w:sz w:val="19"/>
+        </w:rPr>
+        <w:t>The fortnight's sharpest regulatory investment signals cluster across three themes: the AER's active accommodation of hydrogen infrastructure through AGN's HyP Gladstone and HyP SA ring-fencing exemptions, the Commonwealth and WA Government's accelerating critical minerals policy and investment architecture, and the EPBC reform machinery crystallising around the incoming National EPA's enforcement posture. AGN, Transgrid, and the Waratah Super Battery project are all in live AER proceedings simultaneously, each a credible entry point for the energy regulation practice before determinations lock in. The WA Government's critical minerals pipeline prospectus, the federal parliamentary inquiry, Geoscience Australia's precompetitive investment, and US stockpile price-signal reporting collectively create a multi-jurisdiction BD window on policy design, permitting, and investment facilitation that must be jointly prosecuted across PEPI and the resources sector team. The Acusensus ACT road enforcement contract is the fortnight's clearest procurement proof-point, and state-level pipeline conversations in Victoria, NSW, and Queensland should be opened immediately using ACT as the reference case. Norton Rose Fulbright's read of the National EPA's enforcement and restoration contribution posture, combined with the Federal Court's McPhillamys heritage ruling driving WA's heritage law overhaul and the ABC's reporting on Safeguard Mechanism loopholes for new coal and gas, signals that resources clients face compounding approval and compliance risk, a structured regulatory readiness offer is timely. The AER and ACCC annual report release confirms both regulators are resetting cost-recovery and enforcement ambition, reinforcing demand for network and market-participant compliance program redesign across the energy client roster. With the Department of Finance review of KPMG Australia still live, every Federal Government engagement principal must apply heightened conflict discipline across all Commonwealth energy, environment, and resources pursuits this fortnight.</w:t>
       </w:r>
     </w:p>
     <w:p>
@@ -1310,7 +1694,7 @@
           <w:color w:val="000000"/>
           <w:sz w:val="19"/>
         </w:rPr>
-        <w:t>Brief the relevant sector partner this fortnight on the highest-signal regulator development above.</w:t>
+        <w:t>Engage AGN and peer energy network clients on compliance design and network separation frameworks for hydrogen trial projects before the AER ring-fencing draft decision is finalised.</w:t>
       </w:r>
     </w:p>
     <w:p>
@@ -1323,7 +1707,7 @@
           <w:color w:val="000000"/>
           <w:sz w:val="19"/>
         </w:rPr>
-        <w:t>Convene the capability bench for the next reg-tech / capability-review pursuit in pipeline.</w:t>
+        <w:t>Convene a joint PEPI and resources sector team to pursue the WA Government, Commonwealth, and Geoscience Australia critical minerals clients ahead of the parliamentary inquiry's public hearings, leading with policy framing and investment facilitation advisory.</w:t>
       </w:r>
     </w:p>
     <w:p>
@@ -1336,7 +1720,112 @@
           <w:color w:val="000000"/>
           <w:sz w:val="19"/>
         </w:rPr>
-        <w:t>Pursue at least one tracked client on a near-term advisory hook before the next CoP cadence.</w:t>
+        <w:t>Open state government pipeline conversations in Victoria, NSW, and Queensland using the Acusensus ACT road enforcement contract as the reference procurement, targeting intelligent transport infrastructure advisory and delivery assurance mandates.</w:t>
+      </w:r>
+    </w:p>
+    <w:p>
+      <w:pPr>
+        <w:pStyle w:val="ListBullet"/>
+      </w:pPr>
+      <w:r>
+        <w:rPr>
+          <w:rFonts w:ascii="Arial" w:hAnsi="Arial"/>
+          <w:color w:val="000000"/>
+          <w:sz w:val="19"/>
+        </w:rPr>
+        <w:t>Brief resources sector clients on the National EPA's emerging enforcement and restoration contribution posture and the McPhillamys heritage precedent, positioning KPMG to lead EPBC regulatory readiness assessments before the new agency's compliance approach is settled.</w:t>
+      </w:r>
+    </w:p>
+    <w:p>
+      <w:pPr>
+        <w:pStyle w:val="ListBullet"/>
+      </w:pPr>
+      <w:r>
+        <w:rPr>
+          <w:rFonts w:ascii="Arial" w:hAnsi="Arial"/>
+          <w:color w:val="000000"/>
+          <w:sz w:val="19"/>
+        </w:rPr>
+        <w:t>Pursue an independent adviser position on the Waratah Super Battery revenue determination review and the Transgrid cost pass-through application, treating both live AER proceedings as near-term entry points for the energy regulation practice.</w:t>
+      </w:r>
+    </w:p>
+    <w:p>
+      <w:pPr>
+        <w:pStyle w:val="body_letter"/>
+      </w:pPr>
+      <w:r>
+        <w:rPr>
+          <w:rFonts w:ascii="Arial" w:hAnsi="Arial"/>
+          <w:b/>
+          <w:color w:val="000000"/>
+          <w:sz w:val="19"/>
+        </w:rPr>
+        <w:t>Implications for clients</w:t>
+      </w:r>
+    </w:p>
+    <w:p>
+      <w:pPr>
+        <w:pStyle w:val="ListBullet"/>
+      </w:pPr>
+      <w:r>
+        <w:rPr>
+          <w:rFonts w:ascii="Arial" w:hAnsi="Arial"/>
+          <w:color w:val="000000"/>
+          <w:sz w:val="19"/>
+        </w:rPr>
+        <w:t>Engage AGN and peer energy network clients on compliance design and network separation frameworks for hydrogen trial projects before the AER ring-fencing draft decision is finalised.</w:t>
+      </w:r>
+    </w:p>
+    <w:p>
+      <w:pPr>
+        <w:pStyle w:val="ListBullet"/>
+      </w:pPr>
+      <w:r>
+        <w:rPr>
+          <w:rFonts w:ascii="Arial" w:hAnsi="Arial"/>
+          <w:color w:val="000000"/>
+          <w:sz w:val="19"/>
+        </w:rPr>
+        <w:t>Convene a joint PEPI and resources sector team to pursue the WA Government, Commonwealth, and Geoscience Australia critical minerals clients ahead of the parliamentary inquiry's public hearings, leading with policy framing and investment facilitation advisory.</w:t>
+      </w:r>
+    </w:p>
+    <w:p>
+      <w:pPr>
+        <w:pStyle w:val="ListBullet"/>
+      </w:pPr>
+      <w:r>
+        <w:rPr>
+          <w:rFonts w:ascii="Arial" w:hAnsi="Arial"/>
+          <w:color w:val="000000"/>
+          <w:sz w:val="19"/>
+        </w:rPr>
+        <w:t>Open state government pipeline conversations in Victoria, NSW, and Queensland using the Acusensus ACT road enforcement contract as the reference procurement, targeting intelligent transport infrastructure advisory and delivery assurance mandates.</w:t>
+      </w:r>
+    </w:p>
+    <w:p>
+      <w:pPr>
+        <w:pStyle w:val="ListBullet"/>
+      </w:pPr>
+      <w:r>
+        <w:rPr>
+          <w:rFonts w:ascii="Arial" w:hAnsi="Arial"/>
+          <w:color w:val="000000"/>
+          <w:sz w:val="19"/>
+        </w:rPr>
+        <w:t>Brief resources sector clients on the National EPA's emerging enforcement and restoration contribution posture and the McPhillamys heritage precedent, positioning KPMG to lead EPBC regulatory readiness assessments before the new agency's compliance approach is settled.</w:t>
+      </w:r>
+    </w:p>
+    <w:p>
+      <w:pPr>
+        <w:pStyle w:val="ListBullet"/>
+      </w:pPr>
+      <w:r>
+        <w:rPr>
+          <w:rFonts w:ascii="Arial" w:hAnsi="Arial"/>
+          <w:color w:val="000000"/>
+          <w:sz w:val="19"/>
+        </w:rPr>
+        <w:t>Pursue an independent adviser position on the Waratah Super Battery revenue determination review and the Transgrid cost pass-through application, treating both live AER proceedings as near-term entry points for the energy regulation practice.</w:t>
       </w:r>
     </w:p>
     <w:p>
@@ -1360,11 +1849,221 @@
       <w:r>
         <w:rPr>
           <w:rFonts w:ascii="Arial" w:hAnsi="Arial"/>
-          <w:i/>
-          <w:color w:val="666666"/>
+          <w:b/>
+          <w:color w:val="000000"/>
           <w:sz w:val="19"/>
         </w:rPr>
-        <w:t>No sector-level synthesis available this fortnight.</w:t>
+        <w:t>Public Sector</w:t>
+      </w:r>
+    </w:p>
+    <w:p>
+      <w:pPr>
+        <w:pStyle w:val="body_letter"/>
+      </w:pPr>
+      <w:r>
+        <w:rPr>
+          <w:rFonts w:ascii="Arial" w:hAnsi="Arial"/>
+          <w:b w:val="0"/>
+          <w:color w:val="000000"/>
+          <w:sz w:val="19"/>
+        </w:rPr>
+        <w:t>The OAIC's annual report and concurrent data-breach statistics confirm sustained Commonwealth investment in privacy enforcement capability, large-scale breaches are rising and FOI demand is growing, creating a well-scoped assurance and privacy-uplift engagement window. The Commonwealth Ombudsman's finding that the aged-care algorithm tool operates as a 'technological black box', drawing explicit parallels to Robodebt, signals that responsible-AI governance in Commonwealth service delivery is now an active accountability risk for agency clients and a concrete advisory pull. The Department of Finance has commissioned an independent review of KPMG Australia, a material factor that every Federal Government engagement principal must front-of-mind before any pursuit action, proposal submission, or client relationship move this fortnight. Taken together, the regulatory signals point to Federal and Victorian clients under simultaneous pressure on algorithmic accountability, data security posture, and transparency obligations, three areas where KPMG risk, assurance, and technology practices can credibly differentiate.</w:t>
+      </w:r>
+    </w:p>
+    <w:p>
+      <w:pPr>
+        <w:pStyle w:val="body_letter"/>
+      </w:pPr>
+      <w:r>
+        <w:rPr>
+          <w:rFonts w:ascii="Arial" w:hAnsi="Arial"/>
+          <w:b/>
+          <w:color w:val="000000"/>
+          <w:sz w:val="19"/>
+        </w:rPr>
+        <w:t>Financial Services</w:t>
+      </w:r>
+    </w:p>
+    <w:p>
+      <w:pPr>
+        <w:pStyle w:val="body_letter"/>
+      </w:pPr>
+      <w:r>
+        <w:rPr>
+          <w:rFonts w:ascii="Arial" w:hAnsi="Arial"/>
+          <w:b w:val="0"/>
+          <w:color w:val="000000"/>
+          <w:sz w:val="19"/>
+        </w:rPr>
+        <w:t>ASIC's CP 392 consultation on digital asset law reform (licensing standards and guidance) opens a significant implementation advisory window, firms holding or seeking Australian Market Licence equivalents for crypto will need gap assessments before standards are locked in. ASIC's targeted review of superannuation fund valuations (REP 841) identifies systemic weaknesses in unlisted asset methodology and audit scrutiny, signalling near-term assurance demand across mid-tier and industry funds. The $1.35 million penalty against Fortnum Private Wealth for cybersecurity failures, ASIC's most visible cyber enforcement action to date against a wealth manager, sharpens the regulator's expectation of baseline cyber controls as a licence condition, not an IT matter. APRA's incoming deputy chair has publicly flagged operational resilience and non-financial risk as priority focus areas, reinforcing the case for a proactive APRA readiness positioning across the banking and insurance client roster.</w:t>
+      </w:r>
+    </w:p>
+    <w:p>
+      <w:pPr>
+        <w:pStyle w:val="body_letter"/>
+      </w:pPr>
+      <w:r>
+        <w:rPr>
+          <w:rFonts w:ascii="Arial" w:hAnsi="Arial"/>
+          <w:b/>
+          <w:color w:val="000000"/>
+          <w:sz w:val="19"/>
+        </w:rPr>
+        <w:t>Health, Ageing &amp; Human Services</w:t>
+      </w:r>
+    </w:p>
+    <w:p>
+      <w:pPr>
+        <w:pStyle w:val="body_letter"/>
+      </w:pPr>
+      <w:r>
+        <w:rPr>
+          <w:rFonts w:ascii="Arial" w:hAnsi="Arial"/>
+          <w:b w:val="0"/>
+          <w:color w:val="000000"/>
+          <w:sz w:val="19"/>
+        </w:rPr>
+        <w:t>The NDIS Quality and Safeguards Commission's active regulatory reform program, combined with the Department of Health, Disability and Ageing's tightened provider registration requirements, signals a compliance uplift cycle that will stress-test governance and operational maturity across the disability sector over the next 12-18 months. The Aged Care Quality and Safety Commission's new best-practice guidance on incident management systems creates an immediate advisory entry point for mid-tier residential and home-care providers building governance frameworks under the new Aged Care Act. Ahpra's published principles for outcome-based accreditation and the TGA's completed review of AI-powered digital scribes both indicate regulators resetting the technology compliance baseline in clinical settings, an emerging assurance and regulatory-readiness pitch. Landmark Commonwealth funding to address gender undervaluation in care workforces introduces a pay equity and workforce strategy advisory angle that cuts across disability, aged care, and community services simultaneously.</w:t>
+      </w:r>
+    </w:p>
+    <w:p>
+      <w:pPr>
+        <w:pStyle w:val="body_letter"/>
+      </w:pPr>
+      <w:r>
+        <w:rPr>
+          <w:rFonts w:ascii="Arial" w:hAnsi="Arial"/>
+          <w:b/>
+          <w:color w:val="000000"/>
+          <w:sz w:val="19"/>
+        </w:rPr>
+        <w:t>Energy, Mining &amp; Property</w:t>
+      </w:r>
+    </w:p>
+    <w:p>
+      <w:pPr>
+        <w:pStyle w:val="body_letter"/>
+      </w:pPr>
+      <w:r>
+        <w:rPr>
+          <w:rFonts w:ascii="Arial" w:hAnsi="Arial"/>
+          <w:b w:val="0"/>
+          <w:color w:val="000000"/>
+          <w:sz w:val="19"/>
+        </w:rPr>
+        <w:t>The AER's draft ring-fencing exemptions for AGN's hydrogen trial projects (HyP Gladstone and HyP SA) mark a tangible shift in regulatory accommodation for hydrogen infrastructure, creating an immediate advisory window on compliance design and network separation frameworks for energy clients entering the hydrogen transition. Concurrently, a federal parliamentary inquiry into critical minerals, alongside the WA Government's critical minerals pipeline prospectus and Geoscience Australia's precompetitive geoscience investment, signals a sustained uplift in policy, permitting, and investment-facilitation workload across Commonwealth and state clients. Australia's formal declaration of the West Peron formation as a CCS storage site for the Bonaparte project sets a regulatory precedent that will drive compliance and risk advisory demand as the offshore storage pipeline builds. The Project EnergyConnect reopener consultation adds a network repricing engagement to the near-term pipeline for the energy regulation practice.</w:t>
+      </w:r>
+    </w:p>
+    <w:p>
+      <w:pPr>
+        <w:pStyle w:val="body_letter"/>
+      </w:pPr>
+      <w:r>
+        <w:rPr>
+          <w:rFonts w:ascii="Arial" w:hAnsi="Arial"/>
+          <w:b/>
+          <w:color w:val="000000"/>
+          <w:sz w:val="19"/>
+        </w:rPr>
+        <w:t>National Security &amp; Justice</w:t>
+      </w:r>
+    </w:p>
+    <w:p>
+      <w:pPr>
+        <w:pStyle w:val="body_letter"/>
+      </w:pPr>
+      <w:r>
+        <w:rPr>
+          <w:rFonts w:ascii="Arial" w:hAnsi="Arial"/>
+          <w:b w:val="0"/>
+          <w:color w:val="000000"/>
+          <w:sz w:val="19"/>
+        </w:rPr>
+        <w:t>AUSTRAC's activation of AML/CTF 2.0 civil penalties, $21,840 per breach, with guidance now issued for remittance providers, marks the clearest near-term compliance advisory pull in the portfolio; regulated entities are scrambling to operationalise obligations that took effect this month. Concurrently, the AFP's opening statement to the PJCIS radicalisation inquiry and its foreign interference capability uplift announcement signal sustained Commonwealth investment in counter-terrorism and counter-foreign-interference operating models, creating a pursuit lane for organisation design, technology uplift, and training program advisory. ABF's coordinated illicit firearms and tobacco enforcement actions (WA, national) point to cross-agency intelligence-sharing and targeting maturity reviews as live procurement themes. The Law Council's alignment with the parliamentary committee on limiting ACIC's coercive powers introduces a governance and oversight assurance angle that will require agencies to refresh accountability frameworks regardless of legislative outcome.</w:t>
+      </w:r>
+    </w:p>
+    <w:p>
+      <w:pPr>
+        <w:pStyle w:val="body_letter"/>
+      </w:pPr>
+      <w:r>
+        <w:rPr>
+          <w:rFonts w:ascii="Arial" w:hAnsi="Arial"/>
+          <w:b/>
+          <w:color w:val="000000"/>
+          <w:sz w:val="19"/>
+        </w:rPr>
+        <w:t>Defence</w:t>
+      </w:r>
+    </w:p>
+    <w:p>
+      <w:pPr>
+        <w:pStyle w:val="body_letter"/>
+      </w:pPr>
+      <w:r>
+        <w:rPr>
+          <w:rFonts w:ascii="Arial" w:hAnsi="Arial"/>
+          <w:b w:val="0"/>
+          <w:color w:val="000000"/>
+          <w:sz w:val="19"/>
+        </w:rPr>
+        <w:t>AUKUS Pillar II's five-year milestone is generating tangible demand for independent program assurance and capability assessment across advanced technology delivery and allied interoperability, a direct pull-through for KPMG's national security advisory bench. Australia's concurrent push to expand lethal autonomous weapons exports, combined with live scrutiny of Defence Export Controls following the F-35 components report, is pressuring Defence primes and Tier 2 supply-chain participants to uplift trade compliance frameworks ahead of anticipated DEC regulatory tightening. The termination of a 26-year Defence contract signals active procurement reform risk and creates contract governance and transition advisory opportunities for firms positioned as independent advisers. Incoming criminal liability for modern slavery failures in supply chains adds a compliance assurance layer across the Defence industrial base that primes and their advisers cannot defer.</w:t>
+      </w:r>
+    </w:p>
+    <w:p>
+      <w:pPr>
+        <w:pStyle w:val="body_letter"/>
+      </w:pPr>
+      <w:r>
+        <w:rPr>
+          <w:rFonts w:ascii="Arial" w:hAnsi="Arial"/>
+          <w:b/>
+          <w:color w:val="000000"/>
+          <w:sz w:val="19"/>
+        </w:rPr>
+        <w:t>Transport</w:t>
+      </w:r>
+    </w:p>
+    <w:p>
+      <w:pPr>
+        <w:pStyle w:val="body_letter"/>
+      </w:pPr>
+      <w:r>
+        <w:rPr>
+          <w:rFonts w:ascii="Arial" w:hAnsi="Arial"/>
+          <w:b w:val="0"/>
+          <w:color w:val="000000"/>
+          <w:sz w:val="19"/>
+        </w:rPr>
+        <w:t>CASA is accelerating its autonomous aviation regulatory architecture this fortnight, the BVLOS trial continuation and AusSORA airworthiness guidance signal sustained Commonwealth investment in capability frameworks that KPMG can support through regulatory design, implementation advisory, and stakeholder engagement. The ACT government's $210m Acusensus traffic enforcement contract is the clearest procurement signal in the period, confirming state appetite for intelligent transport enforcement infrastructure and opening a pipeline conversation for similar engagements in Victoria, NSW, and Queensland. CASA's contested aircraft registration fee and the NTC's voluntary stevedore and ECP guidelines both reflect regulators shifting toward cost-recovery and co-regulatory models, which will drive demand for industry compliance program redesign and regulatory impact advisory. The CASA probe into Vietjet's financial viability is a direct entry point for the aviation financial advisory and assurance practice, with regulatory clients and airline counterparties both needing support.</w:t>
+      </w:r>
+    </w:p>
+    <w:p>
+      <w:pPr>
+        <w:pStyle w:val="body_letter"/>
+      </w:pPr>
+      <w:r>
+        <w:rPr>
+          <w:rFonts w:ascii="Arial" w:hAnsi="Arial"/>
+          <w:b/>
+          <w:color w:val="000000"/>
+          <w:sz w:val="19"/>
+        </w:rPr>
+        <w:t>Education</w:t>
+      </w:r>
+    </w:p>
+    <w:p>
+      <w:pPr>
+        <w:pStyle w:val="body_letter"/>
+      </w:pPr>
+      <w:r>
+        <w:rPr>
+          <w:rFonts w:ascii="Arial" w:hAnsi="Arial"/>
+          <w:b w:val="0"/>
+          <w:color w:val="000000"/>
+          <w:sz w:val="19"/>
+        </w:rPr>
+        <w:t>The release of the 2025 Standards for RTOs by DEWR constitutes a material compliance reset across the entire VET sector, every registered provider must assess operations against the new framework, and the window before enforcement matures is the clearest pull-through signal for a structured gap-assessment service line. ASQA's escalated scrutiny of RTO ownership and governance disclosures indicates a shift toward enforcement-led oversight of multi-entity provider structures, creating immediate demand for independent governance health-checks and remediation advisory. ASQA has simultaneously published AI principles for the training sector, anchoring an early-mover advisory angle around AI governance frameworks before sector-specific enforcement solidifies. TEQSA's concurrent Threshold Standard amendments, fee consultation, and the ATEC Disability Inclusion Advisory Committee establishment signal that higher education clients face compounding regulatory pressure, compressing the window for proactive engagement across both VET and university segments.</w:t>
       </w:r>
     </w:p>
     <w:p>
@@ -1388,11 +2087,249 @@
       <w:r>
         <w:rPr>
           <w:rFonts w:ascii="Arial" w:hAnsi="Arial"/>
-          <w:i/>
-          <w:color w:val="666666"/>
+          <w:b/>
+          <w:color w:val="000000"/>
           <w:sz w:val="19"/>
         </w:rPr>
-        <w:t>No jurisdiction-level synthesis available this fortnight.</w:t>
+        <w:t>Commonwealth</w:t>
+      </w:r>
+    </w:p>
+    <w:p>
+      <w:pPr>
+        <w:pStyle w:val="body_letter"/>
+      </w:pPr>
+      <w:r>
+        <w:rPr>
+          <w:rFonts w:ascii="Arial" w:hAnsi="Arial"/>
+          <w:b w:val="0"/>
+          <w:color w:val="000000"/>
+          <w:sz w:val="19"/>
+        </w:rPr>
+        <w:t>ASIC is escalating enforcement with $4m in infringement notices issued to 21 Visy and Pratt group companies while simultaneously running a $90m operating deficit from increased litigation costs, signalling a high-volume, high-cost enforcement posture that raises compliance risk across corporate groups. The Department of Home Affairs has opened engagement on cyber security legislative reforms, creating a near-term advisory window for critical infrastructure and regulated entities. The OAIC's latest report shows Australians are increasingly exercising privacy rights, foreshadowing higher complaint volumes and compliance pressure under the Privacy Act reform pipeline. The Commonwealth Ombudsman's critique of an algorithm-based aged care tool, specifically citing failure to implement robodebt royal commission transparency recommendations, puts automated decision-making governance firmly on Commonwealth regulators' agenda.</w:t>
+      </w:r>
+    </w:p>
+    <w:p>
+      <w:pPr>
+        <w:pStyle w:val="body_letter"/>
+      </w:pPr>
+      <w:r>
+        <w:rPr>
+          <w:rFonts w:ascii="Arial" w:hAnsi="Arial"/>
+          <w:b/>
+          <w:color w:val="000000"/>
+          <w:sz w:val="19"/>
+        </w:rPr>
+        <w:t>New South Wales</w:t>
+      </w:r>
+    </w:p>
+    <w:p>
+      <w:pPr>
+        <w:pStyle w:val="body_letter"/>
+      </w:pPr>
+      <w:r>
+        <w:rPr>
+          <w:rFonts w:ascii="Arial" w:hAnsi="Arial"/>
+          <w:b w:val="0"/>
+          <w:color w:val="000000"/>
+          <w:sz w:val="19"/>
+        </w:rPr>
+        <w:t>NSW is legislating a first-of-its-kind independent Office of Animal Welfare, creating a new regulatory body with significant compliance obligations for animal industries and veterinary sectors. SafeWork NSW is running active enforcement campaigns, including a mental health risk investigation at a named employer and a targeted abattoir compliance operation for Safe Work Month, signalling elevated psychosocial and WHS audit risk. The Minns Government has also delivered landmark Local Jobs First procurement reforms and is citing record housing completions as evidence that planning reform is working, both areas generating immediate advisory demand. A cybersecurity breach of an NSW government website, attributed to an OpenAI agent and disclosed months after the fact, raises material questions about breach notification obligations and government digital-infrastructure compliance posture.</w:t>
+      </w:r>
+    </w:p>
+    <w:p>
+      <w:pPr>
+        <w:pStyle w:val="body_letter"/>
+      </w:pPr>
+      <w:r>
+        <w:rPr>
+          <w:rFonts w:ascii="Arial" w:hAnsi="Arial"/>
+          <w:b/>
+          <w:color w:val="000000"/>
+          <w:sz w:val="19"/>
+        </w:rPr>
+        <w:t>Victoria</w:t>
+      </w:r>
+    </w:p>
+    <w:p>
+      <w:pPr>
+        <w:pStyle w:val="body_letter"/>
+      </w:pPr>
+      <w:r>
+        <w:rPr>
+          <w:rFonts w:ascii="Arial" w:hAnsi="Arial"/>
+          <w:b w:val="0"/>
+          <w:color w:val="000000"/>
+          <w:sz w:val="19"/>
+        </w:rPr>
+        <w:t>Victoria's corruption watchdog (IBAC) has had its mandate and 'follow-the-money' powers widened through fast-tracked legislation, representing a significant shift in integrity enforcement that will affect public sector clients and contractors. The Victorian Auditor-General issued adverse findings across multiple areas this period: government advertising campaigns breached political neutrality rules, fire authorities failed asset maintenance obligations, and a youth justice program lacked evidential support for its claimed outcomes. Enforcement activity intensified on multiple fronts, with Victoria's teaching watchdog executing raids on Fitzroy Community School campuses and illicit tobacco crackdowns resulting in 61 store closures. Organisations working with children face new compliance obligations under Working with Children Check reforms effective now, and the Social Services Regulator's October newsletter signals continued active oversight in that sector.</w:t>
+      </w:r>
+    </w:p>
+    <w:p>
+      <w:pPr>
+        <w:pStyle w:val="body_letter"/>
+      </w:pPr>
+      <w:r>
+        <w:rPr>
+          <w:rFonts w:ascii="Arial" w:hAnsi="Arial"/>
+          <w:b/>
+          <w:color w:val="000000"/>
+          <w:sz w:val="19"/>
+        </w:rPr>
+        <w:t>Queensland</w:t>
+      </w:r>
+    </w:p>
+    <w:p>
+      <w:pPr>
+        <w:pStyle w:val="body_letter"/>
+      </w:pPr>
+      <w:r>
+        <w:rPr>
+          <w:rFonts w:ascii="Arial" w:hAnsi="Arial"/>
+          <w:b w:val="0"/>
+          <w:color w:val="000000"/>
+          <w:sz w:val="19"/>
+        </w:rPr>
+        <w:t>Queensland's Parliament has enacted mining reforms streamlining approvals, removing duplication and refining third-party objection rights, creating immediate advisory opportunities for resources-sector clients navigating the new standing and scrutiny framework. The Queensland Government has again deferred suspension of The Star Gold Coast's casino licences as an AUSTRAC enforcement verdict looms, signalling that gaming operators face compounding state and federal regulatory risk. A major industrial relations overhaul grants the Deputy Premier strike-breaking powers, representing a material shift in labour law exposure for employers operating in Queensland. Across the compliance landscape, e-mobility device non-compliance (~50% of private devices), ECEC child safety gaps, and QLS warnings on evidential AML/CTF proof standards each point to active state-level enforcement appetite.</w:t>
+      </w:r>
+    </w:p>
+    <w:p>
+      <w:pPr>
+        <w:pStyle w:val="body_letter"/>
+      </w:pPr>
+      <w:r>
+        <w:rPr>
+          <w:rFonts w:ascii="Arial" w:hAnsi="Arial"/>
+          <w:b/>
+          <w:color w:val="000000"/>
+          <w:sz w:val="19"/>
+        </w:rPr>
+        <w:t>Western Australia</w:t>
+      </w:r>
+    </w:p>
+    <w:p>
+      <w:pPr>
+        <w:pStyle w:val="body_letter"/>
+      </w:pPr>
+      <w:r>
+        <w:rPr>
+          <w:rFonts w:ascii="Arial" w:hAnsi="Arial"/>
+          <w:b w:val="0"/>
+          <w:color w:val="000000"/>
+          <w:sz w:val="19"/>
+        </w:rPr>
+        <w:t>Western Australia is in an active legislative cycle, with payment protection laws for subcontractors now passed, Equal Opportunity Act reforms announced by Premier Cook, and local government reform legislation introduced to Parliament, all creating near-term compliance uplift needs for affected sectors. DWER's defence of expanded environmental fining powers signals a harder enforcement posture on natural resources and land use, reinforcing advisory demand in environmental compliance. The AES framework for alternative electricity services introduces a new regulatory layer in the energy market. The WA government's reimbursement action against Deloitte over a flawed university report is a notable advisory accountability signal for professional services firms operating in the public sector.</w:t>
+      </w:r>
+    </w:p>
+    <w:p>
+      <w:pPr>
+        <w:pStyle w:val="body_letter"/>
+      </w:pPr>
+      <w:r>
+        <w:rPr>
+          <w:rFonts w:ascii="Arial" w:hAnsi="Arial"/>
+          <w:b/>
+          <w:color w:val="000000"/>
+          <w:sz w:val="19"/>
+        </w:rPr>
+        <w:t>South Australia</w:t>
+      </w:r>
+    </w:p>
+    <w:p>
+      <w:pPr>
+        <w:pStyle w:val="body_letter"/>
+      </w:pPr>
+      <w:r>
+        <w:rPr>
+          <w:rFonts w:ascii="Arial" w:hAnsi="Arial"/>
+          <w:b w:val="0"/>
+          <w:color w:val="000000"/>
+          <w:sz w:val="19"/>
+        </w:rPr>
+        <w:t>SafeWork SA is running a sustained enforcement campaign across multiple sectors, with charges laid for asbestos exposure failures at demolition sites, a construction apprentice head-injury prosecution, and action against an amusement hire company, signalling active prosecutorial posture that elevates WHS compliance risk for SA businesses. In parallel, SafeWork SA is flagging new psychosocial hazard rules covering workplace stress and bullying, and new Workplace Exposure Limits are imminent, both creating near-term compliance uplift obligations for SA employers. SA has also enacted new alcohol delivery restrictions as part of a domestic violence legislative response, drawing a direct industry challenge from Retail Drinks Australia, opening advisory opportunity in licensing compliance and regulatory engagement strategy. Phosphine regulation changes have been delayed following consultation, a reminder that SA's regulatory pipeline is active across chemicals, WHS and liquor sectors simultaneously.</w:t>
+      </w:r>
+    </w:p>
+    <w:p>
+      <w:pPr>
+        <w:pStyle w:val="body_letter"/>
+      </w:pPr>
+      <w:r>
+        <w:rPr>
+          <w:rFonts w:ascii="Arial" w:hAnsi="Arial"/>
+          <w:b/>
+          <w:color w:val="000000"/>
+          <w:sz w:val="19"/>
+        </w:rPr>
+        <w:t>Tasmania</w:t>
+      </w:r>
+    </w:p>
+    <w:p>
+      <w:pPr>
+        <w:pStyle w:val="body_letter"/>
+      </w:pPr>
+      <w:r>
+        <w:rPr>
+          <w:rFonts w:ascii="Arial" w:hAnsi="Arial"/>
+          <w:b w:val="0"/>
+          <w:color w:val="000000"/>
+          <w:sz w:val="19"/>
+        </w:rPr>
+        <w:t>Tasmania's Legislative Council has launched an inquiry into the abandoned cashless gaming card amid $18.1 million in pokies losses, signalling renewed gambling regulation scrutiny and advisory opportunity. Parliament has introduced Commission of Inquiry reforms welcomed by the Implementation Monitor, while a charitable sector red tape reduction bill has passed. The state's new planning portal has drawn sharp criticism from Hobart Council as unfit for purpose, and land-clearing investigation procedures face review following farmer protests. A firearms reform bill has been shelved after significant pushback, and AI-generated hallucinated case law by the parole board has prompted attorney-general intervention, raising broader public sector AI governance questions.</w:t>
+      </w:r>
+    </w:p>
+    <w:p>
+      <w:pPr>
+        <w:pStyle w:val="body_letter"/>
+      </w:pPr>
+      <w:r>
+        <w:rPr>
+          <w:rFonts w:ascii="Arial" w:hAnsi="Arial"/>
+          <w:b/>
+          <w:color w:val="000000"/>
+          <w:sz w:val="19"/>
+        </w:rPr>
+        <w:t>Australian Capital Territory</w:t>
+      </w:r>
+    </w:p>
+    <w:p>
+      <w:pPr>
+        <w:pStyle w:val="body_letter"/>
+      </w:pPr>
+      <w:r>
+        <w:rPr>
+          <w:rFonts w:ascii="Arial" w:hAnsi="Arial"/>
+          <w:b w:val="0"/>
+          <w:color w:val="000000"/>
+          <w:sz w:val="19"/>
+        </w:rPr>
+        <w:t>The ACT Government is moving to legislate significant gambling reforms, including a shift to cashless gaming and a reduction in poker machines, representing the territory's most substantial gaming regulatory overhaul in recent years. These changes will create material compliance obligations for venues operating electronic gaming machines and for technology providers supporting cashless payment infrastructure. Separately, an administrative error affecting camera-detected seatbelt fines raises questions about the ACT's enforcement accuracy and procedural integrity in automated infringement systems. KPMG advisory opportunities exist in gaming compliance uplift, venue transition support, and regulatory process audits for automated enforcement programs.</w:t>
+      </w:r>
+    </w:p>
+    <w:p>
+      <w:pPr>
+        <w:pStyle w:val="body_letter"/>
+      </w:pPr>
+      <w:r>
+        <w:rPr>
+          <w:rFonts w:ascii="Arial" w:hAnsi="Arial"/>
+          <w:b/>
+          <w:color w:val="000000"/>
+          <w:sz w:val="19"/>
+        </w:rPr>
+        <w:t>Northern Territory</w:t>
+      </w:r>
+    </w:p>
+    <w:p>
+      <w:pPr>
+        <w:pStyle w:val="body_letter"/>
+      </w:pPr>
+      <w:r>
+        <w:rPr>
+          <w:rFonts w:ascii="Arial" w:hAnsi="Arial"/>
+          <w:b w:val="0"/>
+          <w:color w:val="000000"/>
+          <w:sz w:val="19"/>
+        </w:rPr>
+        <w:t>The Northern Territory is advancing a significant legislative agenda across multiple sectors. Planning and building reform legislation has passed into law, reducing red tape for developers and community associations, while proposed tenancy law reforms are open for public consultation. Environmental compliance obligations are tightening, with NT now requiring major polluters to report toxic emissions and the NT environmental regulator halting assessment of a large AI data centre (Project Ares) on a cattle station citing low confidence in environmental plans. The NT is also progressing gambling reform legislation proposing deposit caps and inducement bans on bookmakers, signalling a priority shift toward consumer protection in the wagering sector. Child protection and teacher registration governance are also under active reform following systemic failure findings, presenting advisory opportunities across regulatory compliance uplift, environmental approvals, and legislative implementation.</w:t>
       </w:r>
     </w:p>
     <w:tbl>
@@ -1438,7 +2375,7 @@
                           <pic:cNvPicPr/>
                         </pic:nvPicPr>
                         <pic:blipFill>
-                          <a:blip r:embed="rId27"/>
+                          <a:blip r:embed="rId29"/>
                           <a:stretch>
                             <a:fillRect/>
                           </a:stretch>

</xml_diff>